<commit_message>
Deploying to gh-pages from @ mattocci27/my-cv@a8ea38cd7a26d766c0ed3c315a529aa38005221f 🚀
</commit_message>
<xml_diff>
--- a/Katabuchi_CV.docx
+++ b/Katabuchi_CV.docx
@@ -199,29 +199,6 @@
       </w:r>
       <w:r>
         <w:t xml:space="preserve">, Xishuangbanna Tropical Botanical Garden, Chinese Academy of Sciences, China</w:t>
-      </w:r>
-    </w:p>
-    <w:p>
-      <w:pPr>
-        <w:pStyle w:val="DefinitionTerm"/>
-      </w:pPr>
-      <w:r>
-        <w:t xml:space="preserve">August 2017-February 2019</w:t>
-      </w:r>
-    </w:p>
-    <w:p>
-      <w:pPr>
-        <w:pStyle w:val="Definition"/>
-      </w:pPr>
-      <w:r>
-        <w:rPr>
-          <w:bCs/>
-          <w:b/>
-        </w:rPr>
-        <w:t xml:space="preserve">Postdoctoral Research Associate</w:t>
-      </w:r>
-      <w:r>
-        <w:t xml:space="preserve">, Michigan State University, USA</w:t>
       </w:r>
     </w:p>
     <w:p>

</xml_diff>

<commit_message>
Deploying to gh-pages from @ mattocci27/my-cv@e94fd7875862a990b78ab633fd41259821362e3d 🚀
</commit_message>
<xml_diff>
--- a/Katabuchi_CV.docx
+++ b/Katabuchi_CV.docx
@@ -547,7 +547,7 @@
       </w:r>
     </w:p>
     <w:bookmarkEnd w:id="24"/>
-    <w:bookmarkStart w:id="53" w:name="publications"/>
+    <w:bookmarkStart w:id="54" w:name="publications"/>
     <w:p>
       <w:pPr>
         <w:pStyle w:val="Heading2"/>
@@ -564,7 +564,7 @@
         </w:numPr>
       </w:pPr>
       <w:r>
-        <w:t xml:space="preserve">Phoutthavong, K.,</w:t>
+        <w:t xml:space="preserve">Zhou, C., Nakamura, A., Song, X. &amp;</w:t>
       </w:r>
       <w:r>
         <w:t xml:space="preserve"> </w:t>
@@ -577,7 +577,10 @@
         <w:t xml:space="preserve">Katabuchi, M.</w:t>
       </w:r>
       <w:r>
-        <w:t xml:space="preserve">, Nakamura, A., Cheng, X. &amp; Cao, M. Interspecific and intraspecific adaptations of pteridophyte leaf traits in limestone and non-limestone forests of monsoon tropical regions of southwest China.</w:t>
+        <w:t xml:space="preserve"> </w:t>
+      </w:r>
+      <w:r>
+        <w:t xml:space="preserve">Artificial light at night (ALAN) influences understory plant traits through ecological processes: A two-year experiment in a rubber plantation in China.</w:t>
       </w:r>
       <w:r>
         <w:t xml:space="preserve"> </w:t>
@@ -589,13 +592,13 @@
           <w:bCs/>
           <w:b/>
         </w:rPr>
-        <w:t xml:space="preserve">Journal of Plant Ecology</w:t>
-      </w:r>
-      <w:r>
-        <w:t xml:space="preserve"> </w:t>
-      </w:r>
-      <w:r>
-        <w:t xml:space="preserve">rtad026 (2023)</w:t>
+        <w:t xml:space="preserve">EcoEvoRxiv</w:t>
+      </w:r>
+      <w:r>
+        <w:t xml:space="preserve"> </w:t>
+      </w:r>
+      <w:r>
+        <w:t xml:space="preserve">(2023)</w:t>
       </w:r>
       <w:r>
         <w:t xml:space="preserve"> </w:t>
@@ -620,7 +623,7 @@
         </w:numPr>
       </w:pPr>
       <w:r>
-        <w:t xml:space="preserve">Maenpuen, P.,</w:t>
+        <w:t xml:space="preserve">Phoutthavong, K.,</w:t>
       </w:r>
       <w:r>
         <w:t xml:space="preserve"> </w:t>
@@ -633,7 +636,7 @@
         <w:t xml:space="preserve">Katabuchi, M.</w:t>
       </w:r>
       <w:r>
-        <w:t xml:space="preserve">, Onoda, Y., Zhou, C., Zhang, J.-L. &amp; Chen, Y.-J. Sources and consequences of mismatch between leaf disc and whole-leaf leaf mass per area (LMA).</w:t>
+        <w:t xml:space="preserve">, Nakamura, A., Cheng, X. &amp; Cao, M. Interspecific and intraspecific adaptations of pteridophyte leaf traits in limestone and non-limestone forests of monsoon tropical regions of southwest China.</w:t>
       </w:r>
       <w:r>
         <w:t xml:space="preserve"> </w:t>
@@ -645,13 +648,13 @@
           <w:bCs/>
           <w:b/>
         </w:rPr>
-        <w:t xml:space="preserve">American Journal of Botany</w:t>
-      </w:r>
-      <w:r>
-        <w:t xml:space="preserve"> </w:t>
-      </w:r>
-      <w:r>
-        <w:t xml:space="preserve">109, 1242–1250 (2022)</w:t>
+        <w:t xml:space="preserve">Journal of Plant Ecology</w:t>
+      </w:r>
+      <w:r>
+        <w:t xml:space="preserve"> </w:t>
+      </w:r>
+      <w:r>
+        <w:t xml:space="preserve">rtad026 (2023)</w:t>
       </w:r>
       <w:r>
         <w:t xml:space="preserve"> </w:t>
@@ -676,7 +679,7 @@
         </w:numPr>
       </w:pPr>
       <w:r>
-        <w:t xml:space="preserve">Chen, Y.-J., Maenpuen, P., Zhang, Y.-J., Barai, K.,</w:t>
+        <w:t xml:space="preserve">Maenpuen, P.,</w:t>
       </w:r>
       <w:r>
         <w:t xml:space="preserve"> </w:t>
@@ -689,7 +692,7 @@
         <w:t xml:space="preserve">Katabuchi, M.</w:t>
       </w:r>
       <w:r>
-        <w:t xml:space="preserve">, Gao, H., Kaewkamol, S., Tao, L.-B. &amp; Zhang, J.-L. Quantifying vulnerability to embolism in tropical trees and lianas using five methods: Can discrepancies be explained by xylem structural traits?</w:t>
+        <w:t xml:space="preserve">, Onoda, Y., Zhou, C., Zhang, J.-L. &amp; Chen, Y.-J. Sources and consequences of mismatch between leaf disc and whole-leaf leaf mass per area (LMA).</w:t>
       </w:r>
       <w:r>
         <w:t xml:space="preserve"> </w:t>
@@ -701,13 +704,13 @@
           <w:bCs/>
           <w:b/>
         </w:rPr>
-        <w:t xml:space="preserve">New Phytologist</w:t>
-      </w:r>
-      <w:r>
-        <w:t xml:space="preserve"> </w:t>
-      </w:r>
-      <w:r>
-        <w:t xml:space="preserve">229, 805–819 (2021)</w:t>
+        <w:t xml:space="preserve">American Journal of Botany</w:t>
+      </w:r>
+      <w:r>
+        <w:t xml:space="preserve"> </w:t>
+      </w:r>
+      <w:r>
+        <w:t xml:space="preserve">109, 1242–1250 (2022)</w:t>
       </w:r>
       <w:r>
         <w:t xml:space="preserve"> </w:t>
@@ -732,7 +735,7 @@
         </w:numPr>
       </w:pPr>
       <w:r>
-        <w:t xml:space="preserve">Chen, Y.-J., Choat, B., Sterck, F., Maenpuen, P.,</w:t>
+        <w:t xml:space="preserve">Chen, Y.-J., Maenpuen, P., Zhang, Y.-J., Barai, K.,</w:t>
       </w:r>
       <w:r>
         <w:t xml:space="preserve"> </w:t>
@@ -745,7 +748,7 @@
         <w:t xml:space="preserve">Katabuchi, M.</w:t>
       </w:r>
       <w:r>
-        <w:t xml:space="preserve">, Zhang, S.-B., Tomlinson, K. W., Oliveira, R. S., Zhang, Y.-J., Shen, J.-X., Cao, K.-F. &amp; Jansen, S. Hydraulic prediction of drought-induced plant dieback and top-kill depends on leaf habit and growth form.</w:t>
+        <w:t xml:space="preserve">, Gao, H., Kaewkamol, S., Tao, L.-B. &amp; Zhang, J.-L. Quantifying vulnerability to embolism in tropical trees and lianas using five methods: Can discrepancies be explained by xylem structural traits?</w:t>
       </w:r>
       <w:r>
         <w:t xml:space="preserve"> </w:t>
@@ -757,13 +760,13 @@
           <w:bCs/>
           <w:b/>
         </w:rPr>
-        <w:t xml:space="preserve">Ecology Letters</w:t>
-      </w:r>
-      <w:r>
-        <w:t xml:space="preserve"> </w:t>
-      </w:r>
-      <w:r>
-        <w:t xml:space="preserve">24, 2350–2363 (2021)</w:t>
+        <w:t xml:space="preserve">New Phytologist</w:t>
+      </w:r>
+      <w:r>
+        <w:t xml:space="preserve"> </w:t>
+      </w:r>
+      <w:r>
+        <w:t xml:space="preserve">229, 805–819 (2021)</w:t>
       </w:r>
       <w:r>
         <w:t xml:space="preserve"> </w:t>
@@ -788,7 +791,7 @@
         </w:numPr>
       </w:pPr>
       <w:r>
-        <w:t xml:space="preserve">Swenson, N. G., Hulshof, C. M.,</w:t>
+        <w:t xml:space="preserve">Chen, Y.-J., Choat, B., Sterck, F., Maenpuen, P.,</w:t>
       </w:r>
       <w:r>
         <w:t xml:space="preserve"> </w:t>
@@ -801,10 +804,7 @@
         <w:t xml:space="preserve">Katabuchi, M.</w:t>
       </w:r>
       <w:r>
-        <w:t xml:space="preserve"> </w:t>
-      </w:r>
-      <w:r>
-        <w:t xml:space="preserve">&amp; Enquist, B. J. Long-term shifts in the functional composition and diversity of a tropical dry forest: A 30-yr study.</w:t>
+        <w:t xml:space="preserve">, Zhang, S.-B., Tomlinson, K. W., Oliveira, R. S., Zhang, Y.-J., Shen, J.-X., Cao, K.-F. &amp; Jansen, S. Hydraulic prediction of drought-induced plant dieback and top-kill depends on leaf habit and growth form.</w:t>
       </w:r>
       <w:r>
         <w:t xml:space="preserve"> </w:t>
@@ -816,13 +816,13 @@
           <w:bCs/>
           <w:b/>
         </w:rPr>
-        <w:t xml:space="preserve">Ecological Monographs</w:t>
-      </w:r>
-      <w:r>
-        <w:t xml:space="preserve"> </w:t>
-      </w:r>
-      <w:r>
-        <w:t xml:space="preserve">e01408 (2020)</w:t>
+        <w:t xml:space="preserve">Ecology Letters</w:t>
+      </w:r>
+      <w:r>
+        <w:t xml:space="preserve"> </w:t>
+      </w:r>
+      <w:r>
+        <w:t xml:space="preserve">24, 2350–2363 (2021)</w:t>
       </w:r>
       <w:r>
         <w:t xml:space="preserve"> </w:t>
@@ -847,7 +847,7 @@
         </w:numPr>
       </w:pPr>
       <w:r>
-        <w:t xml:space="preserve">Sreekar, R.,</w:t>
+        <w:t xml:space="preserve">Swenson, N. G., Hulshof, C. M.,</w:t>
       </w:r>
       <w:r>
         <w:t xml:space="preserve"> </w:t>
@@ -860,7 +860,10 @@
         <w:t xml:space="preserve">Katabuchi, M.</w:t>
       </w:r>
       <w:r>
-        <w:t xml:space="preserve">, Nakamura, A., Corlett, R. T., Slik, J. W. F., Fletcher, C., He, F., Weiblen, G. D., Shen, G., Xu, H., Sun, I.-F., Cao, K., Ma, K., Chang, L.-W., Cao, M., Jiang, M., Gunatilleke, I. A. U. N., Ong, P., Yap, S., Gunatilleke, C. V. S., Novotny, V., Brockelman, W. Y., Xiang, W., Mi, X., Li, X., Wang, X., Qiao, X., Li, Y., Tan, S., Condit, R., Harrison, R. D. &amp; Koh, L. P. Spatial scale changes the relationship between beta diversity, species richness and latitude.</w:t>
+        <w:t xml:space="preserve"> </w:t>
+      </w:r>
+      <w:r>
+        <w:t xml:space="preserve">&amp; Enquist, B. J. Long-term shifts in the functional composition and diversity of a tropical dry forest: A 30-yr study.</w:t>
       </w:r>
       <w:r>
         <w:t xml:space="preserve"> </w:t>
@@ -872,13 +875,13 @@
           <w:bCs/>
           <w:b/>
         </w:rPr>
-        <w:t xml:space="preserve">Open Science</w:t>
-      </w:r>
-      <w:r>
-        <w:t xml:space="preserve"> </w:t>
-      </w:r>
-      <w:r>
-        <w:t xml:space="preserve">5, 181168 (2018)</w:t>
+        <w:t xml:space="preserve">Ecological Monographs</w:t>
+      </w:r>
+      <w:r>
+        <w:t xml:space="preserve"> </w:t>
+      </w:r>
+      <w:r>
+        <w:t xml:space="preserve">e01408 (2020)</w:t>
       </w:r>
       <w:r>
         <w:t xml:space="preserve"> </w:t>
@@ -903,7 +906,7 @@
         </w:numPr>
       </w:pPr>
       <w:r>
-        <w:t xml:space="preserve">Johnson, D. J., Needham, J., Xu, C., Massoud, E. C., Davies, S. J., Anderson-Teixeira, K. J., Bunyavejchewin, S., Chambers, J. Q., Chang-Yang, C.-H., Chiang, J.-M., Chuyong, G. B., Condit, R., Cordell, S., Fletcher, C., Giardina, C. P., Giambelluca, T. W., Gunatilleke, N., Gunatilleke, S., Hsieh, C.-F., Hubbell, S., Inman-Narahari, F., Kassim, A. R.,</w:t>
+        <w:t xml:space="preserve">Sreekar, R.,</w:t>
       </w:r>
       <w:r>
         <w:t xml:space="preserve"> </w:t>
@@ -916,7 +919,7 @@
         <w:t xml:space="preserve">Katabuchi, M.</w:t>
       </w:r>
       <w:r>
-        <w:t xml:space="preserve">, Kenfack, D., Litton, C. M., Lum, S., Mohamad, M., Nasardin, M., Ong, P. S., Ostertag, R., Sack, L., Swenson, N. G., Sun, I. F., Tan, S., Thomas, D. W., Thompson, J., Umaña, M. N., Uriarte, M., Valencia, R., Yap, S., Zimmerman, J., McDowell, N. G. &amp; McMahon, S. M. Climate sensitive size-dependent survival in tropical trees.</w:t>
+        <w:t xml:space="preserve">, Nakamura, A., Corlett, R. T., Slik, J. W. F., Fletcher, C., He, F., Weiblen, G. D., Shen, G., Xu, H., Sun, I.-F., Cao, K., Ma, K., Chang, L.-W., Cao, M., Jiang, M., Gunatilleke, I. A. U. N., Ong, P., Yap, S., Gunatilleke, C. V. S., Novotny, V., Brockelman, W. Y., Xiang, W., Mi, X., Li, X., Wang, X., Qiao, X., Li, Y., Tan, S., Condit, R., Harrison, R. D. &amp; Koh, L. P. Spatial scale changes the relationship between beta diversity, species richness and latitude.</w:t>
       </w:r>
       <w:r>
         <w:t xml:space="preserve"> </w:t>
@@ -928,13 +931,13 @@
           <w:bCs/>
           <w:b/>
         </w:rPr>
-        <w:t xml:space="preserve">Nature Ecology &amp; Evolution</w:t>
-      </w:r>
-      <w:r>
-        <w:t xml:space="preserve"> </w:t>
-      </w:r>
-      <w:r>
-        <w:t xml:space="preserve">1 (2018)</w:t>
+        <w:t xml:space="preserve">Open Science</w:t>
+      </w:r>
+      <w:r>
+        <w:t xml:space="preserve"> </w:t>
+      </w:r>
+      <w:r>
+        <w:t xml:space="preserve">5, 181168 (2018)</w:t>
       </w:r>
       <w:r>
         <w:t xml:space="preserve"> </w:t>
@@ -959,7 +962,7 @@
         </w:numPr>
       </w:pPr>
       <w:r>
-        <w:t xml:space="preserve">Osnas, J. L. D.,</w:t>
+        <w:t xml:space="preserve">Johnson, D. J., Needham, J., Xu, C., Massoud, E. C., Davies, S. J., Anderson-Teixeira, K. J., Bunyavejchewin, S., Chambers, J. Q., Chang-Yang, C.-H., Chiang, J.-M., Chuyong, G. B., Condit, R., Cordell, S., Fletcher, C., Giardina, C. P., Giambelluca, T. W., Gunatilleke, N., Gunatilleke, S., Hsieh, C.-F., Hubbell, S., Inman-Narahari, F., Kassim, A. R.,</w:t>
       </w:r>
       <w:r>
         <w:t xml:space="preserve"> </w:t>
@@ -972,7 +975,7 @@
         <w:t xml:space="preserve">Katabuchi, M.</w:t>
       </w:r>
       <w:r>
-        <w:t xml:space="preserve">, Kitajima, K., Wright, S. J., Reich, P. B., Van Bael, S. A., Kraft, N. J. B., Samaniego, M. J., Pacala, S. W. &amp; Lichstein, J. W. Divergent drivers of leaf trait variation within species, among species, and among functional groups.</w:t>
+        <w:t xml:space="preserve">, Kenfack, D., Litton, C. M., Lum, S., Mohamad, M., Nasardin, M., Ong, P. S., Ostertag, R., Sack, L., Swenson, N. G., Sun, I. F., Tan, S., Thomas, D. W., Thompson, J., Umaña, M. N., Uriarte, M., Valencia, R., Yap, S., Zimmerman, J., McDowell, N. G. &amp; McMahon, S. M. Climate sensitive size-dependent survival in tropical trees.</w:t>
       </w:r>
       <w:r>
         <w:t xml:space="preserve"> </w:t>
@@ -984,13 +987,13 @@
           <w:bCs/>
           <w:b/>
         </w:rPr>
-        <w:t xml:space="preserve">Proceedings of the National Academy of Sciences of the United States of America</w:t>
-      </w:r>
-      <w:r>
-        <w:t xml:space="preserve"> </w:t>
-      </w:r>
-      <w:r>
-        <w:t xml:space="preserve">115, 5480–5485 (2018)</w:t>
+        <w:t xml:space="preserve">Nature Ecology &amp; Evolution</w:t>
+      </w:r>
+      <w:r>
+        <w:t xml:space="preserve"> </w:t>
+      </w:r>
+      <w:r>
+        <w:t xml:space="preserve">1 (2018)</w:t>
       </w:r>
       <w:r>
         <w:t xml:space="preserve"> </w:t>
@@ -1015,7 +1018,7 @@
         </w:numPr>
       </w:pPr>
       <w:r>
-        <w:t xml:space="preserve">Li, Y., Shipley, B., Price, J. N., Dantas, V. de L., Tamme, R., Westoby, M., Siefert, A., Schamp, B. S., Spasojevic, M. J., Jung, V., Laughlin, D. C., Richardson, S. J., Bagousse-Pinguet, Y. L., Schöb, C., Gazol, A., Prentice, H. C., Gross, N., Overton, J., Cianciaruso, M. V., Louault, F., Kamiyama, C., Nakashizuka, T., Hikosaka, K., Sasaki, T.,</w:t>
+        <w:t xml:space="preserve">Osnas, J. L. D.,</w:t>
       </w:r>
       <w:r>
         <w:t xml:space="preserve"> </w:t>
@@ -1028,7 +1031,7 @@
         <w:t xml:space="preserve">Katabuchi, M.</w:t>
       </w:r>
       <w:r>
-        <w:t xml:space="preserve">, Frenette Dussault, C., Gaucherand, S., Chen, N., Vandewalle, M. &amp; Batalha, M. A. Habitat filtering determines the functional niche occupancy of plant communities worldwide.</w:t>
+        <w:t xml:space="preserve">, Kitajima, K., Wright, S. J., Reich, P. B., Van Bael, S. A., Kraft, N. J. B., Samaniego, M. J., Pacala, S. W. &amp; Lichstein, J. W. Divergent drivers of leaf trait variation within species, among species, and among functional groups.</w:t>
       </w:r>
       <w:r>
         <w:t xml:space="preserve"> </w:t>
@@ -1040,13 +1043,13 @@
           <w:bCs/>
           <w:b/>
         </w:rPr>
-        <w:t xml:space="preserve">Journal of Ecology</w:t>
-      </w:r>
-      <w:r>
-        <w:t xml:space="preserve"> </w:t>
-      </w:r>
-      <w:r>
-        <w:t xml:space="preserve">3, 808–809 (2017)</w:t>
+        <w:t xml:space="preserve">Proceedings of the National Academy of Sciences of the United States of America</w:t>
+      </w:r>
+      <w:r>
+        <w:t xml:space="preserve"> </w:t>
+      </w:r>
+      <w:r>
+        <w:t xml:space="preserve">115, 5480–5485 (2018)</w:t>
       </w:r>
       <w:r>
         <w:t xml:space="preserve"> </w:t>
@@ -1071,6 +1074,12 @@
         </w:numPr>
       </w:pPr>
       <w:r>
+        <w:t xml:space="preserve">Li, Y., Shipley, B., Price, J. N., Dantas, V. de L., Tamme, R., Westoby, M., Siefert, A., Schamp, B. S., Spasojevic, M. J., Jung, V., Laughlin, D. C., Richardson, S. J., Bagousse-Pinguet, Y. L., Schöb, C., Gazol, A., Prentice, H. C., Gross, N., Overton, J., Cianciaruso, M. V., Louault, F., Kamiyama, C., Nakashizuka, T., Hikosaka, K., Sasaki, T.,</w:t>
+      </w:r>
+      <w:r>
+        <w:t xml:space="preserve"> </w:t>
+      </w:r>
+      <w:r>
         <w:rPr>
           <w:bCs/>
           <w:b/>
@@ -1078,7 +1087,7 @@
         <w:t xml:space="preserve">Katabuchi, M.</w:t>
       </w:r>
       <w:r>
-        <w:t xml:space="preserve">, Wright, S. J., Swenson, N. G., Feeley, K. J., Condit, R., Hubbell, S. P. &amp; Davies, S. J. Contrasting outcomes of species- and community-level analyses of the temporal consistency of functional composition.</w:t>
+        <w:t xml:space="preserve">, Frenette Dussault, C., Gaucherand, S., Chen, N., Vandewalle, M. &amp; Batalha, M. A. Habitat filtering determines the functional niche occupancy of plant communities worldwide.</w:t>
       </w:r>
       <w:r>
         <w:t xml:space="preserve"> </w:t>
@@ -1090,13 +1099,13 @@
           <w:bCs/>
           <w:b/>
         </w:rPr>
-        <w:t xml:space="preserve">Ecology</w:t>
-      </w:r>
-      <w:r>
-        <w:t xml:space="preserve"> </w:t>
-      </w:r>
-      <w:r>
-        <w:t xml:space="preserve">98, 2273–2280 (2017)</w:t>
+        <w:t xml:space="preserve">Journal of Ecology</w:t>
+      </w:r>
+      <w:r>
+        <w:t xml:space="preserve"> </w:t>
+      </w:r>
+      <w:r>
+        <w:t xml:space="preserve">3, 808–809 (2017)</w:t>
       </w:r>
       <w:r>
         <w:t xml:space="preserve"> </w:t>
@@ -1128,7 +1137,7 @@
         <w:t xml:space="preserve">Katabuchi, M.</w:t>
       </w:r>
       <w:r>
-        <w:t xml:space="preserve">, Kitajima, K., Wright, S. J., Van Bael, S. A., Osnas, J. L. D. &amp; Lichstein, J. W. Decomposing leaf mass into photosynthetic and structural components explains divergent patterns of trait variation within and among plant species.</w:t>
+        <w:t xml:space="preserve">, Wright, S. J., Swenson, N. G., Feeley, K. J., Condit, R., Hubbell, S. P. &amp; Davies, S. J. Contrasting outcomes of species- and community-level analyses of the temporal consistency of functional composition.</w:t>
       </w:r>
       <w:r>
         <w:t xml:space="preserve"> </w:t>
@@ -1140,13 +1149,13 @@
           <w:bCs/>
           <w:b/>
         </w:rPr>
-        <w:t xml:space="preserve">bioRxiv</w:t>
-      </w:r>
-      <w:r>
-        <w:t xml:space="preserve"> </w:t>
-      </w:r>
-      <w:r>
-        <w:t xml:space="preserve">(2017)</w:t>
+        <w:t xml:space="preserve">Ecology</w:t>
+      </w:r>
+      <w:r>
+        <w:t xml:space="preserve"> </w:t>
+      </w:r>
+      <w:r>
+        <w:t xml:space="preserve">98, 2273–2280 (2017)</w:t>
       </w:r>
       <w:r>
         <w:t xml:space="preserve"> </w:t>
@@ -1171,12 +1180,6 @@
         </w:numPr>
       </w:pPr>
       <w:r>
-        <w:t xml:space="preserve">Siefert, A., Violle, C., Chalmandrier, L., Albert, C. H., Taudiere, A., Fajardo, A., Aarssen, L. W., Baraloto, C., Carlucci, M. B., Cianciaruso, M. V., de L. Dantas, V., de Bello, F., Duarte, L. D. S., Fonseca, C. R., Freschet, G. T., Gaucherand, S., Gross, N., Hikosaka, K., Jackson, B., Jung, V., Kamiyama, C.,</w:t>
-      </w:r>
-      <w:r>
-        <w:t xml:space="preserve"> </w:t>
-      </w:r>
-      <w:r>
         <w:rPr>
           <w:bCs/>
           <w:b/>
@@ -1184,7 +1187,7 @@
         <w:t xml:space="preserve">Katabuchi, M.</w:t>
       </w:r>
       <w:r>
-        <w:t xml:space="preserve">, Kembel, S. W., Kichenin, E., Kraft, N. J. B., Lagerström, A., Bagousse-Pinguet, Y. L., Li, Y., Mason, N., Messier, J., Nakashizuka, T., Overton, J. M., Peltzer, D. A., Pérez-Ramos, I. M., Pillar, V. D., Prentice, H. C., Richardson, S., Sasaki, T., Schamp, B. S., Schöb, C., Shipley, B., Sundqvist, M., Sykes, M. T., Vandewalle, M. &amp; Wardle, D. A. A global meta-analysis of the relative extent of intraspecific trait variation in plant communities.</w:t>
+        <w:t xml:space="preserve">, Kitajima, K., Wright, S. J., Van Bael, S. A., Osnas, J. L. D. &amp; Lichstein, J. W. Decomposing leaf mass into photosynthetic and structural components explains divergent patterns of trait variation within and among plant species.</w:t>
       </w:r>
       <w:r>
         <w:t xml:space="preserve"> </w:t>
@@ -1196,13 +1199,13 @@
           <w:bCs/>
           <w:b/>
         </w:rPr>
-        <w:t xml:space="preserve">Ecology Letters</w:t>
-      </w:r>
-      <w:r>
-        <w:t xml:space="preserve"> </w:t>
-      </w:r>
-      <w:r>
-        <w:t xml:space="preserve">18, 1406–1419 (2015)</w:t>
+        <w:t xml:space="preserve">bioRxiv</w:t>
+      </w:r>
+      <w:r>
+        <w:t xml:space="preserve"> </w:t>
+      </w:r>
+      <w:r>
+        <w:t xml:space="preserve">(2017)</w:t>
       </w:r>
       <w:r>
         <w:t xml:space="preserve"> </w:t>
@@ -1227,6 +1230,12 @@
         </w:numPr>
       </w:pPr>
       <w:r>
+        <w:t xml:space="preserve">Siefert, A., Violle, C., Chalmandrier, L., Albert, C. H., Taudiere, A., Fajardo, A., Aarssen, L. W., Baraloto, C., Carlucci, M. B., Cianciaruso, M. V., de L. Dantas, V., de Bello, F., Duarte, L. D. S., Fonseca, C. R., Freschet, G. T., Gaucherand, S., Gross, N., Hikosaka, K., Jackson, B., Jung, V., Kamiyama, C.,</w:t>
+      </w:r>
+      <w:r>
+        <w:t xml:space="preserve"> </w:t>
+      </w:r>
+      <w:r>
         <w:rPr>
           <w:bCs/>
           <w:b/>
@@ -1234,10 +1243,7 @@
         <w:t xml:space="preserve">Katabuchi, M.</w:t>
       </w:r>
       <w:r>
-        <w:t xml:space="preserve"> </w:t>
-      </w:r>
-      <w:r>
-        <w:t xml:space="preserve">LeafArea: An R package for rapid digital image analysis of leaf area.</w:t>
+        <w:t xml:space="preserve">, Kembel, S. W., Kichenin, E., Kraft, N. J. B., Lagerström, A., Bagousse-Pinguet, Y. L., Li, Y., Mason, N., Messier, J., Nakashizuka, T., Overton, J. M., Peltzer, D. A., Pérez-Ramos, I. M., Pillar, V. D., Prentice, H. C., Richardson, S., Sasaki, T., Schamp, B. S., Schöb, C., Shipley, B., Sundqvist, M., Sykes, M. T., Vandewalle, M. &amp; Wardle, D. A. A global meta-analysis of the relative extent of intraspecific trait variation in plant communities.</w:t>
       </w:r>
       <w:r>
         <w:t xml:space="preserve"> </w:t>
@@ -1249,13 +1255,13 @@
           <w:bCs/>
           <w:b/>
         </w:rPr>
-        <w:t xml:space="preserve">Ecological Research</w:t>
-      </w:r>
-      <w:r>
-        <w:t xml:space="preserve"> </w:t>
-      </w:r>
-      <w:r>
-        <w:t xml:space="preserve">30, 1073–1077 (2015)</w:t>
+        <w:t xml:space="preserve">Ecology Letters</w:t>
+      </w:r>
+      <w:r>
+        <w:t xml:space="preserve"> </w:t>
+      </w:r>
+      <w:r>
+        <w:t xml:space="preserve">18, 1406–1419 (2015)</w:t>
       </w:r>
       <w:r>
         <w:t xml:space="preserve"> </w:t>
@@ -1280,12 +1286,6 @@
         </w:numPr>
       </w:pPr>
       <w:r>
-        <w:t xml:space="preserve">Ashton, L. A., Nakamura, A., Basset, Y., Burwell, C. J., Cao, M., Eastwood, R., Odell, E., de Oliveira, E. G., Hurley, K.,</w:t>
-      </w:r>
-      <w:r>
-        <w:t xml:space="preserve"> </w:t>
-      </w:r>
-      <w:r>
         <w:rPr>
           <w:bCs/>
           <w:b/>
@@ -1293,7 +1293,10 @@
         <w:t xml:space="preserve">Katabuchi, M.</w:t>
       </w:r>
       <w:r>
-        <w:t xml:space="preserve">, Maunsell, S., Mcbroom, J., Schmidl, J., Sun, Z., Tang, Y., Whitaker, T., Laidlaw, M. J., Mcdonald, W. J. F. &amp; Kitching, R. L. Vertical stratification of moths across elevation and latitude.</w:t>
+        <w:t xml:space="preserve"> </w:t>
+      </w:r>
+      <w:r>
+        <w:t xml:space="preserve">LeafArea: An R package for rapid digital image analysis of leaf area.</w:t>
       </w:r>
       <w:r>
         <w:t xml:space="preserve"> </w:t>
@@ -1305,13 +1308,13 @@
           <w:bCs/>
           <w:b/>
         </w:rPr>
-        <w:t xml:space="preserve">Journal of Biogeography</w:t>
-      </w:r>
-      <w:r>
-        <w:t xml:space="preserve"> </w:t>
-      </w:r>
-      <w:r>
-        <w:t xml:space="preserve">43, 59–69 (2016)</w:t>
+        <w:t xml:space="preserve">Ecological Research</w:t>
+      </w:r>
+      <w:r>
+        <w:t xml:space="preserve"> </w:t>
+      </w:r>
+      <w:r>
+        <w:t xml:space="preserve">30, 1073–1077 (2015)</w:t>
       </w:r>
       <w:r>
         <w:t xml:space="preserve"> </w:t>
@@ -1336,7 +1339,7 @@
         </w:numPr>
       </w:pPr>
       <w:r>
-        <w:t xml:space="preserve">Nakamura, A., Burwell, C. J., Ashton, L. A., Laidlaw, M. J.,</w:t>
+        <w:t xml:space="preserve">Ashton, L. A., Nakamura, A., Basset, Y., Burwell, C. J., Cao, M., Eastwood, R., Odell, E., de Oliveira, E. G., Hurley, K.,</w:t>
       </w:r>
       <w:r>
         <w:t xml:space="preserve"> </w:t>
@@ -1349,10 +1352,7 @@
         <w:t xml:space="preserve">Katabuchi, M.</w:t>
       </w:r>
       <w:r>
-        <w:t xml:space="preserve"> </w:t>
-      </w:r>
-      <w:r>
-        <w:t xml:space="preserve">&amp; Kitching, R. L. Identifying indicator species of elevation: Comparing the utility of woody plants, ants and moths for long-term monitoring.</w:t>
+        <w:t xml:space="preserve">, Maunsell, S., Mcbroom, J., Schmidl, J., Sun, Z., Tang, Y., Whitaker, T., Laidlaw, M. J., Mcdonald, W. J. F. &amp; Kitching, R. L. Vertical stratification of moths across elevation and latitude.</w:t>
       </w:r>
       <w:r>
         <w:t xml:space="preserve"> </w:t>
@@ -1364,13 +1364,13 @@
           <w:bCs/>
           <w:b/>
         </w:rPr>
-        <w:t xml:space="preserve">Austral Ecology</w:t>
-      </w:r>
-      <w:r>
-        <w:t xml:space="preserve"> </w:t>
-      </w:r>
-      <w:r>
-        <w:t xml:space="preserve">41, 179–188 (2016)</w:t>
+        <w:t xml:space="preserve">Journal of Biogeography</w:t>
+      </w:r>
+      <w:r>
+        <w:t xml:space="preserve"> </w:t>
+      </w:r>
+      <w:r>
+        <w:t xml:space="preserve">43, 59–69 (2016)</w:t>
       </w:r>
       <w:r>
         <w:t xml:space="preserve"> </w:t>
@@ -1395,7 +1395,7 @@
         </w:numPr>
       </w:pPr>
       <w:r>
-        <w:t xml:space="preserve">Nakamura, A., Burwell, C. J., Lambkin, C. L.,</w:t>
+        <w:t xml:space="preserve">Nakamura, A., Burwell, C. J., Ashton, L. A., Laidlaw, M. J.,</w:t>
       </w:r>
       <w:r>
         <w:t xml:space="preserve"> </w:t>
@@ -1408,7 +1408,10 @@
         <w:t xml:space="preserve">Katabuchi, M.</w:t>
       </w:r>
       <w:r>
-        <w:t xml:space="preserve">, Mcdougall, A., Raven, R. J. &amp; Neldner, V. J. The role of human disturbance in island biogeography of arthropods and plants: An information theoretic approach.</w:t>
+        <w:t xml:space="preserve"> </w:t>
+      </w:r>
+      <w:r>
+        <w:t xml:space="preserve">&amp; Kitching, R. L. Identifying indicator species of elevation: Comparing the utility of woody plants, ants and moths for long-term monitoring.</w:t>
       </w:r>
       <w:r>
         <w:t xml:space="preserve"> </w:t>
@@ -1420,13 +1423,13 @@
           <w:bCs/>
           <w:b/>
         </w:rPr>
-        <w:t xml:space="preserve">Journal of Biogeography</w:t>
-      </w:r>
-      <w:r>
-        <w:t xml:space="preserve"> </w:t>
-      </w:r>
-      <w:r>
-        <w:t xml:space="preserve">42, 1406–1417 (2015)</w:t>
+        <w:t xml:space="preserve">Austral Ecology</w:t>
+      </w:r>
+      <w:r>
+        <w:t xml:space="preserve"> </w:t>
+      </w:r>
+      <w:r>
+        <w:t xml:space="preserve">41, 179–188 (2016)</w:t>
       </w:r>
       <w:r>
         <w:t xml:space="preserve"> </w:t>
@@ -1451,7 +1454,7 @@
         </w:numPr>
       </w:pPr>
       <w:r>
-        <w:t xml:space="preserve">Deng, X., Mohandass, D.,</w:t>
+        <w:t xml:space="preserve">Nakamura, A., Burwell, C. J., Lambkin, C. L.,</w:t>
       </w:r>
       <w:r>
         <w:t xml:space="preserve"> </w:t>
@@ -1464,7 +1467,7 @@
         <w:t xml:space="preserve">Katabuchi, M.</w:t>
       </w:r>
       <w:r>
-        <w:t xml:space="preserve">, Hughes, A. C. &amp; Roubik, D. W. Impact of Striped-Squirrel Nectar-Robbing Behaviour on Gender Fitness in</w:t>
+        <w:t xml:space="preserve">, Mcdougall, A., Raven, R. J. &amp; Neldner, V. J. The role of human disturbance in island biogeography of arthropods and plants: An information theoretic approach.</w:t>
       </w:r>
       <w:r>
         <w:t xml:space="preserve"> </w:t>
@@ -1473,42 +1476,16 @@
         <w:rPr>
           <w:iCs/>
           <w:i/>
-        </w:rPr>
-        <w:t xml:space="preserve">Alpinia</w:t>
-      </w:r>
-      <w:r>
-        <w:t xml:space="preserve"> </w:t>
-      </w:r>
-      <w:r>
-        <w:rPr>
-          <w:iCs/>
-          <w:i/>
-        </w:rPr>
-        <w:t xml:space="preserve">Roxburghii</w:t>
-      </w:r>
-      <w:r>
-        <w:t xml:space="preserve"> </w:t>
-      </w:r>
-      <w:r>
-        <w:t xml:space="preserve">Sweet (Zingiberaceae).</w:t>
-      </w:r>
-      <w:r>
-        <w:t xml:space="preserve"> </w:t>
-      </w:r>
-      <w:r>
-        <w:rPr>
-          <w:iCs/>
-          <w:i/>
-          <w:bCs/>
-          <w:b/>
-        </w:rPr>
-        <w:t xml:space="preserve">PLoS ONE</w:t>
-      </w:r>
-      <w:r>
-        <w:t xml:space="preserve"> </w:t>
-      </w:r>
-      <w:r>
-        <w:t xml:space="preserve">10, (2015)</w:t>
+          <w:bCs/>
+          <w:b/>
+        </w:rPr>
+        <w:t xml:space="preserve">Journal of Biogeography</w:t>
+      </w:r>
+      <w:r>
+        <w:t xml:space="preserve"> </w:t>
+      </w:r>
+      <w:r>
+        <w:t xml:space="preserve">42, 1406–1417 (2015)</w:t>
       </w:r>
       <w:r>
         <w:t xml:space="preserve"> </w:t>
@@ -1533,7 +1510,7 @@
         </w:numPr>
       </w:pPr>
       <w:r>
-        <w:t xml:space="preserve">Hikosaka, K., Sasaki, T., Kamiyama, C.,</w:t>
+        <w:t xml:space="preserve">Deng, X., Mohandass, D.,</w:t>
       </w:r>
       <w:r>
         <w:t xml:space="preserve"> </w:t>
@@ -1546,7 +1523,7 @@
         <w:t xml:space="preserve">Katabuchi, M.</w:t>
       </w:r>
       <w:r>
-        <w:t xml:space="preserve">, Oikawa, S., Shimazaki, M., Kimura, K. &amp; Nakshizuka, T. Understanding of species niche, coexistence and extinction based on functional traits : Approaches from community and physiological ecology for subalpine moorland plant communities [in Japanese].</w:t>
+        <w:t xml:space="preserve">, Hughes, A. C. &amp; Roubik, D. W. Impact of Striped-Squirrel Nectar-Robbing Behaviour on Gender Fitness in</w:t>
       </w:r>
       <w:r>
         <w:t xml:space="preserve"> </w:t>
@@ -1555,40 +1532,8 @@
         <w:rPr>
           <w:iCs/>
           <w:i/>
-          <w:bCs/>
-          <w:b/>
-        </w:rPr>
-        <w:t xml:space="preserve">Chikyu-Kankyo</w:t>
-      </w:r>
-      <w:r>
-        <w:t xml:space="preserve"> </w:t>
-      </w:r>
-      <w:r>
-        <w:t xml:space="preserve">19, 33–46 (2014).</w:t>
-      </w:r>
-    </w:p>
-    <w:p>
-      <w:pPr>
-        <w:numPr>
-          <w:ilvl w:val="0"/>
-          <w:numId w:val="1001"/>
-        </w:numPr>
-      </w:pPr>
-      <w:r>
-        <w:t xml:space="preserve">Kamiyama, C.,</w:t>
-      </w:r>
-      <w:r>
-        <w:t xml:space="preserve"> </w:t>
-      </w:r>
-      <w:r>
-        <w:rPr>
-          <w:bCs/>
-          <w:b/>
-        </w:rPr>
-        <w:t xml:space="preserve">Katabuchi, M.</w:t>
-      </w:r>
-      <w:r>
-        <w:t xml:space="preserve">, Sasaki, T., Shimazaki, M., Nakashizuka, T. &amp; Hikosaka, K. Leaf-trait responses to environmental gradients in moorland communities: Contribution of intraspecific variation, species replacement and functional group replacement.</w:t>
+        </w:rPr>
+        <w:t xml:space="preserve">Alpinia</w:t>
       </w:r>
       <w:r>
         <w:t xml:space="preserve"> </w:t>
@@ -1597,16 +1542,32 @@
         <w:rPr>
           <w:iCs/>
           <w:i/>
-          <w:bCs/>
-          <w:b/>
-        </w:rPr>
-        <w:t xml:space="preserve">Ecol Res</w:t>
-      </w:r>
-      <w:r>
-        <w:t xml:space="preserve"> </w:t>
-      </w:r>
-      <w:r>
-        <w:t xml:space="preserve">29, 607–617 (2014)</w:t>
+        </w:rPr>
+        <w:t xml:space="preserve">Roxburghii</w:t>
+      </w:r>
+      <w:r>
+        <w:t xml:space="preserve"> </w:t>
+      </w:r>
+      <w:r>
+        <w:t xml:space="preserve">Sweet (Zingiberaceae).</w:t>
+      </w:r>
+      <w:r>
+        <w:t xml:space="preserve"> </w:t>
+      </w:r>
+      <w:r>
+        <w:rPr>
+          <w:iCs/>
+          <w:i/>
+          <w:bCs/>
+          <w:b/>
+        </w:rPr>
+        <w:t xml:space="preserve">PLoS ONE</w:t>
+      </w:r>
+      <w:r>
+        <w:t xml:space="preserve"> </w:t>
+      </w:r>
+      <w:r>
+        <w:t xml:space="preserve">10, (2015)</w:t>
       </w:r>
       <w:r>
         <w:t xml:space="preserve"> </w:t>
@@ -1631,7 +1592,7 @@
         </w:numPr>
       </w:pPr>
       <w:r>
-        <w:t xml:space="preserve">Sasaki, T.,</w:t>
+        <w:t xml:space="preserve">Hikosaka, K., Sasaki, T., Kamiyama, C.,</w:t>
       </w:r>
       <w:r>
         <w:t xml:space="preserve"> </w:t>
@@ -1644,7 +1605,7 @@
         <w:t xml:space="preserve">Katabuchi, M.</w:t>
       </w:r>
       <w:r>
-        <w:t xml:space="preserve">, Kamiyama, C., Shimazaki, M., Nakashizuka, T. &amp; Hikosaka, K. Vulnerability of moorland plant communities to environmental change: Consequences of realistic species loss on functional diversity.</w:t>
+        <w:t xml:space="preserve">, Oikawa, S., Shimazaki, M., Kimura, K. &amp; Nakshizuka, T. Understanding of species niche, coexistence and extinction based on functional traits : Approaches from community and physiological ecology for subalpine moorland plant communities [in Japanese].</w:t>
       </w:r>
       <w:r>
         <w:t xml:space="preserve"> </w:t>
@@ -1656,13 +1617,55 @@
           <w:bCs/>
           <w:b/>
         </w:rPr>
-        <w:t xml:space="preserve">Journal of Applied Ecology</w:t>
-      </w:r>
-      <w:r>
-        <w:t xml:space="preserve"> </w:t>
-      </w:r>
-      <w:r>
-        <w:t xml:space="preserve">51, 299–308 (2014)</w:t>
+        <w:t xml:space="preserve">Chikyu-Kankyo</w:t>
+      </w:r>
+      <w:r>
+        <w:t xml:space="preserve"> </w:t>
+      </w:r>
+      <w:r>
+        <w:t xml:space="preserve">19, 33–46 (2014).</w:t>
+      </w:r>
+    </w:p>
+    <w:p>
+      <w:pPr>
+        <w:numPr>
+          <w:ilvl w:val="0"/>
+          <w:numId w:val="1001"/>
+        </w:numPr>
+      </w:pPr>
+      <w:r>
+        <w:t xml:space="preserve">Kamiyama, C.,</w:t>
+      </w:r>
+      <w:r>
+        <w:t xml:space="preserve"> </w:t>
+      </w:r>
+      <w:r>
+        <w:rPr>
+          <w:bCs/>
+          <w:b/>
+        </w:rPr>
+        <w:t xml:space="preserve">Katabuchi, M.</w:t>
+      </w:r>
+      <w:r>
+        <w:t xml:space="preserve">, Sasaki, T., Shimazaki, M., Nakashizuka, T. &amp; Hikosaka, K. Leaf-trait responses to environmental gradients in moorland communities: Contribution of intraspecific variation, species replacement and functional group replacement.</w:t>
+      </w:r>
+      <w:r>
+        <w:t xml:space="preserve"> </w:t>
+      </w:r>
+      <w:r>
+        <w:rPr>
+          <w:iCs/>
+          <w:i/>
+          <w:bCs/>
+          <w:b/>
+        </w:rPr>
+        <w:t xml:space="preserve">Ecol Res</w:t>
+      </w:r>
+      <w:r>
+        <w:t xml:space="preserve"> </w:t>
+      </w:r>
+      <w:r>
+        <w:t xml:space="preserve">29, 607–617 (2014)</w:t>
       </w:r>
       <w:r>
         <w:t xml:space="preserve"> </w:t>
@@ -1687,7 +1690,7 @@
         </w:numPr>
       </w:pPr>
       <w:r>
-        <w:t xml:space="preserve">Cádiz, A., Nagata, N.,</w:t>
+        <w:t xml:space="preserve">Sasaki, T.,</w:t>
       </w:r>
       <w:r>
         <w:t xml:space="preserve"> </w:t>
@@ -1700,7 +1703,7 @@
         <w:t xml:space="preserve">Katabuchi, M.</w:t>
       </w:r>
       <w:r>
-        <w:t xml:space="preserve">, DíAZ, L. M., ECHENIQUE-DíAZ, L. M., Akashi, H. D., Makino, T. &amp; Kawata, M. Relative importance of habitat use, range expansion, and speciation in local species diversity of anolis lizards in cuba.</w:t>
+        <w:t xml:space="preserve">, Kamiyama, C., Shimazaki, M., Nakashizuka, T. &amp; Hikosaka, K. Vulnerability of moorland plant communities to environmental change: Consequences of realistic species loss on functional diversity.</w:t>
       </w:r>
       <w:r>
         <w:t xml:space="preserve"> </w:t>
@@ -1712,13 +1715,13 @@
           <w:bCs/>
           <w:b/>
         </w:rPr>
-        <w:t xml:space="preserve">Ecosphere</w:t>
-      </w:r>
-      <w:r>
-        <w:t xml:space="preserve"> </w:t>
-      </w:r>
-      <w:r>
-        <w:t xml:space="preserve">4, (2013)</w:t>
+        <w:t xml:space="preserve">Journal of Applied Ecology</w:t>
+      </w:r>
+      <w:r>
+        <w:t xml:space="preserve"> </w:t>
+      </w:r>
+      <w:r>
+        <w:t xml:space="preserve">51, 299–308 (2014)</w:t>
       </w:r>
       <w:r>
         <w:t xml:space="preserve"> </w:t>
@@ -1743,7 +1746,7 @@
         </w:numPr>
       </w:pPr>
       <w:r>
-        <w:t xml:space="preserve">Asanok, L., Marod, D., Duengkae, P., Pranmongkol, U., Kurokawa, H., Aiba, M.,</w:t>
+        <w:t xml:space="preserve">Cádiz, A., Nagata, N.,</w:t>
       </w:r>
       <w:r>
         <w:t xml:space="preserve"> </w:t>
@@ -1756,10 +1759,7 @@
         <w:t xml:space="preserve">Katabuchi, M.</w:t>
       </w:r>
       <w:r>
-        <w:t xml:space="preserve"> </w:t>
-      </w:r>
-      <w:r>
-        <w:t xml:space="preserve">&amp; Nakashizuka, T. Relationships between functional traits and the ability of forest tree species to reestablish in secondary forest and enrichment plantations in the uplands of northern Thailand.</w:t>
+        <w:t xml:space="preserve">, DíAZ, L. M., ECHENIQUE-DíAZ, L. M., Akashi, H. D., Makino, T. &amp; Kawata, M. Relative importance of habitat use, range expansion, and speciation in local species diversity of anolis lizards in cuba.</w:t>
       </w:r>
       <w:r>
         <w:t xml:space="preserve"> </w:t>
@@ -1771,13 +1771,13 @@
           <w:bCs/>
           <w:b/>
         </w:rPr>
-        <w:t xml:space="preserve">Forest Ecology and Management</w:t>
-      </w:r>
-      <w:r>
-        <w:t xml:space="preserve"> </w:t>
-      </w:r>
-      <w:r>
-        <w:t xml:space="preserve">296, 9–23 (2013)</w:t>
+        <w:t xml:space="preserve">Ecosphere</w:t>
+      </w:r>
+      <w:r>
+        <w:t xml:space="preserve"> </w:t>
+      </w:r>
+      <w:r>
+        <w:t xml:space="preserve">4, (2013)</w:t>
       </w:r>
       <w:r>
         <w:t xml:space="preserve"> </w:t>
@@ -1802,7 +1802,7 @@
         </w:numPr>
       </w:pPr>
       <w:r>
-        <w:t xml:space="preserve">Sasaki, T.,</w:t>
+        <w:t xml:space="preserve">Asanok, L., Marod, D., Duengkae, P., Pranmongkol, U., Kurokawa, H., Aiba, M.,</w:t>
       </w:r>
       <w:r>
         <w:t xml:space="preserve"> </w:t>
@@ -1815,7 +1815,10 @@
         <w:t xml:space="preserve">Katabuchi, M.</w:t>
       </w:r>
       <w:r>
-        <w:t xml:space="preserve">, Kamiyama, C., Shimazaki, M., Nakashizuka, T. &amp; Hikosaka, K. Variations in species composition of moorland plant communities along environmental gradients within a subalpine zone in northern japan.</w:t>
+        <w:t xml:space="preserve"> </w:t>
+      </w:r>
+      <w:r>
+        <w:t xml:space="preserve">&amp; Nakashizuka, T. Relationships between functional traits and the ability of forest tree species to reestablish in secondary forest and enrichment plantations in the uplands of northern Thailand.</w:t>
       </w:r>
       <w:r>
         <w:t xml:space="preserve"> </w:t>
@@ -1827,13 +1830,13 @@
           <w:bCs/>
           <w:b/>
         </w:rPr>
-        <w:t xml:space="preserve">Wetlands</w:t>
-      </w:r>
-      <w:r>
-        <w:t xml:space="preserve"> </w:t>
-      </w:r>
-      <w:r>
-        <w:t xml:space="preserve">33, 269–277 (2013)</w:t>
+        <w:t xml:space="preserve">Forest Ecology and Management</w:t>
+      </w:r>
+      <w:r>
+        <w:t xml:space="preserve"> </w:t>
+      </w:r>
+      <w:r>
+        <w:t xml:space="preserve">296, 9–23 (2013)</w:t>
       </w:r>
       <w:r>
         <w:t xml:space="preserve"> </w:t>
@@ -1858,7 +1861,7 @@
         </w:numPr>
       </w:pPr>
       <w:r>
-        <w:t xml:space="preserve">Aiba, M.,</w:t>
+        <w:t xml:space="preserve">Sasaki, T.,</w:t>
       </w:r>
       <w:r>
         <w:t xml:space="preserve"> </w:t>
@@ -1871,7 +1874,7 @@
         <w:t xml:space="preserve">Katabuchi, M.</w:t>
       </w:r>
       <w:r>
-        <w:t xml:space="preserve">, Takafumi, H., Matsuzaki, S. I. S., Sasaki, T. &amp; Hiura, T. Robustness of trait distribution metrics for community assembly studies under the uncertainties of assembly processes.</w:t>
+        <w:t xml:space="preserve">, Kamiyama, C., Shimazaki, M., Nakashizuka, T. &amp; Hikosaka, K. Variations in species composition of moorland plant communities along environmental gradients within a subalpine zone in northern japan.</w:t>
       </w:r>
       <w:r>
         <w:t xml:space="preserve"> </w:t>
@@ -1883,13 +1886,13 @@
           <w:bCs/>
           <w:b/>
         </w:rPr>
-        <w:t xml:space="preserve">Ecology</w:t>
-      </w:r>
-      <w:r>
-        <w:t xml:space="preserve"> </w:t>
-      </w:r>
-      <w:r>
-        <w:t xml:space="preserve">94, 2873–2885 (2013)</w:t>
+        <w:t xml:space="preserve">Wetlands</w:t>
+      </w:r>
+      <w:r>
+        <w:t xml:space="preserve"> </w:t>
+      </w:r>
+      <w:r>
+        <w:t xml:space="preserve">33, 269–277 (2013)</w:t>
       </w:r>
       <w:r>
         <w:t xml:space="preserve"> </w:t>
@@ -1914,7 +1917,7 @@
         </w:numPr>
       </w:pPr>
       <w:r>
-        <w:t xml:space="preserve">Sasaki, T.,</w:t>
+        <w:t xml:space="preserve">Aiba, M.,</w:t>
       </w:r>
       <w:r>
         <w:t xml:space="preserve"> </w:t>
@@ -1927,7 +1930,7 @@
         <w:t xml:space="preserve">Katabuchi, M.</w:t>
       </w:r>
       <w:r>
-        <w:t xml:space="preserve">, Kamiyama, C., Shimazaki, M., Nakashizuka, T. &amp; Hikosaka, K. Nestedness and niche-based species loss in moorland plant communities.</w:t>
+        <w:t xml:space="preserve">, Takafumi, H., Matsuzaki, S. I. S., Sasaki, T. &amp; Hiura, T. Robustness of trait distribution metrics for community assembly studies under the uncertainties of assembly processes.</w:t>
       </w:r>
       <w:r>
         <w:t xml:space="preserve"> </w:t>
@@ -1939,13 +1942,13 @@
           <w:bCs/>
           <w:b/>
         </w:rPr>
-        <w:t xml:space="preserve">Oikos</w:t>
-      </w:r>
-      <w:r>
-        <w:t xml:space="preserve"> </w:t>
-      </w:r>
-      <w:r>
-        <w:t xml:space="preserve">121, 1783–1790 (2012)</w:t>
+        <w:t xml:space="preserve">Ecology</w:t>
+      </w:r>
+      <w:r>
+        <w:t xml:space="preserve"> </w:t>
+      </w:r>
+      <w:r>
+        <w:t xml:space="preserve">94, 2873–2885 (2013)</w:t>
       </w:r>
       <w:r>
         <w:t xml:space="preserve"> </w:t>
@@ -1983,7 +1986,7 @@
         <w:t xml:space="preserve">Katabuchi, M.</w:t>
       </w:r>
       <w:r>
-        <w:t xml:space="preserve">, Kamiyama, C., Shimazaki, M., Nakashizuka, T. &amp; Hikosaka, K. Diversity partitioning of moorland plant communities across hierarchical spatial scales.</w:t>
+        <w:t xml:space="preserve">, Kamiyama, C., Shimazaki, M., Nakashizuka, T. &amp; Hikosaka, K. Nestedness and niche-based species loss in moorland plant communities.</w:t>
       </w:r>
       <w:r>
         <w:t xml:space="preserve"> </w:t>
@@ -1995,13 +1998,13 @@
           <w:bCs/>
           <w:b/>
         </w:rPr>
-        <w:t xml:space="preserve">Biodiversity and Conservation</w:t>
-      </w:r>
-      <w:r>
-        <w:t xml:space="preserve"> </w:t>
-      </w:r>
-      <w:r>
-        <w:t xml:space="preserve">21, 1577–1588 (2012)</w:t>
+        <w:t xml:space="preserve">Oikos</w:t>
+      </w:r>
+      <w:r>
+        <w:t xml:space="preserve"> </w:t>
+      </w:r>
+      <w:r>
+        <w:t xml:space="preserve">121, 1783–1790 (2012)</w:t>
       </w:r>
       <w:r>
         <w:t xml:space="preserve"> </w:t>
@@ -2026,6 +2029,12 @@
         </w:numPr>
       </w:pPr>
       <w:r>
+        <w:t xml:space="preserve">Sasaki, T.,</w:t>
+      </w:r>
+      <w:r>
+        <w:t xml:space="preserve"> </w:t>
+      </w:r>
+      <w:r>
         <w:rPr>
           <w:bCs/>
           <w:b/>
@@ -2033,7 +2042,7 @@
         <w:t xml:space="preserve">Katabuchi, M.</w:t>
       </w:r>
       <w:r>
-        <w:t xml:space="preserve">, Kurokawa, H., Davies, S. J., Tan, S. &amp; Nakashizuka, T. Soil resource availability shapes community trait structure in a species-rich dipterocarp forest.</w:t>
+        <w:t xml:space="preserve">, Kamiyama, C., Shimazaki, M., Nakashizuka, T. &amp; Hikosaka, K. Diversity partitioning of moorland plant communities across hierarchical spatial scales.</w:t>
       </w:r>
       <w:r>
         <w:t xml:space="preserve"> </w:t>
@@ -2045,13 +2054,13 @@
           <w:bCs/>
           <w:b/>
         </w:rPr>
-        <w:t xml:space="preserve">Journal of Ecology</w:t>
-      </w:r>
-      <w:r>
-        <w:t xml:space="preserve"> </w:t>
-      </w:r>
-      <w:r>
-        <w:t xml:space="preserve">100, 643–651 (2012)</w:t>
+        <w:t xml:space="preserve">Biodiversity and Conservation</w:t>
+      </w:r>
+      <w:r>
+        <w:t xml:space="preserve"> </w:t>
+      </w:r>
+      <w:r>
+        <w:t xml:space="preserve">21, 1577–1588 (2012)</w:t>
       </w:r>
       <w:r>
         <w:t xml:space="preserve"> </w:t>
@@ -2083,7 +2092,7 @@
         <w:t xml:space="preserve">Katabuchi, M.</w:t>
       </w:r>
       <w:r>
-        <w:t xml:space="preserve">, Harrison, R. D. &amp; Nakashizuka, T. Documenting the effect of foundress number in a dioecious fig,</w:t>
+        <w:t xml:space="preserve">, Kurokawa, H., Davies, S. J., Tan, S. &amp; Nakashizuka, T. Soil resource availability shapes community trait structure in a species-rich dipterocarp forest.</w:t>
       </w:r>
       <w:r>
         <w:t xml:space="preserve"> </w:t>
@@ -2092,39 +2101,16 @@
         <w:rPr>
           <w:iCs/>
           <w:i/>
-        </w:rPr>
-        <w:t xml:space="preserve">Ficus</w:t>
-      </w:r>
-      <w:r>
-        <w:t xml:space="preserve"> </w:t>
-      </w:r>
-      <w:r>
-        <w:rPr>
-          <w:iCs/>
-          <w:i/>
-        </w:rPr>
-        <w:t xml:space="preserve">Fistulosa</w:t>
-      </w:r>
-      <w:r>
-        <w:t xml:space="preserve">, in Malaysia.</w:t>
-      </w:r>
-      <w:r>
-        <w:t xml:space="preserve"> </w:t>
-      </w:r>
-      <w:r>
-        <w:rPr>
-          <w:iCs/>
-          <w:i/>
-          <w:bCs/>
-          <w:b/>
-        </w:rPr>
-        <w:t xml:space="preserve">Biotropica</w:t>
-      </w:r>
-      <w:r>
-        <w:t xml:space="preserve"> </w:t>
-      </w:r>
-      <w:r>
-        <w:t xml:space="preserve">40, 457–461 (2008)</w:t>
+          <w:bCs/>
+          <w:b/>
+        </w:rPr>
+        <w:t xml:space="preserve">Journal of Ecology</w:t>
+      </w:r>
+      <w:r>
+        <w:t xml:space="preserve"> </w:t>
+      </w:r>
+      <w:r>
+        <w:t xml:space="preserve">100, 643–651 (2012)</w:t>
       </w:r>
       <w:r>
         <w:t xml:space="preserve"> </w:t>
@@ -2156,7 +2142,7 @@
         <w:t xml:space="preserve">Katabuchi, M.</w:t>
       </w:r>
       <w:r>
-        <w:t xml:space="preserve">, Isagi, Y. &amp; Nakashizuka, T. Development of 17 microsatellite markers for</w:t>
+        <w:t xml:space="preserve">, Harrison, R. D. &amp; Nakashizuka, T. Documenting the effect of foundress number in a dioecious fig,</w:t>
       </w:r>
       <w:r>
         <w:t xml:space="preserve"> </w:t>
@@ -2166,7 +2152,7 @@
           <w:iCs/>
           <w:i/>
         </w:rPr>
-        <w:t xml:space="preserve">Ceratosolen</w:t>
+        <w:t xml:space="preserve">Ficus</w:t>
       </w:r>
       <w:r>
         <w:t xml:space="preserve"> </w:t>
@@ -2176,10 +2162,10 @@
           <w:iCs/>
           <w:i/>
         </w:rPr>
-        <w:t xml:space="preserve">Constrictus</w:t>
-      </w:r>
-      <w:r>
-        <w:t xml:space="preserve">, the pollinating fig wasp of</w:t>
+        <w:t xml:space="preserve">Fistulosa</w:t>
+      </w:r>
+      <w:r>
+        <w:t xml:space="preserve">, in Malaysia.</w:t>
       </w:r>
       <w:r>
         <w:t xml:space="preserve"> </w:t>
@@ -2188,39 +2174,16 @@
         <w:rPr>
           <w:iCs/>
           <w:i/>
-        </w:rPr>
-        <w:t xml:space="preserve">Ficus</w:t>
-      </w:r>
-      <w:r>
-        <w:t xml:space="preserve"> </w:t>
-      </w:r>
-      <w:r>
-        <w:rPr>
-          <w:iCs/>
-          <w:i/>
-        </w:rPr>
-        <w:t xml:space="preserve">Fistulosa</w:t>
-      </w:r>
-      <w:r>
-        <w:t xml:space="preserve">.</w:t>
-      </w:r>
-      <w:r>
-        <w:t xml:space="preserve"> </w:t>
-      </w:r>
-      <w:r>
-        <w:rPr>
-          <w:iCs/>
-          <w:i/>
-          <w:bCs/>
-          <w:b/>
-        </w:rPr>
-        <w:t xml:space="preserve">Molecular Ecology Resources</w:t>
-      </w:r>
-      <w:r>
-        <w:t xml:space="preserve"> </w:t>
-      </w:r>
-      <w:r>
-        <w:t xml:space="preserve">8, 840–842 (2008)</w:t>
+          <w:bCs/>
+          <w:b/>
+        </w:rPr>
+        <w:t xml:space="preserve">Biotropica</w:t>
+      </w:r>
+      <w:r>
+        <w:t xml:space="preserve"> </w:t>
+      </w:r>
+      <w:r>
+        <w:t xml:space="preserve">40, 457–461 (2008)</w:t>
       </w:r>
       <w:r>
         <w:t xml:space="preserve"> </w:t>
@@ -2237,8 +2200,104 @@
         <w:t xml:space="preserve">.</w:t>
       </w:r>
     </w:p>
-    <w:bookmarkEnd w:id="53"/>
-    <w:bookmarkStart w:id="54" w:name="book"/>
+    <w:p>
+      <w:pPr>
+        <w:numPr>
+          <w:ilvl w:val="0"/>
+          <w:numId w:val="1001"/>
+        </w:numPr>
+      </w:pPr>
+      <w:r>
+        <w:rPr>
+          <w:bCs/>
+          <w:b/>
+        </w:rPr>
+        <w:t xml:space="preserve">Katabuchi, M.</w:t>
+      </w:r>
+      <w:r>
+        <w:t xml:space="preserve">, Isagi, Y. &amp; Nakashizuka, T. Development of 17 microsatellite markers for</w:t>
+      </w:r>
+      <w:r>
+        <w:t xml:space="preserve"> </w:t>
+      </w:r>
+      <w:r>
+        <w:rPr>
+          <w:iCs/>
+          <w:i/>
+        </w:rPr>
+        <w:t xml:space="preserve">Ceratosolen</w:t>
+      </w:r>
+      <w:r>
+        <w:t xml:space="preserve"> </w:t>
+      </w:r>
+      <w:r>
+        <w:rPr>
+          <w:iCs/>
+          <w:i/>
+        </w:rPr>
+        <w:t xml:space="preserve">Constrictus</w:t>
+      </w:r>
+      <w:r>
+        <w:t xml:space="preserve">, the pollinating fig wasp of</w:t>
+      </w:r>
+      <w:r>
+        <w:t xml:space="preserve"> </w:t>
+      </w:r>
+      <w:r>
+        <w:rPr>
+          <w:iCs/>
+          <w:i/>
+        </w:rPr>
+        <w:t xml:space="preserve">Ficus</w:t>
+      </w:r>
+      <w:r>
+        <w:t xml:space="preserve"> </w:t>
+      </w:r>
+      <w:r>
+        <w:rPr>
+          <w:iCs/>
+          <w:i/>
+        </w:rPr>
+        <w:t xml:space="preserve">Fistulosa</w:t>
+      </w:r>
+      <w:r>
+        <w:t xml:space="preserve">.</w:t>
+      </w:r>
+      <w:r>
+        <w:t xml:space="preserve"> </w:t>
+      </w:r>
+      <w:r>
+        <w:rPr>
+          <w:iCs/>
+          <w:i/>
+          <w:bCs/>
+          <w:b/>
+        </w:rPr>
+        <w:t xml:space="preserve">Molecular Ecology Resources</w:t>
+      </w:r>
+      <w:r>
+        <w:t xml:space="preserve"> </w:t>
+      </w:r>
+      <w:r>
+        <w:t xml:space="preserve">8, 840–842 (2008)</w:t>
+      </w:r>
+      <w:r>
+        <w:t xml:space="preserve"> </w:t>
+      </w:r>
+      <w:hyperlink r:id="rId53">
+        <w:r>
+          <w:rPr>
+            <w:rStyle w:val="InternetLink"/>
+          </w:rPr>
+          <w:t xml:space="preserve">[doi]</w:t>
+        </w:r>
+      </w:hyperlink>
+      <w:r>
+        <w:t xml:space="preserve">.</w:t>
+      </w:r>
+    </w:p>
+    <w:bookmarkEnd w:id="54"/>
+    <w:bookmarkStart w:id="55" w:name="book"/>
     <w:p>
       <w:pPr>
         <w:pStyle w:val="Heading2"/>
@@ -2272,8 +2331,8 @@
         <w:t xml:space="preserve">, Oikawa S., Shimazaki M., Kimura H. and Nakashizuka T. (2016), Trait-Based Approaches for Understanding Species Niche, Coexistence, and Functional Diversity in Subalpine Moorlands. Structure and Function of Mountain Ecosystems in Japan.</w:t>
       </w:r>
     </w:p>
-    <w:bookmarkEnd w:id="54"/>
-    <w:bookmarkStart w:id="58" w:name="software"/>
+    <w:bookmarkEnd w:id="55"/>
+    <w:bookmarkStart w:id="59" w:name="software"/>
     <w:p>
       <w:pPr>
         <w:pStyle w:val="Heading2"/>
@@ -2303,40 +2362,6 @@
       </w:r>
       <w:r>
         <w:t xml:space="preserve">: Zero-Truncated Poisson Lognormal Distribution,</w:t>
-      </w:r>
-      <w:r>
-        <w:t xml:space="preserve"> </w:t>
-      </w:r>
-      <w:hyperlink r:id="rId55">
-        <w:r>
-          <w:rPr>
-            <w:rStyle w:val="InternetLink"/>
-          </w:rPr>
-          <w:t xml:space="preserve">R CRAN package</w:t>
-        </w:r>
-      </w:hyperlink>
-    </w:p>
-    <w:p>
-      <w:pPr>
-        <w:pStyle w:val="DefinitionTerm"/>
-      </w:pPr>
-      <w:r>
-        <w:t xml:space="preserve">2015</w:t>
-      </w:r>
-    </w:p>
-    <w:p>
-      <w:pPr>
-        <w:pStyle w:val="Definition"/>
-      </w:pPr>
-      <w:r>
-        <w:rPr>
-          <w:bCs/>
-          <w:b/>
-        </w:rPr>
-        <w:t xml:space="preserve">LeafArea</w:t>
-      </w:r>
-      <w:r>
-        <w:t xml:space="preserve">: Rapid Digital Image Analysis of Leaf Area,</w:t>
       </w:r>
       <w:r>
         <w:t xml:space="preserve"> </w:t>
@@ -2367,10 +2392,10 @@
           <w:bCs/>
           <w:b/>
         </w:rPr>
-        <w:t xml:space="preserve">mglmn</w:t>
-      </w:r>
-      <w:r>
-        <w:t xml:space="preserve">: Model Averaging fro Multivariate GLM with Null Models, R CRAN package</w:t>
+        <w:t xml:space="preserve">LeafArea</w:t>
+      </w:r>
+      <w:r>
+        <w:t xml:space="preserve">: Rapid Digital Image Analysis of Leaf Area,</w:t>
       </w:r>
       <w:r>
         <w:t xml:space="preserve"> </w:t>
@@ -2384,8 +2409,42 @@
         </w:r>
       </w:hyperlink>
     </w:p>
-    <w:bookmarkEnd w:id="58"/>
-    <w:bookmarkStart w:id="59" w:name="teaching-experience"/>
+    <w:p>
+      <w:pPr>
+        <w:pStyle w:val="DefinitionTerm"/>
+      </w:pPr>
+      <w:r>
+        <w:t xml:space="preserve">2015</w:t>
+      </w:r>
+    </w:p>
+    <w:p>
+      <w:pPr>
+        <w:pStyle w:val="Definition"/>
+      </w:pPr>
+      <w:r>
+        <w:rPr>
+          <w:bCs/>
+          <w:b/>
+        </w:rPr>
+        <w:t xml:space="preserve">mglmn</w:t>
+      </w:r>
+      <w:r>
+        <w:t xml:space="preserve">: Model Averaging fro Multivariate GLM with Null Models, R CRAN package</w:t>
+      </w:r>
+      <w:r>
+        <w:t xml:space="preserve"> </w:t>
+      </w:r>
+      <w:hyperlink r:id="rId58">
+        <w:r>
+          <w:rPr>
+            <w:rStyle w:val="InternetLink"/>
+          </w:rPr>
+          <w:t xml:space="preserve">R CRAN package</w:t>
+        </w:r>
+      </w:hyperlink>
+    </w:p>
+    <w:bookmarkEnd w:id="59"/>
+    <w:bookmarkStart w:id="60" w:name="teaching-experience"/>
     <w:p>
       <w:pPr>
         <w:pStyle w:val="Heading2"/>
@@ -2442,8 +2501,8 @@
         <w:t xml:space="preserve">R and generalized linear models, Xishuangbanna Tropical Botanical Garden, Chinese Academy of Sciences, China</w:t>
       </w:r>
     </w:p>
-    <w:bookmarkEnd w:id="59"/>
-    <w:bookmarkStart w:id="61" w:name="service"/>
+    <w:bookmarkEnd w:id="60"/>
+    <w:bookmarkStart w:id="62" w:name="service"/>
     <w:p>
       <w:pPr>
         <w:pStyle w:val="Heading2"/>
@@ -2464,7 +2523,7 @@
       <w:pPr>
         <w:pStyle w:val="Definition"/>
       </w:pPr>
-      <w:hyperlink r:id="rId60"/>
+      <w:hyperlink r:id="rId61"/>
     </w:p>
     <w:p>
       <w:pPr>
@@ -2486,7 +2545,7 @@
       <w:pPr>
         <w:pStyle w:val="Definition"/>
       </w:pPr>
-      <w:hyperlink r:id="rId60"/>
+      <w:hyperlink r:id="rId61"/>
     </w:p>
     <w:p>
       <w:pPr>
@@ -2508,7 +2567,7 @@
       <w:pPr>
         <w:pStyle w:val="Definition"/>
       </w:pPr>
-      <w:hyperlink r:id="rId60"/>
+      <w:hyperlink r:id="rId61"/>
     </w:p>
     <w:p>
       <w:pPr>
@@ -2526,8 +2585,8 @@
         <w:t xml:space="preserve">Reviewer for journals (~ 12 per year):</w:t>
       </w:r>
     </w:p>
-    <w:bookmarkEnd w:id="61"/>
-    <w:bookmarkStart w:id="62" w:name="awards-and-prizes"/>
+    <w:bookmarkEnd w:id="62"/>
+    <w:bookmarkStart w:id="63" w:name="awards-and-prizes"/>
     <w:p>
       <w:pPr>
         <w:pStyle w:val="Heading2"/>
@@ -2568,8 +2627,8 @@
         <w:t xml:space="preserve">Dean’s award for excellence, Graduate School of Life Sciences (Master’s Program), Tohoku University</w:t>
       </w:r>
     </w:p>
-    <w:bookmarkEnd w:id="62"/>
-    <w:bookmarkStart w:id="63" w:name="invited-seminars"/>
+    <w:bookmarkEnd w:id="63"/>
+    <w:bookmarkStart w:id="64" w:name="invited-seminars"/>
     <w:p>
       <w:pPr>
         <w:pStyle w:val="Heading2"/>
@@ -2674,8 +2733,8 @@
         <w:t xml:space="preserve">Additive partitioning of functional diversity in plant communities, Xishuangbanna Tropical Botanical Garden, China</w:t>
       </w:r>
     </w:p>
-    <w:bookmarkEnd w:id="63"/>
-    <w:bookmarkStart w:id="64" w:name="international-meetings"/>
+    <w:bookmarkEnd w:id="64"/>
+    <w:bookmarkStart w:id="65" w:name="international-meetings"/>
     <w:p>
       <w:pPr>
         <w:pStyle w:val="Heading2"/>
@@ -3177,8 +3236,8 @@
         <w:t xml:space="preserve">. ATBC, Marburg, Germany</w:t>
       </w:r>
     </w:p>
-    <w:bookmarkEnd w:id="64"/>
-    <w:bookmarkStart w:id="65" w:name="outreach"/>
+    <w:bookmarkEnd w:id="65"/>
+    <w:bookmarkStart w:id="66" w:name="outreach"/>
     <w:p>
       <w:pPr>
         <w:pStyle w:val="Heading2"/>
@@ -3218,8 +3277,8 @@
         <w:t xml:space="preserve">. Invited by the Japanese Association of Interdisciplinary Study Group in University Florida</w:t>
       </w:r>
     </w:p>
-    <w:bookmarkEnd w:id="65"/>
-    <w:bookmarkStart w:id="66" w:name="languages"/>
+    <w:bookmarkEnd w:id="66"/>
+    <w:bookmarkStart w:id="67" w:name="languages"/>
     <w:p>
       <w:pPr>
         <w:pStyle w:val="Heading2"/>
@@ -3236,8 +3295,8 @@
         <w:t xml:space="preserve">Japanese (native), English (fluent), Malay (basic), Chinese-Mandarin (basic)</w:t>
       </w:r>
     </w:p>
-    <w:bookmarkEnd w:id="66"/>
-    <w:bookmarkStart w:id="67" w:name="graduate-students"/>
+    <w:bookmarkEnd w:id="67"/>
+    <w:bookmarkStart w:id="68" w:name="graduate-students"/>
     <w:p>
       <w:pPr>
         <w:pStyle w:val="Heading2"/>
@@ -3254,7 +3313,7 @@
         <w:t xml:space="preserve">Zhou Cong, 2021 - Present, M.Sc. Student, Recipient of UCAS Scholarship.</w:t>
       </w:r>
     </w:p>
-    <w:bookmarkEnd w:id="67"/>
+    <w:bookmarkEnd w:id="68"/>
     <w:sectPr>
       <w:headerReference r:id="rId9" w:type="default"/>
       <w:footnotePr>

</xml_diff>

<commit_message>
Deploying to gh-pages from @ mattocci27/my-cv@4f4552032cdf857688b037e6af1a3c70bfb1d86d 🚀
</commit_message>
<xml_diff>
--- a/Katabuchi_CV.docx
+++ b/Katabuchi_CV.docx
@@ -385,7 +385,7 @@
         <w:pStyle w:val="Definition"/>
       </w:pPr>
       <w:r>
-        <w:t xml:space="preserve">Xishuangbanna State Rainforest Talent Support Program 360,000 RMB</w:t>
+        <w:t xml:space="preserve">Xishuangbanna State Rainforest Talent Support Program 300,000 RMB</w:t>
       </w:r>
     </w:p>
     <w:p>
@@ -654,7 +654,7 @@
         <w:t xml:space="preserve"> </w:t>
       </w:r>
       <w:r>
-        <w:t xml:space="preserve">rtad026 (2023)</w:t>
+        <w:t xml:space="preserve">16, rtad026 (2023)</w:t>
       </w:r>
       <w:r>
         <w:t xml:space="preserve"> </w:t>
@@ -2666,7 +2666,7 @@
         <w:pStyle w:val="Definition"/>
       </w:pPr>
       <w:r>
-        <w:t xml:space="preserve">A quantitive model for divergent drivers of leaf trait variation within and among plant species, Xishuangbanna Tropical Botanical Garden, China</w:t>
+        <w:t xml:space="preserve">A quantitative model for divergent drivers of leaf trait variation within and among plant species, Xishuangbanna Tropical Botanical Garden, China</w:t>
       </w:r>
     </w:p>
     <w:p>
@@ -2803,9 +2803,6 @@
       </w:r>
       <w:r>
         <w:t xml:space="preserve">”</w:t>
-      </w:r>
-      <w:r>
-        <w:t xml:space="preserve"> </w:t>
       </w:r>
       <w:r>
         <w:t xml:space="preserve">, 62nd ESJ Annual meeting, Kagoshima, Japan</w:t>

</xml_diff>

<commit_message>
Deploying to gh-pages from @ mattocci27/my-cv@d8c71b1c523f45264bf3f623927eb7db4711f126 🚀
</commit_message>
<xml_diff>
--- a/Katabuchi_CV.docx
+++ b/Katabuchi_CV.docx
@@ -377,6 +377,22 @@
         <w:pStyle w:val="DefinitionTerm"/>
       </w:pPr>
       <w:r>
+        <w:t xml:space="preserve">2024</w:t>
+      </w:r>
+    </w:p>
+    <w:p>
+      <w:pPr>
+        <w:pStyle w:val="Definition"/>
+      </w:pPr>
+      <w:r>
+        <w:t xml:space="preserve">NIG-JOINT 149,000 JPY</w:t>
+      </w:r>
+    </w:p>
+    <w:p>
+      <w:pPr>
+        <w:pStyle w:val="DefinitionTerm"/>
+      </w:pPr>
+      <w:r>
         <w:t xml:space="preserve">2023</w:t>
       </w:r>
     </w:p>
@@ -580,7 +596,7 @@
         <w:t xml:space="preserve"> </w:t>
       </w:r>
       <w:r>
-        <w:t xml:space="preserve">Artificial light at night (ALAN) influences understory plant traits through ecological processes: A two-year experiment in a rubber plantation in China.</w:t>
+        <w:t xml:space="preserve">Artificial Light at Night (ALAN) Influences Understory Plant Traits through Ecological Processes: A Two-Year Experiment in a Rubber Plantation in China.</w:t>
       </w:r>
       <w:r>
         <w:t xml:space="preserve"> </w:t>
@@ -592,13 +608,13 @@
           <w:bCs/>
           <w:b/>
         </w:rPr>
-        <w:t xml:space="preserve">EcoEvoRxiv</w:t>
-      </w:r>
-      <w:r>
-        <w:t xml:space="preserve"> </w:t>
-      </w:r>
-      <w:r>
-        <w:t xml:space="preserve">(2023)</w:t>
+        <w:t xml:space="preserve">Ecologies</w:t>
+      </w:r>
+      <w:r>
+        <w:t xml:space="preserve"> </w:t>
+      </w:r>
+      <w:r>
+        <w:t xml:space="preserve">4, 704–713 (2023)</w:t>
       </w:r>
       <w:r>
         <w:t xml:space="preserve"> </w:t>

</xml_diff>

<commit_message>
Deploying to gh-pages from @ mattocci27/my-cv@e01bc91882829afc02a5fccf3e73017fda10854a 🚀
</commit_message>
<xml_diff>
--- a/Katabuchi_CV.docx
+++ b/Katabuchi_CV.docx
@@ -7,13 +7,7 @@
         <w:pStyle w:val="Title"/>
       </w:pPr>
       <w:r>
-        <w:t xml:space="preserve">Associate</w:t>
-      </w:r>
-      <w:r>
-        <w:t xml:space="preserve"> </w:t>
-      </w:r>
-      <w:r>
-        <w:t xml:space="preserve">Professor</w:t>
+        <w:t xml:space="preserve">Associate Professor</w:t>
       </w:r>
     </w:p>
     <w:p>
@@ -21,13 +15,7 @@
         <w:pStyle w:val="Author"/>
       </w:pPr>
       <w:r>
-        <w:t xml:space="preserve">Masatoshi</w:t>
-      </w:r>
-      <w:r>
-        <w:t xml:space="preserve"> </w:t>
-      </w:r>
-      <w:r>
-        <w:t xml:space="preserve">Katabuchi</w:t>
+        <w:t xml:space="preserve">Masatoshi Katabuchi</w:t>
       </w:r>
     </w:p>
     <w:bookmarkStart w:id="20" w:name="research-interest"/>
@@ -63,8 +51,8 @@
       </w:pPr>
       <w:r>
         <w:rPr>
-          <w:bCs/>
-          <w:b/>
+          <w:b/>
+          <w:bCs/>
         </w:rPr>
         <w:t xml:space="preserve">Tohoku University, Japan</w:t>
       </w:r>
@@ -86,8 +74,8 @@
       </w:pPr>
       <w:r>
         <w:rPr>
-          <w:bCs/>
-          <w:b/>
+          <w:b/>
+          <w:bCs/>
         </w:rPr>
         <w:t xml:space="preserve">Ph.D. (Life Sciences)</w:t>
       </w:r>
@@ -98,13 +86,7 @@
         <w:t xml:space="preserve"> </w:t>
       </w:r>
       <w:r>
-        <w:t xml:space="preserve">“</w:t>
-      </w:r>
-      <w:r>
-        <w:t xml:space="preserve">Community assembly and dynamics in tropical rainforests on the basis of functional traits</w:t>
-      </w:r>
-      <w:r>
-        <w:t xml:space="preserve">”</w:t>
+        <w:t xml:space="preserve">“Community assembly and dynamics in tropical rainforests on the basis of functional traits”</w:t>
       </w:r>
       <w:r>
         <w:t xml:space="preserve">.</w:t>
@@ -124,8 +106,8 @@
       </w:pPr>
       <w:r>
         <w:rPr>
-          <w:bCs/>
-          <w:b/>
+          <w:b/>
+          <w:bCs/>
         </w:rPr>
         <w:t xml:space="preserve">M.S. (Life Sciences)</w:t>
       </w:r>
@@ -136,13 +118,7 @@
         <w:t xml:space="preserve"> </w:t>
       </w:r>
       <w:r>
-        <w:t xml:space="preserve">“</w:t>
-      </w:r>
-      <w:r>
-        <w:t xml:space="preserve">Reproductive ecology of a common dioecious fig and its pollinating wasp in a tropical secondary forest in Sarawak, Malaysia</w:t>
-      </w:r>
-      <w:r>
-        <w:t xml:space="preserve">”</w:t>
+        <w:t xml:space="preserve">“Reproductive ecology of a common dioecious fig and its pollinating wasp in a tropical secondary forest in Sarawak, Malaysia”</w:t>
       </w:r>
     </w:p>
     <w:p>
@@ -159,8 +135,8 @@
       </w:pPr>
       <w:r>
         <w:rPr>
-          <w:bCs/>
-          <w:b/>
+          <w:b/>
+          <w:bCs/>
         </w:rPr>
         <w:t xml:space="preserve">B.S. (Biology)</w:t>
       </w:r>
@@ -192,8 +168,8 @@
       </w:pPr>
       <w:r>
         <w:rPr>
-          <w:bCs/>
-          <w:b/>
+          <w:b/>
+          <w:bCs/>
         </w:rPr>
         <w:t xml:space="preserve">Associate Professor</w:t>
       </w:r>
@@ -215,8 +191,8 @@
       </w:pPr>
       <w:r>
         <w:rPr>
-          <w:bCs/>
-          <w:b/>
+          <w:b/>
+          <w:bCs/>
         </w:rPr>
         <w:t xml:space="preserve">Postdoctoral Research Associate</w:t>
       </w:r>
@@ -238,8 +214,8 @@
       </w:pPr>
       <w:r>
         <w:rPr>
-          <w:bCs/>
-          <w:b/>
+          <w:b/>
+          <w:bCs/>
         </w:rPr>
         <w:t xml:space="preserve">Visiting Scholar</w:t>
       </w:r>
@@ -261,8 +237,8 @@
       </w:pPr>
       <w:r>
         <w:rPr>
-          <w:bCs/>
-          <w:b/>
+          <w:b/>
+          <w:bCs/>
         </w:rPr>
         <w:t xml:space="preserve">Postdoctoral Research Associate</w:t>
       </w:r>
@@ -284,8 +260,8 @@
       </w:pPr>
       <w:r>
         <w:rPr>
-          <w:bCs/>
-          <w:b/>
+          <w:b/>
+          <w:bCs/>
         </w:rPr>
         <w:t xml:space="preserve">JSPS Postdoctoral Fellow for Research Abroad</w:t>
       </w:r>
@@ -307,8 +283,8 @@
       </w:pPr>
       <w:r>
         <w:rPr>
-          <w:bCs/>
-          <w:b/>
+          <w:b/>
+          <w:bCs/>
         </w:rPr>
         <w:t xml:space="preserve">Postdoctoral Research Fellow</w:t>
       </w:r>
@@ -330,8 +306,8 @@
       </w:pPr>
       <w:r>
         <w:rPr>
-          <w:bCs/>
-          <w:b/>
+          <w:b/>
+          <w:bCs/>
         </w:rPr>
         <w:t xml:space="preserve">Postdoctoral Research Fellow</w:t>
       </w:r>
@@ -353,8 +329,8 @@
       </w:pPr>
       <w:r>
         <w:rPr>
-          <w:bCs/>
-          <w:b/>
+          <w:b/>
+          <w:bCs/>
         </w:rPr>
         <w:t xml:space="preserve">JSPS Research Fellow DC2</w:t>
       </w:r>
@@ -377,6 +353,38 @@
         <w:pStyle w:val="DefinitionTerm"/>
       </w:pPr>
       <w:r>
+        <w:t xml:space="preserve">2025</w:t>
+      </w:r>
+    </w:p>
+    <w:p>
+      <w:pPr>
+        <w:pStyle w:val="Definition"/>
+      </w:pPr>
+      <w:r>
+        <w:t xml:space="preserve">NIG-JOINT 193,000 JPY</w:t>
+      </w:r>
+    </w:p>
+    <w:p>
+      <w:pPr>
+        <w:pStyle w:val="DefinitionTerm"/>
+      </w:pPr>
+      <w:r>
+        <w:t xml:space="preserve">2025</w:t>
+      </w:r>
+    </w:p>
+    <w:p>
+      <w:pPr>
+        <w:pStyle w:val="Definition"/>
+      </w:pPr>
+      <w:r>
+        <w:t xml:space="preserve">Xingdian Talent Support Program of Yunnan Province 600,000 RMB</w:t>
+      </w:r>
+    </w:p>
+    <w:p>
+      <w:pPr>
+        <w:pStyle w:val="DefinitionTerm"/>
+      </w:pPr>
+      <w:r>
         <w:t xml:space="preserve">2024</w:t>
       </w:r>
     </w:p>
@@ -401,7 +409,7 @@
         <w:pStyle w:val="Definition"/>
       </w:pPr>
       <w:r>
-        <w:t xml:space="preserve">Xishuangbanna State Rainforest Talent Support Program 300,000 RMB</w:t>
+        <w:t xml:space="preserve">Xishuangbanna State Rainforest Talent Support Program (E4BN041B01) 360,000 RMB</w:t>
       </w:r>
     </w:p>
     <w:p>
@@ -563,7 +571,7 @@
       </w:r>
     </w:p>
     <w:bookmarkEnd w:id="24"/>
-    <w:bookmarkStart w:id="54" w:name="publications"/>
+    <w:bookmarkStart w:id="55" w:name="publications"/>
     <w:p>
       <w:pPr>
         <w:pStyle w:val="Heading2"/>
@@ -580,15 +588,15 @@
         </w:numPr>
       </w:pPr>
       <w:r>
-        <w:t xml:space="preserve">Zhou, C., Nakamura, A., Song, X. &amp;</w:t>
-      </w:r>
-      <w:r>
-        <w:t xml:space="preserve"> </w:t>
-      </w:r>
-      <w:r>
-        <w:rPr>
-          <w:bCs/>
-          <w:b/>
+        <w:t xml:space="preserve">Nguyen, T. D. &amp;</w:t>
+      </w:r>
+      <w:r>
+        <w:t xml:space="preserve"> </w:t>
+      </w:r>
+      <w:r>
+        <w:rPr>
+          <w:b/>
+          <w:bCs/>
         </w:rPr>
         <w:t xml:space="preserve">Katabuchi, M.</w:t>
       </w:r>
@@ -596,25 +604,61 @@
         <w:t xml:space="preserve"> </w:t>
       </w:r>
       <w:r>
-        <w:t xml:space="preserve">Artificial Light at Night (ALAN) Influences Understory Plant Traits through Ecological Processes: A Two-Year Experiment in a Rubber Plantation in China.</w:t>
-      </w:r>
-      <w:r>
-        <w:t xml:space="preserve"> </w:t>
-      </w:r>
-      <w:r>
-        <w:rPr>
+        <w:t xml:space="preserve">Saturating allometric relationships reveal how wood density shapes global tree architecture.</w:t>
+      </w:r>
+      <w:r>
+        <w:t xml:space="preserve"> </w:t>
+      </w:r>
+      <w:r>
+        <w:rPr>
+          <w:b/>
+          <w:bCs/>
+          <w:i/>
           <w:iCs/>
+        </w:rPr>
+        <w:t xml:space="preserve">Journal of Forestry Research</w:t>
+      </w:r>
+      <w:r>
+        <w:t xml:space="preserve"> </w:t>
+      </w:r>
+      <w:r>
+        <w:t xml:space="preserve">(accepted).</w:t>
+      </w:r>
+    </w:p>
+    <w:p>
+      <w:pPr>
+        <w:numPr>
+          <w:ilvl w:val="0"/>
+          <w:numId w:val="1001"/>
+        </w:numPr>
+      </w:pPr>
+      <w:r>
+        <w:rPr>
+          <w:b/>
+          <w:bCs/>
+        </w:rPr>
+        <w:t xml:space="preserve">Katabuchi, M.</w:t>
+      </w:r>
+      <w:r>
+        <w:t xml:space="preserve">, Kitajima, K., Wright, S. J., Van Bael, S. A., Osnas, J. L. D. &amp; Lichstein, J. W. Decomposing leaf mass into metabolic and structural components explains divergent patterns of trait variation within and among plant species.</w:t>
+      </w:r>
+      <w:r>
+        <w:t xml:space="preserve"> </w:t>
+      </w:r>
+      <w:r>
+        <w:rPr>
+          <w:b/>
+          <w:bCs/>
           <w:i/>
-          <w:bCs/>
-          <w:b/>
-        </w:rPr>
-        <w:t xml:space="preserve">Ecologies</w:t>
-      </w:r>
-      <w:r>
-        <w:t xml:space="preserve"> </w:t>
-      </w:r>
-      <w:r>
-        <w:t xml:space="preserve">4, 704–713 (2023)</w:t>
+          <w:iCs/>
+        </w:rPr>
+        <w:t xml:space="preserve">Oecologia</w:t>
+      </w:r>
+      <w:r>
+        <w:t xml:space="preserve"> </w:t>
+      </w:r>
+      <w:r>
+        <w:t xml:space="preserve">207, 71 (2025)</w:t>
       </w:r>
       <w:r>
         <w:t xml:space="preserve"> </w:t>
@@ -639,38 +683,38 @@
         </w:numPr>
       </w:pPr>
       <w:r>
-        <w:t xml:space="preserve">Phoutthavong, K.,</w:t>
-      </w:r>
-      <w:r>
-        <w:t xml:space="preserve"> </w:t>
-      </w:r>
-      <w:r>
-        <w:rPr>
-          <w:bCs/>
-          <w:b/>
+        <w:t xml:space="preserve">Song, X.,</w:t>
+      </w:r>
+      <w:r>
+        <w:t xml:space="preserve"> </w:t>
+      </w:r>
+      <w:r>
+        <w:rPr>
+          <w:b/>
+          <w:bCs/>
         </w:rPr>
         <w:t xml:space="preserve">Katabuchi, M.</w:t>
       </w:r>
       <w:r>
-        <w:t xml:space="preserve">, Nakamura, A., Cheng, X. &amp; Cao, M. Interspecific and intraspecific adaptations of pteridophyte leaf traits in limestone and non-limestone forests of monsoon tropical regions of southwest China.</w:t>
-      </w:r>
-      <w:r>
-        <w:t xml:space="preserve"> </w:t>
-      </w:r>
-      <w:r>
-        <w:rPr>
+        <w:t xml:space="preserve">, Chase, J. M., Johnson, D. J., Zhang, W., Deng, X., Cao, M. &amp; Yang, J. Drought tolerance and species abundance mediate dry season negative density dependence in a tropical forest.</w:t>
+      </w:r>
+      <w:r>
+        <w:t xml:space="preserve"> </w:t>
+      </w:r>
+      <w:r>
+        <w:rPr>
+          <w:b/>
+          <w:bCs/>
+          <w:i/>
           <w:iCs/>
-          <w:i/>
-          <w:bCs/>
-          <w:b/>
-        </w:rPr>
-        <w:t xml:space="preserve">Journal of Plant Ecology</w:t>
-      </w:r>
-      <w:r>
-        <w:t xml:space="preserve"> </w:t>
-      </w:r>
-      <w:r>
-        <w:t xml:space="preserve">16, rtad026 (2023)</w:t>
+        </w:rPr>
+        <w:t xml:space="preserve">Ecology</w:t>
+      </w:r>
+      <w:r>
+        <w:t xml:space="preserve"> </w:t>
+      </w:r>
+      <w:r>
+        <w:t xml:space="preserve">105, e4382 (2024)</w:t>
       </w:r>
       <w:r>
         <w:t xml:space="preserve"> </w:t>
@@ -695,38 +739,41 @@
         </w:numPr>
       </w:pPr>
       <w:r>
-        <w:t xml:space="preserve">Maenpuen, P.,</w:t>
-      </w:r>
-      <w:r>
-        <w:t xml:space="preserve"> </w:t>
-      </w:r>
-      <w:r>
-        <w:rPr>
-          <w:bCs/>
-          <w:b/>
+        <w:t xml:space="preserve">Zhou, C., Nakamura, A., Song, X. &amp;</w:t>
+      </w:r>
+      <w:r>
+        <w:t xml:space="preserve"> </w:t>
+      </w:r>
+      <w:r>
+        <w:rPr>
+          <w:b/>
+          <w:bCs/>
         </w:rPr>
         <w:t xml:space="preserve">Katabuchi, M.</w:t>
       </w:r>
       <w:r>
-        <w:t xml:space="preserve">, Onoda, Y., Zhou, C., Zhang, J.-L. &amp; Chen, Y.-J. Sources and consequences of mismatch between leaf disc and whole-leaf leaf mass per area (LMA).</w:t>
-      </w:r>
-      <w:r>
-        <w:t xml:space="preserve"> </w:t>
-      </w:r>
-      <w:r>
-        <w:rPr>
+        <w:t xml:space="preserve"> </w:t>
+      </w:r>
+      <w:r>
+        <w:t xml:space="preserve">Artificial Light at Night (ALAN) Influences Understory Plant Traits through Ecological Processes: A Two-Year Experiment in a Rubber Plantation in China.</w:t>
+      </w:r>
+      <w:r>
+        <w:t xml:space="preserve"> </w:t>
+      </w:r>
+      <w:r>
+        <w:rPr>
+          <w:b/>
+          <w:bCs/>
+          <w:i/>
           <w:iCs/>
-          <w:i/>
-          <w:bCs/>
-          <w:b/>
-        </w:rPr>
-        <w:t xml:space="preserve">American Journal of Botany</w:t>
-      </w:r>
-      <w:r>
-        <w:t xml:space="preserve"> </w:t>
-      </w:r>
-      <w:r>
-        <w:t xml:space="preserve">109, 1242–1250 (2022)</w:t>
+        </w:rPr>
+        <w:t xml:space="preserve">Ecologies</w:t>
+      </w:r>
+      <w:r>
+        <w:t xml:space="preserve"> </w:t>
+      </w:r>
+      <w:r>
+        <w:t xml:space="preserve">4, 704–713 (2023)</w:t>
       </w:r>
       <w:r>
         <w:t xml:space="preserve"> </w:t>
@@ -751,38 +798,38 @@
         </w:numPr>
       </w:pPr>
       <w:r>
-        <w:t xml:space="preserve">Chen, Y.-J., Maenpuen, P., Zhang, Y.-J., Barai, K.,</w:t>
-      </w:r>
-      <w:r>
-        <w:t xml:space="preserve"> </w:t>
-      </w:r>
-      <w:r>
-        <w:rPr>
-          <w:bCs/>
-          <w:b/>
+        <w:t xml:space="preserve">Phoutthavong, K.,</w:t>
+      </w:r>
+      <w:r>
+        <w:t xml:space="preserve"> </w:t>
+      </w:r>
+      <w:r>
+        <w:rPr>
+          <w:b/>
+          <w:bCs/>
         </w:rPr>
         <w:t xml:space="preserve">Katabuchi, M.</w:t>
       </w:r>
       <w:r>
-        <w:t xml:space="preserve">, Gao, H., Kaewkamol, S., Tao, L.-B. &amp; Zhang, J.-L. Quantifying vulnerability to embolism in tropical trees and lianas using five methods: Can discrepancies be explained by xylem structural traits?</w:t>
-      </w:r>
-      <w:r>
-        <w:t xml:space="preserve"> </w:t>
-      </w:r>
-      <w:r>
-        <w:rPr>
+        <w:t xml:space="preserve">, Nakamura, A., Cheng, X. &amp; Cao, M. Inter- and intraspecific adaptations of pteridophyte leaf traits in limestone and non-limestone forests of monsoon tropical regions of southwest China.</w:t>
+      </w:r>
+      <w:r>
+        <w:t xml:space="preserve"> </w:t>
+      </w:r>
+      <w:r>
+        <w:rPr>
+          <w:b/>
+          <w:bCs/>
+          <w:i/>
           <w:iCs/>
-          <w:i/>
-          <w:bCs/>
-          <w:b/>
-        </w:rPr>
-        <w:t xml:space="preserve">New Phytologist</w:t>
-      </w:r>
-      <w:r>
-        <w:t xml:space="preserve"> </w:t>
-      </w:r>
-      <w:r>
-        <w:t xml:space="preserve">229, 805–819 (2021)</w:t>
+        </w:rPr>
+        <w:t xml:space="preserve">Journal of Plant Ecology</w:t>
+      </w:r>
+      <w:r>
+        <w:t xml:space="preserve"> </w:t>
+      </w:r>
+      <w:r>
+        <w:t xml:space="preserve">16, rtad026 (2023)</w:t>
       </w:r>
       <w:r>
         <w:t xml:space="preserve"> </w:t>
@@ -807,38 +854,38 @@
         </w:numPr>
       </w:pPr>
       <w:r>
-        <w:t xml:space="preserve">Chen, Y.-J., Choat, B., Sterck, F., Maenpuen, P.,</w:t>
-      </w:r>
-      <w:r>
-        <w:t xml:space="preserve"> </w:t>
-      </w:r>
-      <w:r>
-        <w:rPr>
-          <w:bCs/>
-          <w:b/>
+        <w:t xml:space="preserve">Maenpuen, P.,</w:t>
+      </w:r>
+      <w:r>
+        <w:t xml:space="preserve"> </w:t>
+      </w:r>
+      <w:r>
+        <w:rPr>
+          <w:b/>
+          <w:bCs/>
         </w:rPr>
         <w:t xml:space="preserve">Katabuchi, M.</w:t>
       </w:r>
       <w:r>
-        <w:t xml:space="preserve">, Zhang, S.-B., Tomlinson, K. W., Oliveira, R. S., Zhang, Y.-J., Shen, J.-X., Cao, K.-F. &amp; Jansen, S. Hydraulic prediction of drought-induced plant dieback and top-kill depends on leaf habit and growth form.</w:t>
-      </w:r>
-      <w:r>
-        <w:t xml:space="preserve"> </w:t>
-      </w:r>
-      <w:r>
-        <w:rPr>
+        <w:t xml:space="preserve">, Onoda, Y., Zhou, C., Zhang, J.-L. &amp; Chen, Y.-J. Sources and consequences of mismatch between leaf disc and whole-leaf leaf mass per area (LMA).</w:t>
+      </w:r>
+      <w:r>
+        <w:t xml:space="preserve"> </w:t>
+      </w:r>
+      <w:r>
+        <w:rPr>
+          <w:b/>
+          <w:bCs/>
+          <w:i/>
           <w:iCs/>
-          <w:i/>
-          <w:bCs/>
-          <w:b/>
-        </w:rPr>
-        <w:t xml:space="preserve">Ecology Letters</w:t>
-      </w:r>
-      <w:r>
-        <w:t xml:space="preserve"> </w:t>
-      </w:r>
-      <w:r>
-        <w:t xml:space="preserve">24, 2350–2363 (2021)</w:t>
+        </w:rPr>
+        <w:t xml:space="preserve">American Journal of Botany</w:t>
+      </w:r>
+      <w:r>
+        <w:t xml:space="preserve"> </w:t>
+      </w:r>
+      <w:r>
+        <w:t xml:space="preserve">109, 1242–1250 (2022)</w:t>
       </w:r>
       <w:r>
         <w:t xml:space="preserve"> </w:t>
@@ -863,41 +910,38 @@
         </w:numPr>
       </w:pPr>
       <w:r>
-        <w:t xml:space="preserve">Swenson, N. G., Hulshof, C. M.,</w:t>
-      </w:r>
-      <w:r>
-        <w:t xml:space="preserve"> </w:t>
-      </w:r>
-      <w:r>
-        <w:rPr>
-          <w:bCs/>
-          <w:b/>
+        <w:t xml:space="preserve">Chen, Y.-J., Choat, B., Sterck, F., Maenpuen, P.,</w:t>
+      </w:r>
+      <w:r>
+        <w:t xml:space="preserve"> </w:t>
+      </w:r>
+      <w:r>
+        <w:rPr>
+          <w:b/>
+          <w:bCs/>
         </w:rPr>
         <w:t xml:space="preserve">Katabuchi, M.</w:t>
       </w:r>
       <w:r>
-        <w:t xml:space="preserve"> </w:t>
-      </w:r>
-      <w:r>
-        <w:t xml:space="preserve">&amp; Enquist, B. J. Long-term shifts in the functional composition and diversity of a tropical dry forest: A 30-yr study.</w:t>
-      </w:r>
-      <w:r>
-        <w:t xml:space="preserve"> </w:t>
-      </w:r>
-      <w:r>
-        <w:rPr>
+        <w:t xml:space="preserve">, Zhang, S.-B., Tomlinson, K. W., Oliveira, R. S., Zhang, Y.-J., Shen, J.-X., Cao, K.-F. &amp; Jansen, S. Hydraulic prediction of drought-induced plant dieback and top-kill depends on leaf habit and growth form.</w:t>
+      </w:r>
+      <w:r>
+        <w:t xml:space="preserve"> </w:t>
+      </w:r>
+      <w:r>
+        <w:rPr>
+          <w:b/>
+          <w:bCs/>
+          <w:i/>
           <w:iCs/>
-          <w:i/>
-          <w:bCs/>
-          <w:b/>
-        </w:rPr>
-        <w:t xml:space="preserve">Ecological Monographs</w:t>
-      </w:r>
-      <w:r>
-        <w:t xml:space="preserve"> </w:t>
-      </w:r>
-      <w:r>
-        <w:t xml:space="preserve">e01408 (2020)</w:t>
+        </w:rPr>
+        <w:t xml:space="preserve">Ecology Letters</w:t>
+      </w:r>
+      <w:r>
+        <w:t xml:space="preserve"> </w:t>
+      </w:r>
+      <w:r>
+        <w:t xml:space="preserve">24, 2350–2363 (2021)</w:t>
       </w:r>
       <w:r>
         <w:t xml:space="preserve"> </w:t>
@@ -922,38 +966,38 @@
         </w:numPr>
       </w:pPr>
       <w:r>
-        <w:t xml:space="preserve">Sreekar, R.,</w:t>
-      </w:r>
-      <w:r>
-        <w:t xml:space="preserve"> </w:t>
-      </w:r>
-      <w:r>
-        <w:rPr>
-          <w:bCs/>
-          <w:b/>
+        <w:t xml:space="preserve">Chen, Y.-J., Maenpuen, P., Zhang, Y.-J., Barai, K.,</w:t>
+      </w:r>
+      <w:r>
+        <w:t xml:space="preserve"> </w:t>
+      </w:r>
+      <w:r>
+        <w:rPr>
+          <w:b/>
+          <w:bCs/>
         </w:rPr>
         <w:t xml:space="preserve">Katabuchi, M.</w:t>
       </w:r>
       <w:r>
-        <w:t xml:space="preserve">, Nakamura, A., Corlett, R. T., Slik, J. W. F., Fletcher, C., He, F., Weiblen, G. D., Shen, G., Xu, H., Sun, I.-F., Cao, K., Ma, K., Chang, L.-W., Cao, M., Jiang, M., Gunatilleke, I. A. U. N., Ong, P., Yap, S., Gunatilleke, C. V. S., Novotny, V., Brockelman, W. Y., Xiang, W., Mi, X., Li, X., Wang, X., Qiao, X., Li, Y., Tan, S., Condit, R., Harrison, R. D. &amp; Koh, L. P. Spatial scale changes the relationship between beta diversity, species richness and latitude.</w:t>
-      </w:r>
-      <w:r>
-        <w:t xml:space="preserve"> </w:t>
-      </w:r>
-      <w:r>
-        <w:rPr>
+        <w:t xml:space="preserve">, Gao, H., Kaewkamol, S., Tao, L.-B. &amp; Zhang, J.-L. Quantifying vulnerability to embolism in tropical trees and lianas using five methods: Can discrepancies be explained by xylem structural traits?</w:t>
+      </w:r>
+      <w:r>
+        <w:t xml:space="preserve"> </w:t>
+      </w:r>
+      <w:r>
+        <w:rPr>
+          <w:b/>
+          <w:bCs/>
+          <w:i/>
           <w:iCs/>
-          <w:i/>
-          <w:bCs/>
-          <w:b/>
-        </w:rPr>
-        <w:t xml:space="preserve">Open Science</w:t>
-      </w:r>
-      <w:r>
-        <w:t xml:space="preserve"> </w:t>
-      </w:r>
-      <w:r>
-        <w:t xml:space="preserve">5, 181168 (2018)</w:t>
+        </w:rPr>
+        <w:t xml:space="preserve">New Phytologist</w:t>
+      </w:r>
+      <w:r>
+        <w:t xml:space="preserve"> </w:t>
+      </w:r>
+      <w:r>
+        <w:t xml:space="preserve">229, 805–819 (2021)</w:t>
       </w:r>
       <w:r>
         <w:t xml:space="preserve"> </w:t>
@@ -978,38 +1022,41 @@
         </w:numPr>
       </w:pPr>
       <w:r>
-        <w:t xml:space="preserve">Johnson, D. J., Needham, J., Xu, C., Massoud, E. C., Davies, S. J., Anderson-Teixeira, K. J., Bunyavejchewin, S., Chambers, J. Q., Chang-Yang, C.-H., Chiang, J.-M., Chuyong, G. B., Condit, R., Cordell, S., Fletcher, C., Giardina, C. P., Giambelluca, T. W., Gunatilleke, N., Gunatilleke, S., Hsieh, C.-F., Hubbell, S., Inman-Narahari, F., Kassim, A. R.,</w:t>
-      </w:r>
-      <w:r>
-        <w:t xml:space="preserve"> </w:t>
-      </w:r>
-      <w:r>
-        <w:rPr>
-          <w:bCs/>
-          <w:b/>
+        <w:t xml:space="preserve">Swenson, N. G., Hulshof, C. M.,</w:t>
+      </w:r>
+      <w:r>
+        <w:t xml:space="preserve"> </w:t>
+      </w:r>
+      <w:r>
+        <w:rPr>
+          <w:b/>
+          <w:bCs/>
         </w:rPr>
         <w:t xml:space="preserve">Katabuchi, M.</w:t>
       </w:r>
       <w:r>
-        <w:t xml:space="preserve">, Kenfack, D., Litton, C. M., Lum, S., Mohamad, M., Nasardin, M., Ong, P. S., Ostertag, R., Sack, L., Swenson, N. G., Sun, I. F., Tan, S., Thomas, D. W., Thompson, J., Umaña, M. N., Uriarte, M., Valencia, R., Yap, S., Zimmerman, J., McDowell, N. G. &amp; McMahon, S. M. Climate sensitive size-dependent survival in tropical trees.</w:t>
-      </w:r>
-      <w:r>
-        <w:t xml:space="preserve"> </w:t>
-      </w:r>
-      <w:r>
-        <w:rPr>
+        <w:t xml:space="preserve"> </w:t>
+      </w:r>
+      <w:r>
+        <w:t xml:space="preserve">&amp; Enquist, B. J. Long-term shifts in the functional composition and diversity of a tropical dry forest: A 30-yr study.</w:t>
+      </w:r>
+      <w:r>
+        <w:t xml:space="preserve"> </w:t>
+      </w:r>
+      <w:r>
+        <w:rPr>
+          <w:b/>
+          <w:bCs/>
+          <w:i/>
           <w:iCs/>
-          <w:i/>
-          <w:bCs/>
-          <w:b/>
-        </w:rPr>
-        <w:t xml:space="preserve">Nature Ecology &amp; Evolution</w:t>
-      </w:r>
-      <w:r>
-        <w:t xml:space="preserve"> </w:t>
-      </w:r>
-      <w:r>
-        <w:t xml:space="preserve">1 (2018)</w:t>
+        </w:rPr>
+        <w:t xml:space="preserve">Ecological Monographs</w:t>
+      </w:r>
+      <w:r>
+        <w:t xml:space="preserve"> </w:t>
+      </w:r>
+      <w:r>
+        <w:t xml:space="preserve">e01408 (2020)</w:t>
       </w:r>
       <w:r>
         <w:t xml:space="preserve"> </w:t>
@@ -1034,38 +1081,38 @@
         </w:numPr>
       </w:pPr>
       <w:r>
-        <w:t xml:space="preserve">Osnas, J. L. D.,</w:t>
-      </w:r>
-      <w:r>
-        <w:t xml:space="preserve"> </w:t>
-      </w:r>
-      <w:r>
-        <w:rPr>
-          <w:bCs/>
-          <w:b/>
+        <w:t xml:space="preserve">Sreekar, R.,</w:t>
+      </w:r>
+      <w:r>
+        <w:t xml:space="preserve"> </w:t>
+      </w:r>
+      <w:r>
+        <w:rPr>
+          <w:b/>
+          <w:bCs/>
         </w:rPr>
         <w:t xml:space="preserve">Katabuchi, M.</w:t>
       </w:r>
       <w:r>
-        <w:t xml:space="preserve">, Kitajima, K., Wright, S. J., Reich, P. B., Van Bael, S. A., Kraft, N. J. B., Samaniego, M. J., Pacala, S. W. &amp; Lichstein, J. W. Divergent drivers of leaf trait variation within species, among species, and among functional groups.</w:t>
-      </w:r>
-      <w:r>
-        <w:t xml:space="preserve"> </w:t>
-      </w:r>
-      <w:r>
-        <w:rPr>
+        <w:t xml:space="preserve">, Nakamura, A., Corlett, R. T., Slik, J. W. F., Fletcher, C., He, F., Weiblen, G. D., Shen, G., Xu, H., Sun, I.-F., Cao, K., Ma, K., Chang, L.-W., Cao, M., Jiang, M., Gunatilleke, I. A. U. N., Ong, P., Yap, S., Gunatilleke, C. V. S., Novotny, V., Brockelman, W. Y., Xiang, W., Mi, X., Li, X., Wang, X., Qiao, X., Li, Y., Tan, S., Condit, R., Harrison, R. D. &amp; Koh, L. P. Spatial scale changes the relationship between beta diversity, species richness and latitude.</w:t>
+      </w:r>
+      <w:r>
+        <w:t xml:space="preserve"> </w:t>
+      </w:r>
+      <w:r>
+        <w:rPr>
+          <w:b/>
+          <w:bCs/>
+          <w:i/>
           <w:iCs/>
-          <w:i/>
-          <w:bCs/>
-          <w:b/>
-        </w:rPr>
-        <w:t xml:space="preserve">Proceedings of the National Academy of Sciences of the United States of America</w:t>
-      </w:r>
-      <w:r>
-        <w:t xml:space="preserve"> </w:t>
-      </w:r>
-      <w:r>
-        <w:t xml:space="preserve">115, 5480–5485 (2018)</w:t>
+        </w:rPr>
+        <w:t xml:space="preserve">Open Science</w:t>
+      </w:r>
+      <w:r>
+        <w:t xml:space="preserve"> </w:t>
+      </w:r>
+      <w:r>
+        <w:t xml:space="preserve">5, 181168 (2018)</w:t>
       </w:r>
       <w:r>
         <w:t xml:space="preserve"> </w:t>
@@ -1090,38 +1137,38 @@
         </w:numPr>
       </w:pPr>
       <w:r>
-        <w:t xml:space="preserve">Li, Y., Shipley, B., Price, J. N., Dantas, V. de L., Tamme, R., Westoby, M., Siefert, A., Schamp, B. S., Spasojevic, M. J., Jung, V., Laughlin, D. C., Richardson, S. J., Bagousse-Pinguet, Y. L., Schöb, C., Gazol, A., Prentice, H. C., Gross, N., Overton, J., Cianciaruso, M. V., Louault, F., Kamiyama, C., Nakashizuka, T., Hikosaka, K., Sasaki, T.,</w:t>
-      </w:r>
-      <w:r>
-        <w:t xml:space="preserve"> </w:t>
-      </w:r>
-      <w:r>
-        <w:rPr>
-          <w:bCs/>
-          <w:b/>
+        <w:t xml:space="preserve">Johnson, D. J., Needham, J., Xu, C., Massoud, E. C., Davies, S. J., Anderson-Teixeira, K. J., Bunyavejchewin, S., Chambers, J. Q., Chang-Yang, C.-H., Chiang, J.-M., Chuyong, G. B., Condit, R., Cordell, S., Fletcher, C., Giardina, C. P., Giambelluca, T. W., Gunatilleke, N., Gunatilleke, S., Hsieh, C.-F., Hubbell, S., Inman-Narahari, F., Kassim, A. R.,</w:t>
+      </w:r>
+      <w:r>
+        <w:t xml:space="preserve"> </w:t>
+      </w:r>
+      <w:r>
+        <w:rPr>
+          <w:b/>
+          <w:bCs/>
         </w:rPr>
         <w:t xml:space="preserve">Katabuchi, M.</w:t>
       </w:r>
       <w:r>
-        <w:t xml:space="preserve">, Frenette Dussault, C., Gaucherand, S., Chen, N., Vandewalle, M. &amp; Batalha, M. A. Habitat filtering determines the functional niche occupancy of plant communities worldwide.</w:t>
-      </w:r>
-      <w:r>
-        <w:t xml:space="preserve"> </w:t>
-      </w:r>
-      <w:r>
-        <w:rPr>
+        <w:t xml:space="preserve">, Kenfack, D., Litton, C. M., Lum, S., Mohamad, M., Nasardin, M., Ong, P. S., Ostertag, R., Sack, L., Swenson, N. G., Sun, I. F., Tan, S., Thomas, D. W., Thompson, J., Umaña, M. N., Uriarte, M., Valencia, R., Yap, S., Zimmerman, J., McDowell, N. G. &amp; McMahon, S. M. Climate sensitive size-dependent survival in tropical trees.</w:t>
+      </w:r>
+      <w:r>
+        <w:t xml:space="preserve"> </w:t>
+      </w:r>
+      <w:r>
+        <w:rPr>
+          <w:b/>
+          <w:bCs/>
+          <w:i/>
           <w:iCs/>
-          <w:i/>
-          <w:bCs/>
-          <w:b/>
-        </w:rPr>
-        <w:t xml:space="preserve">Journal of Ecology</w:t>
-      </w:r>
-      <w:r>
-        <w:t xml:space="preserve"> </w:t>
-      </w:r>
-      <w:r>
-        <w:t xml:space="preserve">3, 808–809 (2017)</w:t>
+        </w:rPr>
+        <w:t xml:space="preserve">Nature Ecology &amp; Evolution</w:t>
+      </w:r>
+      <w:r>
+        <w:t xml:space="preserve"> </w:t>
+      </w:r>
+      <w:r>
+        <w:t xml:space="preserve">1 (2018)</w:t>
       </w:r>
       <w:r>
         <w:t xml:space="preserve"> </w:t>
@@ -1146,32 +1193,38 @@
         </w:numPr>
       </w:pPr>
       <w:r>
-        <w:rPr>
-          <w:bCs/>
-          <w:b/>
+        <w:t xml:space="preserve">Osnas, J. L. D.,</w:t>
+      </w:r>
+      <w:r>
+        <w:t xml:space="preserve"> </w:t>
+      </w:r>
+      <w:r>
+        <w:rPr>
+          <w:b/>
+          <w:bCs/>
         </w:rPr>
         <w:t xml:space="preserve">Katabuchi, M.</w:t>
       </w:r>
       <w:r>
-        <w:t xml:space="preserve">, Wright, S. J., Swenson, N. G., Feeley, K. J., Condit, R., Hubbell, S. P. &amp; Davies, S. J. Contrasting outcomes of species- and community-level analyses of the temporal consistency of functional composition.</w:t>
-      </w:r>
-      <w:r>
-        <w:t xml:space="preserve"> </w:t>
-      </w:r>
-      <w:r>
-        <w:rPr>
+        <w:t xml:space="preserve">, Kitajima, K., Wright, S. J., Reich, P. B., Van Bael, S. A., Kraft, N. J. B., Samaniego, M. J., Pacala, S. W. &amp; Lichstein, J. W. Divergent drivers of leaf trait variation within species, among species, and among functional groups.</w:t>
+      </w:r>
+      <w:r>
+        <w:t xml:space="preserve"> </w:t>
+      </w:r>
+      <w:r>
+        <w:rPr>
+          <w:b/>
+          <w:bCs/>
+          <w:i/>
           <w:iCs/>
-          <w:i/>
-          <w:bCs/>
-          <w:b/>
-        </w:rPr>
-        <w:t xml:space="preserve">Ecology</w:t>
-      </w:r>
-      <w:r>
-        <w:t xml:space="preserve"> </w:t>
-      </w:r>
-      <w:r>
-        <w:t xml:space="preserve">98, 2273–2280 (2017)</w:t>
+        </w:rPr>
+        <w:t xml:space="preserve">Proceedings of the National Academy of Sciences of the United States of America</w:t>
+      </w:r>
+      <w:r>
+        <w:t xml:space="preserve"> </w:t>
+      </w:r>
+      <w:r>
+        <w:t xml:space="preserve">115, 5480–5485 (2018)</w:t>
       </w:r>
       <w:r>
         <w:t xml:space="preserve"> </w:t>
@@ -1196,32 +1249,38 @@
         </w:numPr>
       </w:pPr>
       <w:r>
-        <w:rPr>
-          <w:bCs/>
-          <w:b/>
+        <w:t xml:space="preserve">Li, Y., Shipley, B., Price, J. N., Dantas, V. de L., Tamme, R., Westoby, M., Siefert, A., Schamp, B. S., Spasojevic, M. J., Jung, V., Laughlin, D. C., Richardson, S. J., Bagousse-Pinguet, Y. L., Schöb, C., Gazol, A., Prentice, H. C., Gross, N., Overton, J., Cianciaruso, M. V., Louault, F., Kamiyama, C., Nakashizuka, T., Hikosaka, K., Sasaki, T.,</w:t>
+      </w:r>
+      <w:r>
+        <w:t xml:space="preserve"> </w:t>
+      </w:r>
+      <w:r>
+        <w:rPr>
+          <w:b/>
+          <w:bCs/>
         </w:rPr>
         <w:t xml:space="preserve">Katabuchi, M.</w:t>
       </w:r>
       <w:r>
-        <w:t xml:space="preserve">, Kitajima, K., Wright, S. J., Van Bael, S. A., Osnas, J. L. D. &amp; Lichstein, J. W. Decomposing leaf mass into photosynthetic and structural components explains divergent patterns of trait variation within and among plant species.</w:t>
-      </w:r>
-      <w:r>
-        <w:t xml:space="preserve"> </w:t>
-      </w:r>
-      <w:r>
-        <w:rPr>
+        <w:t xml:space="preserve">, Frenette Dussault, C., Gaucherand, S., Chen, N., Vandewalle, M. &amp; Batalha, M. A. Habitat filtering determines the functional niche occupancy of plant communities worldwide.</w:t>
+      </w:r>
+      <w:r>
+        <w:t xml:space="preserve"> </w:t>
+      </w:r>
+      <w:r>
+        <w:rPr>
+          <w:b/>
+          <w:bCs/>
+          <w:i/>
           <w:iCs/>
-          <w:i/>
-          <w:bCs/>
-          <w:b/>
-        </w:rPr>
-        <w:t xml:space="preserve">bioRxiv</w:t>
-      </w:r>
-      <w:r>
-        <w:t xml:space="preserve"> </w:t>
-      </w:r>
-      <w:r>
-        <w:t xml:space="preserve">(2017)</w:t>
+        </w:rPr>
+        <w:t xml:space="preserve">Journal of Ecology</w:t>
+      </w:r>
+      <w:r>
+        <w:t xml:space="preserve"> </w:t>
+      </w:r>
+      <w:r>
+        <w:t xml:space="preserve">3, 808–809 (2017)</w:t>
       </w:r>
       <w:r>
         <w:t xml:space="preserve"> </w:t>
@@ -1246,38 +1305,32 @@
         </w:numPr>
       </w:pPr>
       <w:r>
-        <w:t xml:space="preserve">Siefert, A., Violle, C., Chalmandrier, L., Albert, C. H., Taudiere, A., Fajardo, A., Aarssen, L. W., Baraloto, C., Carlucci, M. B., Cianciaruso, M. V., de L. Dantas, V., de Bello, F., Duarte, L. D. S., Fonseca, C. R., Freschet, G. T., Gaucherand, S., Gross, N., Hikosaka, K., Jackson, B., Jung, V., Kamiyama, C.,</w:t>
-      </w:r>
-      <w:r>
-        <w:t xml:space="preserve"> </w:t>
-      </w:r>
-      <w:r>
-        <w:rPr>
-          <w:bCs/>
-          <w:b/>
+        <w:rPr>
+          <w:b/>
+          <w:bCs/>
         </w:rPr>
         <w:t xml:space="preserve">Katabuchi, M.</w:t>
       </w:r>
       <w:r>
-        <w:t xml:space="preserve">, Kembel, S. W., Kichenin, E., Kraft, N. J. B., Lagerström, A., Bagousse-Pinguet, Y. L., Li, Y., Mason, N., Messier, J., Nakashizuka, T., Overton, J. M., Peltzer, D. A., Pérez-Ramos, I. M., Pillar, V. D., Prentice, H. C., Richardson, S., Sasaki, T., Schamp, B. S., Schöb, C., Shipley, B., Sundqvist, M., Sykes, M. T., Vandewalle, M. &amp; Wardle, D. A. A global meta-analysis of the relative extent of intraspecific trait variation in plant communities.</w:t>
-      </w:r>
-      <w:r>
-        <w:t xml:space="preserve"> </w:t>
-      </w:r>
-      <w:r>
-        <w:rPr>
+        <w:t xml:space="preserve">, Wright, S. J., Swenson, N. G., Feeley, K. J., Condit, R., Hubbell, S. P. &amp; Davies, S. J. Contrasting outcomes of species- and community-level analyses of the temporal consistency of functional composition.</w:t>
+      </w:r>
+      <w:r>
+        <w:t xml:space="preserve"> </w:t>
+      </w:r>
+      <w:r>
+        <w:rPr>
+          <w:b/>
+          <w:bCs/>
+          <w:i/>
           <w:iCs/>
-          <w:i/>
-          <w:bCs/>
-          <w:b/>
-        </w:rPr>
-        <w:t xml:space="preserve">Ecology Letters</w:t>
-      </w:r>
-      <w:r>
-        <w:t xml:space="preserve"> </w:t>
-      </w:r>
-      <w:r>
-        <w:t xml:space="preserve">18, 1406–1419 (2015)</w:t>
+        </w:rPr>
+        <w:t xml:space="preserve">Ecology</w:t>
+      </w:r>
+      <w:r>
+        <w:t xml:space="preserve"> </w:t>
+      </w:r>
+      <w:r>
+        <w:t xml:space="preserve">98, 2273–2280 (2017)</w:t>
       </w:r>
       <w:r>
         <w:t xml:space="preserve"> </w:t>
@@ -1302,35 +1355,38 @@
         </w:numPr>
       </w:pPr>
       <w:r>
-        <w:rPr>
-          <w:bCs/>
-          <w:b/>
+        <w:t xml:space="preserve">Siefert, A., Violle, C., Chalmandrier, L., Albert, C. H., Taudiere, A., Fajardo, A., Aarssen, L. W., Baraloto, C., Carlucci, M. B., Cianciaruso, M. V., de L. Dantas, V., de Bello, F., Duarte, L. D. S., Fonseca, C. R., Freschet, G. T., Gaucherand, S., Gross, N., Hikosaka, K., Jackson, B., Jung, V., Kamiyama, C.,</w:t>
+      </w:r>
+      <w:r>
+        <w:t xml:space="preserve"> </w:t>
+      </w:r>
+      <w:r>
+        <w:rPr>
+          <w:b/>
+          <w:bCs/>
         </w:rPr>
         <w:t xml:space="preserve">Katabuchi, M.</w:t>
       </w:r>
       <w:r>
-        <w:t xml:space="preserve"> </w:t>
-      </w:r>
-      <w:r>
-        <w:t xml:space="preserve">LeafArea: An R package for rapid digital image analysis of leaf area.</w:t>
-      </w:r>
-      <w:r>
-        <w:t xml:space="preserve"> </w:t>
-      </w:r>
-      <w:r>
-        <w:rPr>
+        <w:t xml:space="preserve">, Kembel, S. W., Kichenin, E., Kraft, N. J. B., Lagerström, A., Bagousse-Pinguet, Y. L., Li, Y., Mason, N., Messier, J., Nakashizuka, T., Overton, J. M., Peltzer, D. A., Pérez-Ramos, I. M., Pillar, V. D., Prentice, H. C., Richardson, S., Sasaki, T., Schamp, B. S., Schöb, C., Shipley, B., Sundqvist, M., Sykes, M. T., Vandewalle, M. &amp; Wardle, D. A. A global meta-analysis of the relative extent of intraspecific trait variation in plant communities.</w:t>
+      </w:r>
+      <w:r>
+        <w:t xml:space="preserve"> </w:t>
+      </w:r>
+      <w:r>
+        <w:rPr>
+          <w:b/>
+          <w:bCs/>
+          <w:i/>
           <w:iCs/>
-          <w:i/>
-          <w:bCs/>
-          <w:b/>
-        </w:rPr>
-        <w:t xml:space="preserve">Ecological Research</w:t>
-      </w:r>
-      <w:r>
-        <w:t xml:space="preserve"> </w:t>
-      </w:r>
-      <w:r>
-        <w:t xml:space="preserve">30, 1073–1077 (2015)</w:t>
+        </w:rPr>
+        <w:t xml:space="preserve">Ecology Letters</w:t>
+      </w:r>
+      <w:r>
+        <w:t xml:space="preserve"> </w:t>
+      </w:r>
+      <w:r>
+        <w:t xml:space="preserve">18, 1406–1419 (2015)</w:t>
       </w:r>
       <w:r>
         <w:t xml:space="preserve"> </w:t>
@@ -1355,38 +1411,35 @@
         </w:numPr>
       </w:pPr>
       <w:r>
-        <w:t xml:space="preserve">Ashton, L. A., Nakamura, A., Basset, Y., Burwell, C. J., Cao, M., Eastwood, R., Odell, E., de Oliveira, E. G., Hurley, K.,</w:t>
-      </w:r>
-      <w:r>
-        <w:t xml:space="preserve"> </w:t>
-      </w:r>
-      <w:r>
-        <w:rPr>
-          <w:bCs/>
-          <w:b/>
+        <w:rPr>
+          <w:b/>
+          <w:bCs/>
         </w:rPr>
         <w:t xml:space="preserve">Katabuchi, M.</w:t>
       </w:r>
       <w:r>
-        <w:t xml:space="preserve">, Maunsell, S., Mcbroom, J., Schmidl, J., Sun, Z., Tang, Y., Whitaker, T., Laidlaw, M. J., Mcdonald, W. J. F. &amp; Kitching, R. L. Vertical stratification of moths across elevation and latitude.</w:t>
-      </w:r>
-      <w:r>
-        <w:t xml:space="preserve"> </w:t>
-      </w:r>
-      <w:r>
-        <w:rPr>
+        <w:t xml:space="preserve"> </w:t>
+      </w:r>
+      <w:r>
+        <w:t xml:space="preserve">LeafArea: An R package for rapid digital image analysis of leaf area.</w:t>
+      </w:r>
+      <w:r>
+        <w:t xml:space="preserve"> </w:t>
+      </w:r>
+      <w:r>
+        <w:rPr>
+          <w:b/>
+          <w:bCs/>
+          <w:i/>
           <w:iCs/>
-          <w:i/>
-          <w:bCs/>
-          <w:b/>
-        </w:rPr>
-        <w:t xml:space="preserve">Journal of Biogeography</w:t>
-      </w:r>
-      <w:r>
-        <w:t xml:space="preserve"> </w:t>
-      </w:r>
-      <w:r>
-        <w:t xml:space="preserve">43, 59–69 (2016)</w:t>
+        </w:rPr>
+        <w:t xml:space="preserve">Ecological Research</w:t>
+      </w:r>
+      <w:r>
+        <w:t xml:space="preserve"> </w:t>
+      </w:r>
+      <w:r>
+        <w:t xml:space="preserve">30, 1073–1077 (2015)</w:t>
       </w:r>
       <w:r>
         <w:t xml:space="preserve"> </w:t>
@@ -1411,41 +1464,38 @@
         </w:numPr>
       </w:pPr>
       <w:r>
-        <w:t xml:space="preserve">Nakamura, A., Burwell, C. J., Ashton, L. A., Laidlaw, M. J.,</w:t>
-      </w:r>
-      <w:r>
-        <w:t xml:space="preserve"> </w:t>
-      </w:r>
-      <w:r>
-        <w:rPr>
-          <w:bCs/>
-          <w:b/>
+        <w:t xml:space="preserve">Ashton, L. A., Nakamura, A., Basset, Y., Burwell, C. J., Cao, M., Eastwood, R., Odell, E., de Oliveira, E. G., Hurley, K.,</w:t>
+      </w:r>
+      <w:r>
+        <w:t xml:space="preserve"> </w:t>
+      </w:r>
+      <w:r>
+        <w:rPr>
+          <w:b/>
+          <w:bCs/>
         </w:rPr>
         <w:t xml:space="preserve">Katabuchi, M.</w:t>
       </w:r>
       <w:r>
-        <w:t xml:space="preserve"> </w:t>
-      </w:r>
-      <w:r>
-        <w:t xml:space="preserve">&amp; Kitching, R. L. Identifying indicator species of elevation: Comparing the utility of woody plants, ants and moths for long-term monitoring.</w:t>
-      </w:r>
-      <w:r>
-        <w:t xml:space="preserve"> </w:t>
-      </w:r>
-      <w:r>
-        <w:rPr>
+        <w:t xml:space="preserve">, Maunsell, S., Mcbroom, J., Schmidl, J., Sun, Z., Tang, Y., Whitaker, T., Laidlaw, M. J., Mcdonald, W. J. F. &amp; Kitching, R. L. Vertical stratification of moths across elevation and latitude.</w:t>
+      </w:r>
+      <w:r>
+        <w:t xml:space="preserve"> </w:t>
+      </w:r>
+      <w:r>
+        <w:rPr>
+          <w:b/>
+          <w:bCs/>
+          <w:i/>
           <w:iCs/>
-          <w:i/>
-          <w:bCs/>
-          <w:b/>
-        </w:rPr>
-        <w:t xml:space="preserve">Austral Ecology</w:t>
-      </w:r>
-      <w:r>
-        <w:t xml:space="preserve"> </w:t>
-      </w:r>
-      <w:r>
-        <w:t xml:space="preserve">41, 179–188 (2016)</w:t>
+        </w:rPr>
+        <w:t xml:space="preserve">Journal of Biogeography</w:t>
+      </w:r>
+      <w:r>
+        <w:t xml:space="preserve"> </w:t>
+      </w:r>
+      <w:r>
+        <w:t xml:space="preserve">43, 59–69 (2016)</w:t>
       </w:r>
       <w:r>
         <w:t xml:space="preserve"> </w:t>
@@ -1470,38 +1520,41 @@
         </w:numPr>
       </w:pPr>
       <w:r>
-        <w:t xml:space="preserve">Nakamura, A., Burwell, C. J., Lambkin, C. L.,</w:t>
-      </w:r>
-      <w:r>
-        <w:t xml:space="preserve"> </w:t>
-      </w:r>
-      <w:r>
-        <w:rPr>
-          <w:bCs/>
-          <w:b/>
+        <w:t xml:space="preserve">Nakamura, A., Burwell, C. J., Ashton, L. A., Laidlaw, M. J.,</w:t>
+      </w:r>
+      <w:r>
+        <w:t xml:space="preserve"> </w:t>
+      </w:r>
+      <w:r>
+        <w:rPr>
+          <w:b/>
+          <w:bCs/>
         </w:rPr>
         <w:t xml:space="preserve">Katabuchi, M.</w:t>
       </w:r>
       <w:r>
-        <w:t xml:space="preserve">, Mcdougall, A., Raven, R. J. &amp; Neldner, V. J. The role of human disturbance in island biogeography of arthropods and plants: An information theoretic approach.</w:t>
-      </w:r>
-      <w:r>
-        <w:t xml:space="preserve"> </w:t>
-      </w:r>
-      <w:r>
-        <w:rPr>
+        <w:t xml:space="preserve"> </w:t>
+      </w:r>
+      <w:r>
+        <w:t xml:space="preserve">&amp; Kitching, R. L. Identifying indicator species of elevation: Comparing the utility of woody plants, ants and moths for long-term monitoring.</w:t>
+      </w:r>
+      <w:r>
+        <w:t xml:space="preserve"> </w:t>
+      </w:r>
+      <w:r>
+        <w:rPr>
+          <w:b/>
+          <w:bCs/>
+          <w:i/>
           <w:iCs/>
-          <w:i/>
-          <w:bCs/>
-          <w:b/>
-        </w:rPr>
-        <w:t xml:space="preserve">Journal of Biogeography</w:t>
-      </w:r>
-      <w:r>
-        <w:t xml:space="preserve"> </w:t>
-      </w:r>
-      <w:r>
-        <w:t xml:space="preserve">42, 1406–1417 (2015)</w:t>
+        </w:rPr>
+        <w:t xml:space="preserve">Austral Ecology</w:t>
+      </w:r>
+      <w:r>
+        <w:t xml:space="preserve"> </w:t>
+      </w:r>
+      <w:r>
+        <w:t xml:space="preserve">41, 179–188 (2016)</w:t>
       </w:r>
       <w:r>
         <w:t xml:space="preserve"> </w:t>
@@ -1526,64 +1579,38 @@
         </w:numPr>
       </w:pPr>
       <w:r>
-        <w:t xml:space="preserve">Deng, X., Mohandass, D.,</w:t>
-      </w:r>
-      <w:r>
-        <w:t xml:space="preserve"> </w:t>
-      </w:r>
-      <w:r>
-        <w:rPr>
-          <w:bCs/>
-          <w:b/>
+        <w:t xml:space="preserve">Nakamura, A., Burwell, C. J., Lambkin, C. L.,</w:t>
+      </w:r>
+      <w:r>
+        <w:t xml:space="preserve"> </w:t>
+      </w:r>
+      <w:r>
+        <w:rPr>
+          <w:b/>
+          <w:bCs/>
         </w:rPr>
         <w:t xml:space="preserve">Katabuchi, M.</w:t>
       </w:r>
       <w:r>
-        <w:t xml:space="preserve">, Hughes, A. C. &amp; Roubik, D. W. Impact of Striped-Squirrel Nectar-Robbing Behaviour on Gender Fitness in</w:t>
-      </w:r>
-      <w:r>
-        <w:t xml:space="preserve"> </w:t>
-      </w:r>
-      <w:r>
-        <w:rPr>
+        <w:t xml:space="preserve">, Mcdougall, A., Raven, R. J. &amp; Neldner, V. J. The role of human disturbance in island biogeography of arthropods and plants: An information theoretic approach.</w:t>
+      </w:r>
+      <w:r>
+        <w:t xml:space="preserve"> </w:t>
+      </w:r>
+      <w:r>
+        <w:rPr>
+          <w:b/>
+          <w:bCs/>
+          <w:i/>
           <w:iCs/>
-          <w:i/>
-        </w:rPr>
-        <w:t xml:space="preserve">Alpinia</w:t>
-      </w:r>
-      <w:r>
-        <w:t xml:space="preserve"> </w:t>
-      </w:r>
-      <w:r>
-        <w:rPr>
-          <w:iCs/>
-          <w:i/>
-        </w:rPr>
-        <w:t xml:space="preserve">Roxburghii</w:t>
-      </w:r>
-      <w:r>
-        <w:t xml:space="preserve"> </w:t>
-      </w:r>
-      <w:r>
-        <w:t xml:space="preserve">Sweet (Zingiberaceae).</w:t>
-      </w:r>
-      <w:r>
-        <w:t xml:space="preserve"> </w:t>
-      </w:r>
-      <w:r>
-        <w:rPr>
-          <w:iCs/>
-          <w:i/>
-          <w:bCs/>
-          <w:b/>
-        </w:rPr>
-        <w:t xml:space="preserve">PLoS ONE</w:t>
-      </w:r>
-      <w:r>
-        <w:t xml:space="preserve"> </w:t>
-      </w:r>
-      <w:r>
-        <w:t xml:space="preserve">10, (2015)</w:t>
+        </w:rPr>
+        <w:t xml:space="preserve">Journal of Biogeography</w:t>
+      </w:r>
+      <w:r>
+        <w:t xml:space="preserve"> </w:t>
+      </w:r>
+      <w:r>
+        <w:t xml:space="preserve">42, 1406–1417 (2015)</w:t>
       </w:r>
       <w:r>
         <w:t xml:space="preserve"> </w:t>
@@ -1608,80 +1635,64 @@
         </w:numPr>
       </w:pPr>
       <w:r>
-        <w:t xml:space="preserve">Hikosaka, K., Sasaki, T., Kamiyama, C.,</w:t>
-      </w:r>
-      <w:r>
-        <w:t xml:space="preserve"> </w:t>
-      </w:r>
-      <w:r>
-        <w:rPr>
-          <w:bCs/>
-          <w:b/>
+        <w:t xml:space="preserve">Deng, X., Mohandass, D.,</w:t>
+      </w:r>
+      <w:r>
+        <w:t xml:space="preserve"> </w:t>
+      </w:r>
+      <w:r>
+        <w:rPr>
+          <w:b/>
+          <w:bCs/>
         </w:rPr>
         <w:t xml:space="preserve">Katabuchi, M.</w:t>
       </w:r>
       <w:r>
-        <w:t xml:space="preserve">, Oikawa, S., Shimazaki, M., Kimura, K. &amp; Nakshizuka, T. Understanding of species niche, coexistence and extinction based on functional traits : Approaches from community and physiological ecology for subalpine moorland plant communities [in Japanese].</w:t>
-      </w:r>
-      <w:r>
-        <w:t xml:space="preserve"> </w:t>
-      </w:r>
-      <w:r>
-        <w:rPr>
+        <w:t xml:space="preserve">, Hughes, A. C. &amp; Roubik, D. W. Impact of Striped-Squirrel Nectar-Robbing Behaviour on Gender Fitness in</w:t>
+      </w:r>
+      <w:r>
+        <w:t xml:space="preserve"> </w:t>
+      </w:r>
+      <w:r>
+        <w:rPr>
+          <w:i/>
           <w:iCs/>
+        </w:rPr>
+        <w:t xml:space="preserve">Alpinia</w:t>
+      </w:r>
+      <w:r>
+        <w:t xml:space="preserve"> </w:t>
+      </w:r>
+      <w:r>
+        <w:rPr>
           <w:i/>
-          <w:bCs/>
-          <w:b/>
-        </w:rPr>
-        <w:t xml:space="preserve">Chikyu-Kankyo</w:t>
-      </w:r>
-      <w:r>
-        <w:t xml:space="preserve"> </w:t>
-      </w:r>
-      <w:r>
-        <w:t xml:space="preserve">19, 33–46 (2014).</w:t>
-      </w:r>
-    </w:p>
-    <w:p>
-      <w:pPr>
-        <w:numPr>
-          <w:ilvl w:val="0"/>
-          <w:numId w:val="1001"/>
-        </w:numPr>
-      </w:pPr>
-      <w:r>
-        <w:t xml:space="preserve">Kamiyama, C.,</w:t>
-      </w:r>
-      <w:r>
-        <w:t xml:space="preserve"> </w:t>
-      </w:r>
-      <w:r>
-        <w:rPr>
-          <w:bCs/>
-          <w:b/>
-        </w:rPr>
-        <w:t xml:space="preserve">Katabuchi, M.</w:t>
-      </w:r>
-      <w:r>
-        <w:t xml:space="preserve">, Sasaki, T., Shimazaki, M., Nakashizuka, T. &amp; Hikosaka, K. Leaf-trait responses to environmental gradients in moorland communities: Contribution of intraspecific variation, species replacement and functional group replacement.</w:t>
-      </w:r>
-      <w:r>
-        <w:t xml:space="preserve"> </w:t>
-      </w:r>
-      <w:r>
-        <w:rPr>
           <w:iCs/>
+        </w:rPr>
+        <w:t xml:space="preserve">Roxburghii</w:t>
+      </w:r>
+      <w:r>
+        <w:t xml:space="preserve"> </w:t>
+      </w:r>
+      <w:r>
+        <w:t xml:space="preserve">Sweet (Zingiberaceae).</w:t>
+      </w:r>
+      <w:r>
+        <w:t xml:space="preserve"> </w:t>
+      </w:r>
+      <w:r>
+        <w:rPr>
+          <w:b/>
+          <w:bCs/>
           <w:i/>
-          <w:bCs/>
-          <w:b/>
-        </w:rPr>
-        <w:t xml:space="preserve">Ecol Res</w:t>
-      </w:r>
-      <w:r>
-        <w:t xml:space="preserve"> </w:t>
-      </w:r>
-      <w:r>
-        <w:t xml:space="preserve">29, 607–617 (2014)</w:t>
+          <w:iCs/>
+        </w:rPr>
+        <w:t xml:space="preserve">PLoS ONE</w:t>
+      </w:r>
+      <w:r>
+        <w:t xml:space="preserve"> </w:t>
+      </w:r>
+      <w:r>
+        <w:t xml:space="preserve">10, (2015)</w:t>
       </w:r>
       <w:r>
         <w:t xml:space="preserve"> </w:t>
@@ -1706,38 +1717,80 @@
         </w:numPr>
       </w:pPr>
       <w:r>
-        <w:t xml:space="preserve">Sasaki, T.,</w:t>
-      </w:r>
-      <w:r>
-        <w:t xml:space="preserve"> </w:t>
-      </w:r>
-      <w:r>
-        <w:rPr>
-          <w:bCs/>
-          <w:b/>
+        <w:t xml:space="preserve">Hikosaka, K., Sasaki, T., Kamiyama, C.,</w:t>
+      </w:r>
+      <w:r>
+        <w:t xml:space="preserve"> </w:t>
+      </w:r>
+      <w:r>
+        <w:rPr>
+          <w:b/>
+          <w:bCs/>
         </w:rPr>
         <w:t xml:space="preserve">Katabuchi, M.</w:t>
       </w:r>
       <w:r>
-        <w:t xml:space="preserve">, Kamiyama, C., Shimazaki, M., Nakashizuka, T. &amp; Hikosaka, K. Vulnerability of moorland plant communities to environmental change: Consequences of realistic species loss on functional diversity.</w:t>
-      </w:r>
-      <w:r>
-        <w:t xml:space="preserve"> </w:t>
-      </w:r>
-      <w:r>
-        <w:rPr>
+        <w:t xml:space="preserve">, Oikawa, S., Shimazaki, M., Kimura, K. &amp; Nakshizuka, T. Understanding of species niche, coexistence and extinction based on functional traits : Approaches from community and physiological ecology for subalpine moorland plant communities [in Japanese].</w:t>
+      </w:r>
+      <w:r>
+        <w:t xml:space="preserve"> </w:t>
+      </w:r>
+      <w:r>
+        <w:rPr>
+          <w:b/>
+          <w:bCs/>
+          <w:i/>
           <w:iCs/>
+        </w:rPr>
+        <w:t xml:space="preserve">Chikyu-Kankyo</w:t>
+      </w:r>
+      <w:r>
+        <w:t xml:space="preserve"> </w:t>
+      </w:r>
+      <w:r>
+        <w:t xml:space="preserve">19, 33–46 (2014).</w:t>
+      </w:r>
+    </w:p>
+    <w:p>
+      <w:pPr>
+        <w:numPr>
+          <w:ilvl w:val="0"/>
+          <w:numId w:val="1001"/>
+        </w:numPr>
+      </w:pPr>
+      <w:r>
+        <w:t xml:space="preserve">Kamiyama, C.,</w:t>
+      </w:r>
+      <w:r>
+        <w:t xml:space="preserve"> </w:t>
+      </w:r>
+      <w:r>
+        <w:rPr>
+          <w:b/>
+          <w:bCs/>
+        </w:rPr>
+        <w:t xml:space="preserve">Katabuchi, M.</w:t>
+      </w:r>
+      <w:r>
+        <w:t xml:space="preserve">, Sasaki, T., Shimazaki, M., Nakashizuka, T. &amp; Hikosaka, K. Leaf-trait responses to environmental gradients in moorland communities: Contribution of intraspecific variation, species replacement and functional group replacement.</w:t>
+      </w:r>
+      <w:r>
+        <w:t xml:space="preserve"> </w:t>
+      </w:r>
+      <w:r>
+        <w:rPr>
+          <w:b/>
+          <w:bCs/>
           <w:i/>
-          <w:bCs/>
-          <w:b/>
-        </w:rPr>
-        <w:t xml:space="preserve">Journal of Applied Ecology</w:t>
-      </w:r>
-      <w:r>
-        <w:t xml:space="preserve"> </w:t>
-      </w:r>
-      <w:r>
-        <w:t xml:space="preserve">51, 299–308 (2014)</w:t>
+          <w:iCs/>
+        </w:rPr>
+        <w:t xml:space="preserve">Ecological Research</w:t>
+      </w:r>
+      <w:r>
+        <w:t xml:space="preserve"> </w:t>
+      </w:r>
+      <w:r>
+        <w:t xml:space="preserve">29, 607–617 (2014)</w:t>
       </w:r>
       <w:r>
         <w:t xml:space="preserve"> </w:t>
@@ -1762,38 +1815,38 @@
         </w:numPr>
       </w:pPr>
       <w:r>
-        <w:t xml:space="preserve">Cádiz, A., Nagata, N.,</w:t>
-      </w:r>
-      <w:r>
-        <w:t xml:space="preserve"> </w:t>
-      </w:r>
-      <w:r>
-        <w:rPr>
-          <w:bCs/>
-          <w:b/>
+        <w:t xml:space="preserve">Sasaki, T.,</w:t>
+      </w:r>
+      <w:r>
+        <w:t xml:space="preserve"> </w:t>
+      </w:r>
+      <w:r>
+        <w:rPr>
+          <w:b/>
+          <w:bCs/>
         </w:rPr>
         <w:t xml:space="preserve">Katabuchi, M.</w:t>
       </w:r>
       <w:r>
-        <w:t xml:space="preserve">, DíAZ, L. M., ECHENIQUE-DíAZ, L. M., Akashi, H. D., Makino, T. &amp; Kawata, M. Relative importance of habitat use, range expansion, and speciation in local species diversity of anolis lizards in cuba.</w:t>
-      </w:r>
-      <w:r>
-        <w:t xml:space="preserve"> </w:t>
-      </w:r>
-      <w:r>
-        <w:rPr>
+        <w:t xml:space="preserve">, Kamiyama, C., Shimazaki, M., Nakashizuka, T. &amp; Hikosaka, K. Vulnerability of moorland plant communities to environmental change: Consequences of realistic species loss on functional diversity.</w:t>
+      </w:r>
+      <w:r>
+        <w:t xml:space="preserve"> </w:t>
+      </w:r>
+      <w:r>
+        <w:rPr>
+          <w:b/>
+          <w:bCs/>
+          <w:i/>
           <w:iCs/>
-          <w:i/>
-          <w:bCs/>
-          <w:b/>
-        </w:rPr>
-        <w:t xml:space="preserve">Ecosphere</w:t>
-      </w:r>
-      <w:r>
-        <w:t xml:space="preserve"> </w:t>
-      </w:r>
-      <w:r>
-        <w:t xml:space="preserve">4, (2013)</w:t>
+        </w:rPr>
+        <w:t xml:space="preserve">Journal of Applied Ecology</w:t>
+      </w:r>
+      <w:r>
+        <w:t xml:space="preserve"> </w:t>
+      </w:r>
+      <w:r>
+        <w:t xml:space="preserve">51, 299–308 (2014)</w:t>
       </w:r>
       <w:r>
         <w:t xml:space="preserve"> </w:t>
@@ -1818,41 +1871,38 @@
         </w:numPr>
       </w:pPr>
       <w:r>
-        <w:t xml:space="preserve">Asanok, L., Marod, D., Duengkae, P., Pranmongkol, U., Kurokawa, H., Aiba, M.,</w:t>
-      </w:r>
-      <w:r>
-        <w:t xml:space="preserve"> </w:t>
-      </w:r>
-      <w:r>
-        <w:rPr>
-          <w:bCs/>
-          <w:b/>
+        <w:t xml:space="preserve">Cádiz, A., Nagata, N.,</w:t>
+      </w:r>
+      <w:r>
+        <w:t xml:space="preserve"> </w:t>
+      </w:r>
+      <w:r>
+        <w:rPr>
+          <w:b/>
+          <w:bCs/>
         </w:rPr>
         <w:t xml:space="preserve">Katabuchi, M.</w:t>
       </w:r>
       <w:r>
-        <w:t xml:space="preserve"> </w:t>
-      </w:r>
-      <w:r>
-        <w:t xml:space="preserve">&amp; Nakashizuka, T. Relationships between functional traits and the ability of forest tree species to reestablish in secondary forest and enrichment plantations in the uplands of northern Thailand.</w:t>
-      </w:r>
-      <w:r>
-        <w:t xml:space="preserve"> </w:t>
-      </w:r>
-      <w:r>
-        <w:rPr>
+        <w:t xml:space="preserve">, DíAZ, L. M., ECHENIQUE-DíAZ, L. M., Akashi, H. D., Makino, T. &amp; Kawata, M. Relative importance of habitat use, range expansion, and speciation in local species diversity of anolis lizards in cuba.</w:t>
+      </w:r>
+      <w:r>
+        <w:t xml:space="preserve"> </w:t>
+      </w:r>
+      <w:r>
+        <w:rPr>
+          <w:b/>
+          <w:bCs/>
+          <w:i/>
           <w:iCs/>
-          <w:i/>
-          <w:bCs/>
-          <w:b/>
-        </w:rPr>
-        <w:t xml:space="preserve">Forest Ecology and Management</w:t>
-      </w:r>
-      <w:r>
-        <w:t xml:space="preserve"> </w:t>
-      </w:r>
-      <w:r>
-        <w:t xml:space="preserve">296, 9–23 (2013)</w:t>
+        </w:rPr>
+        <w:t xml:space="preserve">Ecosphere</w:t>
+      </w:r>
+      <w:r>
+        <w:t xml:space="preserve"> </w:t>
+      </w:r>
+      <w:r>
+        <w:t xml:space="preserve">4, (2013)</w:t>
       </w:r>
       <w:r>
         <w:t xml:space="preserve"> </w:t>
@@ -1877,38 +1927,41 @@
         </w:numPr>
       </w:pPr>
       <w:r>
-        <w:t xml:space="preserve">Sasaki, T.,</w:t>
-      </w:r>
-      <w:r>
-        <w:t xml:space="preserve"> </w:t>
-      </w:r>
-      <w:r>
-        <w:rPr>
-          <w:bCs/>
-          <w:b/>
+        <w:t xml:space="preserve">Asanok, L., Marod, D., Duengkae, P., Pranmongkol, U., Kurokawa, H., Aiba, M.,</w:t>
+      </w:r>
+      <w:r>
+        <w:t xml:space="preserve"> </w:t>
+      </w:r>
+      <w:r>
+        <w:rPr>
+          <w:b/>
+          <w:bCs/>
         </w:rPr>
         <w:t xml:space="preserve">Katabuchi, M.</w:t>
       </w:r>
       <w:r>
-        <w:t xml:space="preserve">, Kamiyama, C., Shimazaki, M., Nakashizuka, T. &amp; Hikosaka, K. Variations in species composition of moorland plant communities along environmental gradients within a subalpine zone in northern japan.</w:t>
-      </w:r>
-      <w:r>
-        <w:t xml:space="preserve"> </w:t>
-      </w:r>
-      <w:r>
-        <w:rPr>
+        <w:t xml:space="preserve"> </w:t>
+      </w:r>
+      <w:r>
+        <w:t xml:space="preserve">&amp; Nakashizuka, T. Relationships between functional traits and the ability of forest tree species to reestablish in secondary forest and enrichment plantations in the uplands of northern Thailand.</w:t>
+      </w:r>
+      <w:r>
+        <w:t xml:space="preserve"> </w:t>
+      </w:r>
+      <w:r>
+        <w:rPr>
+          <w:b/>
+          <w:bCs/>
+          <w:i/>
           <w:iCs/>
-          <w:i/>
-          <w:bCs/>
-          <w:b/>
-        </w:rPr>
-        <w:t xml:space="preserve">Wetlands</w:t>
-      </w:r>
-      <w:r>
-        <w:t xml:space="preserve"> </w:t>
-      </w:r>
-      <w:r>
-        <w:t xml:space="preserve">33, 269–277 (2013)</w:t>
+        </w:rPr>
+        <w:t xml:space="preserve">Forest Ecology and Management</w:t>
+      </w:r>
+      <w:r>
+        <w:t xml:space="preserve"> </w:t>
+      </w:r>
+      <w:r>
+        <w:t xml:space="preserve">296, 9–23 (2013)</w:t>
       </w:r>
       <w:r>
         <w:t xml:space="preserve"> </w:t>
@@ -1933,38 +1986,38 @@
         </w:numPr>
       </w:pPr>
       <w:r>
-        <w:t xml:space="preserve">Aiba, M.,</w:t>
-      </w:r>
-      <w:r>
-        <w:t xml:space="preserve"> </w:t>
-      </w:r>
-      <w:r>
-        <w:rPr>
-          <w:bCs/>
-          <w:b/>
+        <w:t xml:space="preserve">Sasaki, T.,</w:t>
+      </w:r>
+      <w:r>
+        <w:t xml:space="preserve"> </w:t>
+      </w:r>
+      <w:r>
+        <w:rPr>
+          <w:b/>
+          <w:bCs/>
         </w:rPr>
         <w:t xml:space="preserve">Katabuchi, M.</w:t>
       </w:r>
       <w:r>
-        <w:t xml:space="preserve">, Takafumi, H., Matsuzaki, S. I. S., Sasaki, T. &amp; Hiura, T. Robustness of trait distribution metrics for community assembly studies under the uncertainties of assembly processes.</w:t>
-      </w:r>
-      <w:r>
-        <w:t xml:space="preserve"> </w:t>
-      </w:r>
-      <w:r>
-        <w:rPr>
+        <w:t xml:space="preserve">, Kamiyama, C., Shimazaki, M., Nakashizuka, T. &amp; Hikosaka, K. Variations in species composition of moorland plant communities along environmental gradients within a subalpine zone in northern japan.</w:t>
+      </w:r>
+      <w:r>
+        <w:t xml:space="preserve"> </w:t>
+      </w:r>
+      <w:r>
+        <w:rPr>
+          <w:b/>
+          <w:bCs/>
+          <w:i/>
           <w:iCs/>
-          <w:i/>
-          <w:bCs/>
-          <w:b/>
-        </w:rPr>
-        <w:t xml:space="preserve">Ecology</w:t>
-      </w:r>
-      <w:r>
-        <w:t xml:space="preserve"> </w:t>
-      </w:r>
-      <w:r>
-        <w:t xml:space="preserve">94, 2873–2885 (2013)</w:t>
+        </w:rPr>
+        <w:t xml:space="preserve">Wetlands</w:t>
+      </w:r>
+      <w:r>
+        <w:t xml:space="preserve"> </w:t>
+      </w:r>
+      <w:r>
+        <w:t xml:space="preserve">33, 269–277 (2013)</w:t>
       </w:r>
       <w:r>
         <w:t xml:space="preserve"> </w:t>
@@ -1989,38 +2042,38 @@
         </w:numPr>
       </w:pPr>
       <w:r>
-        <w:t xml:space="preserve">Sasaki, T.,</w:t>
-      </w:r>
-      <w:r>
-        <w:t xml:space="preserve"> </w:t>
-      </w:r>
-      <w:r>
-        <w:rPr>
-          <w:bCs/>
-          <w:b/>
+        <w:t xml:space="preserve">Aiba, M.,</w:t>
+      </w:r>
+      <w:r>
+        <w:t xml:space="preserve"> </w:t>
+      </w:r>
+      <w:r>
+        <w:rPr>
+          <w:b/>
+          <w:bCs/>
         </w:rPr>
         <w:t xml:space="preserve">Katabuchi, M.</w:t>
       </w:r>
       <w:r>
-        <w:t xml:space="preserve">, Kamiyama, C., Shimazaki, M., Nakashizuka, T. &amp; Hikosaka, K. Nestedness and niche-based species loss in moorland plant communities.</w:t>
-      </w:r>
-      <w:r>
-        <w:t xml:space="preserve"> </w:t>
-      </w:r>
-      <w:r>
-        <w:rPr>
+        <w:t xml:space="preserve">, Takafumi, H., Matsuzaki, S. I. S., Sasaki, T. &amp; Hiura, T. Robustness of trait distribution metrics for community assembly studies under the uncertainties of assembly processes.</w:t>
+      </w:r>
+      <w:r>
+        <w:t xml:space="preserve"> </w:t>
+      </w:r>
+      <w:r>
+        <w:rPr>
+          <w:b/>
+          <w:bCs/>
+          <w:i/>
           <w:iCs/>
-          <w:i/>
-          <w:bCs/>
-          <w:b/>
-        </w:rPr>
-        <w:t xml:space="preserve">Oikos</w:t>
-      </w:r>
-      <w:r>
-        <w:t xml:space="preserve"> </w:t>
-      </w:r>
-      <w:r>
-        <w:t xml:space="preserve">121, 1783–1790 (2012)</w:t>
+        </w:rPr>
+        <w:t xml:space="preserve">Ecology</w:t>
+      </w:r>
+      <w:r>
+        <w:t xml:space="preserve"> </w:t>
+      </w:r>
+      <w:r>
+        <w:t xml:space="preserve">94, 2873–2885 (2013)</w:t>
       </w:r>
       <w:r>
         <w:t xml:space="preserve"> </w:t>
@@ -2052,31 +2105,31 @@
       </w:r>
       <w:r>
         <w:rPr>
-          <w:bCs/>
-          <w:b/>
+          <w:b/>
+          <w:bCs/>
         </w:rPr>
         <w:t xml:space="preserve">Katabuchi, M.</w:t>
       </w:r>
       <w:r>
-        <w:t xml:space="preserve">, Kamiyama, C., Shimazaki, M., Nakashizuka, T. &amp; Hikosaka, K. Diversity partitioning of moorland plant communities across hierarchical spatial scales.</w:t>
-      </w:r>
-      <w:r>
-        <w:t xml:space="preserve"> </w:t>
-      </w:r>
-      <w:r>
-        <w:rPr>
+        <w:t xml:space="preserve">, Kamiyama, C., Shimazaki, M., Nakashizuka, T. &amp; Hikosaka, K. Nestedness and niche-based species loss in moorland plant communities.</w:t>
+      </w:r>
+      <w:r>
+        <w:t xml:space="preserve"> </w:t>
+      </w:r>
+      <w:r>
+        <w:rPr>
+          <w:b/>
+          <w:bCs/>
+          <w:i/>
           <w:iCs/>
-          <w:i/>
-          <w:bCs/>
-          <w:b/>
-        </w:rPr>
-        <w:t xml:space="preserve">Biodiversity and Conservation</w:t>
-      </w:r>
-      <w:r>
-        <w:t xml:space="preserve"> </w:t>
-      </w:r>
-      <w:r>
-        <w:t xml:space="preserve">21, 1577–1588 (2012)</w:t>
+        </w:rPr>
+        <w:t xml:space="preserve">Oikos</w:t>
+      </w:r>
+      <w:r>
+        <w:t xml:space="preserve"> </w:t>
+      </w:r>
+      <w:r>
+        <w:t xml:space="preserve">121, 1783–1790 (2012)</w:t>
       </w:r>
       <w:r>
         <w:t xml:space="preserve"> </w:t>
@@ -2101,32 +2154,38 @@
         </w:numPr>
       </w:pPr>
       <w:r>
-        <w:rPr>
-          <w:bCs/>
-          <w:b/>
+        <w:t xml:space="preserve">Sasaki, T.,</w:t>
+      </w:r>
+      <w:r>
+        <w:t xml:space="preserve"> </w:t>
+      </w:r>
+      <w:r>
+        <w:rPr>
+          <w:b/>
+          <w:bCs/>
         </w:rPr>
         <w:t xml:space="preserve">Katabuchi, M.</w:t>
       </w:r>
       <w:r>
-        <w:t xml:space="preserve">, Kurokawa, H., Davies, S. J., Tan, S. &amp; Nakashizuka, T. Soil resource availability shapes community trait structure in a species-rich dipterocarp forest.</w:t>
-      </w:r>
-      <w:r>
-        <w:t xml:space="preserve"> </w:t>
-      </w:r>
-      <w:r>
-        <w:rPr>
+        <w:t xml:space="preserve">, Kamiyama, C., Shimazaki, M., Nakashizuka, T. &amp; Hikosaka, K. Diversity partitioning of moorland plant communities across hierarchical spatial scales.</w:t>
+      </w:r>
+      <w:r>
+        <w:t xml:space="preserve"> </w:t>
+      </w:r>
+      <w:r>
+        <w:rPr>
+          <w:b/>
+          <w:bCs/>
+          <w:i/>
           <w:iCs/>
-          <w:i/>
-          <w:bCs/>
-          <w:b/>
-        </w:rPr>
-        <w:t xml:space="preserve">Journal of Ecology</w:t>
-      </w:r>
-      <w:r>
-        <w:t xml:space="preserve"> </w:t>
-      </w:r>
-      <w:r>
-        <w:t xml:space="preserve">100, 643–651 (2012)</w:t>
+        </w:rPr>
+        <w:t xml:space="preserve">Biodiversity and Conservation</w:t>
+      </w:r>
+      <w:r>
+        <w:t xml:space="preserve"> </w:t>
+      </w:r>
+      <w:r>
+        <w:t xml:space="preserve">21, 1577–1588 (2012)</w:t>
       </w:r>
       <w:r>
         <w:t xml:space="preserve"> </w:t>
@@ -2152,54 +2211,31 @@
       </w:pPr>
       <w:r>
         <w:rPr>
-          <w:bCs/>
-          <w:b/>
+          <w:b/>
+          <w:bCs/>
         </w:rPr>
         <w:t xml:space="preserve">Katabuchi, M.</w:t>
       </w:r>
       <w:r>
-        <w:t xml:space="preserve">, Harrison, R. D. &amp; Nakashizuka, T. Documenting the effect of foundress number in a dioecious fig,</w:t>
-      </w:r>
-      <w:r>
-        <w:t xml:space="preserve"> </w:t>
-      </w:r>
-      <w:r>
-        <w:rPr>
+        <w:t xml:space="preserve">, Kurokawa, H., Davies, S. J., Tan, S. &amp; Nakashizuka, T. Soil resource availability shapes community trait structure in a species-rich dipterocarp forest.</w:t>
+      </w:r>
+      <w:r>
+        <w:t xml:space="preserve"> </w:t>
+      </w:r>
+      <w:r>
+        <w:rPr>
+          <w:b/>
+          <w:bCs/>
+          <w:i/>
           <w:iCs/>
-          <w:i/>
-        </w:rPr>
-        <w:t xml:space="preserve">Ficus</w:t>
-      </w:r>
-      <w:r>
-        <w:t xml:space="preserve"> </w:t>
-      </w:r>
-      <w:r>
-        <w:rPr>
-          <w:iCs/>
-          <w:i/>
-        </w:rPr>
-        <w:t xml:space="preserve">Fistulosa</w:t>
-      </w:r>
-      <w:r>
-        <w:t xml:space="preserve">, in Malaysia.</w:t>
-      </w:r>
-      <w:r>
-        <w:t xml:space="preserve"> </w:t>
-      </w:r>
-      <w:r>
-        <w:rPr>
-          <w:iCs/>
-          <w:i/>
-          <w:bCs/>
-          <w:b/>
-        </w:rPr>
-        <w:t xml:space="preserve">Biotropica</w:t>
-      </w:r>
-      <w:r>
-        <w:t xml:space="preserve"> </w:t>
-      </w:r>
-      <w:r>
-        <w:t xml:space="preserve">40, 457–461 (2008)</w:t>
+        </w:rPr>
+        <w:t xml:space="preserve">Journal of Ecology</w:t>
+      </w:r>
+      <w:r>
+        <w:t xml:space="preserve"> </w:t>
+      </w:r>
+      <w:r>
+        <w:t xml:space="preserve">100, 643–651 (2012)</w:t>
       </w:r>
       <w:r>
         <w:t xml:space="preserve"> </w:t>
@@ -2225,8 +2261,8 @@
       </w:pPr>
       <w:r>
         <w:rPr>
-          <w:bCs/>
-          <w:b/>
+          <w:b/>
+          <w:bCs/>
         </w:rPr>
         <w:t xml:space="preserve">Katabuchi, M.</w:t>
       </w:r>
@@ -2238,56 +2274,56 @@
       </w:r>
       <w:r>
         <w:rPr>
+          <w:i/>
           <w:iCs/>
+        </w:rPr>
+        <w:t xml:space="preserve">Ceratosolen</w:t>
+      </w:r>
+      <w:r>
+        <w:t xml:space="preserve"> </w:t>
+      </w:r>
+      <w:r>
+        <w:rPr>
           <w:i/>
-        </w:rPr>
-        <w:t xml:space="preserve">Ceratosolen</w:t>
-      </w:r>
-      <w:r>
-        <w:t xml:space="preserve"> </w:t>
-      </w:r>
-      <w:r>
-        <w:rPr>
           <w:iCs/>
+        </w:rPr>
+        <w:t xml:space="preserve">Constrictus</w:t>
+      </w:r>
+      <w:r>
+        <w:t xml:space="preserve">, the pollinating fig wasp of</w:t>
+      </w:r>
+      <w:r>
+        <w:t xml:space="preserve"> </w:t>
+      </w:r>
+      <w:r>
+        <w:rPr>
           <w:i/>
-        </w:rPr>
-        <w:t xml:space="preserve">Constrictus</w:t>
-      </w:r>
-      <w:r>
-        <w:t xml:space="preserve">, the pollinating fig wasp of</w:t>
-      </w:r>
-      <w:r>
-        <w:t xml:space="preserve"> </w:t>
-      </w:r>
-      <w:r>
-        <w:rPr>
           <w:iCs/>
+        </w:rPr>
+        <w:t xml:space="preserve">Ficus</w:t>
+      </w:r>
+      <w:r>
+        <w:t xml:space="preserve"> </w:t>
+      </w:r>
+      <w:r>
+        <w:rPr>
           <w:i/>
-        </w:rPr>
-        <w:t xml:space="preserve">Ficus</w:t>
-      </w:r>
-      <w:r>
-        <w:t xml:space="preserve"> </w:t>
-      </w:r>
-      <w:r>
-        <w:rPr>
           <w:iCs/>
+        </w:rPr>
+        <w:t xml:space="preserve">Fistulosa</w:t>
+      </w:r>
+      <w:r>
+        <w:t xml:space="preserve">.</w:t>
+      </w:r>
+      <w:r>
+        <w:t xml:space="preserve"> </w:t>
+      </w:r>
+      <w:r>
+        <w:rPr>
+          <w:b/>
+          <w:bCs/>
           <w:i/>
-        </w:rPr>
-        <w:t xml:space="preserve">Fistulosa</w:t>
-      </w:r>
-      <w:r>
-        <w:t xml:space="preserve">.</w:t>
-      </w:r>
-      <w:r>
-        <w:t xml:space="preserve"> </w:t>
-      </w:r>
-      <w:r>
-        <w:rPr>
           <w:iCs/>
-          <w:i/>
-          <w:bCs/>
-          <w:b/>
         </w:rPr>
         <w:t xml:space="preserve">Molecular Ecology Resources</w:t>
       </w:r>
@@ -2312,8 +2348,81 @@
         <w:t xml:space="preserve">.</w:t>
       </w:r>
     </w:p>
-    <w:bookmarkEnd w:id="54"/>
-    <w:bookmarkStart w:id="55" w:name="book"/>
+    <w:p>
+      <w:pPr>
+        <w:numPr>
+          <w:ilvl w:val="0"/>
+          <w:numId w:val="1001"/>
+        </w:numPr>
+      </w:pPr>
+      <w:r>
+        <w:rPr>
+          <w:b/>
+          <w:bCs/>
+        </w:rPr>
+        <w:t xml:space="preserve">Katabuchi, M.</w:t>
+      </w:r>
+      <w:r>
+        <w:t xml:space="preserve">, Harrison, R. D. &amp; Nakashizuka, T. Documenting the effect of foundress number in a dioecious fig,</w:t>
+      </w:r>
+      <w:r>
+        <w:t xml:space="preserve"> </w:t>
+      </w:r>
+      <w:r>
+        <w:rPr>
+          <w:i/>
+          <w:iCs/>
+        </w:rPr>
+        <w:t xml:space="preserve">Ficus</w:t>
+      </w:r>
+      <w:r>
+        <w:t xml:space="preserve"> </w:t>
+      </w:r>
+      <w:r>
+        <w:rPr>
+          <w:i/>
+          <w:iCs/>
+        </w:rPr>
+        <w:t xml:space="preserve">Fistulosa</w:t>
+      </w:r>
+      <w:r>
+        <w:t xml:space="preserve">, in Malaysia.</w:t>
+      </w:r>
+      <w:r>
+        <w:t xml:space="preserve"> </w:t>
+      </w:r>
+      <w:r>
+        <w:rPr>
+          <w:b/>
+          <w:bCs/>
+          <w:i/>
+          <w:iCs/>
+        </w:rPr>
+        <w:t xml:space="preserve">Biotropica</w:t>
+      </w:r>
+      <w:r>
+        <w:t xml:space="preserve"> </w:t>
+      </w:r>
+      <w:r>
+        <w:t xml:space="preserve">40, 457–461 (2008)</w:t>
+      </w:r>
+      <w:r>
+        <w:t xml:space="preserve"> </w:t>
+      </w:r>
+      <w:hyperlink r:id="rId54">
+        <w:r>
+          <w:rPr>
+            <w:rStyle w:val="InternetLink"/>
+          </w:rPr>
+          <w:t xml:space="preserve">[doi]</w:t>
+        </w:r>
+      </w:hyperlink>
+      <w:r>
+        <w:t xml:space="preserve">.</w:t>
+      </w:r>
+    </w:p>
+    <w:bookmarkEnd w:id="55"/>
+    <w:bookmarkStart w:id="56" w:name="book"/>
     <w:p>
       <w:pPr>
         <w:pStyle w:val="Heading2"/>
@@ -2324,11 +2433,11 @@
     </w:p>
     <w:p>
       <w:pPr>
+        <w:pStyle w:val="Compact"/>
         <w:numPr>
           <w:ilvl w:val="0"/>
           <w:numId w:val="1002"/>
         </w:numPr>
-        <w:pStyle w:val="Compact"/>
       </w:pPr>
       <w:r>
         <w:t xml:space="preserve">Hikosaka K., Sasaki T., Kamiyama C.,</w:t>
@@ -2338,8 +2447,8 @@
       </w:r>
       <w:r>
         <w:rPr>
-          <w:bCs/>
-          <w:b/>
+          <w:b/>
+          <w:bCs/>
         </w:rPr>
         <w:t xml:space="preserve">Katabuchi M.</w:t>
       </w:r>
@@ -2347,8 +2456,8 @@
         <w:t xml:space="preserve">, Oikawa S., Shimazaki M., Kimura H. and Nakashizuka T. (2016), Trait-Based Approaches for Understanding Species Niche, Coexistence, and Functional Diversity in Subalpine Moorlands. Structure and Function of Mountain Ecosystems in Japan.</w:t>
       </w:r>
     </w:p>
-    <w:bookmarkEnd w:id="55"/>
-    <w:bookmarkStart w:id="59" w:name="software"/>
+    <w:bookmarkEnd w:id="56"/>
+    <w:bookmarkStart w:id="60" w:name="software"/>
     <w:p>
       <w:pPr>
         <w:pStyle w:val="Heading2"/>
@@ -2371,47 +2480,13 @@
       </w:pPr>
       <w:r>
         <w:rPr>
-          <w:bCs/>
-          <w:b/>
+          <w:b/>
+          <w:bCs/>
         </w:rPr>
         <w:t xml:space="preserve">ztpln</w:t>
       </w:r>
       <w:r>
         <w:t xml:space="preserve">: Zero-Truncated Poisson Lognormal Distribution,</w:t>
-      </w:r>
-      <w:r>
-        <w:t xml:space="preserve"> </w:t>
-      </w:r>
-      <w:hyperlink r:id="rId56">
-        <w:r>
-          <w:rPr>
-            <w:rStyle w:val="InternetLink"/>
-          </w:rPr>
-          <w:t xml:space="preserve">R CRAN package</w:t>
-        </w:r>
-      </w:hyperlink>
-    </w:p>
-    <w:p>
-      <w:pPr>
-        <w:pStyle w:val="DefinitionTerm"/>
-      </w:pPr>
-      <w:r>
-        <w:t xml:space="preserve">2015</w:t>
-      </w:r>
-    </w:p>
-    <w:p>
-      <w:pPr>
-        <w:pStyle w:val="Definition"/>
-      </w:pPr>
-      <w:r>
-        <w:rPr>
-          <w:bCs/>
-          <w:b/>
-        </w:rPr>
-        <w:t xml:space="preserve">LeafArea</w:t>
-      </w:r>
-      <w:r>
-        <w:t xml:space="preserve">: Rapid Digital Image Analysis of Leaf Area,</w:t>
       </w:r>
       <w:r>
         <w:t xml:space="preserve"> </w:t>
@@ -2439,13 +2514,13 @@
       </w:pPr>
       <w:r>
         <w:rPr>
-          <w:bCs/>
-          <w:b/>
-        </w:rPr>
-        <w:t xml:space="preserve">mglmn</w:t>
-      </w:r>
-      <w:r>
-        <w:t xml:space="preserve">: Model Averaging fro Multivariate GLM with Null Models, R CRAN package</w:t>
+          <w:b/>
+          <w:bCs/>
+        </w:rPr>
+        <w:t xml:space="preserve">LeafArea</w:t>
+      </w:r>
+      <w:r>
+        <w:t xml:space="preserve">: Rapid Digital Image Analysis of Leaf Area,</w:t>
       </w:r>
       <w:r>
         <w:t xml:space="preserve"> </w:t>
@@ -2459,8 +2534,42 @@
         </w:r>
       </w:hyperlink>
     </w:p>
-    <w:bookmarkEnd w:id="59"/>
-    <w:bookmarkStart w:id="60" w:name="teaching-experience"/>
+    <w:p>
+      <w:pPr>
+        <w:pStyle w:val="DefinitionTerm"/>
+      </w:pPr>
+      <w:r>
+        <w:t xml:space="preserve">2015</w:t>
+      </w:r>
+    </w:p>
+    <w:p>
+      <w:pPr>
+        <w:pStyle w:val="Definition"/>
+      </w:pPr>
+      <w:r>
+        <w:rPr>
+          <w:b/>
+          <w:bCs/>
+        </w:rPr>
+        <w:t xml:space="preserve">mglmn</w:t>
+      </w:r>
+      <w:r>
+        <w:t xml:space="preserve">: Model Averaging fro Multivariate GLM with Null Models, R CRAN package</w:t>
+      </w:r>
+      <w:r>
+        <w:t xml:space="preserve"> </w:t>
+      </w:r>
+      <w:hyperlink r:id="rId59">
+        <w:r>
+          <w:rPr>
+            <w:rStyle w:val="InternetLink"/>
+          </w:rPr>
+          <w:t xml:space="preserve">R CRAN package</w:t>
+        </w:r>
+      </w:hyperlink>
+    </w:p>
+    <w:bookmarkEnd w:id="60"/>
+    <w:bookmarkStart w:id="61" w:name="teaching-experience"/>
     <w:p>
       <w:pPr>
         <w:pStyle w:val="Heading2"/>
@@ -2517,8 +2626,8 @@
         <w:t xml:space="preserve">R and generalized linear models, Xishuangbanna Tropical Botanical Garden, Chinese Academy of Sciences, China</w:t>
       </w:r>
     </w:p>
-    <w:bookmarkEnd w:id="60"/>
-    <w:bookmarkStart w:id="62" w:name="service"/>
+    <w:bookmarkEnd w:id="61"/>
+    <w:bookmarkStart w:id="63" w:name="service"/>
     <w:p>
       <w:pPr>
         <w:pStyle w:val="Heading2"/>
@@ -2539,7 +2648,7 @@
       <w:pPr>
         <w:pStyle w:val="Definition"/>
       </w:pPr>
-      <w:hyperlink r:id="rId61"/>
+      <w:hyperlink r:id="rId62"/>
     </w:p>
     <w:p>
       <w:pPr>
@@ -2561,7 +2670,7 @@
       <w:pPr>
         <w:pStyle w:val="Definition"/>
       </w:pPr>
-      <w:hyperlink r:id="rId61"/>
+      <w:hyperlink r:id="rId62"/>
     </w:p>
     <w:p>
       <w:pPr>
@@ -2583,7 +2692,7 @@
       <w:pPr>
         <w:pStyle w:val="Definition"/>
       </w:pPr>
-      <w:hyperlink r:id="rId61"/>
+      <w:hyperlink r:id="rId62"/>
     </w:p>
     <w:p>
       <w:pPr>
@@ -2601,8 +2710,8 @@
         <w:t xml:space="preserve">Reviewer for journals (~ 12 per year):</w:t>
       </w:r>
     </w:p>
-    <w:bookmarkEnd w:id="62"/>
-    <w:bookmarkStart w:id="63" w:name="awards-and-prizes"/>
+    <w:bookmarkEnd w:id="63"/>
+    <w:bookmarkStart w:id="64" w:name="awards-and-prizes"/>
     <w:p>
       <w:pPr>
         <w:pStyle w:val="Heading2"/>
@@ -2643,8 +2752,8 @@
         <w:t xml:space="preserve">Dean’s award for excellence, Graduate School of Life Sciences (Master’s Program), Tohoku University</w:t>
       </w:r>
     </w:p>
-    <w:bookmarkEnd w:id="63"/>
-    <w:bookmarkStart w:id="64" w:name="invited-seminars"/>
+    <w:bookmarkEnd w:id="64"/>
+    <w:bookmarkStart w:id="65" w:name="invited-seminars"/>
     <w:p>
       <w:pPr>
         <w:pStyle w:val="Heading2"/>
@@ -2749,8 +2858,8 @@
         <w:t xml:space="preserve">Additive partitioning of functional diversity in plant communities, Xishuangbanna Tropical Botanical Garden, China</w:t>
       </w:r>
     </w:p>
-    <w:bookmarkEnd w:id="64"/>
-    <w:bookmarkStart w:id="65" w:name="international-meetings"/>
+    <w:bookmarkEnd w:id="65"/>
+    <w:bookmarkStart w:id="66" w:name="international-meetings"/>
     <w:p>
       <w:pPr>
         <w:pStyle w:val="Heading2"/>
@@ -2765,8 +2874,8 @@
       </w:pPr>
       <w:r>
         <w:rPr>
-          <w:bCs/>
-          <w:b/>
+          <w:b/>
+          <w:bCs/>
         </w:rPr>
         <w:t xml:space="preserve">Invited</w:t>
       </w:r>
@@ -2785,8 +2894,8 @@
       </w:pPr>
       <w:r>
         <w:rPr>
-          <w:bCs/>
-          <w:b/>
+          <w:b/>
+          <w:bCs/>
         </w:rPr>
         <w:t xml:space="preserve">Masatoshi Katabuchi</w:t>
       </w:r>
@@ -2797,13 +2906,7 @@
         <w:t xml:space="preserve"> </w:t>
       </w:r>
       <w:r>
-        <w:t xml:space="preserve">“</w:t>
-      </w:r>
-      <w:r>
-        <w:t xml:space="preserve">Future perspective for functional trait research</w:t>
-      </w:r>
-      <w:r>
-        <w:t xml:space="preserve">”</w:t>
+        <w:t xml:space="preserve">“Future perspective for functional trait research”</w:t>
       </w:r>
       <w:r>
         <w:t xml:space="preserve">, Organized session on</w:t>
@@ -2812,13 +2915,7 @@
         <w:t xml:space="preserve"> </w:t>
       </w:r>
       <w:r>
-        <w:t xml:space="preserve">“</w:t>
-      </w:r>
-      <w:r>
-        <w:t xml:space="preserve">Achievements and outstanding questions for trait-based forest ecology</w:t>
-      </w:r>
-      <w:r>
-        <w:t xml:space="preserve">”</w:t>
+        <w:t xml:space="preserve">“Achievements and outstanding questions for trait-based forest ecology”</w:t>
       </w:r>
       <w:r>
         <w:t xml:space="preserve">, 62nd ESJ Annual meeting, Kagoshima, Japan</w:t>
@@ -2838,8 +2935,8 @@
       </w:pPr>
       <w:r>
         <w:rPr>
-          <w:bCs/>
-          <w:b/>
+          <w:b/>
+          <w:bCs/>
         </w:rPr>
         <w:t xml:space="preserve">Masatoshi Katabuchi (Organizer)</w:t>
       </w:r>
@@ -2850,13 +2947,7 @@
         <w:t xml:space="preserve"> </w:t>
       </w:r>
       <w:r>
-        <w:t xml:space="preserve">“</w:t>
-      </w:r>
-      <w:r>
-        <w:t xml:space="preserve">Seedling dynamics and its consequence to community assembly processes in a tropical forest</w:t>
-      </w:r>
-      <w:r>
-        <w:t xml:space="preserve">”</w:t>
+        <w:t xml:space="preserve">“Seedling dynamics and its consequence to community assembly processes in a tropical forest”</w:t>
       </w:r>
       <w:r>
         <w:t xml:space="preserve">, Symposium on</w:t>
@@ -2865,13 +2956,7 @@
         <w:t xml:space="preserve"> </w:t>
       </w:r>
       <w:r>
-        <w:t xml:space="preserve">“</w:t>
-      </w:r>
-      <w:r>
-        <w:t xml:space="preserve">Integrating the structure and dynamics of tree communities to uncover the mechanisms underlying species coexistence</w:t>
-      </w:r>
-      <w:r>
-        <w:t xml:space="preserve">”</w:t>
+        <w:t xml:space="preserve">“Integrating the structure and dynamics of tree communities to uncover the mechanisms underlying species coexistence”</w:t>
       </w:r>
       <w:r>
         <w:t xml:space="preserve">, 61st ESJ Annual meeting, Hiroshima, Japan</w:t>
@@ -2891,8 +2976,8 @@
       </w:pPr>
       <w:r>
         <w:rPr>
-          <w:bCs/>
-          <w:b/>
+          <w:b/>
+          <w:bCs/>
         </w:rPr>
         <w:t xml:space="preserve">Masatoshi Katabuchi</w:t>
       </w:r>
@@ -2906,13 +2991,7 @@
         <w:t xml:space="preserve"> </w:t>
       </w:r>
       <w:r>
-        <w:t xml:space="preserve">“</w:t>
-      </w:r>
-      <w:r>
-        <w:t xml:space="preserve">Community assembly and demography of tropical tree species</w:t>
-      </w:r>
-      <w:r>
-        <w:t xml:space="preserve">”</w:t>
+        <w:t xml:space="preserve">“Community assembly and demography of tropical tree species”</w:t>
       </w:r>
       <w:r>
         <w:t xml:space="preserve">, Workshop on</w:t>
@@ -2921,13 +3000,7 @@
         <w:t xml:space="preserve"> </w:t>
       </w:r>
       <w:r>
-        <w:t xml:space="preserve">“</w:t>
-      </w:r>
-      <w:r>
-        <w:t xml:space="preserve">Life history regulation of forest trees: towards cross-biome analysis</w:t>
-      </w:r>
-      <w:r>
-        <w:t xml:space="preserve">”</w:t>
+        <w:t xml:space="preserve">“Life history regulation of forest trees: towards cross-biome analysis”</w:t>
       </w:r>
       <w:r>
         <w:t xml:space="preserve">, Sapporo, Japan</w:t>
@@ -2939,8 +3012,8 @@
       </w:pPr>
       <w:r>
         <w:rPr>
-          <w:bCs/>
-          <w:b/>
+          <w:b/>
+          <w:bCs/>
         </w:rPr>
         <w:t xml:space="preserve">Submitted</w:t>
       </w:r>
@@ -2959,8 +3032,8 @@
       </w:pPr>
       <w:r>
         <w:rPr>
-          <w:bCs/>
-          <w:b/>
+          <w:b/>
+          <w:bCs/>
         </w:rPr>
         <w:t xml:space="preserve">Masatoshi Katabuchi</w:t>
       </w:r>
@@ -2971,13 +3044,7 @@
         <w:t xml:space="preserve"> </w:t>
       </w:r>
       <w:r>
-        <w:t xml:space="preserve">“</w:t>
-      </w:r>
-      <w:r>
-        <w:t xml:space="preserve">Combining metacommunity and trait-based approaches predicts species abundances distributions in biological communities</w:t>
-      </w:r>
-      <w:r>
-        <w:t xml:space="preserve">”</w:t>
+        <w:t xml:space="preserve">“Combining metacommunity and trait-based approaches predicts species abundances distributions in biological communities”</w:t>
       </w:r>
       <w:r>
         <w:t xml:space="preserve">, 66th ESJ Annual meeting, Kobe, Japan</w:t>
@@ -2997,8 +3064,8 @@
       </w:pPr>
       <w:r>
         <w:rPr>
-          <w:bCs/>
-          <w:b/>
+          <w:b/>
+          <w:bCs/>
         </w:rPr>
         <w:t xml:space="preserve">Masatoshi Katabuchi</w:t>
       </w:r>
@@ -3009,13 +3076,7 @@
         <w:t xml:space="preserve"> </w:t>
       </w:r>
       <w:r>
-        <w:t xml:space="preserve">“</w:t>
-      </w:r>
-      <w:r>
-        <w:t xml:space="preserve">Decomposing leaf mass into photosynthetic and structural components explains diverge patterns of trait variation within vs. among plant communities</w:t>
-      </w:r>
-      <w:r>
-        <w:t xml:space="preserve">”</w:t>
+        <w:t xml:space="preserve">“Decomposing leaf mass into photosynthetic and structural components explains diverge patterns of trait variation within vs. among plant communities”</w:t>
       </w:r>
       <w:r>
         <w:t xml:space="preserve">, 100th ESA Annual meeting, Baltimore, USA</w:t>
@@ -3035,8 +3096,8 @@
       </w:pPr>
       <w:r>
         <w:rPr>
-          <w:bCs/>
-          <w:b/>
+          <w:b/>
+          <w:bCs/>
         </w:rPr>
         <w:t xml:space="preserve">Masatoshi Katabuchi</w:t>
       </w:r>
@@ -3047,13 +3108,7 @@
         <w:t xml:space="preserve"> </w:t>
       </w:r>
       <w:r>
-        <w:t xml:space="preserve">“</w:t>
-      </w:r>
-      <w:r>
-        <w:t xml:space="preserve">Intraspecific trait variations affect spatial patterns of functional diversity among moorland plant communities</w:t>
-      </w:r>
-      <w:r>
-        <w:t xml:space="preserve">”</w:t>
+        <w:t xml:space="preserve">“Intraspecific trait variations affect spatial patterns of functional diversity among moorland plant communities”</w:t>
       </w:r>
       <w:r>
         <w:t xml:space="preserve">, 99th ESA Annual meeting, Sacramento, USA.</w:t>
@@ -3073,8 +3128,8 @@
       </w:pPr>
       <w:r>
         <w:rPr>
-          <w:bCs/>
-          <w:b/>
+          <w:b/>
+          <w:bCs/>
         </w:rPr>
         <w:t xml:space="preserve">Masatoshi Katabuchi</w:t>
       </w:r>
@@ -3085,13 +3140,7 @@
         <w:t xml:space="preserve"> </w:t>
       </w:r>
       <w:r>
-        <w:t xml:space="preserve">“</w:t>
-      </w:r>
-      <w:r>
-        <w:t xml:space="preserve">Negative density dependence reduces survival rates of common tree species in a species-rich tropical rain forest</w:t>
-      </w:r>
-      <w:r>
-        <w:t xml:space="preserve">”</w:t>
+        <w:t xml:space="preserve">“Negative density dependence reduces survival rates of common tree species in a species-rich tropical rain forest”</w:t>
       </w:r>
       <w:r>
         <w:t xml:space="preserve">, ATBC, San Jose, Costa Rica</w:t>
@@ -3111,8 +3160,8 @@
       </w:pPr>
       <w:r>
         <w:rPr>
-          <w:bCs/>
-          <w:b/>
+          <w:b/>
+          <w:bCs/>
         </w:rPr>
         <w:t xml:space="preserve">Masatoshi Katabuchi</w:t>
       </w:r>
@@ -3123,13 +3172,7 @@
         <w:t xml:space="preserve"> </w:t>
       </w:r>
       <w:r>
-        <w:t xml:space="preserve">“</w:t>
-      </w:r>
-      <w:r>
-        <w:t xml:space="preserve">Soil resource availability shapes community trait structure in a species-rich dipterocarp forest</w:t>
-      </w:r>
-      <w:r>
-        <w:t xml:space="preserve">”</w:t>
+        <w:t xml:space="preserve">“Soil resource availability shapes community trait structure in a species-rich dipterocarp forest”</w:t>
       </w:r>
       <w:r>
         <w:t xml:space="preserve">, ATBC Asia-Pacific chapter, XTBG, China</w:t>
@@ -3149,8 +3192,8 @@
       </w:pPr>
       <w:r>
         <w:rPr>
-          <w:bCs/>
-          <w:b/>
+          <w:b/>
+          <w:bCs/>
         </w:rPr>
         <w:t xml:space="preserve">Masatoshi Katabuchi</w:t>
       </w:r>
@@ -3161,13 +3204,7 @@
         <w:t xml:space="preserve"> </w:t>
       </w:r>
       <w:r>
-        <w:t xml:space="preserve">“</w:t>
-      </w:r>
-      <w:r>
-        <w:t xml:space="preserve">Nonrandom abundance distributions of a tropical tree community: evidence from traits correlation at a local scale</w:t>
-      </w:r>
-      <w:r>
-        <w:t xml:space="preserve">”</w:t>
+        <w:t xml:space="preserve">“Nonrandom abundance distributions of a tropical tree community: evidence from traits correlation at a local scale”</w:t>
       </w:r>
       <w:r>
         <w:t xml:space="preserve">. ATBC, Arusha, Tanzania</w:t>
@@ -3187,8 +3224,8 @@
       </w:pPr>
       <w:r>
         <w:rPr>
-          <w:bCs/>
-          <w:b/>
+          <w:b/>
+          <w:bCs/>
         </w:rPr>
         <w:t xml:space="preserve">Masatoshi Katabuchi</w:t>
       </w:r>
@@ -3199,13 +3236,7 @@
         <w:t xml:space="preserve"> </w:t>
       </w:r>
       <w:r>
-        <w:t xml:space="preserve">“</w:t>
-      </w:r>
-      <w:r>
-        <w:t xml:space="preserve">Soil variation and functional trait assembly in a diverse dipterocarp forest</w:t>
-      </w:r>
-      <w:r>
-        <w:t xml:space="preserve">”</w:t>
+        <w:t xml:space="preserve">“Soil variation and functional trait assembly in a diverse dipterocarp forest”</w:t>
       </w:r>
       <w:r>
         <w:t xml:space="preserve">. 95th ESA Annual meeting, Pittsburgh, USA</w:t>
@@ -3225,8 +3256,8 @@
       </w:pPr>
       <w:r>
         <w:rPr>
-          <w:bCs/>
-          <w:b/>
+          <w:b/>
+          <w:bCs/>
         </w:rPr>
         <w:t xml:space="preserve">Masatoshi Katabuchi</w:t>
       </w:r>
@@ -3237,20 +3268,14 @@
         <w:t xml:space="preserve"> </w:t>
       </w:r>
       <w:r>
-        <w:t xml:space="preserve">“</w:t>
-      </w:r>
-      <w:r>
-        <w:t xml:space="preserve">Inbreeding and mating structure in a dioecious-fig pollinating wasp</w:t>
-      </w:r>
-      <w:r>
-        <w:t xml:space="preserve">”</w:t>
+        <w:t xml:space="preserve">“Inbreeding and mating structure in a dioecious-fig pollinating wasp”</w:t>
       </w:r>
       <w:r>
         <w:t xml:space="preserve">. ATBC, Marburg, Germany</w:t>
       </w:r>
     </w:p>
-    <w:bookmarkEnd w:id="65"/>
-    <w:bookmarkStart w:id="66" w:name="outreach"/>
+    <w:bookmarkEnd w:id="66"/>
+    <w:bookmarkStart w:id="67" w:name="outreach"/>
     <w:p>
       <w:pPr>
         <w:pStyle w:val="Heading2"/>
@@ -3278,20 +3303,14 @@
         <w:t xml:space="preserve"> </w:t>
       </w:r>
       <w:r>
-        <w:t xml:space="preserve">“</w:t>
-      </w:r>
-      <w:r>
-        <w:t xml:space="preserve">Leaves and tropical rainforests</w:t>
-      </w:r>
-      <w:r>
-        <w:t xml:space="preserve">”</w:t>
+        <w:t xml:space="preserve">“Leaves and tropical rainforests”</w:t>
       </w:r>
       <w:r>
         <w:t xml:space="preserve">. Invited by the Japanese Association of Interdisciplinary Study Group in University Florida</w:t>
       </w:r>
     </w:p>
-    <w:bookmarkEnd w:id="66"/>
-    <w:bookmarkStart w:id="67" w:name="languages"/>
+    <w:bookmarkEnd w:id="67"/>
+    <w:bookmarkStart w:id="68" w:name="languages"/>
     <w:p>
       <w:pPr>
         <w:pStyle w:val="Heading2"/>
@@ -3308,8 +3327,8 @@
         <w:t xml:space="preserve">Japanese (native), English (fluent), Malay (basic), Chinese-Mandarin (basic)</w:t>
       </w:r>
     </w:p>
-    <w:bookmarkEnd w:id="67"/>
-    <w:bookmarkStart w:id="68" w:name="graduate-students"/>
+    <w:bookmarkEnd w:id="68"/>
+    <w:bookmarkStart w:id="69" w:name="graduate-students"/>
     <w:p>
       <w:pPr>
         <w:pStyle w:val="Heading2"/>
@@ -3326,7 +3345,7 @@
         <w:t xml:space="preserve">Zhou Cong, 2021 - Present, M.Sc. Student, Recipient of UCAS Scholarship.</w:t>
       </w:r>
     </w:p>
-    <w:bookmarkEnd w:id="68"/>
+    <w:bookmarkEnd w:id="69"/>
     <w:sectPr>
       <w:headerReference r:id="rId9" w:type="default"/>
       <w:footnotePr>
@@ -3390,14 +3409,14 @@
 <file path=word/numbering.xml><?xml version="1.0" encoding="utf-8"?>
 <w:numbering xmlns:w="http://schemas.openxmlformats.org/wordprocessingml/2006/main">
   <w:abstractNum w:abstractNumId="990">
-    <w:nsid w:val="A990"/>
+    <w:nsid w:val="0000A990"/>
     <w:multiLevelType w:val="multilevel"/>
     <w:lvl w:ilvl="0">
       <w:numFmt w:val="bullet"/>
       <w:lvlText w:val=" "/>
       <w:lvlJc w:val="left"/>
       <w:pPr>
-        <w:ind w:left="720" w:hanging="480"/>
+        <w:ind w:left="720" w:hanging="360"/>
       </w:pPr>
     </w:lvl>
     <w:lvl w:ilvl="1">
@@ -3405,7 +3424,7 @@
       <w:lvlText w:val=" "/>
       <w:lvlJc w:val="left"/>
       <w:pPr>
-        <w:ind w:left="1440" w:hanging="480"/>
+        <w:ind w:left="1440" w:hanging="360"/>
       </w:pPr>
     </w:lvl>
     <w:lvl w:ilvl="2">
@@ -3413,7 +3432,7 @@
       <w:lvlText w:val=" "/>
       <w:lvlJc w:val="left"/>
       <w:pPr>
-        <w:ind w:left="2160" w:hanging="480"/>
+        <w:ind w:left="2160" w:hanging="360"/>
       </w:pPr>
     </w:lvl>
     <w:lvl w:ilvl="3">
@@ -3421,7 +3440,7 @@
       <w:lvlText w:val=" "/>
       <w:lvlJc w:val="left"/>
       <w:pPr>
-        <w:ind w:left="2880" w:hanging="480"/>
+        <w:ind w:left="2880" w:hanging="360"/>
       </w:pPr>
     </w:lvl>
     <w:lvl w:ilvl="4">
@@ -3429,7 +3448,7 @@
       <w:lvlText w:val=" "/>
       <w:lvlJc w:val="left"/>
       <w:pPr>
-        <w:ind w:left="3600" w:hanging="480"/>
+        <w:ind w:left="3600" w:hanging="360"/>
       </w:pPr>
     </w:lvl>
     <w:lvl w:ilvl="5">
@@ -3437,7 +3456,7 @@
       <w:lvlText w:val=" "/>
       <w:lvlJc w:val="left"/>
       <w:pPr>
-        <w:ind w:left="4320" w:hanging="480"/>
+        <w:ind w:left="4320" w:hanging="360"/>
       </w:pPr>
     </w:lvl>
     <w:lvl w:ilvl="6">
@@ -3445,7 +3464,7 @@
       <w:lvlText w:val=" "/>
       <w:lvlJc w:val="left"/>
       <w:pPr>
-        <w:ind w:left="5040" w:hanging="480"/>
+        <w:ind w:left="5040" w:hanging="360"/>
       </w:pPr>
     </w:lvl>
     <w:lvl w:ilvl="7">
@@ -3453,7 +3472,7 @@
       <w:lvlText w:val=" "/>
       <w:lvlJc w:val="left"/>
       <w:pPr>
-        <w:ind w:left="5760" w:hanging="480"/>
+        <w:ind w:left="5760" w:hanging="360"/>
       </w:pPr>
     </w:lvl>
     <w:lvl w:ilvl="8">
@@ -3461,12 +3480,12 @@
       <w:lvlText w:val=" "/>
       <w:lvlJc w:val="left"/>
       <w:pPr>
-        <w:ind w:left="6480" w:hanging="480"/>
+        <w:ind w:left="6480" w:hanging="360"/>
       </w:pPr>
     </w:lvl>
   </w:abstractNum>
   <w:abstractNum w:abstractNumId="99411">
-    <w:nsid w:val="A99411"/>
+    <w:nsid w:val="00A99411"/>
     <w:multiLevelType w:val="multilevel"/>
     <w:lvl w:ilvl="0">
       <w:start w:val="1"/>
@@ -3474,7 +3493,7 @@
       <w:lvlText w:val="%1."/>
       <w:lvlJc w:val="left"/>
       <w:pPr>
-        <w:ind w:left="720" w:hanging="480"/>
+        <w:ind w:left="720" w:hanging="360"/>
       </w:pPr>
     </w:lvl>
     <w:lvl w:ilvl="1">
@@ -3483,7 +3502,7 @@
       <w:lvlText w:val="%2."/>
       <w:lvlJc w:val="left"/>
       <w:pPr>
-        <w:ind w:left="1440" w:hanging="480"/>
+        <w:ind w:left="1440" w:hanging="360"/>
       </w:pPr>
     </w:lvl>
     <w:lvl w:ilvl="2">
@@ -3492,7 +3511,7 @@
       <w:lvlText w:val="%3."/>
       <w:lvlJc w:val="left"/>
       <w:pPr>
-        <w:ind w:left="2160" w:hanging="480"/>
+        <w:ind w:left="2160" w:hanging="360"/>
       </w:pPr>
     </w:lvl>
     <w:lvl w:ilvl="3">
@@ -3501,7 +3520,7 @@
       <w:lvlText w:val="%4."/>
       <w:lvlJc w:val="left"/>
       <w:pPr>
-        <w:ind w:left="2880" w:hanging="480"/>
+        <w:ind w:left="2880" w:hanging="360"/>
       </w:pPr>
     </w:lvl>
     <w:lvl w:ilvl="4">
@@ -3510,7 +3529,7 @@
       <w:lvlText w:val="%5."/>
       <w:lvlJc w:val="left"/>
       <w:pPr>
-        <w:ind w:left="3600" w:hanging="480"/>
+        <w:ind w:left="3600" w:hanging="360"/>
       </w:pPr>
     </w:lvl>
     <w:lvl w:ilvl="5">
@@ -3519,7 +3538,7 @@
       <w:lvlText w:val="%6."/>
       <w:lvlJc w:val="left"/>
       <w:pPr>
-        <w:ind w:left="4320" w:hanging="480"/>
+        <w:ind w:left="4320" w:hanging="360"/>
       </w:pPr>
     </w:lvl>
     <w:lvl w:ilvl="6">
@@ -3528,7 +3547,7 @@
       <w:lvlText w:val="%7."/>
       <w:lvlJc w:val="left"/>
       <w:pPr>
-        <w:ind w:left="5040" w:hanging="480"/>
+        <w:ind w:left="5040" w:hanging="360"/>
       </w:pPr>
     </w:lvl>
     <w:lvl w:ilvl="7">
@@ -3537,7 +3556,7 @@
       <w:lvlText w:val="%8."/>
       <w:lvlJc w:val="left"/>
       <w:pPr>
-        <w:ind w:left="5760" w:hanging="480"/>
+        <w:ind w:left="5760" w:hanging="360"/>
       </w:pPr>
     </w:lvl>
     <w:lvl w:ilvl="8">
@@ -3546,7 +3565,7 @@
       <w:lvlText w:val="%9."/>
       <w:lvlJc w:val="left"/>
       <w:pPr>
-        <w:ind w:left="6480" w:hanging="480"/>
+        <w:ind w:left="6480" w:hanging="360"/>
       </w:pPr>
     </w:lvl>
   </w:abstractNum>
@@ -4661,6 +4680,7 @@
     <w:name w:val="KeywordTok"/>
     <w:basedOn w:val="VerbatimChar"/>
     <w:rPr>
+      <w:b/>
       <w:color w:val="003b4f"/>
       <w:shd w:val="clear" w:fill="f1f3f5"/>
     </w:rPr>
@@ -4765,9 +4785,9 @@
     <w:name w:val="DocumentationTok"/>
     <w:basedOn w:val="VerbatimChar"/>
     <w:rPr>
+      <w:i/>
       <w:color w:val="5e5e5e"/>
       <w:shd w:val="clear" w:fill="f1f3f5"/>
-      <w:i/>
     </w:rPr>
   </w:style>
   <w:style w:type="character" w:customStyle="1" w:styleId="AnnotationTok">
@@ -4782,9 +4802,9 @@
     <w:name w:val="CommentVarTok"/>
     <w:basedOn w:val="VerbatimChar"/>
     <w:rPr>
+      <w:i/>
       <w:color w:val="5e5e5e"/>
       <w:shd w:val="clear" w:fill="f1f3f5"/>
-      <w:i/>
     </w:rPr>
   </w:style>
   <w:style w:type="character" w:customStyle="1" w:styleId="OtherTok">
@@ -4815,6 +4835,7 @@
     <w:name w:val="ControlFlowTok"/>
     <w:basedOn w:val="VerbatimChar"/>
     <w:rPr>
+      <w:b/>
       <w:color w:val="003b4f"/>
       <w:shd w:val="clear" w:fill="f1f3f5"/>
     </w:rPr>
@@ -4879,9 +4900,9 @@
     <w:name w:val="WarningTok"/>
     <w:basedOn w:val="VerbatimChar"/>
     <w:rPr>
+      <w:i/>
       <w:color w:val="5e5e5e"/>
       <w:shd w:val="clear" w:fill="f1f3f5"/>
-      <w:i/>
     </w:rPr>
   </w:style>
   <w:style w:type="character" w:customStyle="1" w:styleId="AlertTok">

</xml_diff>

<commit_message>
Deploying to gh-pages from @ mattocci27/my-cv@5dae9a129bbd07b2a1e693a788999205fdf890b1 🚀
</commit_message>
<xml_diff>
--- a/Katabuchi_CV.docx
+++ b/Katabuchi_CV.docx
@@ -3342,7 +3342,15 @@
         <w:pStyle w:val="FirstParagraph"/>
       </w:pPr>
       <w:r>
-        <w:t xml:space="preserve">Zhou Cong, 2021 - Present, M.Sc. Student, Recipient of UCAS Scholarship.</w:t>
+        <w:t xml:space="preserve">Thi Duyen Nguyen, 2021 - 2025, M.Sc. Student, Recipient of ANSO Scholarship.</w:t>
+      </w:r>
+    </w:p>
+    <w:p>
+      <w:pPr>
+        <w:pStyle w:val="TextBody"/>
+      </w:pPr>
+      <w:r>
+        <w:t xml:space="preserve">Zhou Cong, 2021 - 2023, M.Sc. Student, Recipient of UCAS Scholarship.</w:t>
       </w:r>
     </w:p>
     <w:bookmarkEnd w:id="69"/>

</xml_diff>

<commit_message>
Deploying to gh-pages from @ mattocci27/my-cv@220923a499f433a9934cfc957a65b1142b3fa5f7 🚀
</commit_message>
<xml_diff>
--- a/Katabuchi_CV.docx
+++ b/Katabuchi_CV.docx
@@ -377,7 +377,7 @@
         <w:pStyle w:val="Definition"/>
       </w:pPr>
       <w:r>
-        <w:t xml:space="preserve">Xingdian Talent Support Program of Yunnan Province 600,000 RMB</w:t>
+        <w:t xml:space="preserve">Xingdian Talent Support Program of Yunnan Province (E5YNR03B01) 600,000 RMB</w:t>
       </w:r>
     </w:p>
     <w:p>
@@ -2583,6 +2583,22 @@
         <w:pStyle w:val="DefinitionTerm"/>
       </w:pPr>
       <w:r>
+        <w:t xml:space="preserve">2025</w:t>
+      </w:r>
+    </w:p>
+    <w:p>
+      <w:pPr>
+        <w:pStyle w:val="Definition"/>
+      </w:pPr>
+      <w:r>
+        <w:t xml:space="preserve">The 8th Advanced Statistics Workshop, Xishuangbanna Tropical Botanical Garden, Chinese Academy of Sciences, China</w:t>
+      </w:r>
+    </w:p>
+    <w:p>
+      <w:pPr>
+        <w:pStyle w:val="DefinitionTerm"/>
+      </w:pPr>
+      <w:r>
         <w:t xml:space="preserve">2019-</w:t>
       </w:r>
     </w:p>
@@ -2591,7 +2607,7 @@
         <w:pStyle w:val="Definition"/>
       </w:pPr>
       <w:r>
-        <w:t xml:space="preserve">How do we measure and study biological diversity?, Advanced Field course in Ecology and Conservation, Xishuangbanna Tropical Botanical Garden, Chinese Academy of Sciences, China</w:t>
+        <w:t xml:space="preserve">Advanced Field course in Ecology and Conservation, Xishuangbanna Tropical Botanical Garden, Chinese Academy of Sciences, China</w:t>
       </w:r>
     </w:p>
     <w:p>
@@ -2627,13 +2643,13 @@
       </w:r>
     </w:p>
     <w:bookmarkEnd w:id="61"/>
-    <w:bookmarkStart w:id="63" w:name="service"/>
+    <w:bookmarkStart w:id="64" w:name="academic-service"/>
     <w:p>
       <w:pPr>
         <w:pStyle w:val="Heading2"/>
       </w:pPr>
       <w:r>
-        <w:t xml:space="preserve">Service</w:t>
+        <w:t xml:space="preserve">Academic Service</w:t>
       </w:r>
     </w:p>
     <w:p>
@@ -2641,6 +2657,28 @@
         <w:pStyle w:val="DefinitionTerm"/>
       </w:pPr>
       <w:r>
+        <w:t xml:space="preserve">2023-</w:t>
+      </w:r>
+    </w:p>
+    <w:p>
+      <w:pPr>
+        <w:pStyle w:val="Definition"/>
+      </w:pPr>
+      <w:hyperlink r:id="rId62"/>
+    </w:p>
+    <w:p>
+      <w:pPr>
+        <w:pStyle w:val="Definition"/>
+      </w:pPr>
+      <w:r>
+        <w:t xml:space="preserve">Editorial Board Member of Thai Forest Ecological Research Journal</w:t>
+      </w:r>
+    </w:p>
+    <w:p>
+      <w:pPr>
+        <w:pStyle w:val="DefinitionTerm"/>
+      </w:pPr>
+      <w:r>
         <w:t xml:space="preserve">2015-2017</w:t>
       </w:r>
     </w:p>
@@ -2702,22 +2740,588 @@
         <w:t xml:space="preserve">Statistical editor for Lepcey, The Journal of Tropical Asian Entomology</w:t>
       </w:r>
     </w:p>
+    <w:bookmarkStart w:id="63" w:name="reviewer-for-journals-12-per-year"/>
+    <w:p>
+      <w:pPr>
+        <w:pStyle w:val="Heading3"/>
+      </w:pPr>
+      <w:r>
+        <w:t xml:space="preserve">Reviewer for journals (~ 12 per year):</w:t>
+      </w:r>
+    </w:p>
+    <w:bookmarkEnd w:id="63"/>
+    <w:bookmarkEnd w:id="64"/>
+    <w:bookmarkStart w:id="65" w:name="awards-and-prizes"/>
+    <w:p>
+      <w:pPr>
+        <w:pStyle w:val="Heading2"/>
+      </w:pPr>
+      <w:r>
+        <w:t xml:space="preserve">Awards and Prizes</w:t>
+      </w:r>
+    </w:p>
+    <w:p>
+      <w:pPr>
+        <w:pStyle w:val="DefinitionTerm"/>
+      </w:pPr>
+      <w:r>
+        <w:t xml:space="preserve">2012</w:t>
+      </w:r>
+    </w:p>
+    <w:p>
+      <w:pPr>
+        <w:pStyle w:val="Definition"/>
+      </w:pPr>
+      <w:r>
+        <w:t xml:space="preserve">Dean’s award for excellence, Graduate School of Life Sciences (Doctoral Program), Tohoku University</w:t>
+      </w:r>
+    </w:p>
+    <w:p>
+      <w:pPr>
+        <w:pStyle w:val="DefinitionTerm"/>
+      </w:pPr>
+      <w:r>
+        <w:t xml:space="preserve">2009</w:t>
+      </w:r>
+    </w:p>
+    <w:p>
+      <w:pPr>
+        <w:pStyle w:val="Definition"/>
+      </w:pPr>
+      <w:r>
+        <w:t xml:space="preserve">Dean’s award for excellence, Graduate School of Life Sciences (Master’s Program), Tohoku University</w:t>
+      </w:r>
+    </w:p>
+    <w:bookmarkEnd w:id="65"/>
+    <w:bookmarkStart w:id="66" w:name="invited-seminars"/>
+    <w:p>
+      <w:pPr>
+        <w:pStyle w:val="Heading2"/>
+      </w:pPr>
+      <w:r>
+        <w:t xml:space="preserve">Invited Seminars</w:t>
+      </w:r>
+    </w:p>
+    <w:p>
+      <w:pPr>
+        <w:pStyle w:val="DefinitionTerm"/>
+      </w:pPr>
+      <w:r>
+        <w:t xml:space="preserve">2021</w:t>
+      </w:r>
+    </w:p>
+    <w:p>
+      <w:pPr>
+        <w:pStyle w:val="Definition"/>
+      </w:pPr>
+      <w:r>
+        <w:t xml:space="preserve">Introduction to visualization using ggplot2, International Institute of Tropical Agriculture, Kenya</w:t>
+      </w:r>
+    </w:p>
+    <w:p>
+      <w:pPr>
+        <w:pStyle w:val="DefinitionTerm"/>
+      </w:pPr>
+      <w:r>
+        <w:t xml:space="preserve">2018</w:t>
+      </w:r>
+    </w:p>
+    <w:p>
+      <w:pPr>
+        <w:pStyle w:val="Definition"/>
+      </w:pPr>
+      <w:r>
+        <w:t xml:space="preserve">A quantitative model for divergent drivers of leaf trait variation within and among plant species, Xishuangbanna Tropical Botanical Garden, China</w:t>
+      </w:r>
+    </w:p>
+    <w:p>
+      <w:pPr>
+        <w:pStyle w:val="DefinitionTerm"/>
+      </w:pPr>
+      <w:r>
+        <w:t xml:space="preserve">2018</w:t>
+      </w:r>
+    </w:p>
+    <w:p>
+      <w:pPr>
+        <w:pStyle w:val="Definition"/>
+      </w:pPr>
+      <w:r>
+        <w:t xml:space="preserve">Species coexistence and functional traits. Graduate School of Life Sciences, Tohoku University, Japan</w:t>
+      </w:r>
+    </w:p>
+    <w:p>
+      <w:pPr>
+        <w:pStyle w:val="DefinitionTerm"/>
+      </w:pPr>
+      <w:r>
+        <w:t xml:space="preserve">2018</w:t>
+      </w:r>
+    </w:p>
+    <w:p>
+      <w:pPr>
+        <w:pStyle w:val="Definition"/>
+      </w:pPr>
+      <w:r>
+        <w:t xml:space="preserve">Species coexistence and functional traits. Graduate School of Environment and Information Sciences, Yokoyama National University, Japan</w:t>
+      </w:r>
+    </w:p>
+    <w:p>
+      <w:pPr>
+        <w:pStyle w:val="DefinitionTerm"/>
+      </w:pPr>
+      <w:r>
+        <w:t xml:space="preserve">2016</w:t>
+      </w:r>
+    </w:p>
+    <w:p>
+      <w:pPr>
+        <w:pStyle w:val="Definition"/>
+      </w:pPr>
+      <w:r>
+        <w:t xml:space="preserve">Decomposing leaf mass into photosynthetic and structural components explains divergent patterns of trait variation within and among plant species. Department of Ecology and Evolutionary Biology, Princeton University, NJ</w:t>
+      </w:r>
+    </w:p>
+    <w:p>
+      <w:pPr>
+        <w:pStyle w:val="DefinitionTerm"/>
+      </w:pPr>
+      <w:r>
+        <w:t xml:space="preserve">2013</w:t>
+      </w:r>
+    </w:p>
+    <w:p>
+      <w:pPr>
+        <w:pStyle w:val="Definition"/>
+      </w:pPr>
+      <w:r>
+        <w:t xml:space="preserve">Additive partitioning of functional diversity in plant communities, Xishuangbanna Tropical Botanical Garden, China</w:t>
+      </w:r>
+    </w:p>
+    <w:bookmarkEnd w:id="66"/>
+    <w:bookmarkStart w:id="67" w:name="international-meetings"/>
+    <w:p>
+      <w:pPr>
+        <w:pStyle w:val="Heading2"/>
+      </w:pPr>
+      <w:r>
+        <w:t xml:space="preserve">International Meetings</w:t>
+      </w:r>
+    </w:p>
     <w:p>
       <w:pPr>
         <w:pStyle w:val="FirstParagraph"/>
       </w:pPr>
       <w:r>
-        <w:t xml:space="preserve">Reviewer for journals (~ 12 per year):</w:t>
-      </w:r>
-    </w:p>
-    <w:bookmarkEnd w:id="63"/>
-    <w:bookmarkStart w:id="64" w:name="awards-and-prizes"/>
+        <w:rPr>
+          <w:b/>
+          <w:bCs/>
+        </w:rPr>
+        <w:t xml:space="preserve">Invited</w:t>
+      </w:r>
+    </w:p>
+    <w:p>
+      <w:pPr>
+        <w:pStyle w:val="DefinitionTerm"/>
+      </w:pPr>
+      <w:r>
+        <w:t xml:space="preserve">2015</w:t>
+      </w:r>
+    </w:p>
+    <w:p>
+      <w:pPr>
+        <w:pStyle w:val="Definition"/>
+      </w:pPr>
+      <w:r>
+        <w:rPr>
+          <w:b/>
+          <w:bCs/>
+        </w:rPr>
+        <w:t xml:space="preserve">Masatoshi Katabuchi</w:t>
+      </w:r>
+      <w:r>
+        <w:t xml:space="preserve">,</w:t>
+      </w:r>
+      <w:r>
+        <w:t xml:space="preserve"> </w:t>
+      </w:r>
+      <w:r>
+        <w:t xml:space="preserve">“Future perspective for functional trait research”</w:t>
+      </w:r>
+      <w:r>
+        <w:t xml:space="preserve">, Organized session on</w:t>
+      </w:r>
+      <w:r>
+        <w:t xml:space="preserve"> </w:t>
+      </w:r>
+      <w:r>
+        <w:t xml:space="preserve">“Achievements and outstanding questions for trait-based forest ecology”</w:t>
+      </w:r>
+      <w:r>
+        <w:t xml:space="preserve">, 62nd ESJ Annual meeting, Kagoshima, Japan</w:t>
+      </w:r>
+    </w:p>
+    <w:p>
+      <w:pPr>
+        <w:pStyle w:val="DefinitionTerm"/>
+      </w:pPr>
+      <w:r>
+        <w:t xml:space="preserve">2014</w:t>
+      </w:r>
+    </w:p>
+    <w:p>
+      <w:pPr>
+        <w:pStyle w:val="Definition"/>
+      </w:pPr>
+      <w:r>
+        <w:rPr>
+          <w:b/>
+          <w:bCs/>
+        </w:rPr>
+        <w:t xml:space="preserve">Masatoshi Katabuchi (Organizer)</w:t>
+      </w:r>
+      <w:r>
+        <w:t xml:space="preserve">,</w:t>
+      </w:r>
+      <w:r>
+        <w:t xml:space="preserve"> </w:t>
+      </w:r>
+      <w:r>
+        <w:t xml:space="preserve">“Seedling dynamics and its consequence to community assembly processes in a tropical forest”</w:t>
+      </w:r>
+      <w:r>
+        <w:t xml:space="preserve">, Symposium on</w:t>
+      </w:r>
+      <w:r>
+        <w:t xml:space="preserve"> </w:t>
+      </w:r>
+      <w:r>
+        <w:t xml:space="preserve">“Integrating the structure and dynamics of tree communities to uncover the mechanisms underlying species coexistence”</w:t>
+      </w:r>
+      <w:r>
+        <w:t xml:space="preserve">, 61st ESJ Annual meeting, Hiroshima, Japan</w:t>
+      </w:r>
+    </w:p>
+    <w:p>
+      <w:pPr>
+        <w:pStyle w:val="DefinitionTerm"/>
+      </w:pPr>
+      <w:r>
+        <w:t xml:space="preserve">2011</w:t>
+      </w:r>
+    </w:p>
+    <w:p>
+      <w:pPr>
+        <w:pStyle w:val="Definition"/>
+      </w:pPr>
+      <w:r>
+        <w:rPr>
+          <w:b/>
+          <w:bCs/>
+        </w:rPr>
+        <w:t xml:space="preserve">Masatoshi Katabuchi</w:t>
+      </w:r>
+      <w:r>
+        <w:t xml:space="preserve"> </w:t>
+      </w:r>
+      <w:r>
+        <w:t xml:space="preserve">and Hiroko Kurokawa</w:t>
+      </w:r>
+      <w:r>
+        <w:t xml:space="preserve"> </w:t>
+      </w:r>
+      <w:r>
+        <w:t xml:space="preserve">“Community assembly and demography of tropical tree species”</w:t>
+      </w:r>
+      <w:r>
+        <w:t xml:space="preserve">, Workshop on</w:t>
+      </w:r>
+      <w:r>
+        <w:t xml:space="preserve"> </w:t>
+      </w:r>
+      <w:r>
+        <w:t xml:space="preserve">“Life history regulation of forest trees: towards cross-biome analysis”</w:t>
+      </w:r>
+      <w:r>
+        <w:t xml:space="preserve">, Sapporo, Japan</w:t>
+      </w:r>
+    </w:p>
+    <w:p>
+      <w:pPr>
+        <w:pStyle w:val="FirstParagraph"/>
+      </w:pPr>
+      <w:r>
+        <w:rPr>
+          <w:b/>
+          <w:bCs/>
+        </w:rPr>
+        <w:t xml:space="preserve">Submitted</w:t>
+      </w:r>
+    </w:p>
+    <w:p>
+      <w:pPr>
+        <w:pStyle w:val="DefinitionTerm"/>
+      </w:pPr>
+      <w:r>
+        <w:t xml:space="preserve">2019</w:t>
+      </w:r>
+    </w:p>
+    <w:p>
+      <w:pPr>
+        <w:pStyle w:val="Definition"/>
+      </w:pPr>
+      <w:r>
+        <w:rPr>
+          <w:b/>
+          <w:bCs/>
+        </w:rPr>
+        <w:t xml:space="preserve">Masatoshi Katabuchi</w:t>
+      </w:r>
+      <w:r>
+        <w:t xml:space="preserve">, Kaito Umemura, Thomas Koffel, Litchman Elena, Klausmeier A Christopher,</w:t>
+      </w:r>
+      <w:r>
+        <w:t xml:space="preserve"> </w:t>
+      </w:r>
+      <w:r>
+        <w:t xml:space="preserve">“Combining metacommunity and trait-based approaches predicts species abundances distributions in biological communities”</w:t>
+      </w:r>
+      <w:r>
+        <w:t xml:space="preserve">, 66th ESJ Annual meeting, Kobe, Japan</w:t>
+      </w:r>
+    </w:p>
+    <w:p>
+      <w:pPr>
+        <w:pStyle w:val="DefinitionTerm"/>
+      </w:pPr>
+      <w:r>
+        <w:t xml:space="preserve">2015</w:t>
+      </w:r>
+    </w:p>
+    <w:p>
+      <w:pPr>
+        <w:pStyle w:val="Definition"/>
+      </w:pPr>
+      <w:r>
+        <w:rPr>
+          <w:b/>
+          <w:bCs/>
+        </w:rPr>
+        <w:t xml:space="preserve">Masatoshi Katabuchi</w:t>
+      </w:r>
+      <w:r>
+        <w:t xml:space="preserve">, Kaoru Kitajima, Joesph Wright, Jeanne Osnas and Jeremy Lichstein</w:t>
+      </w:r>
+      <w:r>
+        <w:t xml:space="preserve"> </w:t>
+      </w:r>
+      <w:r>
+        <w:t xml:space="preserve">“Decomposing leaf mass into photosynthetic and structural components explains diverge patterns of trait variation within vs. among plant communities”</w:t>
+      </w:r>
+      <w:r>
+        <w:t xml:space="preserve">, 100th ESA Annual meeting, Baltimore, USA</w:t>
+      </w:r>
+    </w:p>
+    <w:p>
+      <w:pPr>
+        <w:pStyle w:val="DefinitionTerm"/>
+      </w:pPr>
+      <w:r>
+        <w:t xml:space="preserve">2014</w:t>
+      </w:r>
+    </w:p>
+    <w:p>
+      <w:pPr>
+        <w:pStyle w:val="Definition"/>
+      </w:pPr>
+      <w:r>
+        <w:rPr>
+          <w:b/>
+          <w:bCs/>
+        </w:rPr>
+        <w:t xml:space="preserve">Masatoshi Katabuchi</w:t>
+      </w:r>
+      <w:r>
+        <w:t xml:space="preserve">, Takehiro Sasaki, Chiho Kamiyama, Masaya Shimazaki, Tohru Nakashizuka and Kouki Hikosaka</w:t>
+      </w:r>
+      <w:r>
+        <w:t xml:space="preserve"> </w:t>
+      </w:r>
+      <w:r>
+        <w:t xml:space="preserve">“Intraspecific trait variations affect spatial patterns of functional diversity among moorland plant communities”</w:t>
+      </w:r>
+      <w:r>
+        <w:t xml:space="preserve">, 99th ESA Annual meeting, Sacramento, USA.</w:t>
+      </w:r>
+    </w:p>
+    <w:p>
+      <w:pPr>
+        <w:pStyle w:val="DefinitionTerm"/>
+      </w:pPr>
+      <w:r>
+        <w:t xml:space="preserve">2013</w:t>
+      </w:r>
+    </w:p>
+    <w:p>
+      <w:pPr>
+        <w:pStyle w:val="Definition"/>
+      </w:pPr>
+      <w:r>
+        <w:rPr>
+          <w:b/>
+          <w:bCs/>
+        </w:rPr>
+        <w:t xml:space="preserve">Masatoshi Katabuchi</w:t>
+      </w:r>
+      <w:r>
+        <w:t xml:space="preserve">, Sylvester Tan and Tohru Nakashizuka</w:t>
+      </w:r>
+      <w:r>
+        <w:t xml:space="preserve"> </w:t>
+      </w:r>
+      <w:r>
+        <w:t xml:space="preserve">“Negative density dependence reduces survival rates of common tree species in a species-rich tropical rain forest”</w:t>
+      </w:r>
+      <w:r>
+        <w:t xml:space="preserve">, ATBC, San Jose, Costa Rica</w:t>
+      </w:r>
+    </w:p>
+    <w:p>
+      <w:pPr>
+        <w:pStyle w:val="DefinitionTerm"/>
+      </w:pPr>
+      <w:r>
+        <w:t xml:space="preserve">2012</w:t>
+      </w:r>
+    </w:p>
+    <w:p>
+      <w:pPr>
+        <w:pStyle w:val="Definition"/>
+      </w:pPr>
+      <w:r>
+        <w:rPr>
+          <w:b/>
+          <w:bCs/>
+        </w:rPr>
+        <w:t xml:space="preserve">Masatoshi Katabuchi</w:t>
+      </w:r>
+      <w:r>
+        <w:t xml:space="preserve">, Hiroko Kurokawa, Stuart Davies, Sylvester Tan and Tohru Nakashizuka</w:t>
+      </w:r>
+      <w:r>
+        <w:t xml:space="preserve"> </w:t>
+      </w:r>
+      <w:r>
+        <w:t xml:space="preserve">“Soil resource availability shapes community trait structure in a species-rich dipterocarp forest”</w:t>
+      </w:r>
+      <w:r>
+        <w:t xml:space="preserve">, ATBC Asia-Pacific chapter, XTBG, China</w:t>
+      </w:r>
+    </w:p>
+    <w:p>
+      <w:pPr>
+        <w:pStyle w:val="DefinitionTerm"/>
+      </w:pPr>
+      <w:r>
+        <w:t xml:space="preserve">2011</w:t>
+      </w:r>
+    </w:p>
+    <w:p>
+      <w:pPr>
+        <w:pStyle w:val="Definition"/>
+      </w:pPr>
+      <w:r>
+        <w:rPr>
+          <w:b/>
+          <w:bCs/>
+        </w:rPr>
+        <w:t xml:space="preserve">Masatoshi Katabuchi</w:t>
+      </w:r>
+      <w:r>
+        <w:t xml:space="preserve">, Hiroko Kurokawa, Sylvester Tan, Stuart J. Davies, and Tohru Nakashizuka,</w:t>
+      </w:r>
+      <w:r>
+        <w:t xml:space="preserve"> </w:t>
+      </w:r>
+      <w:r>
+        <w:t xml:space="preserve">“Nonrandom abundance distributions of a tropical tree community: evidence from traits correlation at a local scale”</w:t>
+      </w:r>
+      <w:r>
+        <w:t xml:space="preserve">. ATBC, Arusha, Tanzania</w:t>
+      </w:r>
+    </w:p>
+    <w:p>
+      <w:pPr>
+        <w:pStyle w:val="DefinitionTerm"/>
+      </w:pPr>
+      <w:r>
+        <w:t xml:space="preserve">2010</w:t>
+      </w:r>
+    </w:p>
+    <w:p>
+      <w:pPr>
+        <w:pStyle w:val="Definition"/>
+      </w:pPr>
+      <w:r>
+        <w:rPr>
+          <w:b/>
+          <w:bCs/>
+        </w:rPr>
+        <w:t xml:space="preserve">Masatoshi Katabuchi</w:t>
+      </w:r>
+      <w:r>
+        <w:t xml:space="preserve">, Hiroko Kurokawa, Sylvester Tan, and Tohru Nakashizuka,</w:t>
+      </w:r>
+      <w:r>
+        <w:t xml:space="preserve"> </w:t>
+      </w:r>
+      <w:r>
+        <w:t xml:space="preserve">“Soil variation and functional trait assembly in a diverse dipterocarp forest”</w:t>
+      </w:r>
+      <w:r>
+        <w:t xml:space="preserve">. 95th ESA Annual meeting, Pittsburgh, USA</w:t>
+      </w:r>
+    </w:p>
+    <w:p>
+      <w:pPr>
+        <w:pStyle w:val="DefinitionTerm"/>
+      </w:pPr>
+      <w:r>
+        <w:t xml:space="preserve">2009</w:t>
+      </w:r>
+    </w:p>
+    <w:p>
+      <w:pPr>
+        <w:pStyle w:val="Definition"/>
+      </w:pPr>
+      <w:r>
+        <w:rPr>
+          <w:b/>
+          <w:bCs/>
+        </w:rPr>
+        <w:t xml:space="preserve">Masatoshi Katabuchi</w:t>
+      </w:r>
+      <w:r>
+        <w:t xml:space="preserve">, Jun Yokoyama, and Tohru Nakashizuka,</w:t>
+      </w:r>
+      <w:r>
+        <w:t xml:space="preserve"> </w:t>
+      </w:r>
+      <w:r>
+        <w:t xml:space="preserve">“Inbreeding and mating structure in a dioecious-fig pollinating wasp”</w:t>
+      </w:r>
+      <w:r>
+        <w:t xml:space="preserve">. ATBC, Marburg, Germany</w:t>
+      </w:r>
+    </w:p>
+    <w:bookmarkEnd w:id="67"/>
+    <w:bookmarkStart w:id="68" w:name="outreach"/>
     <w:p>
       <w:pPr>
         <w:pStyle w:val="Heading2"/>
       </w:pPr>
       <w:r>
-        <w:t xml:space="preserve">Awards and Prizes</w:t>
+        <w:t xml:space="preserve">Outreach</w:t>
       </w:r>
     </w:p>
     <w:p>
@@ -2725,147 +3329,52 @@
         <w:pStyle w:val="DefinitionTerm"/>
       </w:pPr>
       <w:r>
-        <w:t xml:space="preserve">2012</w:t>
-      </w:r>
-    </w:p>
-    <w:p>
-      <w:pPr>
-        <w:pStyle w:val="Definition"/>
-      </w:pPr>
-      <w:r>
-        <w:t xml:space="preserve">Dean’s award for excellence, Graduate School of Life Sciences (Doctoral Program), Tohoku University</w:t>
-      </w:r>
-    </w:p>
-    <w:p>
-      <w:pPr>
-        <w:pStyle w:val="DefinitionTerm"/>
-      </w:pPr>
-      <w:r>
-        <w:t xml:space="preserve">2009</w:t>
-      </w:r>
-    </w:p>
-    <w:p>
-      <w:pPr>
-        <w:pStyle w:val="Definition"/>
-      </w:pPr>
-      <w:r>
-        <w:t xml:space="preserve">Dean’s award for excellence, Graduate School of Life Sciences (Master’s Program), Tohoku University</w:t>
-      </w:r>
-    </w:p>
-    <w:bookmarkEnd w:id="64"/>
-    <w:bookmarkStart w:id="65" w:name="invited-seminars"/>
+        <w:t xml:space="preserve">2015</w:t>
+      </w:r>
+    </w:p>
+    <w:p>
+      <w:pPr>
+        <w:pStyle w:val="Definition"/>
+      </w:pPr>
+      <w:r>
+        <w:t xml:space="preserve">Masatoshi Katabuchi</w:t>
+      </w:r>
+      <w:r>
+        <w:t xml:space="preserve"> </w:t>
+      </w:r>
+      <w:r>
+        <w:t xml:space="preserve">“Leaves and tropical rainforests”</w:t>
+      </w:r>
+      <w:r>
+        <w:t xml:space="preserve">. Invited by the Japanese Association of Interdisciplinary Study Group in University Florida</w:t>
+      </w:r>
+    </w:p>
+    <w:bookmarkEnd w:id="68"/>
+    <w:bookmarkStart w:id="69" w:name="languages"/>
     <w:p>
       <w:pPr>
         <w:pStyle w:val="Heading2"/>
       </w:pPr>
       <w:r>
-        <w:t xml:space="preserve">Invited Seminars</w:t>
-      </w:r>
-    </w:p>
-    <w:p>
-      <w:pPr>
-        <w:pStyle w:val="DefinitionTerm"/>
-      </w:pPr>
-      <w:r>
-        <w:t xml:space="preserve">2021</w:t>
-      </w:r>
-    </w:p>
-    <w:p>
-      <w:pPr>
-        <w:pStyle w:val="Definition"/>
-      </w:pPr>
-      <w:r>
-        <w:t xml:space="preserve">Introduction to visualization using ggplot2, International Institute of Tropical Agriculture, Kenya</w:t>
-      </w:r>
-    </w:p>
-    <w:p>
-      <w:pPr>
-        <w:pStyle w:val="DefinitionTerm"/>
-      </w:pPr>
-      <w:r>
-        <w:t xml:space="preserve">2018</w:t>
-      </w:r>
-    </w:p>
-    <w:p>
-      <w:pPr>
-        <w:pStyle w:val="Definition"/>
-      </w:pPr>
-      <w:r>
-        <w:t xml:space="preserve">A quantitative model for divergent drivers of leaf trait variation within and among plant species, Xishuangbanna Tropical Botanical Garden, China</w:t>
-      </w:r>
-    </w:p>
-    <w:p>
-      <w:pPr>
-        <w:pStyle w:val="DefinitionTerm"/>
-      </w:pPr>
-      <w:r>
-        <w:t xml:space="preserve">2018</w:t>
-      </w:r>
-    </w:p>
-    <w:p>
-      <w:pPr>
-        <w:pStyle w:val="Definition"/>
-      </w:pPr>
-      <w:r>
-        <w:t xml:space="preserve">Species coexistence and functional traits. Graduate School of Life Sciences, Tohoku University, Japan</w:t>
-      </w:r>
-    </w:p>
-    <w:p>
-      <w:pPr>
-        <w:pStyle w:val="DefinitionTerm"/>
-      </w:pPr>
-      <w:r>
-        <w:t xml:space="preserve">2018</w:t>
-      </w:r>
-    </w:p>
-    <w:p>
-      <w:pPr>
-        <w:pStyle w:val="Definition"/>
-      </w:pPr>
-      <w:r>
-        <w:t xml:space="preserve">Species coexistence and functional traits. Graduate School of Environment and Information Sciences, Yokoyama National University, Japan</w:t>
-      </w:r>
-    </w:p>
-    <w:p>
-      <w:pPr>
-        <w:pStyle w:val="DefinitionTerm"/>
-      </w:pPr>
-      <w:r>
-        <w:t xml:space="preserve">2016</w:t>
-      </w:r>
-    </w:p>
-    <w:p>
-      <w:pPr>
-        <w:pStyle w:val="Definition"/>
-      </w:pPr>
-      <w:r>
-        <w:t xml:space="preserve">Decomposing leaf mass into photosynthetic and structural components explains divergent patterns of trait variation within and among plant species. Department of Ecology and Evolutionary Biology, Princeton University, NJ</w:t>
-      </w:r>
-    </w:p>
-    <w:p>
-      <w:pPr>
-        <w:pStyle w:val="DefinitionTerm"/>
-      </w:pPr>
-      <w:r>
-        <w:t xml:space="preserve">2013</w:t>
-      </w:r>
-    </w:p>
-    <w:p>
-      <w:pPr>
-        <w:pStyle w:val="Definition"/>
-      </w:pPr>
-      <w:r>
-        <w:t xml:space="preserve">Additive partitioning of functional diversity in plant communities, Xishuangbanna Tropical Botanical Garden, China</w:t>
-      </w:r>
-    </w:p>
-    <w:bookmarkEnd w:id="65"/>
-    <w:bookmarkStart w:id="66" w:name="international-meetings"/>
+        <w:t xml:space="preserve">Languages</w:t>
+      </w:r>
+    </w:p>
+    <w:p>
+      <w:pPr>
+        <w:pStyle w:val="FirstParagraph"/>
+      </w:pPr>
+      <w:r>
+        <w:t xml:space="preserve">Japanese (native), English (fluent), Malay (basic), Chinese-Mandarin (basic)</w:t>
+      </w:r>
+    </w:p>
+    <w:bookmarkEnd w:id="69"/>
+    <w:bookmarkStart w:id="70" w:name="graduate-students"/>
     <w:p>
       <w:pPr>
         <w:pStyle w:val="Heading2"/>
       </w:pPr>
       <w:r>
-        <w:t xml:space="preserve">International Meetings</w:t>
+        <w:t xml:space="preserve">Graduate Students</w:t>
       </w:r>
     </w:p>
     <w:p>
@@ -2873,475 +3382,6 @@
         <w:pStyle w:val="FirstParagraph"/>
       </w:pPr>
       <w:r>
-        <w:rPr>
-          <w:b/>
-          <w:bCs/>
-        </w:rPr>
-        <w:t xml:space="preserve">Invited</w:t>
-      </w:r>
-    </w:p>
-    <w:p>
-      <w:pPr>
-        <w:pStyle w:val="DefinitionTerm"/>
-      </w:pPr>
-      <w:r>
-        <w:t xml:space="preserve">2015</w:t>
-      </w:r>
-    </w:p>
-    <w:p>
-      <w:pPr>
-        <w:pStyle w:val="Definition"/>
-      </w:pPr>
-      <w:r>
-        <w:rPr>
-          <w:b/>
-          <w:bCs/>
-        </w:rPr>
-        <w:t xml:space="preserve">Masatoshi Katabuchi</w:t>
-      </w:r>
-      <w:r>
-        <w:t xml:space="preserve">,</w:t>
-      </w:r>
-      <w:r>
-        <w:t xml:space="preserve"> </w:t>
-      </w:r>
-      <w:r>
-        <w:t xml:space="preserve">“Future perspective for functional trait research”</w:t>
-      </w:r>
-      <w:r>
-        <w:t xml:space="preserve">, Organized session on</w:t>
-      </w:r>
-      <w:r>
-        <w:t xml:space="preserve"> </w:t>
-      </w:r>
-      <w:r>
-        <w:t xml:space="preserve">“Achievements and outstanding questions for trait-based forest ecology”</w:t>
-      </w:r>
-      <w:r>
-        <w:t xml:space="preserve">, 62nd ESJ Annual meeting, Kagoshima, Japan</w:t>
-      </w:r>
-    </w:p>
-    <w:p>
-      <w:pPr>
-        <w:pStyle w:val="DefinitionTerm"/>
-      </w:pPr>
-      <w:r>
-        <w:t xml:space="preserve">2014</w:t>
-      </w:r>
-    </w:p>
-    <w:p>
-      <w:pPr>
-        <w:pStyle w:val="Definition"/>
-      </w:pPr>
-      <w:r>
-        <w:rPr>
-          <w:b/>
-          <w:bCs/>
-        </w:rPr>
-        <w:t xml:space="preserve">Masatoshi Katabuchi (Organizer)</w:t>
-      </w:r>
-      <w:r>
-        <w:t xml:space="preserve">,</w:t>
-      </w:r>
-      <w:r>
-        <w:t xml:space="preserve"> </w:t>
-      </w:r>
-      <w:r>
-        <w:t xml:space="preserve">“Seedling dynamics and its consequence to community assembly processes in a tropical forest”</w:t>
-      </w:r>
-      <w:r>
-        <w:t xml:space="preserve">, Symposium on</w:t>
-      </w:r>
-      <w:r>
-        <w:t xml:space="preserve"> </w:t>
-      </w:r>
-      <w:r>
-        <w:t xml:space="preserve">“Integrating the structure and dynamics of tree communities to uncover the mechanisms underlying species coexistence”</w:t>
-      </w:r>
-      <w:r>
-        <w:t xml:space="preserve">, 61st ESJ Annual meeting, Hiroshima, Japan</w:t>
-      </w:r>
-    </w:p>
-    <w:p>
-      <w:pPr>
-        <w:pStyle w:val="DefinitionTerm"/>
-      </w:pPr>
-      <w:r>
-        <w:t xml:space="preserve">2011</w:t>
-      </w:r>
-    </w:p>
-    <w:p>
-      <w:pPr>
-        <w:pStyle w:val="Definition"/>
-      </w:pPr>
-      <w:r>
-        <w:rPr>
-          <w:b/>
-          <w:bCs/>
-        </w:rPr>
-        <w:t xml:space="preserve">Masatoshi Katabuchi</w:t>
-      </w:r>
-      <w:r>
-        <w:t xml:space="preserve"> </w:t>
-      </w:r>
-      <w:r>
-        <w:t xml:space="preserve">and Hiroko Kurokawa</w:t>
-      </w:r>
-      <w:r>
-        <w:t xml:space="preserve"> </w:t>
-      </w:r>
-      <w:r>
-        <w:t xml:space="preserve">“Community assembly and demography of tropical tree species”</w:t>
-      </w:r>
-      <w:r>
-        <w:t xml:space="preserve">, Workshop on</w:t>
-      </w:r>
-      <w:r>
-        <w:t xml:space="preserve"> </w:t>
-      </w:r>
-      <w:r>
-        <w:t xml:space="preserve">“Life history regulation of forest trees: towards cross-biome analysis”</w:t>
-      </w:r>
-      <w:r>
-        <w:t xml:space="preserve">, Sapporo, Japan</w:t>
-      </w:r>
-    </w:p>
-    <w:p>
-      <w:pPr>
-        <w:pStyle w:val="FirstParagraph"/>
-      </w:pPr>
-      <w:r>
-        <w:rPr>
-          <w:b/>
-          <w:bCs/>
-        </w:rPr>
-        <w:t xml:space="preserve">Submitted</w:t>
-      </w:r>
-    </w:p>
-    <w:p>
-      <w:pPr>
-        <w:pStyle w:val="DefinitionTerm"/>
-      </w:pPr>
-      <w:r>
-        <w:t xml:space="preserve">2019</w:t>
-      </w:r>
-    </w:p>
-    <w:p>
-      <w:pPr>
-        <w:pStyle w:val="Definition"/>
-      </w:pPr>
-      <w:r>
-        <w:rPr>
-          <w:b/>
-          <w:bCs/>
-        </w:rPr>
-        <w:t xml:space="preserve">Masatoshi Katabuchi</w:t>
-      </w:r>
-      <w:r>
-        <w:t xml:space="preserve">, Kaito Umemura, Thomas Koffel, Litchman Elena, Klausmeier A Christopher,</w:t>
-      </w:r>
-      <w:r>
-        <w:t xml:space="preserve"> </w:t>
-      </w:r>
-      <w:r>
-        <w:t xml:space="preserve">“Combining metacommunity and trait-based approaches predicts species abundances distributions in biological communities”</w:t>
-      </w:r>
-      <w:r>
-        <w:t xml:space="preserve">, 66th ESJ Annual meeting, Kobe, Japan</w:t>
-      </w:r>
-    </w:p>
-    <w:p>
-      <w:pPr>
-        <w:pStyle w:val="DefinitionTerm"/>
-      </w:pPr>
-      <w:r>
-        <w:t xml:space="preserve">2015</w:t>
-      </w:r>
-    </w:p>
-    <w:p>
-      <w:pPr>
-        <w:pStyle w:val="Definition"/>
-      </w:pPr>
-      <w:r>
-        <w:rPr>
-          <w:b/>
-          <w:bCs/>
-        </w:rPr>
-        <w:t xml:space="preserve">Masatoshi Katabuchi</w:t>
-      </w:r>
-      <w:r>
-        <w:t xml:space="preserve">, Kaoru Kitajima, Joesph Wright, Jeanne Osnas and Jeremy Lichstein</w:t>
-      </w:r>
-      <w:r>
-        <w:t xml:space="preserve"> </w:t>
-      </w:r>
-      <w:r>
-        <w:t xml:space="preserve">“Decomposing leaf mass into photosynthetic and structural components explains diverge patterns of trait variation within vs. among plant communities”</w:t>
-      </w:r>
-      <w:r>
-        <w:t xml:space="preserve">, 100th ESA Annual meeting, Baltimore, USA</w:t>
-      </w:r>
-    </w:p>
-    <w:p>
-      <w:pPr>
-        <w:pStyle w:val="DefinitionTerm"/>
-      </w:pPr>
-      <w:r>
-        <w:t xml:space="preserve">2014</w:t>
-      </w:r>
-    </w:p>
-    <w:p>
-      <w:pPr>
-        <w:pStyle w:val="Definition"/>
-      </w:pPr>
-      <w:r>
-        <w:rPr>
-          <w:b/>
-          <w:bCs/>
-        </w:rPr>
-        <w:t xml:space="preserve">Masatoshi Katabuchi</w:t>
-      </w:r>
-      <w:r>
-        <w:t xml:space="preserve">, Takehiro Sasaki, Chiho Kamiyama, Masaya Shimazaki, Tohru Nakashizuka and Kouki Hikosaka</w:t>
-      </w:r>
-      <w:r>
-        <w:t xml:space="preserve"> </w:t>
-      </w:r>
-      <w:r>
-        <w:t xml:space="preserve">“Intraspecific trait variations affect spatial patterns of functional diversity among moorland plant communities”</w:t>
-      </w:r>
-      <w:r>
-        <w:t xml:space="preserve">, 99th ESA Annual meeting, Sacramento, USA.</w:t>
-      </w:r>
-    </w:p>
-    <w:p>
-      <w:pPr>
-        <w:pStyle w:val="DefinitionTerm"/>
-      </w:pPr>
-      <w:r>
-        <w:t xml:space="preserve">2013</w:t>
-      </w:r>
-    </w:p>
-    <w:p>
-      <w:pPr>
-        <w:pStyle w:val="Definition"/>
-      </w:pPr>
-      <w:r>
-        <w:rPr>
-          <w:b/>
-          <w:bCs/>
-        </w:rPr>
-        <w:t xml:space="preserve">Masatoshi Katabuchi</w:t>
-      </w:r>
-      <w:r>
-        <w:t xml:space="preserve">, Sylvester Tan and Tohru Nakashizuka</w:t>
-      </w:r>
-      <w:r>
-        <w:t xml:space="preserve"> </w:t>
-      </w:r>
-      <w:r>
-        <w:t xml:space="preserve">“Negative density dependence reduces survival rates of common tree species in a species-rich tropical rain forest”</w:t>
-      </w:r>
-      <w:r>
-        <w:t xml:space="preserve">, ATBC, San Jose, Costa Rica</w:t>
-      </w:r>
-    </w:p>
-    <w:p>
-      <w:pPr>
-        <w:pStyle w:val="DefinitionTerm"/>
-      </w:pPr>
-      <w:r>
-        <w:t xml:space="preserve">2012</w:t>
-      </w:r>
-    </w:p>
-    <w:p>
-      <w:pPr>
-        <w:pStyle w:val="Definition"/>
-      </w:pPr>
-      <w:r>
-        <w:rPr>
-          <w:b/>
-          <w:bCs/>
-        </w:rPr>
-        <w:t xml:space="preserve">Masatoshi Katabuchi</w:t>
-      </w:r>
-      <w:r>
-        <w:t xml:space="preserve">, Hiroko Kurokawa, Stuart Davies, Sylvester Tan and Tohru Nakashizuka</w:t>
-      </w:r>
-      <w:r>
-        <w:t xml:space="preserve"> </w:t>
-      </w:r>
-      <w:r>
-        <w:t xml:space="preserve">“Soil resource availability shapes community trait structure in a species-rich dipterocarp forest”</w:t>
-      </w:r>
-      <w:r>
-        <w:t xml:space="preserve">, ATBC Asia-Pacific chapter, XTBG, China</w:t>
-      </w:r>
-    </w:p>
-    <w:p>
-      <w:pPr>
-        <w:pStyle w:val="DefinitionTerm"/>
-      </w:pPr>
-      <w:r>
-        <w:t xml:space="preserve">2011</w:t>
-      </w:r>
-    </w:p>
-    <w:p>
-      <w:pPr>
-        <w:pStyle w:val="Definition"/>
-      </w:pPr>
-      <w:r>
-        <w:rPr>
-          <w:b/>
-          <w:bCs/>
-        </w:rPr>
-        <w:t xml:space="preserve">Masatoshi Katabuchi</w:t>
-      </w:r>
-      <w:r>
-        <w:t xml:space="preserve">, Hiroko Kurokawa, Sylvester Tan, Stuart J. Davies, and Tohru Nakashizuka,</w:t>
-      </w:r>
-      <w:r>
-        <w:t xml:space="preserve"> </w:t>
-      </w:r>
-      <w:r>
-        <w:t xml:space="preserve">“Nonrandom abundance distributions of a tropical tree community: evidence from traits correlation at a local scale”</w:t>
-      </w:r>
-      <w:r>
-        <w:t xml:space="preserve">. ATBC, Arusha, Tanzania</w:t>
-      </w:r>
-    </w:p>
-    <w:p>
-      <w:pPr>
-        <w:pStyle w:val="DefinitionTerm"/>
-      </w:pPr>
-      <w:r>
-        <w:t xml:space="preserve">2010</w:t>
-      </w:r>
-    </w:p>
-    <w:p>
-      <w:pPr>
-        <w:pStyle w:val="Definition"/>
-      </w:pPr>
-      <w:r>
-        <w:rPr>
-          <w:b/>
-          <w:bCs/>
-        </w:rPr>
-        <w:t xml:space="preserve">Masatoshi Katabuchi</w:t>
-      </w:r>
-      <w:r>
-        <w:t xml:space="preserve">, Hiroko Kurokawa, Sylvester Tan, and Tohru Nakashizuka,</w:t>
-      </w:r>
-      <w:r>
-        <w:t xml:space="preserve"> </w:t>
-      </w:r>
-      <w:r>
-        <w:t xml:space="preserve">“Soil variation and functional trait assembly in a diverse dipterocarp forest”</w:t>
-      </w:r>
-      <w:r>
-        <w:t xml:space="preserve">. 95th ESA Annual meeting, Pittsburgh, USA</w:t>
-      </w:r>
-    </w:p>
-    <w:p>
-      <w:pPr>
-        <w:pStyle w:val="DefinitionTerm"/>
-      </w:pPr>
-      <w:r>
-        <w:t xml:space="preserve">2009</w:t>
-      </w:r>
-    </w:p>
-    <w:p>
-      <w:pPr>
-        <w:pStyle w:val="Definition"/>
-      </w:pPr>
-      <w:r>
-        <w:rPr>
-          <w:b/>
-          <w:bCs/>
-        </w:rPr>
-        <w:t xml:space="preserve">Masatoshi Katabuchi</w:t>
-      </w:r>
-      <w:r>
-        <w:t xml:space="preserve">, Jun Yokoyama, and Tohru Nakashizuka,</w:t>
-      </w:r>
-      <w:r>
-        <w:t xml:space="preserve"> </w:t>
-      </w:r>
-      <w:r>
-        <w:t xml:space="preserve">“Inbreeding and mating structure in a dioecious-fig pollinating wasp”</w:t>
-      </w:r>
-      <w:r>
-        <w:t xml:space="preserve">. ATBC, Marburg, Germany</w:t>
-      </w:r>
-    </w:p>
-    <w:bookmarkEnd w:id="66"/>
-    <w:bookmarkStart w:id="67" w:name="outreach"/>
-    <w:p>
-      <w:pPr>
-        <w:pStyle w:val="Heading2"/>
-      </w:pPr>
-      <w:r>
-        <w:t xml:space="preserve">Outreach</w:t>
-      </w:r>
-    </w:p>
-    <w:p>
-      <w:pPr>
-        <w:pStyle w:val="DefinitionTerm"/>
-      </w:pPr>
-      <w:r>
-        <w:t xml:space="preserve">2015</w:t>
-      </w:r>
-    </w:p>
-    <w:p>
-      <w:pPr>
-        <w:pStyle w:val="Definition"/>
-      </w:pPr>
-      <w:r>
-        <w:t xml:space="preserve">Masatoshi Katabuchi</w:t>
-      </w:r>
-      <w:r>
-        <w:t xml:space="preserve"> </w:t>
-      </w:r>
-      <w:r>
-        <w:t xml:space="preserve">“Leaves and tropical rainforests”</w:t>
-      </w:r>
-      <w:r>
-        <w:t xml:space="preserve">. Invited by the Japanese Association of Interdisciplinary Study Group in University Florida</w:t>
-      </w:r>
-    </w:p>
-    <w:bookmarkEnd w:id="67"/>
-    <w:bookmarkStart w:id="68" w:name="languages"/>
-    <w:p>
-      <w:pPr>
-        <w:pStyle w:val="Heading2"/>
-      </w:pPr>
-      <w:r>
-        <w:t xml:space="preserve">Languages</w:t>
-      </w:r>
-    </w:p>
-    <w:p>
-      <w:pPr>
-        <w:pStyle w:val="FirstParagraph"/>
-      </w:pPr>
-      <w:r>
-        <w:t xml:space="preserve">Japanese (native), English (fluent), Malay (basic), Chinese-Mandarin (basic)</w:t>
-      </w:r>
-    </w:p>
-    <w:bookmarkEnd w:id="68"/>
-    <w:bookmarkStart w:id="69" w:name="graduate-students"/>
-    <w:p>
-      <w:pPr>
-        <w:pStyle w:val="Heading2"/>
-      </w:pPr>
-      <w:r>
-        <w:t xml:space="preserve">Graduate Students</w:t>
-      </w:r>
-    </w:p>
-    <w:p>
-      <w:pPr>
-        <w:pStyle w:val="FirstParagraph"/>
-      </w:pPr>
-      <w:r>
         <w:t xml:space="preserve">Thi Duyen Nguyen, 2021 - 2025, M.Sc. Student, Recipient of ANSO Scholarship.</w:t>
       </w:r>
     </w:p>
@@ -3353,7 +3393,7 @@
         <w:t xml:space="preserve">Zhou Cong, 2021 - 2023, M.Sc. Student, Recipient of UCAS Scholarship.</w:t>
       </w:r>
     </w:p>
-    <w:bookmarkEnd w:id="69"/>
+    <w:bookmarkEnd w:id="70"/>
     <w:sectPr>
       <w:headerReference r:id="rId9" w:type="default"/>
       <w:footnotePr>

</xml_diff>

<commit_message>
Deploying to gh-pages from @ mattocci27/my-cv@b775b3d84a66265e7149e14aeac32612c8d77848 🚀
</commit_message>
<xml_diff>
--- a/Katabuchi_CV.docx
+++ b/Katabuchi_CV.docx
@@ -571,7 +571,7 @@
       </w:r>
     </w:p>
     <w:bookmarkEnd w:id="24"/>
-    <w:bookmarkStart w:id="55" w:name="publications"/>
+    <w:bookmarkStart w:id="57" w:name="publications"/>
     <w:p>
       <w:pPr>
         <w:pStyle w:val="Heading2"/>
@@ -588,7 +588,7 @@
         </w:numPr>
       </w:pPr>
       <w:r>
-        <w:t xml:space="preserve">Nguyen, T. D. &amp;</w:t>
+        <w:t xml:space="preserve">Chen, Y.-J., Maenpuen, P.,</w:t>
       </w:r>
       <w:r>
         <w:t xml:space="preserve"> </w:t>
@@ -601,10 +601,7 @@
         <w:t xml:space="preserve">Katabuchi, M.</w:t>
       </w:r>
       <w:r>
-        <w:t xml:space="preserve"> </w:t>
-      </w:r>
-      <w:r>
-        <w:t xml:space="preserve">Saturating allometric relationships reveal how wood density shapes global tree architecture.</w:t>
+        <w:t xml:space="preserve">, Tor-ngern, P., Palmroth, S., Zhang, S.-B., Xiao, Y.-X., Liu, M. &amp; Oren, R. Hydraulic conductivity-induced systematic parameter variation in a widely used thermal dissipation sap-flow technique.</w:t>
       </w:r>
       <w:r>
         <w:t xml:space="preserve"> </w:t>
@@ -616,49 +613,13 @@
           <w:i/>
           <w:iCs/>
         </w:rPr>
-        <w:t xml:space="preserve">Journal of Forestry Research</w:t>
-      </w:r>
-      <w:r>
-        <w:t xml:space="preserve"> </w:t>
-      </w:r>
-      <w:r>
-        <w:t xml:space="preserve">(accepted).</w:t>
-      </w:r>
-    </w:p>
-    <w:p>
-      <w:pPr>
-        <w:numPr>
-          <w:ilvl w:val="0"/>
-          <w:numId w:val="1001"/>
-        </w:numPr>
-      </w:pPr>
-      <w:r>
-        <w:rPr>
-          <w:b/>
-          <w:bCs/>
-        </w:rPr>
-        <w:t xml:space="preserve">Katabuchi, M.</w:t>
-      </w:r>
-      <w:r>
-        <w:t xml:space="preserve">, Kitajima, K., Wright, S. J., Van Bael, S. A., Osnas, J. L. D. &amp; Lichstein, J. W. Decomposing leaf mass into metabolic and structural components explains divergent patterns of trait variation within and among plant species.</w:t>
-      </w:r>
-      <w:r>
-        <w:t xml:space="preserve"> </w:t>
-      </w:r>
-      <w:r>
-        <w:rPr>
-          <w:b/>
-          <w:bCs/>
-          <w:i/>
-          <w:iCs/>
-        </w:rPr>
-        <w:t xml:space="preserve">Oecologia</w:t>
-      </w:r>
-      <w:r>
-        <w:t xml:space="preserve"> </w:t>
-      </w:r>
-      <w:r>
-        <w:t xml:space="preserve">207, 71 (2025)</w:t>
+        <w:t xml:space="preserve">New Phytologist</w:t>
+      </w:r>
+      <w:r>
+        <w:t xml:space="preserve"> </w:t>
+      </w:r>
+      <w:r>
+        <w:t xml:space="preserve">(2025)</w:t>
       </w:r>
       <w:r>
         <w:t xml:space="preserve"> </w:t>
@@ -683,7 +644,7 @@
         </w:numPr>
       </w:pPr>
       <w:r>
-        <w:t xml:space="preserve">Song, X.,</w:t>
+        <w:t xml:space="preserve">Nguyen, T. D. &amp;</w:t>
       </w:r>
       <w:r>
         <w:t xml:space="preserve"> </w:t>
@@ -696,7 +657,10 @@
         <w:t xml:space="preserve">Katabuchi, M.</w:t>
       </w:r>
       <w:r>
-        <w:t xml:space="preserve">, Chase, J. M., Johnson, D. J., Zhang, W., Deng, X., Cao, M. &amp; Yang, J. Drought tolerance and species abundance mediate dry season negative density dependence in a tropical forest.</w:t>
+        <w:t xml:space="preserve"> </w:t>
+      </w:r>
+      <w:r>
+        <w:t xml:space="preserve">Saturating allometric relationships reveal how wood density shapes global tree architecture.</w:t>
       </w:r>
       <w:r>
         <w:t xml:space="preserve"> </w:t>
@@ -708,13 +672,13 @@
           <w:i/>
           <w:iCs/>
         </w:rPr>
-        <w:t xml:space="preserve">Ecology</w:t>
-      </w:r>
-      <w:r>
-        <w:t xml:space="preserve"> </w:t>
-      </w:r>
-      <w:r>
-        <w:t xml:space="preserve">105, e4382 (2024)</w:t>
+        <w:t xml:space="preserve">Journal of Forestry Research</w:t>
+      </w:r>
+      <w:r>
+        <w:t xml:space="preserve"> </w:t>
+      </w:r>
+      <w:r>
+        <w:t xml:space="preserve">36, 107 (2025)</w:t>
       </w:r>
       <w:r>
         <w:t xml:space="preserve"> </w:t>
@@ -739,12 +703,6 @@
         </w:numPr>
       </w:pPr>
       <w:r>
-        <w:t xml:space="preserve">Zhou, C., Nakamura, A., Song, X. &amp;</w:t>
-      </w:r>
-      <w:r>
-        <w:t xml:space="preserve"> </w:t>
-      </w:r>
-      <w:r>
         <w:rPr>
           <w:b/>
           <w:bCs/>
@@ -752,10 +710,7 @@
         <w:t xml:space="preserve">Katabuchi, M.</w:t>
       </w:r>
       <w:r>
-        <w:t xml:space="preserve"> </w:t>
-      </w:r>
-      <w:r>
-        <w:t xml:space="preserve">Artificial Light at Night (ALAN) Influences Understory Plant Traits through Ecological Processes: A Two-Year Experiment in a Rubber Plantation in China.</w:t>
+        <w:t xml:space="preserve">, Kitajima, K., Wright, S. J., Van Bael, S. A., Osnas, J. L. D. &amp; Lichstein, J. W. Decomposing leaf mass into metabolic and structural components explains divergent patterns of trait variation within and among plant species.</w:t>
       </w:r>
       <w:r>
         <w:t xml:space="preserve"> </w:t>
@@ -767,13 +722,13 @@
           <w:i/>
           <w:iCs/>
         </w:rPr>
-        <w:t xml:space="preserve">Ecologies</w:t>
-      </w:r>
-      <w:r>
-        <w:t xml:space="preserve"> </w:t>
-      </w:r>
-      <w:r>
-        <w:t xml:space="preserve">4, 704–713 (2023)</w:t>
+        <w:t xml:space="preserve">Oecologia</w:t>
+      </w:r>
+      <w:r>
+        <w:t xml:space="preserve"> </w:t>
+      </w:r>
+      <w:r>
+        <w:t xml:space="preserve">207, 71 (2025)</w:t>
       </w:r>
       <w:r>
         <w:t xml:space="preserve"> </w:t>
@@ -798,7 +753,7 @@
         </w:numPr>
       </w:pPr>
       <w:r>
-        <w:t xml:space="preserve">Phoutthavong, K.,</w:t>
+        <w:t xml:space="preserve">Song, X.,</w:t>
       </w:r>
       <w:r>
         <w:t xml:space="preserve"> </w:t>
@@ -811,7 +766,7 @@
         <w:t xml:space="preserve">Katabuchi, M.</w:t>
       </w:r>
       <w:r>
-        <w:t xml:space="preserve">, Nakamura, A., Cheng, X. &amp; Cao, M. Inter- and intraspecific adaptations of pteridophyte leaf traits in limestone and non-limestone forests of monsoon tropical regions of southwest China.</w:t>
+        <w:t xml:space="preserve">, Chase, J. M., Johnson, D. J., Zhang, W., Deng, X., Cao, M. &amp; Yang, J. Drought tolerance and species abundance mediate dry season negative density dependence in a tropical forest.</w:t>
       </w:r>
       <w:r>
         <w:t xml:space="preserve"> </w:t>
@@ -823,13 +778,13 @@
           <w:i/>
           <w:iCs/>
         </w:rPr>
-        <w:t xml:space="preserve">Journal of Plant Ecology</w:t>
-      </w:r>
-      <w:r>
-        <w:t xml:space="preserve"> </w:t>
-      </w:r>
-      <w:r>
-        <w:t xml:space="preserve">16, rtad026 (2023)</w:t>
+        <w:t xml:space="preserve">Ecology</w:t>
+      </w:r>
+      <w:r>
+        <w:t xml:space="preserve"> </w:t>
+      </w:r>
+      <w:r>
+        <w:t xml:space="preserve">105, e4382 (2024)</w:t>
       </w:r>
       <w:r>
         <w:t xml:space="preserve"> </w:t>
@@ -854,7 +809,7 @@
         </w:numPr>
       </w:pPr>
       <w:r>
-        <w:t xml:space="preserve">Maenpuen, P.,</w:t>
+        <w:t xml:space="preserve">Zhou, C., Nakamura, A., Song, X. &amp;</w:t>
       </w:r>
       <w:r>
         <w:t xml:space="preserve"> </w:t>
@@ -867,7 +822,10 @@
         <w:t xml:space="preserve">Katabuchi, M.</w:t>
       </w:r>
       <w:r>
-        <w:t xml:space="preserve">, Onoda, Y., Zhou, C., Zhang, J.-L. &amp; Chen, Y.-J. Sources and consequences of mismatch between leaf disc and whole-leaf leaf mass per area (LMA).</w:t>
+        <w:t xml:space="preserve"> </w:t>
+      </w:r>
+      <w:r>
+        <w:t xml:space="preserve">Artificial Light at Night (ALAN) Influences Understory Plant Traits through Ecological Processes: A Two-Year Experiment in a Rubber Plantation in China.</w:t>
       </w:r>
       <w:r>
         <w:t xml:space="preserve"> </w:t>
@@ -879,13 +837,13 @@
           <w:i/>
           <w:iCs/>
         </w:rPr>
-        <w:t xml:space="preserve">American Journal of Botany</w:t>
-      </w:r>
-      <w:r>
-        <w:t xml:space="preserve"> </w:t>
-      </w:r>
-      <w:r>
-        <w:t xml:space="preserve">109, 1242–1250 (2022)</w:t>
+        <w:t xml:space="preserve">Ecologies</w:t>
+      </w:r>
+      <w:r>
+        <w:t xml:space="preserve"> </w:t>
+      </w:r>
+      <w:r>
+        <w:t xml:space="preserve">4, 704–713 (2023)</w:t>
       </w:r>
       <w:r>
         <w:t xml:space="preserve"> </w:t>
@@ -910,7 +868,7 @@
         </w:numPr>
       </w:pPr>
       <w:r>
-        <w:t xml:space="preserve">Chen, Y.-J., Choat, B., Sterck, F., Maenpuen, P.,</w:t>
+        <w:t xml:space="preserve">Phoutthavong, K.,</w:t>
       </w:r>
       <w:r>
         <w:t xml:space="preserve"> </w:t>
@@ -923,7 +881,7 @@
         <w:t xml:space="preserve">Katabuchi, M.</w:t>
       </w:r>
       <w:r>
-        <w:t xml:space="preserve">, Zhang, S.-B., Tomlinson, K. W., Oliveira, R. S., Zhang, Y.-J., Shen, J.-X., Cao, K.-F. &amp; Jansen, S. Hydraulic prediction of drought-induced plant dieback and top-kill depends on leaf habit and growth form.</w:t>
+        <w:t xml:space="preserve">, Nakamura, A., Cheng, X. &amp; Cao, M. Inter- and intraspecific adaptations of pteridophyte leaf traits in limestone and non-limestone forests of monsoon tropical regions of southwest China.</w:t>
       </w:r>
       <w:r>
         <w:t xml:space="preserve"> </w:t>
@@ -935,13 +893,13 @@
           <w:i/>
           <w:iCs/>
         </w:rPr>
-        <w:t xml:space="preserve">Ecology Letters</w:t>
-      </w:r>
-      <w:r>
-        <w:t xml:space="preserve"> </w:t>
-      </w:r>
-      <w:r>
-        <w:t xml:space="preserve">24, 2350–2363 (2021)</w:t>
+        <w:t xml:space="preserve">Journal of Plant Ecology</w:t>
+      </w:r>
+      <w:r>
+        <w:t xml:space="preserve"> </w:t>
+      </w:r>
+      <w:r>
+        <w:t xml:space="preserve">16, rtad026 (2023)</w:t>
       </w:r>
       <w:r>
         <w:t xml:space="preserve"> </w:t>
@@ -966,7 +924,7 @@
         </w:numPr>
       </w:pPr>
       <w:r>
-        <w:t xml:space="preserve">Chen, Y.-J., Maenpuen, P., Zhang, Y.-J., Barai, K.,</w:t>
+        <w:t xml:space="preserve">Maenpuen, P.,</w:t>
       </w:r>
       <w:r>
         <w:t xml:space="preserve"> </w:t>
@@ -979,7 +937,7 @@
         <w:t xml:space="preserve">Katabuchi, M.</w:t>
       </w:r>
       <w:r>
-        <w:t xml:space="preserve">, Gao, H., Kaewkamol, S., Tao, L.-B. &amp; Zhang, J.-L. Quantifying vulnerability to embolism in tropical trees and lianas using five methods: Can discrepancies be explained by xylem structural traits?</w:t>
+        <w:t xml:space="preserve">, Onoda, Y., Zhou, C., Zhang, J.-L. &amp; Chen, Y.-J. Sources and consequences of mismatch between leaf disc and whole-leaf leaf mass per area (LMA).</w:t>
       </w:r>
       <w:r>
         <w:t xml:space="preserve"> </w:t>
@@ -991,13 +949,13 @@
           <w:i/>
           <w:iCs/>
         </w:rPr>
-        <w:t xml:space="preserve">New Phytologist</w:t>
-      </w:r>
-      <w:r>
-        <w:t xml:space="preserve"> </w:t>
-      </w:r>
-      <w:r>
-        <w:t xml:space="preserve">229, 805–819 (2021)</w:t>
+        <w:t xml:space="preserve">American Journal of Botany</w:t>
+      </w:r>
+      <w:r>
+        <w:t xml:space="preserve"> </w:t>
+      </w:r>
+      <w:r>
+        <w:t xml:space="preserve">109, 1242–1250 (2022)</w:t>
       </w:r>
       <w:r>
         <w:t xml:space="preserve"> </w:t>
@@ -1022,7 +980,7 @@
         </w:numPr>
       </w:pPr>
       <w:r>
-        <w:t xml:space="preserve">Swenson, N. G., Hulshof, C. M.,</w:t>
+        <w:t xml:space="preserve">Chen, Y.-J., Choat, B., Sterck, F., Maenpuen, P.,</w:t>
       </w:r>
       <w:r>
         <w:t xml:space="preserve"> </w:t>
@@ -1035,10 +993,7 @@
         <w:t xml:space="preserve">Katabuchi, M.</w:t>
       </w:r>
       <w:r>
-        <w:t xml:space="preserve"> </w:t>
-      </w:r>
-      <w:r>
-        <w:t xml:space="preserve">&amp; Enquist, B. J. Long-term shifts in the functional composition and diversity of a tropical dry forest: A 30-yr study.</w:t>
+        <w:t xml:space="preserve">, Zhang, S.-B., Tomlinson, K. W., Oliveira, R. S., Zhang, Y.-J., Shen, J.-X., Cao, K.-F. &amp; Jansen, S. Hydraulic prediction of drought-induced plant dieback and top-kill depends on leaf habit and growth form.</w:t>
       </w:r>
       <w:r>
         <w:t xml:space="preserve"> </w:t>
@@ -1050,13 +1005,13 @@
           <w:i/>
           <w:iCs/>
         </w:rPr>
-        <w:t xml:space="preserve">Ecological Monographs</w:t>
-      </w:r>
-      <w:r>
-        <w:t xml:space="preserve"> </w:t>
-      </w:r>
-      <w:r>
-        <w:t xml:space="preserve">e01408 (2020)</w:t>
+        <w:t xml:space="preserve">Ecology Letters</w:t>
+      </w:r>
+      <w:r>
+        <w:t xml:space="preserve"> </w:t>
+      </w:r>
+      <w:r>
+        <w:t xml:space="preserve">24, 2350–2363 (2021)</w:t>
       </w:r>
       <w:r>
         <w:t xml:space="preserve"> </w:t>
@@ -1081,7 +1036,7 @@
         </w:numPr>
       </w:pPr>
       <w:r>
-        <w:t xml:space="preserve">Sreekar, R.,</w:t>
+        <w:t xml:space="preserve">Chen, Y.-J., Maenpuen, P., Zhang, Y.-J., Barai, K.,</w:t>
       </w:r>
       <w:r>
         <w:t xml:space="preserve"> </w:t>
@@ -1094,7 +1049,7 @@
         <w:t xml:space="preserve">Katabuchi, M.</w:t>
       </w:r>
       <w:r>
-        <w:t xml:space="preserve">, Nakamura, A., Corlett, R. T., Slik, J. W. F., Fletcher, C., He, F., Weiblen, G. D., Shen, G., Xu, H., Sun, I.-F., Cao, K., Ma, K., Chang, L.-W., Cao, M., Jiang, M., Gunatilleke, I. A. U. N., Ong, P., Yap, S., Gunatilleke, C. V. S., Novotny, V., Brockelman, W. Y., Xiang, W., Mi, X., Li, X., Wang, X., Qiao, X., Li, Y., Tan, S., Condit, R., Harrison, R. D. &amp; Koh, L. P. Spatial scale changes the relationship between beta diversity, species richness and latitude.</w:t>
+        <w:t xml:space="preserve">, Gao, H., Kaewkamol, S., Tao, L.-B. &amp; Zhang, J.-L. Quantifying vulnerability to embolism in tropical trees and lianas using five methods: Can discrepancies be explained by xylem structural traits?</w:t>
       </w:r>
       <w:r>
         <w:t xml:space="preserve"> </w:t>
@@ -1106,13 +1061,13 @@
           <w:i/>
           <w:iCs/>
         </w:rPr>
-        <w:t xml:space="preserve">Open Science</w:t>
-      </w:r>
-      <w:r>
-        <w:t xml:space="preserve"> </w:t>
-      </w:r>
-      <w:r>
-        <w:t xml:space="preserve">5, 181168 (2018)</w:t>
+        <w:t xml:space="preserve">New Phytologist</w:t>
+      </w:r>
+      <w:r>
+        <w:t xml:space="preserve"> </w:t>
+      </w:r>
+      <w:r>
+        <w:t xml:space="preserve">229, 805–819 (2021)</w:t>
       </w:r>
       <w:r>
         <w:t xml:space="preserve"> </w:t>
@@ -1137,7 +1092,7 @@
         </w:numPr>
       </w:pPr>
       <w:r>
-        <w:t xml:space="preserve">Johnson, D. J., Needham, J., Xu, C., Massoud, E. C., Davies, S. J., Anderson-Teixeira, K. J., Bunyavejchewin, S., Chambers, J. Q., Chang-Yang, C.-H., Chiang, J.-M., Chuyong, G. B., Condit, R., Cordell, S., Fletcher, C., Giardina, C. P., Giambelluca, T. W., Gunatilleke, N., Gunatilleke, S., Hsieh, C.-F., Hubbell, S., Inman-Narahari, F., Kassim, A. R.,</w:t>
+        <w:t xml:space="preserve">Swenson, N. G., Hulshof, C. M.,</w:t>
       </w:r>
       <w:r>
         <w:t xml:space="preserve"> </w:t>
@@ -1150,7 +1105,10 @@
         <w:t xml:space="preserve">Katabuchi, M.</w:t>
       </w:r>
       <w:r>
-        <w:t xml:space="preserve">, Kenfack, D., Litton, C. M., Lum, S., Mohamad, M., Nasardin, M., Ong, P. S., Ostertag, R., Sack, L., Swenson, N. G., Sun, I. F., Tan, S., Thomas, D. W., Thompson, J., Umaña, M. N., Uriarte, M., Valencia, R., Yap, S., Zimmerman, J., McDowell, N. G. &amp; McMahon, S. M. Climate sensitive size-dependent survival in tropical trees.</w:t>
+        <w:t xml:space="preserve"> </w:t>
+      </w:r>
+      <w:r>
+        <w:t xml:space="preserve">&amp; Enquist, B. J. Long-term shifts in the functional composition and diversity of a tropical dry forest: A 30-yr study.</w:t>
       </w:r>
       <w:r>
         <w:t xml:space="preserve"> </w:t>
@@ -1162,13 +1120,13 @@
           <w:i/>
           <w:iCs/>
         </w:rPr>
-        <w:t xml:space="preserve">Nature Ecology &amp; Evolution</w:t>
-      </w:r>
-      <w:r>
-        <w:t xml:space="preserve"> </w:t>
-      </w:r>
-      <w:r>
-        <w:t xml:space="preserve">1 (2018)</w:t>
+        <w:t xml:space="preserve">Ecological Monographs</w:t>
+      </w:r>
+      <w:r>
+        <w:t xml:space="preserve"> </w:t>
+      </w:r>
+      <w:r>
+        <w:t xml:space="preserve">e01408 (2020)</w:t>
       </w:r>
       <w:r>
         <w:t xml:space="preserve"> </w:t>
@@ -1193,7 +1151,7 @@
         </w:numPr>
       </w:pPr>
       <w:r>
-        <w:t xml:space="preserve">Osnas, J. L. D.,</w:t>
+        <w:t xml:space="preserve">Sreekar, R.,</w:t>
       </w:r>
       <w:r>
         <w:t xml:space="preserve"> </w:t>
@@ -1206,7 +1164,7 @@
         <w:t xml:space="preserve">Katabuchi, M.</w:t>
       </w:r>
       <w:r>
-        <w:t xml:space="preserve">, Kitajima, K., Wright, S. J., Reich, P. B., Van Bael, S. A., Kraft, N. J. B., Samaniego, M. J., Pacala, S. W. &amp; Lichstein, J. W. Divergent drivers of leaf trait variation within species, among species, and among functional groups.</w:t>
+        <w:t xml:space="preserve">, Nakamura, A., Corlett, R. T., Slik, J. W. F., Fletcher, C., He, F., Weiblen, G. D., Shen, G., Xu, H., Sun, I.-F., Cao, K., Ma, K., Chang, L.-W., Cao, M., Jiang, M., Gunatilleke, I. A. U. N., Ong, P., Yap, S., Gunatilleke, C. V. S., Novotny, V., Brockelman, W. Y., Xiang, W., Mi, X., Li, X., Wang, X., Qiao, X., Li, Y., Tan, S., Condit, R., Harrison, R. D. &amp; Koh, L. P. Spatial scale changes the relationship between beta diversity, species richness and latitude.</w:t>
       </w:r>
       <w:r>
         <w:t xml:space="preserve"> </w:t>
@@ -1218,13 +1176,13 @@
           <w:i/>
           <w:iCs/>
         </w:rPr>
-        <w:t xml:space="preserve">Proceedings of the National Academy of Sciences of the United States of America</w:t>
-      </w:r>
-      <w:r>
-        <w:t xml:space="preserve"> </w:t>
-      </w:r>
-      <w:r>
-        <w:t xml:space="preserve">115, 5480–5485 (2018)</w:t>
+        <w:t xml:space="preserve">Open Science</w:t>
+      </w:r>
+      <w:r>
+        <w:t xml:space="preserve"> </w:t>
+      </w:r>
+      <w:r>
+        <w:t xml:space="preserve">5, 181168 (2018)</w:t>
       </w:r>
       <w:r>
         <w:t xml:space="preserve"> </w:t>
@@ -1249,7 +1207,7 @@
         </w:numPr>
       </w:pPr>
       <w:r>
-        <w:t xml:space="preserve">Li, Y., Shipley, B., Price, J. N., Dantas, V. de L., Tamme, R., Westoby, M., Siefert, A., Schamp, B. S., Spasojevic, M. J., Jung, V., Laughlin, D. C., Richardson, S. J., Bagousse-Pinguet, Y. L., Schöb, C., Gazol, A., Prentice, H. C., Gross, N., Overton, J., Cianciaruso, M. V., Louault, F., Kamiyama, C., Nakashizuka, T., Hikosaka, K., Sasaki, T.,</w:t>
+        <w:t xml:space="preserve">Johnson, D. J., Needham, J., Xu, C., Massoud, E. C., Davies, S. J., Anderson-Teixeira, K. J., Bunyavejchewin, S., Chambers, J. Q., Chang-Yang, C.-H., Chiang, J.-M., Chuyong, G. B., Condit, R., Cordell, S., Fletcher, C., Giardina, C. P., Giambelluca, T. W., Gunatilleke, N., Gunatilleke, S., Hsieh, C.-F., Hubbell, S., Inman-Narahari, F., Kassim, A. R.,</w:t>
       </w:r>
       <w:r>
         <w:t xml:space="preserve"> </w:t>
@@ -1262,7 +1220,7 @@
         <w:t xml:space="preserve">Katabuchi, M.</w:t>
       </w:r>
       <w:r>
-        <w:t xml:space="preserve">, Frenette Dussault, C., Gaucherand, S., Chen, N., Vandewalle, M. &amp; Batalha, M. A. Habitat filtering determines the functional niche occupancy of plant communities worldwide.</w:t>
+        <w:t xml:space="preserve">, Kenfack, D., Litton, C. M., Lum, S., Mohamad, M., Nasardin, M., Ong, P. S., Ostertag, R., Sack, L., Swenson, N. G., Sun, I. F., Tan, S., Thomas, D. W., Thompson, J., Umaña, M. N., Uriarte, M., Valencia, R., Yap, S., Zimmerman, J., McDowell, N. G. &amp; McMahon, S. M. Climate sensitive size-dependent survival in tropical trees.</w:t>
       </w:r>
       <w:r>
         <w:t xml:space="preserve"> </w:t>
@@ -1274,13 +1232,13 @@
           <w:i/>
           <w:iCs/>
         </w:rPr>
-        <w:t xml:space="preserve">Journal of Ecology</w:t>
-      </w:r>
-      <w:r>
-        <w:t xml:space="preserve"> </w:t>
-      </w:r>
-      <w:r>
-        <w:t xml:space="preserve">3, 808–809 (2017)</w:t>
+        <w:t xml:space="preserve">Nature Ecology &amp; Evolution</w:t>
+      </w:r>
+      <w:r>
+        <w:t xml:space="preserve"> </w:t>
+      </w:r>
+      <w:r>
+        <w:t xml:space="preserve">1 (2018)</w:t>
       </w:r>
       <w:r>
         <w:t xml:space="preserve"> </w:t>
@@ -1305,6 +1263,12 @@
         </w:numPr>
       </w:pPr>
       <w:r>
+        <w:t xml:space="preserve">Osnas, J. L. D.,</w:t>
+      </w:r>
+      <w:r>
+        <w:t xml:space="preserve"> </w:t>
+      </w:r>
+      <w:r>
         <w:rPr>
           <w:b/>
           <w:bCs/>
@@ -1312,7 +1276,7 @@
         <w:t xml:space="preserve">Katabuchi, M.</w:t>
       </w:r>
       <w:r>
-        <w:t xml:space="preserve">, Wright, S. J., Swenson, N. G., Feeley, K. J., Condit, R., Hubbell, S. P. &amp; Davies, S. J. Contrasting outcomes of species- and community-level analyses of the temporal consistency of functional composition.</w:t>
+        <w:t xml:space="preserve">, Kitajima, K., Wright, S. J., Reich, P. B., Van Bael, S. A., Kraft, N. J. B., Samaniego, M. J., Pacala, S. W. &amp; Lichstein, J. W. Divergent drivers of leaf trait variation within species, among species, and among functional groups.</w:t>
       </w:r>
       <w:r>
         <w:t xml:space="preserve"> </w:t>
@@ -1324,13 +1288,13 @@
           <w:i/>
           <w:iCs/>
         </w:rPr>
-        <w:t xml:space="preserve">Ecology</w:t>
-      </w:r>
-      <w:r>
-        <w:t xml:space="preserve"> </w:t>
-      </w:r>
-      <w:r>
-        <w:t xml:space="preserve">98, 2273–2280 (2017)</w:t>
+        <w:t xml:space="preserve">Proceedings of the National Academy of Sciences of the United States of America</w:t>
+      </w:r>
+      <w:r>
+        <w:t xml:space="preserve"> </w:t>
+      </w:r>
+      <w:r>
+        <w:t xml:space="preserve">115, 5480–5485 (2018)</w:t>
       </w:r>
       <w:r>
         <w:t xml:space="preserve"> </w:t>
@@ -1355,7 +1319,7 @@
         </w:numPr>
       </w:pPr>
       <w:r>
-        <w:t xml:space="preserve">Siefert, A., Violle, C., Chalmandrier, L., Albert, C. H., Taudiere, A., Fajardo, A., Aarssen, L. W., Baraloto, C., Carlucci, M. B., Cianciaruso, M. V., de L. Dantas, V., de Bello, F., Duarte, L. D. S., Fonseca, C. R., Freschet, G. T., Gaucherand, S., Gross, N., Hikosaka, K., Jackson, B., Jung, V., Kamiyama, C.,</w:t>
+        <w:t xml:space="preserve">Li, Y., Shipley, B., Price, J. N., Dantas, V. de L., Tamme, R., Westoby, M., Siefert, A., Schamp, B. S., Spasojevic, M. J., Jung, V., Laughlin, D. C., Richardson, S. J., Bagousse-Pinguet, Y. L., Schöb, C., Gazol, A., Prentice, H. C., Gross, N., Overton, J., Cianciaruso, M. V., Louault, F., Kamiyama, C., Nakashizuka, T., Hikosaka, K., Sasaki, T.,</w:t>
       </w:r>
       <w:r>
         <w:t xml:space="preserve"> </w:t>
@@ -1368,7 +1332,7 @@
         <w:t xml:space="preserve">Katabuchi, M.</w:t>
       </w:r>
       <w:r>
-        <w:t xml:space="preserve">, Kembel, S. W., Kichenin, E., Kraft, N. J. B., Lagerström, A., Bagousse-Pinguet, Y. L., Li, Y., Mason, N., Messier, J., Nakashizuka, T., Overton, J. M., Peltzer, D. A., Pérez-Ramos, I. M., Pillar, V. D., Prentice, H. C., Richardson, S., Sasaki, T., Schamp, B. S., Schöb, C., Shipley, B., Sundqvist, M., Sykes, M. T., Vandewalle, M. &amp; Wardle, D. A. A global meta-analysis of the relative extent of intraspecific trait variation in plant communities.</w:t>
+        <w:t xml:space="preserve">, Frenette Dussault, C., Gaucherand, S., Chen, N., Vandewalle, M. &amp; Batalha, M. A. Habitat filtering determines the functional niche occupancy of plant communities worldwide.</w:t>
       </w:r>
       <w:r>
         <w:t xml:space="preserve"> </w:t>
@@ -1380,13 +1344,13 @@
           <w:i/>
           <w:iCs/>
         </w:rPr>
-        <w:t xml:space="preserve">Ecology Letters</w:t>
-      </w:r>
-      <w:r>
-        <w:t xml:space="preserve"> </w:t>
-      </w:r>
-      <w:r>
-        <w:t xml:space="preserve">18, 1406–1419 (2015)</w:t>
+        <w:t xml:space="preserve">Journal of Ecology</w:t>
+      </w:r>
+      <w:r>
+        <w:t xml:space="preserve"> </w:t>
+      </w:r>
+      <w:r>
+        <w:t xml:space="preserve">3, 808–809 (2017)</w:t>
       </w:r>
       <w:r>
         <w:t xml:space="preserve"> </w:t>
@@ -1418,10 +1382,7 @@
         <w:t xml:space="preserve">Katabuchi, M.</w:t>
       </w:r>
       <w:r>
-        <w:t xml:space="preserve"> </w:t>
-      </w:r>
-      <w:r>
-        <w:t xml:space="preserve">LeafArea: An R package for rapid digital image analysis of leaf area.</w:t>
+        <w:t xml:space="preserve">, Wright, S. J., Swenson, N. G., Feeley, K. J., Condit, R., Hubbell, S. P. &amp; Davies, S. J. Contrasting outcomes of species- and community-level analyses of the temporal consistency of functional composition.</w:t>
       </w:r>
       <w:r>
         <w:t xml:space="preserve"> </w:t>
@@ -1433,13 +1394,13 @@
           <w:i/>
           <w:iCs/>
         </w:rPr>
-        <w:t xml:space="preserve">Ecological Research</w:t>
-      </w:r>
-      <w:r>
-        <w:t xml:space="preserve"> </w:t>
-      </w:r>
-      <w:r>
-        <w:t xml:space="preserve">30, 1073–1077 (2015)</w:t>
+        <w:t xml:space="preserve">Ecology</w:t>
+      </w:r>
+      <w:r>
+        <w:t xml:space="preserve"> </w:t>
+      </w:r>
+      <w:r>
+        <w:t xml:space="preserve">98, 2273–2280 (2017)</w:t>
       </w:r>
       <w:r>
         <w:t xml:space="preserve"> </w:t>
@@ -1464,7 +1425,7 @@
         </w:numPr>
       </w:pPr>
       <w:r>
-        <w:t xml:space="preserve">Ashton, L. A., Nakamura, A., Basset, Y., Burwell, C. J., Cao, M., Eastwood, R., Odell, E., de Oliveira, E. G., Hurley, K.,</w:t>
+        <w:t xml:space="preserve">Siefert, A., Violle, C., Chalmandrier, L., Albert, C. H., Taudiere, A., Fajardo, A., Aarssen, L. W., Baraloto, C., Carlucci, M. B., Cianciaruso, M. V., de L. Dantas, V., de Bello, F., Duarte, L. D. S., Fonseca, C. R., Freschet, G. T., Gaucherand, S., Gross, N., Hikosaka, K., Jackson, B., Jung, V., Kamiyama, C.,</w:t>
       </w:r>
       <w:r>
         <w:t xml:space="preserve"> </w:t>
@@ -1477,7 +1438,7 @@
         <w:t xml:space="preserve">Katabuchi, M.</w:t>
       </w:r>
       <w:r>
-        <w:t xml:space="preserve">, Maunsell, S., Mcbroom, J., Schmidl, J., Sun, Z., Tang, Y., Whitaker, T., Laidlaw, M. J., Mcdonald, W. J. F. &amp; Kitching, R. L. Vertical stratification of moths across elevation and latitude.</w:t>
+        <w:t xml:space="preserve">, Kembel, S. W., Kichenin, E., Kraft, N. J. B., Lagerström, A., Bagousse-Pinguet, Y. L., Li, Y., Mason, N., Messier, J., Nakashizuka, T., Overton, J. M., Peltzer, D. A., Pérez-Ramos, I. M., Pillar, V. D., Prentice, H. C., Richardson, S., Sasaki, T., Schamp, B. S., Schöb, C., Shipley, B., Sundqvist, M., Sykes, M. T., Vandewalle, M. &amp; Wardle, D. A. A global meta-analysis of the relative extent of intraspecific trait variation in plant communities.</w:t>
       </w:r>
       <w:r>
         <w:t xml:space="preserve"> </w:t>
@@ -1489,13 +1450,13 @@
           <w:i/>
           <w:iCs/>
         </w:rPr>
-        <w:t xml:space="preserve">Journal of Biogeography</w:t>
-      </w:r>
-      <w:r>
-        <w:t xml:space="preserve"> </w:t>
-      </w:r>
-      <w:r>
-        <w:t xml:space="preserve">43, 59–69 (2016)</w:t>
+        <w:t xml:space="preserve">Ecology Letters</w:t>
+      </w:r>
+      <w:r>
+        <w:t xml:space="preserve"> </w:t>
+      </w:r>
+      <w:r>
+        <w:t xml:space="preserve">18, 1406–1419 (2015)</w:t>
       </w:r>
       <w:r>
         <w:t xml:space="preserve"> </w:t>
@@ -1520,12 +1481,6 @@
         </w:numPr>
       </w:pPr>
       <w:r>
-        <w:t xml:space="preserve">Nakamura, A., Burwell, C. J., Ashton, L. A., Laidlaw, M. J.,</w:t>
-      </w:r>
-      <w:r>
-        <w:t xml:space="preserve"> </w:t>
-      </w:r>
-      <w:r>
         <w:rPr>
           <w:b/>
           <w:bCs/>
@@ -1536,7 +1491,7 @@
         <w:t xml:space="preserve"> </w:t>
       </w:r>
       <w:r>
-        <w:t xml:space="preserve">&amp; Kitching, R. L. Identifying indicator species of elevation: Comparing the utility of woody plants, ants and moths for long-term monitoring.</w:t>
+        <w:t xml:space="preserve">LeafArea: An R package for rapid digital image analysis of leaf area.</w:t>
       </w:r>
       <w:r>
         <w:t xml:space="preserve"> </w:t>
@@ -1548,13 +1503,13 @@
           <w:i/>
           <w:iCs/>
         </w:rPr>
-        <w:t xml:space="preserve">Austral Ecology</w:t>
-      </w:r>
-      <w:r>
-        <w:t xml:space="preserve"> </w:t>
-      </w:r>
-      <w:r>
-        <w:t xml:space="preserve">41, 179–188 (2016)</w:t>
+        <w:t xml:space="preserve">Ecological Research</w:t>
+      </w:r>
+      <w:r>
+        <w:t xml:space="preserve"> </w:t>
+      </w:r>
+      <w:r>
+        <w:t xml:space="preserve">30, 1073–1077 (2015)</w:t>
       </w:r>
       <w:r>
         <w:t xml:space="preserve"> </w:t>
@@ -1579,7 +1534,7 @@
         </w:numPr>
       </w:pPr>
       <w:r>
-        <w:t xml:space="preserve">Nakamura, A., Burwell, C. J., Lambkin, C. L.,</w:t>
+        <w:t xml:space="preserve">Ashton, L. A., Nakamura, A., Basset, Y., Burwell, C. J., Cao, M., Eastwood, R., Odell, E., de Oliveira, E. G., Hurley, K.,</w:t>
       </w:r>
       <w:r>
         <w:t xml:space="preserve"> </w:t>
@@ -1592,7 +1547,7 @@
         <w:t xml:space="preserve">Katabuchi, M.</w:t>
       </w:r>
       <w:r>
-        <w:t xml:space="preserve">, Mcdougall, A., Raven, R. J. &amp; Neldner, V. J. The role of human disturbance in island biogeography of arthropods and plants: An information theoretic approach.</w:t>
+        <w:t xml:space="preserve">, Maunsell, S., Mcbroom, J., Schmidl, J., Sun, Z., Tang, Y., Whitaker, T., Laidlaw, M. J., Mcdonald, W. J. F. &amp; Kitching, R. L. Vertical stratification of moths across elevation and latitude.</w:t>
       </w:r>
       <w:r>
         <w:t xml:space="preserve"> </w:t>
@@ -1610,7 +1565,7 @@
         <w:t xml:space="preserve"> </w:t>
       </w:r>
       <w:r>
-        <w:t xml:space="preserve">42, 1406–1417 (2015)</w:t>
+        <w:t xml:space="preserve">43, 59–69 (2016)</w:t>
       </w:r>
       <w:r>
         <w:t xml:space="preserve"> </w:t>
@@ -1635,7 +1590,7 @@
         </w:numPr>
       </w:pPr>
       <w:r>
-        <w:t xml:space="preserve">Deng, X., Mohandass, D.,</w:t>
+        <w:t xml:space="preserve">Nakamura, A., Burwell, C. J., Ashton, L. A., Laidlaw, M. J.,</w:t>
       </w:r>
       <w:r>
         <w:t xml:space="preserve"> </w:t>
@@ -1648,51 +1603,28 @@
         <w:t xml:space="preserve">Katabuchi, M.</w:t>
       </w:r>
       <w:r>
-        <w:t xml:space="preserve">, Hughes, A. C. &amp; Roubik, D. W. Impact of Striped-Squirrel Nectar-Robbing Behaviour on Gender Fitness in</w:t>
-      </w:r>
-      <w:r>
-        <w:t xml:space="preserve"> </w:t>
-      </w:r>
-      <w:r>
-        <w:rPr>
+        <w:t xml:space="preserve"> </w:t>
+      </w:r>
+      <w:r>
+        <w:t xml:space="preserve">&amp; Kitching, R. L. Identifying indicator species of elevation: Comparing the utility of woody plants, ants and moths for long-term monitoring.</w:t>
+      </w:r>
+      <w:r>
+        <w:t xml:space="preserve"> </w:t>
+      </w:r>
+      <w:r>
+        <w:rPr>
+          <w:b/>
+          <w:bCs/>
           <w:i/>
           <w:iCs/>
         </w:rPr>
-        <w:t xml:space="preserve">Alpinia</w:t>
-      </w:r>
-      <w:r>
-        <w:t xml:space="preserve"> </w:t>
-      </w:r>
-      <w:r>
-        <w:rPr>
-          <w:i/>
-          <w:iCs/>
-        </w:rPr>
-        <w:t xml:space="preserve">Roxburghii</w:t>
-      </w:r>
-      <w:r>
-        <w:t xml:space="preserve"> </w:t>
-      </w:r>
-      <w:r>
-        <w:t xml:space="preserve">Sweet (Zingiberaceae).</w:t>
-      </w:r>
-      <w:r>
-        <w:t xml:space="preserve"> </w:t>
-      </w:r>
-      <w:r>
-        <w:rPr>
-          <w:b/>
-          <w:bCs/>
-          <w:i/>
-          <w:iCs/>
-        </w:rPr>
-        <w:t xml:space="preserve">PLoS ONE</w:t>
-      </w:r>
-      <w:r>
-        <w:t xml:space="preserve"> </w:t>
-      </w:r>
-      <w:r>
-        <w:t xml:space="preserve">10, (2015)</w:t>
+        <w:t xml:space="preserve">Austral Ecology</w:t>
+      </w:r>
+      <w:r>
+        <w:t xml:space="preserve"> </w:t>
+      </w:r>
+      <w:r>
+        <w:t xml:space="preserve">41, 179–188 (2016)</w:t>
       </w:r>
       <w:r>
         <w:t xml:space="preserve"> </w:t>
@@ -1717,7 +1649,7 @@
         </w:numPr>
       </w:pPr>
       <w:r>
-        <w:t xml:space="preserve">Hikosaka, K., Sasaki, T., Kamiyama, C.,</w:t>
+        <w:t xml:space="preserve">Nakamura, A., Burwell, C. J., Lambkin, C. L.,</w:t>
       </w:r>
       <w:r>
         <w:t xml:space="preserve"> </w:t>
@@ -1730,7 +1662,7 @@
         <w:t xml:space="preserve">Katabuchi, M.</w:t>
       </w:r>
       <w:r>
-        <w:t xml:space="preserve">, Oikawa, S., Shimazaki, M., Kimura, K. &amp; Nakshizuka, T. Understanding of species niche, coexistence and extinction based on functional traits : Approaches from community and physiological ecology for subalpine moorland plant communities [in Japanese].</w:t>
+        <w:t xml:space="preserve">, Mcdougall, A., Raven, R. J. &amp; Neldner, V. J. The role of human disturbance in island biogeography of arthropods and plants: An information theoretic approach.</w:t>
       </w:r>
       <w:r>
         <w:t xml:space="preserve"> </w:t>
@@ -1742,55 +1674,13 @@
           <w:i/>
           <w:iCs/>
         </w:rPr>
-        <w:t xml:space="preserve">Chikyu-Kankyo</w:t>
-      </w:r>
-      <w:r>
-        <w:t xml:space="preserve"> </w:t>
-      </w:r>
-      <w:r>
-        <w:t xml:space="preserve">19, 33–46 (2014).</w:t>
-      </w:r>
-    </w:p>
-    <w:p>
-      <w:pPr>
-        <w:numPr>
-          <w:ilvl w:val="0"/>
-          <w:numId w:val="1001"/>
-        </w:numPr>
-      </w:pPr>
-      <w:r>
-        <w:t xml:space="preserve">Kamiyama, C.,</w:t>
-      </w:r>
-      <w:r>
-        <w:t xml:space="preserve"> </w:t>
-      </w:r>
-      <w:r>
-        <w:rPr>
-          <w:b/>
-          <w:bCs/>
-        </w:rPr>
-        <w:t xml:space="preserve">Katabuchi, M.</w:t>
-      </w:r>
-      <w:r>
-        <w:t xml:space="preserve">, Sasaki, T., Shimazaki, M., Nakashizuka, T. &amp; Hikosaka, K. Leaf-trait responses to environmental gradients in moorland communities: Contribution of intraspecific variation, species replacement and functional group replacement.</w:t>
-      </w:r>
-      <w:r>
-        <w:t xml:space="preserve"> </w:t>
-      </w:r>
-      <w:r>
-        <w:rPr>
-          <w:b/>
-          <w:bCs/>
-          <w:i/>
-          <w:iCs/>
-        </w:rPr>
-        <w:t xml:space="preserve">Ecological Research</w:t>
-      </w:r>
-      <w:r>
-        <w:t xml:space="preserve"> </w:t>
-      </w:r>
-      <w:r>
-        <w:t xml:space="preserve">29, 607–617 (2014)</w:t>
+        <w:t xml:space="preserve">Journal of Biogeography</w:t>
+      </w:r>
+      <w:r>
+        <w:t xml:space="preserve"> </w:t>
+      </w:r>
+      <w:r>
+        <w:t xml:space="preserve">42, 1406–1417 (2015)</w:t>
       </w:r>
       <w:r>
         <w:t xml:space="preserve"> </w:t>
@@ -1815,7 +1705,7 @@
         </w:numPr>
       </w:pPr>
       <w:r>
-        <w:t xml:space="preserve">Sasaki, T.,</w:t>
+        <w:t xml:space="preserve">Deng, X., Mohandass, D.,</w:t>
       </w:r>
       <w:r>
         <w:t xml:space="preserve"> </w:t>
@@ -1828,25 +1718,51 @@
         <w:t xml:space="preserve">Katabuchi, M.</w:t>
       </w:r>
       <w:r>
-        <w:t xml:space="preserve">, Kamiyama, C., Shimazaki, M., Nakashizuka, T. &amp; Hikosaka, K. Vulnerability of moorland plant communities to environmental change: Consequences of realistic species loss on functional diversity.</w:t>
-      </w:r>
-      <w:r>
-        <w:t xml:space="preserve"> </w:t>
-      </w:r>
-      <w:r>
-        <w:rPr>
-          <w:b/>
-          <w:bCs/>
+        <w:t xml:space="preserve">, Hughes, A. C. &amp; Roubik, D. W. Impact of Striped-Squirrel Nectar-Robbing Behaviour on Gender Fitness in</w:t>
+      </w:r>
+      <w:r>
+        <w:t xml:space="preserve"> </w:t>
+      </w:r>
+      <w:r>
+        <w:rPr>
           <w:i/>
           <w:iCs/>
         </w:rPr>
-        <w:t xml:space="preserve">Journal of Applied Ecology</w:t>
-      </w:r>
-      <w:r>
-        <w:t xml:space="preserve"> </w:t>
-      </w:r>
-      <w:r>
-        <w:t xml:space="preserve">51, 299–308 (2014)</w:t>
+        <w:t xml:space="preserve">Alpinia</w:t>
+      </w:r>
+      <w:r>
+        <w:t xml:space="preserve"> </w:t>
+      </w:r>
+      <w:r>
+        <w:rPr>
+          <w:i/>
+          <w:iCs/>
+        </w:rPr>
+        <w:t xml:space="preserve">Roxburghii</w:t>
+      </w:r>
+      <w:r>
+        <w:t xml:space="preserve"> </w:t>
+      </w:r>
+      <w:r>
+        <w:t xml:space="preserve">Sweet (Zingiberaceae).</w:t>
+      </w:r>
+      <w:r>
+        <w:t xml:space="preserve"> </w:t>
+      </w:r>
+      <w:r>
+        <w:rPr>
+          <w:b/>
+          <w:bCs/>
+          <w:i/>
+          <w:iCs/>
+        </w:rPr>
+        <w:t xml:space="preserve">PLoS ONE</w:t>
+      </w:r>
+      <w:r>
+        <w:t xml:space="preserve"> </w:t>
+      </w:r>
+      <w:r>
+        <w:t xml:space="preserve">10, (2015)</w:t>
       </w:r>
       <w:r>
         <w:t xml:space="preserve"> </w:t>
@@ -1871,7 +1787,7 @@
         </w:numPr>
       </w:pPr>
       <w:r>
-        <w:t xml:space="preserve">Cádiz, A., Nagata, N.,</w:t>
+        <w:t xml:space="preserve">Hikosaka, K., Sasaki, T., Kamiyama, C.,</w:t>
       </w:r>
       <w:r>
         <w:t xml:space="preserve"> </w:t>
@@ -1884,7 +1800,7 @@
         <w:t xml:space="preserve">Katabuchi, M.</w:t>
       </w:r>
       <w:r>
-        <w:t xml:space="preserve">, DíAZ, L. M., ECHENIQUE-DíAZ, L. M., Akashi, H. D., Makino, T. &amp; Kawata, M. Relative importance of habitat use, range expansion, and speciation in local species diversity of anolis lizards in cuba.</w:t>
+        <w:t xml:space="preserve">, Oikawa, S., Shimazaki, M., Kimura, K. &amp; Nakshizuka, T. Understanding of species niche, coexistence and extinction based on functional traits : Approaches from community and physiological ecology for subalpine moorland plant communities [in Japanese].</w:t>
       </w:r>
       <w:r>
         <w:t xml:space="preserve"> </w:t>
@@ -1896,13 +1812,55 @@
           <w:i/>
           <w:iCs/>
         </w:rPr>
-        <w:t xml:space="preserve">Ecosphere</w:t>
-      </w:r>
-      <w:r>
-        <w:t xml:space="preserve"> </w:t>
-      </w:r>
-      <w:r>
-        <w:t xml:space="preserve">4, (2013)</w:t>
+        <w:t xml:space="preserve">Chikyu-Kankyo</w:t>
+      </w:r>
+      <w:r>
+        <w:t xml:space="preserve"> </w:t>
+      </w:r>
+      <w:r>
+        <w:t xml:space="preserve">19, 33–46 (2014).</w:t>
+      </w:r>
+    </w:p>
+    <w:p>
+      <w:pPr>
+        <w:numPr>
+          <w:ilvl w:val="0"/>
+          <w:numId w:val="1001"/>
+        </w:numPr>
+      </w:pPr>
+      <w:r>
+        <w:t xml:space="preserve">Kamiyama, C.,</w:t>
+      </w:r>
+      <w:r>
+        <w:t xml:space="preserve"> </w:t>
+      </w:r>
+      <w:r>
+        <w:rPr>
+          <w:b/>
+          <w:bCs/>
+        </w:rPr>
+        <w:t xml:space="preserve">Katabuchi, M.</w:t>
+      </w:r>
+      <w:r>
+        <w:t xml:space="preserve">, Sasaki, T., Shimazaki, M., Nakashizuka, T. &amp; Hikosaka, K. Leaf-trait responses to environmental gradients in moorland communities: Contribution of intraspecific variation, species replacement and functional group replacement.</w:t>
+      </w:r>
+      <w:r>
+        <w:t xml:space="preserve"> </w:t>
+      </w:r>
+      <w:r>
+        <w:rPr>
+          <w:b/>
+          <w:bCs/>
+          <w:i/>
+          <w:iCs/>
+        </w:rPr>
+        <w:t xml:space="preserve">Ecological Research</w:t>
+      </w:r>
+      <w:r>
+        <w:t xml:space="preserve"> </w:t>
+      </w:r>
+      <w:r>
+        <w:t xml:space="preserve">29, 607–617 (2014)</w:t>
       </w:r>
       <w:r>
         <w:t xml:space="preserve"> </w:t>
@@ -1927,7 +1885,7 @@
         </w:numPr>
       </w:pPr>
       <w:r>
-        <w:t xml:space="preserve">Asanok, L., Marod, D., Duengkae, P., Pranmongkol, U., Kurokawa, H., Aiba, M.,</w:t>
+        <w:t xml:space="preserve">Sasaki, T.,</w:t>
       </w:r>
       <w:r>
         <w:t xml:space="preserve"> </w:t>
@@ -1940,10 +1898,7 @@
         <w:t xml:space="preserve">Katabuchi, M.</w:t>
       </w:r>
       <w:r>
-        <w:t xml:space="preserve"> </w:t>
-      </w:r>
-      <w:r>
-        <w:t xml:space="preserve">&amp; Nakashizuka, T. Relationships between functional traits and the ability of forest tree species to reestablish in secondary forest and enrichment plantations in the uplands of northern Thailand.</w:t>
+        <w:t xml:space="preserve">, Kamiyama, C., Shimazaki, M., Nakashizuka, T. &amp; Hikosaka, K. Vulnerability of moorland plant communities to environmental change: Consequences of realistic species loss on functional diversity.</w:t>
       </w:r>
       <w:r>
         <w:t xml:space="preserve"> </w:t>
@@ -1955,13 +1910,13 @@
           <w:i/>
           <w:iCs/>
         </w:rPr>
-        <w:t xml:space="preserve">Forest Ecology and Management</w:t>
-      </w:r>
-      <w:r>
-        <w:t xml:space="preserve"> </w:t>
-      </w:r>
-      <w:r>
-        <w:t xml:space="preserve">296, 9–23 (2013)</w:t>
+        <w:t xml:space="preserve">Journal of Applied Ecology</w:t>
+      </w:r>
+      <w:r>
+        <w:t xml:space="preserve"> </w:t>
+      </w:r>
+      <w:r>
+        <w:t xml:space="preserve">51, 299–308 (2014)</w:t>
       </w:r>
       <w:r>
         <w:t xml:space="preserve"> </w:t>
@@ -1986,7 +1941,7 @@
         </w:numPr>
       </w:pPr>
       <w:r>
-        <w:t xml:space="preserve">Sasaki, T.,</w:t>
+        <w:t xml:space="preserve">Cádiz, A., Nagata, N.,</w:t>
       </w:r>
       <w:r>
         <w:t xml:space="preserve"> </w:t>
@@ -1999,7 +1954,7 @@
         <w:t xml:space="preserve">Katabuchi, M.</w:t>
       </w:r>
       <w:r>
-        <w:t xml:space="preserve">, Kamiyama, C., Shimazaki, M., Nakashizuka, T. &amp; Hikosaka, K. Variations in species composition of moorland plant communities along environmental gradients within a subalpine zone in northern japan.</w:t>
+        <w:t xml:space="preserve">, DíAZ, L. M., ECHENIQUE-DíAZ, L. M., Akashi, H. D., Makino, T. &amp; Kawata, M. Relative importance of habitat use, range expansion, and speciation in local species diversity of anolis lizards in cuba.</w:t>
       </w:r>
       <w:r>
         <w:t xml:space="preserve"> </w:t>
@@ -2011,13 +1966,13 @@
           <w:i/>
           <w:iCs/>
         </w:rPr>
-        <w:t xml:space="preserve">Wetlands</w:t>
-      </w:r>
-      <w:r>
-        <w:t xml:space="preserve"> </w:t>
-      </w:r>
-      <w:r>
-        <w:t xml:space="preserve">33, 269–277 (2013)</w:t>
+        <w:t xml:space="preserve">Ecosphere</w:t>
+      </w:r>
+      <w:r>
+        <w:t xml:space="preserve"> </w:t>
+      </w:r>
+      <w:r>
+        <w:t xml:space="preserve">4, (2013)</w:t>
       </w:r>
       <w:r>
         <w:t xml:space="preserve"> </w:t>
@@ -2042,7 +1997,7 @@
         </w:numPr>
       </w:pPr>
       <w:r>
-        <w:t xml:space="preserve">Aiba, M.,</w:t>
+        <w:t xml:space="preserve">Asanok, L., Marod, D., Duengkae, P., Pranmongkol, U., Kurokawa, H., Aiba, M.,</w:t>
       </w:r>
       <w:r>
         <w:t xml:space="preserve"> </w:t>
@@ -2055,7 +2010,10 @@
         <w:t xml:space="preserve">Katabuchi, M.</w:t>
       </w:r>
       <w:r>
-        <w:t xml:space="preserve">, Takafumi, H., Matsuzaki, S. I. S., Sasaki, T. &amp; Hiura, T. Robustness of trait distribution metrics for community assembly studies under the uncertainties of assembly processes.</w:t>
+        <w:t xml:space="preserve"> </w:t>
+      </w:r>
+      <w:r>
+        <w:t xml:space="preserve">&amp; Nakashizuka, T. Relationships between functional traits and the ability of forest tree species to reestablish in secondary forest and enrichment plantations in the uplands of northern Thailand.</w:t>
       </w:r>
       <w:r>
         <w:t xml:space="preserve"> </w:t>
@@ -2067,13 +2025,13 @@
           <w:i/>
           <w:iCs/>
         </w:rPr>
-        <w:t xml:space="preserve">Ecology</w:t>
-      </w:r>
-      <w:r>
-        <w:t xml:space="preserve"> </w:t>
-      </w:r>
-      <w:r>
-        <w:t xml:space="preserve">94, 2873–2885 (2013)</w:t>
+        <w:t xml:space="preserve">Forest Ecology and Management</w:t>
+      </w:r>
+      <w:r>
+        <w:t xml:space="preserve"> </w:t>
+      </w:r>
+      <w:r>
+        <w:t xml:space="preserve">296, 9–23 (2013)</w:t>
       </w:r>
       <w:r>
         <w:t xml:space="preserve"> </w:t>
@@ -2111,7 +2069,7 @@
         <w:t xml:space="preserve">Katabuchi, M.</w:t>
       </w:r>
       <w:r>
-        <w:t xml:space="preserve">, Kamiyama, C., Shimazaki, M., Nakashizuka, T. &amp; Hikosaka, K. Nestedness and niche-based species loss in moorland plant communities.</w:t>
+        <w:t xml:space="preserve">, Kamiyama, C., Shimazaki, M., Nakashizuka, T. &amp; Hikosaka, K. Variations in species composition of moorland plant communities along environmental gradients within a subalpine zone in northern japan.</w:t>
       </w:r>
       <w:r>
         <w:t xml:space="preserve"> </w:t>
@@ -2123,13 +2081,13 @@
           <w:i/>
           <w:iCs/>
         </w:rPr>
-        <w:t xml:space="preserve">Oikos</w:t>
-      </w:r>
-      <w:r>
-        <w:t xml:space="preserve"> </w:t>
-      </w:r>
-      <w:r>
-        <w:t xml:space="preserve">121, 1783–1790 (2012)</w:t>
+        <w:t xml:space="preserve">Wetlands</w:t>
+      </w:r>
+      <w:r>
+        <w:t xml:space="preserve"> </w:t>
+      </w:r>
+      <w:r>
+        <w:t xml:space="preserve">33, 269–277 (2013)</w:t>
       </w:r>
       <w:r>
         <w:t xml:space="preserve"> </w:t>
@@ -2154,7 +2112,7 @@
         </w:numPr>
       </w:pPr>
       <w:r>
-        <w:t xml:space="preserve">Sasaki, T.,</w:t>
+        <w:t xml:space="preserve">Aiba, M.,</w:t>
       </w:r>
       <w:r>
         <w:t xml:space="preserve"> </w:t>
@@ -2167,7 +2125,7 @@
         <w:t xml:space="preserve">Katabuchi, M.</w:t>
       </w:r>
       <w:r>
-        <w:t xml:space="preserve">, Kamiyama, C., Shimazaki, M., Nakashizuka, T. &amp; Hikosaka, K. Diversity partitioning of moorland plant communities across hierarchical spatial scales.</w:t>
+        <w:t xml:space="preserve">, Takafumi, H., Matsuzaki, S. I. S., Sasaki, T. &amp; Hiura, T. Robustness of trait distribution metrics for community assembly studies under the uncertainties of assembly processes.</w:t>
       </w:r>
       <w:r>
         <w:t xml:space="preserve"> </w:t>
@@ -2179,13 +2137,13 @@
           <w:i/>
           <w:iCs/>
         </w:rPr>
-        <w:t xml:space="preserve">Biodiversity and Conservation</w:t>
-      </w:r>
-      <w:r>
-        <w:t xml:space="preserve"> </w:t>
-      </w:r>
-      <w:r>
-        <w:t xml:space="preserve">21, 1577–1588 (2012)</w:t>
+        <w:t xml:space="preserve">Ecology</w:t>
+      </w:r>
+      <w:r>
+        <w:t xml:space="preserve"> </w:t>
+      </w:r>
+      <w:r>
+        <w:t xml:space="preserve">94, 2873–2885 (2013)</w:t>
       </w:r>
       <w:r>
         <w:t xml:space="preserve"> </w:t>
@@ -2210,6 +2168,12 @@
         </w:numPr>
       </w:pPr>
       <w:r>
+        <w:t xml:space="preserve">Sasaki, T.,</w:t>
+      </w:r>
+      <w:r>
+        <w:t xml:space="preserve"> </w:t>
+      </w:r>
+      <w:r>
         <w:rPr>
           <w:b/>
           <w:bCs/>
@@ -2217,7 +2181,7 @@
         <w:t xml:space="preserve">Katabuchi, M.</w:t>
       </w:r>
       <w:r>
-        <w:t xml:space="preserve">, Kurokawa, H., Davies, S. J., Tan, S. &amp; Nakashizuka, T. Soil resource availability shapes community trait structure in a species-rich dipterocarp forest.</w:t>
+        <w:t xml:space="preserve">, Kamiyama, C., Shimazaki, M., Nakashizuka, T. &amp; Hikosaka, K. Nestedness and niche-based species loss in moorland plant communities.</w:t>
       </w:r>
       <w:r>
         <w:t xml:space="preserve"> </w:t>
@@ -2229,13 +2193,13 @@
           <w:i/>
           <w:iCs/>
         </w:rPr>
-        <w:t xml:space="preserve">Journal of Ecology</w:t>
-      </w:r>
-      <w:r>
-        <w:t xml:space="preserve"> </w:t>
-      </w:r>
-      <w:r>
-        <w:t xml:space="preserve">100, 643–651 (2012)</w:t>
+        <w:t xml:space="preserve">Oikos</w:t>
+      </w:r>
+      <w:r>
+        <w:t xml:space="preserve"> </w:t>
+      </w:r>
+      <w:r>
+        <w:t xml:space="preserve">121, 1783–1790 (2012)</w:t>
       </w:r>
       <w:r>
         <w:t xml:space="preserve"> </w:t>
@@ -2260,6 +2224,12 @@
         </w:numPr>
       </w:pPr>
       <w:r>
+        <w:t xml:space="preserve">Sasaki, T.,</w:t>
+      </w:r>
+      <w:r>
+        <w:t xml:space="preserve"> </w:t>
+      </w:r>
+      <w:r>
         <w:rPr>
           <w:b/>
           <w:bCs/>
@@ -2267,71 +2237,25 @@
         <w:t xml:space="preserve">Katabuchi, M.</w:t>
       </w:r>
       <w:r>
-        <w:t xml:space="preserve">, Isagi, Y. &amp; Nakashizuka, T. Development of 17 microsatellite markers for</w:t>
-      </w:r>
-      <w:r>
-        <w:t xml:space="preserve"> </w:t>
-      </w:r>
-      <w:r>
-        <w:rPr>
+        <w:t xml:space="preserve">, Kamiyama, C., Shimazaki, M., Nakashizuka, T. &amp; Hikosaka, K. Diversity partitioning of moorland plant communities across hierarchical spatial scales.</w:t>
+      </w:r>
+      <w:r>
+        <w:t xml:space="preserve"> </w:t>
+      </w:r>
+      <w:r>
+        <w:rPr>
+          <w:b/>
+          <w:bCs/>
           <w:i/>
           <w:iCs/>
         </w:rPr>
-        <w:t xml:space="preserve">Ceratosolen</w:t>
-      </w:r>
-      <w:r>
-        <w:t xml:space="preserve"> </w:t>
-      </w:r>
-      <w:r>
-        <w:rPr>
-          <w:i/>
-          <w:iCs/>
-        </w:rPr>
-        <w:t xml:space="preserve">Constrictus</w:t>
-      </w:r>
-      <w:r>
-        <w:t xml:space="preserve">, the pollinating fig wasp of</w:t>
-      </w:r>
-      <w:r>
-        <w:t xml:space="preserve"> </w:t>
-      </w:r>
-      <w:r>
-        <w:rPr>
-          <w:i/>
-          <w:iCs/>
-        </w:rPr>
-        <w:t xml:space="preserve">Ficus</w:t>
-      </w:r>
-      <w:r>
-        <w:t xml:space="preserve"> </w:t>
-      </w:r>
-      <w:r>
-        <w:rPr>
-          <w:i/>
-          <w:iCs/>
-        </w:rPr>
-        <w:t xml:space="preserve">Fistulosa</w:t>
-      </w:r>
-      <w:r>
-        <w:t xml:space="preserve">.</w:t>
-      </w:r>
-      <w:r>
-        <w:t xml:space="preserve"> </w:t>
-      </w:r>
-      <w:r>
-        <w:rPr>
-          <w:b/>
-          <w:bCs/>
-          <w:i/>
-          <w:iCs/>
-        </w:rPr>
-        <w:t xml:space="preserve">Molecular Ecology Resources</w:t>
-      </w:r>
-      <w:r>
-        <w:t xml:space="preserve"> </w:t>
-      </w:r>
-      <w:r>
-        <w:t xml:space="preserve">8, 840–842 (2008)</w:t>
+        <w:t xml:space="preserve">Biodiversity and Conservation</w:t>
+      </w:r>
+      <w:r>
+        <w:t xml:space="preserve"> </w:t>
+      </w:r>
+      <w:r>
+        <w:t xml:space="preserve">21, 1577–1588 (2012)</w:t>
       </w:r>
       <w:r>
         <w:t xml:space="preserve"> </w:t>
@@ -2363,48 +2287,25 @@
         <w:t xml:space="preserve">Katabuchi, M.</w:t>
       </w:r>
       <w:r>
-        <w:t xml:space="preserve">, Harrison, R. D. &amp; Nakashizuka, T. Documenting the effect of foundress number in a dioecious fig,</w:t>
-      </w:r>
-      <w:r>
-        <w:t xml:space="preserve"> </w:t>
-      </w:r>
-      <w:r>
-        <w:rPr>
+        <w:t xml:space="preserve">, Kurokawa, H., Davies, S. J., Tan, S. &amp; Nakashizuka, T. Soil resource availability shapes community trait structure in a species-rich dipterocarp forest.</w:t>
+      </w:r>
+      <w:r>
+        <w:t xml:space="preserve"> </w:t>
+      </w:r>
+      <w:r>
+        <w:rPr>
+          <w:b/>
+          <w:bCs/>
           <w:i/>
           <w:iCs/>
         </w:rPr>
-        <w:t xml:space="preserve">Ficus</w:t>
-      </w:r>
-      <w:r>
-        <w:t xml:space="preserve"> </w:t>
-      </w:r>
-      <w:r>
-        <w:rPr>
-          <w:i/>
-          <w:iCs/>
-        </w:rPr>
-        <w:t xml:space="preserve">Fistulosa</w:t>
-      </w:r>
-      <w:r>
-        <w:t xml:space="preserve">, in Malaysia.</w:t>
-      </w:r>
-      <w:r>
-        <w:t xml:space="preserve"> </w:t>
-      </w:r>
-      <w:r>
-        <w:rPr>
-          <w:b/>
-          <w:bCs/>
-          <w:i/>
-          <w:iCs/>
-        </w:rPr>
-        <w:t xml:space="preserve">Biotropica</w:t>
-      </w:r>
-      <w:r>
-        <w:t xml:space="preserve"> </w:t>
-      </w:r>
-      <w:r>
-        <w:t xml:space="preserve">40, 457–461 (2008)</w:t>
+        <w:t xml:space="preserve">Journal of Ecology</w:t>
+      </w:r>
+      <w:r>
+        <w:t xml:space="preserve"> </w:t>
+      </w:r>
+      <w:r>
+        <w:t xml:space="preserve">100, 643–651 (2012)</w:t>
       </w:r>
       <w:r>
         <w:t xml:space="preserve"> </w:t>
@@ -2421,8 +2322,177 @@
         <w:t xml:space="preserve">.</w:t>
       </w:r>
     </w:p>
-    <w:bookmarkEnd w:id="55"/>
-    <w:bookmarkStart w:id="56" w:name="book"/>
+    <w:p>
+      <w:pPr>
+        <w:numPr>
+          <w:ilvl w:val="0"/>
+          <w:numId w:val="1001"/>
+        </w:numPr>
+      </w:pPr>
+      <w:r>
+        <w:rPr>
+          <w:b/>
+          <w:bCs/>
+        </w:rPr>
+        <w:t xml:space="preserve">Katabuchi, M.</w:t>
+      </w:r>
+      <w:r>
+        <w:t xml:space="preserve">, Isagi, Y. &amp; Nakashizuka, T. Development of 17 microsatellite markers for</w:t>
+      </w:r>
+      <w:r>
+        <w:t xml:space="preserve"> </w:t>
+      </w:r>
+      <w:r>
+        <w:rPr>
+          <w:i/>
+          <w:iCs/>
+        </w:rPr>
+        <w:t xml:space="preserve">Ceratosolen</w:t>
+      </w:r>
+      <w:r>
+        <w:t xml:space="preserve"> </w:t>
+      </w:r>
+      <w:r>
+        <w:rPr>
+          <w:i/>
+          <w:iCs/>
+        </w:rPr>
+        <w:t xml:space="preserve">Constrictus</w:t>
+      </w:r>
+      <w:r>
+        <w:t xml:space="preserve">, the pollinating fig wasp of</w:t>
+      </w:r>
+      <w:r>
+        <w:t xml:space="preserve"> </w:t>
+      </w:r>
+      <w:r>
+        <w:rPr>
+          <w:i/>
+          <w:iCs/>
+        </w:rPr>
+        <w:t xml:space="preserve">Ficus</w:t>
+      </w:r>
+      <w:r>
+        <w:t xml:space="preserve"> </w:t>
+      </w:r>
+      <w:r>
+        <w:rPr>
+          <w:i/>
+          <w:iCs/>
+        </w:rPr>
+        <w:t xml:space="preserve">Fistulosa</w:t>
+      </w:r>
+      <w:r>
+        <w:t xml:space="preserve">.</w:t>
+      </w:r>
+      <w:r>
+        <w:t xml:space="preserve"> </w:t>
+      </w:r>
+      <w:r>
+        <w:rPr>
+          <w:b/>
+          <w:bCs/>
+          <w:i/>
+          <w:iCs/>
+        </w:rPr>
+        <w:t xml:space="preserve">Molecular Ecology Resources</w:t>
+      </w:r>
+      <w:r>
+        <w:t xml:space="preserve"> </w:t>
+      </w:r>
+      <w:r>
+        <w:t xml:space="preserve">8, 840–842 (2008)</w:t>
+      </w:r>
+      <w:r>
+        <w:t xml:space="preserve"> </w:t>
+      </w:r>
+      <w:hyperlink r:id="rId55">
+        <w:r>
+          <w:rPr>
+            <w:rStyle w:val="InternetLink"/>
+          </w:rPr>
+          <w:t xml:space="preserve">[doi]</w:t>
+        </w:r>
+      </w:hyperlink>
+      <w:r>
+        <w:t xml:space="preserve">.</w:t>
+      </w:r>
+    </w:p>
+    <w:p>
+      <w:pPr>
+        <w:numPr>
+          <w:ilvl w:val="0"/>
+          <w:numId w:val="1001"/>
+        </w:numPr>
+      </w:pPr>
+      <w:r>
+        <w:rPr>
+          <w:b/>
+          <w:bCs/>
+        </w:rPr>
+        <w:t xml:space="preserve">Katabuchi, M.</w:t>
+      </w:r>
+      <w:r>
+        <w:t xml:space="preserve">, Harrison, R. D. &amp; Nakashizuka, T. Documenting the effect of foundress number in a dioecious fig,</w:t>
+      </w:r>
+      <w:r>
+        <w:t xml:space="preserve"> </w:t>
+      </w:r>
+      <w:r>
+        <w:rPr>
+          <w:i/>
+          <w:iCs/>
+        </w:rPr>
+        <w:t xml:space="preserve">Ficus</w:t>
+      </w:r>
+      <w:r>
+        <w:t xml:space="preserve"> </w:t>
+      </w:r>
+      <w:r>
+        <w:rPr>
+          <w:i/>
+          <w:iCs/>
+        </w:rPr>
+        <w:t xml:space="preserve">Fistulosa</w:t>
+      </w:r>
+      <w:r>
+        <w:t xml:space="preserve">, in Malaysia.</w:t>
+      </w:r>
+      <w:r>
+        <w:t xml:space="preserve"> </w:t>
+      </w:r>
+      <w:r>
+        <w:rPr>
+          <w:b/>
+          <w:bCs/>
+          <w:i/>
+          <w:iCs/>
+        </w:rPr>
+        <w:t xml:space="preserve">Biotropica</w:t>
+      </w:r>
+      <w:r>
+        <w:t xml:space="preserve"> </w:t>
+      </w:r>
+      <w:r>
+        <w:t xml:space="preserve">40, 457–461 (2008)</w:t>
+      </w:r>
+      <w:r>
+        <w:t xml:space="preserve"> </w:t>
+      </w:r>
+      <w:hyperlink r:id="rId56">
+        <w:r>
+          <w:rPr>
+            <w:rStyle w:val="InternetLink"/>
+          </w:rPr>
+          <w:t xml:space="preserve">[doi]</w:t>
+        </w:r>
+      </w:hyperlink>
+      <w:r>
+        <w:t xml:space="preserve">.</w:t>
+      </w:r>
+    </w:p>
+    <w:bookmarkEnd w:id="57"/>
+    <w:bookmarkStart w:id="58" w:name="book"/>
     <w:p>
       <w:pPr>
         <w:pStyle w:val="Heading2"/>
@@ -2456,8 +2526,8 @@
         <w:t xml:space="preserve">, Oikawa S., Shimazaki M., Kimura H. and Nakashizuka T. (2016), Trait-Based Approaches for Understanding Species Niche, Coexistence, and Functional Diversity in Subalpine Moorlands. Structure and Function of Mountain Ecosystems in Japan.</w:t>
       </w:r>
     </w:p>
-    <w:bookmarkEnd w:id="56"/>
-    <w:bookmarkStart w:id="60" w:name="software"/>
+    <w:bookmarkEnd w:id="58"/>
+    <w:bookmarkStart w:id="62" w:name="software"/>
     <w:p>
       <w:pPr>
         <w:pStyle w:val="Heading2"/>
@@ -2487,74 +2557,6 @@
       </w:r>
       <w:r>
         <w:t xml:space="preserve">: Zero-Truncated Poisson Lognormal Distribution,</w:t>
-      </w:r>
-      <w:r>
-        <w:t xml:space="preserve"> </w:t>
-      </w:r>
-      <w:hyperlink r:id="rId57">
-        <w:r>
-          <w:rPr>
-            <w:rStyle w:val="InternetLink"/>
-          </w:rPr>
-          <w:t xml:space="preserve">R CRAN package</w:t>
-        </w:r>
-      </w:hyperlink>
-    </w:p>
-    <w:p>
-      <w:pPr>
-        <w:pStyle w:val="DefinitionTerm"/>
-      </w:pPr>
-      <w:r>
-        <w:t xml:space="preserve">2015</w:t>
-      </w:r>
-    </w:p>
-    <w:p>
-      <w:pPr>
-        <w:pStyle w:val="Definition"/>
-      </w:pPr>
-      <w:r>
-        <w:rPr>
-          <w:b/>
-          <w:bCs/>
-        </w:rPr>
-        <w:t xml:space="preserve">LeafArea</w:t>
-      </w:r>
-      <w:r>
-        <w:t xml:space="preserve">: Rapid Digital Image Analysis of Leaf Area,</w:t>
-      </w:r>
-      <w:r>
-        <w:t xml:space="preserve"> </w:t>
-      </w:r>
-      <w:hyperlink r:id="rId58">
-        <w:r>
-          <w:rPr>
-            <w:rStyle w:val="InternetLink"/>
-          </w:rPr>
-          <w:t xml:space="preserve">R CRAN package</w:t>
-        </w:r>
-      </w:hyperlink>
-    </w:p>
-    <w:p>
-      <w:pPr>
-        <w:pStyle w:val="DefinitionTerm"/>
-      </w:pPr>
-      <w:r>
-        <w:t xml:space="preserve">2015</w:t>
-      </w:r>
-    </w:p>
-    <w:p>
-      <w:pPr>
-        <w:pStyle w:val="Definition"/>
-      </w:pPr>
-      <w:r>
-        <w:rPr>
-          <w:b/>
-          <w:bCs/>
-        </w:rPr>
-        <w:t xml:space="preserve">mglmn</w:t>
-      </w:r>
-      <w:r>
-        <w:t xml:space="preserve">: Model Averaging fro Multivariate GLM with Null Models, R CRAN package</w:t>
       </w:r>
       <w:r>
         <w:t xml:space="preserve"> </w:t>
@@ -2568,8 +2570,76 @@
         </w:r>
       </w:hyperlink>
     </w:p>
-    <w:bookmarkEnd w:id="60"/>
-    <w:bookmarkStart w:id="61" w:name="teaching-experience"/>
+    <w:p>
+      <w:pPr>
+        <w:pStyle w:val="DefinitionTerm"/>
+      </w:pPr>
+      <w:r>
+        <w:t xml:space="preserve">2015</w:t>
+      </w:r>
+    </w:p>
+    <w:p>
+      <w:pPr>
+        <w:pStyle w:val="Definition"/>
+      </w:pPr>
+      <w:r>
+        <w:rPr>
+          <w:b/>
+          <w:bCs/>
+        </w:rPr>
+        <w:t xml:space="preserve">LeafArea</w:t>
+      </w:r>
+      <w:r>
+        <w:t xml:space="preserve">: Rapid Digital Image Analysis of Leaf Area,</w:t>
+      </w:r>
+      <w:r>
+        <w:t xml:space="preserve"> </w:t>
+      </w:r>
+      <w:hyperlink r:id="rId60">
+        <w:r>
+          <w:rPr>
+            <w:rStyle w:val="InternetLink"/>
+          </w:rPr>
+          <w:t xml:space="preserve">R CRAN package</w:t>
+        </w:r>
+      </w:hyperlink>
+    </w:p>
+    <w:p>
+      <w:pPr>
+        <w:pStyle w:val="DefinitionTerm"/>
+      </w:pPr>
+      <w:r>
+        <w:t xml:space="preserve">2015</w:t>
+      </w:r>
+    </w:p>
+    <w:p>
+      <w:pPr>
+        <w:pStyle w:val="Definition"/>
+      </w:pPr>
+      <w:r>
+        <w:rPr>
+          <w:b/>
+          <w:bCs/>
+        </w:rPr>
+        <w:t xml:space="preserve">mglmn</w:t>
+      </w:r>
+      <w:r>
+        <w:t xml:space="preserve">: Model Averaging fro Multivariate GLM with Null Models, R CRAN package</w:t>
+      </w:r>
+      <w:r>
+        <w:t xml:space="preserve"> </w:t>
+      </w:r>
+      <w:hyperlink r:id="rId61">
+        <w:r>
+          <w:rPr>
+            <w:rStyle w:val="InternetLink"/>
+          </w:rPr>
+          <w:t xml:space="preserve">R CRAN package</w:t>
+        </w:r>
+      </w:hyperlink>
+    </w:p>
+    <w:bookmarkEnd w:id="62"/>
+    <w:bookmarkStart w:id="63" w:name="teaching-experience"/>
     <w:p>
       <w:pPr>
         <w:pStyle w:val="Heading2"/>
@@ -2642,8 +2712,8 @@
         <w:t xml:space="preserve">R and generalized linear models, Xishuangbanna Tropical Botanical Garden, Chinese Academy of Sciences, China</w:t>
       </w:r>
     </w:p>
-    <w:bookmarkEnd w:id="61"/>
-    <w:bookmarkStart w:id="64" w:name="academic-service"/>
+    <w:bookmarkEnd w:id="63"/>
+    <w:bookmarkStart w:id="66" w:name="academic-service"/>
     <w:p>
       <w:pPr>
         <w:pStyle w:val="Heading2"/>
@@ -2664,7 +2734,7 @@
       <w:pPr>
         <w:pStyle w:val="Definition"/>
       </w:pPr>
-      <w:hyperlink r:id="rId62"/>
+      <w:hyperlink r:id="rId64"/>
     </w:p>
     <w:p>
       <w:pPr>
@@ -2686,7 +2756,7 @@
       <w:pPr>
         <w:pStyle w:val="Definition"/>
       </w:pPr>
-      <w:hyperlink r:id="rId62"/>
+      <w:hyperlink r:id="rId64"/>
     </w:p>
     <w:p>
       <w:pPr>
@@ -2708,7 +2778,7 @@
       <w:pPr>
         <w:pStyle w:val="Definition"/>
       </w:pPr>
-      <w:hyperlink r:id="rId62"/>
+      <w:hyperlink r:id="rId64"/>
     </w:p>
     <w:p>
       <w:pPr>
@@ -2730,7 +2800,7 @@
       <w:pPr>
         <w:pStyle w:val="Definition"/>
       </w:pPr>
-      <w:hyperlink r:id="rId62"/>
+      <w:hyperlink r:id="rId64"/>
     </w:p>
     <w:p>
       <w:pPr>
@@ -2740,7 +2810,7 @@
         <w:t xml:space="preserve">Statistical editor for Lepcey, The Journal of Tropical Asian Entomology</w:t>
       </w:r>
     </w:p>
-    <w:bookmarkStart w:id="63" w:name="reviewer-for-journals-12-per-year"/>
+    <w:bookmarkStart w:id="65" w:name="reviewer-for-journals-12-per-year"/>
     <w:p>
       <w:pPr>
         <w:pStyle w:val="Heading3"/>
@@ -2749,9 +2819,9 @@
         <w:t xml:space="preserve">Reviewer for journals (~ 12 per year):</w:t>
       </w:r>
     </w:p>
-    <w:bookmarkEnd w:id="63"/>
-    <w:bookmarkEnd w:id="64"/>
-    <w:bookmarkStart w:id="65" w:name="awards-and-prizes"/>
+    <w:bookmarkEnd w:id="65"/>
+    <w:bookmarkEnd w:id="66"/>
+    <w:bookmarkStart w:id="67" w:name="awards-and-prizes"/>
     <w:p>
       <w:pPr>
         <w:pStyle w:val="Heading2"/>
@@ -2792,8 +2862,8 @@
         <w:t xml:space="preserve">Dean’s award for excellence, Graduate School of Life Sciences (Master’s Program), Tohoku University</w:t>
       </w:r>
     </w:p>
-    <w:bookmarkEnd w:id="65"/>
-    <w:bookmarkStart w:id="66" w:name="invited-seminars"/>
+    <w:bookmarkEnd w:id="67"/>
+    <w:bookmarkStart w:id="68" w:name="invited-seminars"/>
     <w:p>
       <w:pPr>
         <w:pStyle w:val="Heading2"/>
@@ -2898,8 +2968,8 @@
         <w:t xml:space="preserve">Additive partitioning of functional diversity in plant communities, Xishuangbanna Tropical Botanical Garden, China</w:t>
       </w:r>
     </w:p>
-    <w:bookmarkEnd w:id="66"/>
-    <w:bookmarkStart w:id="67" w:name="international-meetings"/>
+    <w:bookmarkEnd w:id="68"/>
+    <w:bookmarkStart w:id="69" w:name="international-meetings"/>
     <w:p>
       <w:pPr>
         <w:pStyle w:val="Heading2"/>
@@ -3314,8 +3384,8 @@
         <w:t xml:space="preserve">. ATBC, Marburg, Germany</w:t>
       </w:r>
     </w:p>
-    <w:bookmarkEnd w:id="67"/>
-    <w:bookmarkStart w:id="68" w:name="outreach"/>
+    <w:bookmarkEnd w:id="69"/>
+    <w:bookmarkStart w:id="70" w:name="outreach"/>
     <w:p>
       <w:pPr>
         <w:pStyle w:val="Heading2"/>
@@ -3349,8 +3419,8 @@
         <w:t xml:space="preserve">. Invited by the Japanese Association of Interdisciplinary Study Group in University Florida</w:t>
       </w:r>
     </w:p>
-    <w:bookmarkEnd w:id="68"/>
-    <w:bookmarkStart w:id="69" w:name="languages"/>
+    <w:bookmarkEnd w:id="70"/>
+    <w:bookmarkStart w:id="71" w:name="languages"/>
     <w:p>
       <w:pPr>
         <w:pStyle w:val="Heading2"/>
@@ -3367,8 +3437,8 @@
         <w:t xml:space="preserve">Japanese (native), English (fluent), Malay (basic), Chinese-Mandarin (basic)</w:t>
       </w:r>
     </w:p>
-    <w:bookmarkEnd w:id="69"/>
-    <w:bookmarkStart w:id="70" w:name="graduate-students"/>
+    <w:bookmarkEnd w:id="71"/>
+    <w:bookmarkStart w:id="72" w:name="graduate-students"/>
     <w:p>
       <w:pPr>
         <w:pStyle w:val="Heading2"/>
@@ -3393,7 +3463,7 @@
         <w:t xml:space="preserve">Zhou Cong, 2021 - 2023, M.Sc. Student, Recipient of UCAS Scholarship.</w:t>
       </w:r>
     </w:p>
-    <w:bookmarkEnd w:id="70"/>
+    <w:bookmarkEnd w:id="72"/>
     <w:sectPr>
       <w:headerReference r:id="rId9" w:type="default"/>
       <w:footnotePr>

</xml_diff>

<commit_message>
Deploying to gh-pages from @ mattocci27/my-cv@4efd3f731408e9675e7de92bda526a36443770b5 🚀
</commit_message>
<xml_diff>
--- a/Katabuchi_CV.docx
+++ b/Katabuchi_CV.docx
@@ -182,6 +182,29 @@
         <w:pStyle w:val="DefinitionTerm"/>
       </w:pPr>
       <w:r>
+        <w:t xml:space="preserve">October 2019-</w:t>
+      </w:r>
+    </w:p>
+    <w:p>
+      <w:pPr>
+        <w:pStyle w:val="Definition"/>
+      </w:pPr>
+      <w:r>
+        <w:rPr>
+          <w:b/>
+          <w:bCs/>
+        </w:rPr>
+        <w:t xml:space="preserve">Graduate Supervisor</w:t>
+      </w:r>
+      <w:r>
+        <w:t xml:space="preserve">, University of Chinese Academy of Sciences, China</w:t>
+      </w:r>
+    </w:p>
+    <w:p>
+      <w:pPr>
+        <w:pStyle w:val="DefinitionTerm"/>
+      </w:pPr>
+      <w:r>
         <w:t xml:space="preserve">August 2017-February 2019</w:t>
       </w:r>
     </w:p>
@@ -571,13 +594,27 @@
       </w:r>
     </w:p>
     <w:bookmarkEnd w:id="24"/>
-    <w:bookmarkStart w:id="57" w:name="publications"/>
+    <w:bookmarkStart w:id="58" w:name="publications"/>
     <w:p>
       <w:pPr>
         <w:pStyle w:val="Heading2"/>
       </w:pPr>
       <w:r>
         <w:t xml:space="preserve">Publications</w:t>
+      </w:r>
+    </w:p>
+    <w:p>
+      <w:pPr>
+        <w:pStyle w:val="FirstParagraph"/>
+      </w:pPr>
+      <w:r>
+        <w:t xml:space="preserve">*: corresponding author,</w:t>
+      </w:r>
+      <w:r>
+        <w:t xml:space="preserve"> </w:t>
+      </w:r>
+      <w:r>
+        <w:t xml:space="preserve">†: equal contribution</w:t>
       </w:r>
     </w:p>
     <w:p>
@@ -588,7 +625,7 @@
         </w:numPr>
       </w:pPr>
       <w:r>
-        <w:t xml:space="preserve">Chen, Y.-J., Maenpuen, P.,</w:t>
+        <w:t xml:space="preserve">Kurokawa, H.*, Arai, T., Takayanagi, S., Kobayashi, M., Fukuzawa, K.,</w:t>
       </w:r>
       <w:r>
         <w:t xml:space="preserve"> </w:t>
@@ -601,7 +638,7 @@
         <w:t xml:space="preserve">Katabuchi, M.</w:t>
       </w:r>
       <w:r>
-        <w:t xml:space="preserve">, Tor-ngern, P., Palmroth, S., Zhang, S.-B., Xiao, Y.-X., Liu, M. &amp; Oren, R. Hydraulic conductivity-induced systematic parameter variation in a widely used thermal dissipation sap-flow technique.</w:t>
+        <w:t xml:space="preserve">, Oguro, M., Aiba, M., Nagano, S., Hikosaka, K., Shibata, H., Kaneko, N. &amp; Nakashizuka, T. Leaf litter decomposition along an elevation gradient across two contrasting forest types: Implications for future climate change.</w:t>
       </w:r>
       <w:r>
         <w:t xml:space="preserve"> </w:t>
@@ -613,7 +650,7 @@
           <w:i/>
           <w:iCs/>
         </w:rPr>
-        <w:t xml:space="preserve">New Phytologist</w:t>
+        <w:t xml:space="preserve">Ecological Research</w:t>
       </w:r>
       <w:r>
         <w:t xml:space="preserve"> </w:t>
@@ -644,23 +681,20 @@
         </w:numPr>
       </w:pPr>
       <w:r>
-        <w:t xml:space="preserve">Nguyen, T. D. &amp;</w:t>
-      </w:r>
-      <w:r>
-        <w:t xml:space="preserve"> </w:t>
-      </w:r>
-      <w:r>
-        <w:rPr>
-          <w:b/>
-          <w:bCs/>
-        </w:rPr>
-        <w:t xml:space="preserve">Katabuchi, M.</w:t>
-      </w:r>
-      <w:r>
-        <w:t xml:space="preserve"> </w:t>
-      </w:r>
-      <w:r>
-        <w:t xml:space="preserve">Saturating allometric relationships reveal how wood density shapes global tree architecture.</w:t>
+        <w:t xml:space="preserve">Chen, Y.-J.†*, Maenpuen, P.†,</w:t>
+      </w:r>
+      <w:r>
+        <w:t xml:space="preserve"> </w:t>
+      </w:r>
+      <w:r>
+        <w:rPr>
+          <w:b/>
+          <w:bCs/>
+        </w:rPr>
+        <w:t xml:space="preserve">Katabuchi, M.†</w:t>
+      </w:r>
+      <w:r>
+        <w:t xml:space="preserve">, Tor-ngern, P., Palmroth, S., Zhang, S.-B., Xiao, Y.-X., Liu, M. &amp; Oren, R.†* Hydraulic conductivity-induced systematic parameter variation in a widely used thermal dissipation sap-flow technique.</w:t>
       </w:r>
       <w:r>
         <w:t xml:space="preserve"> </w:t>
@@ -672,13 +706,13 @@
           <w:i/>
           <w:iCs/>
         </w:rPr>
-        <w:t xml:space="preserve">Journal of Forestry Research</w:t>
-      </w:r>
-      <w:r>
-        <w:t xml:space="preserve"> </w:t>
-      </w:r>
-      <w:r>
-        <w:t xml:space="preserve">36, 107 (2025)</w:t>
+        <w:t xml:space="preserve">New Phytologist</w:t>
+      </w:r>
+      <w:r>
+        <w:t xml:space="preserve"> </w:t>
+      </w:r>
+      <w:r>
+        <w:t xml:space="preserve">(2025)</w:t>
       </w:r>
       <w:r>
         <w:t xml:space="preserve"> </w:t>
@@ -703,14 +737,23 @@
         </w:numPr>
       </w:pPr>
       <w:r>
-        <w:rPr>
-          <w:b/>
-          <w:bCs/>
-        </w:rPr>
-        <w:t xml:space="preserve">Katabuchi, M.</w:t>
-      </w:r>
-      <w:r>
-        <w:t xml:space="preserve">, Kitajima, K., Wright, S. J., Van Bael, S. A., Osnas, J. L. D. &amp; Lichstein, J. W. Decomposing leaf mass into metabolic and structural components explains divergent patterns of trait variation within and among plant species.</w:t>
+        <w:t xml:space="preserve">Nguyen, T. D. &amp;</w:t>
+      </w:r>
+      <w:r>
+        <w:t xml:space="preserve"> </w:t>
+      </w:r>
+      <w:r>
+        <w:rPr>
+          <w:b/>
+          <w:bCs/>
+        </w:rPr>
+        <w:t xml:space="preserve">Katabuchi, M.*</w:t>
+      </w:r>
+      <w:r>
+        <w:t xml:space="preserve"> </w:t>
+      </w:r>
+      <w:r>
+        <w:t xml:space="preserve">Saturating allometric relationships reveal how wood density shapes global tree architecture.</w:t>
       </w:r>
       <w:r>
         <w:t xml:space="preserve"> </w:t>
@@ -722,13 +765,13 @@
           <w:i/>
           <w:iCs/>
         </w:rPr>
-        <w:t xml:space="preserve">Oecologia</w:t>
-      </w:r>
-      <w:r>
-        <w:t xml:space="preserve"> </w:t>
-      </w:r>
-      <w:r>
-        <w:t xml:space="preserve">207, 71 (2025)</w:t>
+        <w:t xml:space="preserve">Journal of Forestry Research</w:t>
+      </w:r>
+      <w:r>
+        <w:t xml:space="preserve"> </w:t>
+      </w:r>
+      <w:r>
+        <w:t xml:space="preserve">36, 107 (2025)</w:t>
       </w:r>
       <w:r>
         <w:t xml:space="preserve"> </w:t>
@@ -753,20 +796,14 @@
         </w:numPr>
       </w:pPr>
       <w:r>
-        <w:t xml:space="preserve">Song, X.,</w:t>
-      </w:r>
-      <w:r>
-        <w:t xml:space="preserve"> </w:t>
-      </w:r>
-      <w:r>
-        <w:rPr>
-          <w:b/>
-          <w:bCs/>
-        </w:rPr>
-        <w:t xml:space="preserve">Katabuchi, M.</w:t>
-      </w:r>
-      <w:r>
-        <w:t xml:space="preserve">, Chase, J. M., Johnson, D. J., Zhang, W., Deng, X., Cao, M. &amp; Yang, J. Drought tolerance and species abundance mediate dry season negative density dependence in a tropical forest.</w:t>
+        <w:rPr>
+          <w:b/>
+          <w:bCs/>
+        </w:rPr>
+        <w:t xml:space="preserve">Katabuchi, M.*</w:t>
+      </w:r>
+      <w:r>
+        <w:t xml:space="preserve">, Kitajima, K., Wright, S. J., Van Bael, S. A., Osnas, J. L. D. &amp; Lichstein, J. W. Decomposing leaf mass into metabolic and structural components explains divergent patterns of trait variation within and among plant species.</w:t>
       </w:r>
       <w:r>
         <w:t xml:space="preserve"> </w:t>
@@ -778,13 +815,13 @@
           <w:i/>
           <w:iCs/>
         </w:rPr>
-        <w:t xml:space="preserve">Ecology</w:t>
-      </w:r>
-      <w:r>
-        <w:t xml:space="preserve"> </w:t>
-      </w:r>
-      <w:r>
-        <w:t xml:space="preserve">105, e4382 (2024)</w:t>
+        <w:t xml:space="preserve">Oecologia</w:t>
+      </w:r>
+      <w:r>
+        <w:t xml:space="preserve"> </w:t>
+      </w:r>
+      <w:r>
+        <w:t xml:space="preserve">207, 71 (2025)</w:t>
       </w:r>
       <w:r>
         <w:t xml:space="preserve"> </w:t>
@@ -809,23 +846,20 @@
         </w:numPr>
       </w:pPr>
       <w:r>
-        <w:t xml:space="preserve">Zhou, C., Nakamura, A., Song, X. &amp;</w:t>
-      </w:r>
-      <w:r>
-        <w:t xml:space="preserve"> </w:t>
-      </w:r>
-      <w:r>
-        <w:rPr>
-          <w:b/>
-          <w:bCs/>
-        </w:rPr>
-        <w:t xml:space="preserve">Katabuchi, M.</w:t>
-      </w:r>
-      <w:r>
-        <w:t xml:space="preserve"> </w:t>
-      </w:r>
-      <w:r>
-        <w:t xml:space="preserve">Artificial Light at Night (ALAN) Influences Understory Plant Traits through Ecological Processes: A Two-Year Experiment in a Rubber Plantation in China.</w:t>
+        <w:t xml:space="preserve">Song, X.†,</w:t>
+      </w:r>
+      <w:r>
+        <w:t xml:space="preserve"> </w:t>
+      </w:r>
+      <w:r>
+        <w:rPr>
+          <w:b/>
+          <w:bCs/>
+        </w:rPr>
+        <w:t xml:space="preserve">Katabuchi, M.†</w:t>
+      </w:r>
+      <w:r>
+        <w:t xml:space="preserve">, Chase, J. M., Johnson, D. J., Zhang, W., Deng, X., Cao, M. &amp; Yang, J.* Drought tolerance and species abundance mediate dry season negative density dependence in a tropical forest.</w:t>
       </w:r>
       <w:r>
         <w:t xml:space="preserve"> </w:t>
@@ -837,13 +871,13 @@
           <w:i/>
           <w:iCs/>
         </w:rPr>
-        <w:t xml:space="preserve">Ecologies</w:t>
-      </w:r>
-      <w:r>
-        <w:t xml:space="preserve"> </w:t>
-      </w:r>
-      <w:r>
-        <w:t xml:space="preserve">4, 704–713 (2023)</w:t>
+        <w:t xml:space="preserve">Ecology</w:t>
+      </w:r>
+      <w:r>
+        <w:t xml:space="preserve"> </w:t>
+      </w:r>
+      <w:r>
+        <w:t xml:space="preserve">105, e4382 (2024)</w:t>
       </w:r>
       <w:r>
         <w:t xml:space="preserve"> </w:t>
@@ -868,20 +902,23 @@
         </w:numPr>
       </w:pPr>
       <w:r>
-        <w:t xml:space="preserve">Phoutthavong, K.,</w:t>
-      </w:r>
-      <w:r>
-        <w:t xml:space="preserve"> </w:t>
-      </w:r>
-      <w:r>
-        <w:rPr>
-          <w:b/>
-          <w:bCs/>
-        </w:rPr>
-        <w:t xml:space="preserve">Katabuchi, M.</w:t>
-      </w:r>
-      <w:r>
-        <w:t xml:space="preserve">, Nakamura, A., Cheng, X. &amp; Cao, M. Inter- and intraspecific adaptations of pteridophyte leaf traits in limestone and non-limestone forests of monsoon tropical regions of southwest China.</w:t>
+        <w:t xml:space="preserve">Zhou, C., Nakamura, A., Song, X. &amp;</w:t>
+      </w:r>
+      <w:r>
+        <w:t xml:space="preserve"> </w:t>
+      </w:r>
+      <w:r>
+        <w:rPr>
+          <w:b/>
+          <w:bCs/>
+        </w:rPr>
+        <w:t xml:space="preserve">Katabuchi, M.*</w:t>
+      </w:r>
+      <w:r>
+        <w:t xml:space="preserve"> </w:t>
+      </w:r>
+      <w:r>
+        <w:t xml:space="preserve">Artificial Light at Night (ALAN) Influences Understory Plant Traits through Ecological Processes: A Two-Year Experiment in a Rubber Plantation in China.</w:t>
       </w:r>
       <w:r>
         <w:t xml:space="preserve"> </w:t>
@@ -893,13 +930,13 @@
           <w:i/>
           <w:iCs/>
         </w:rPr>
-        <w:t xml:space="preserve">Journal of Plant Ecology</w:t>
-      </w:r>
-      <w:r>
-        <w:t xml:space="preserve"> </w:t>
-      </w:r>
-      <w:r>
-        <w:t xml:space="preserve">16, rtad026 (2023)</w:t>
+        <w:t xml:space="preserve">Ecologies</w:t>
+      </w:r>
+      <w:r>
+        <w:t xml:space="preserve"> </w:t>
+      </w:r>
+      <w:r>
+        <w:t xml:space="preserve">4, 704–713 (2023)</w:t>
       </w:r>
       <w:r>
         <w:t xml:space="preserve"> </w:t>
@@ -924,20 +961,20 @@
         </w:numPr>
       </w:pPr>
       <w:r>
-        <w:t xml:space="preserve">Maenpuen, P.,</w:t>
-      </w:r>
-      <w:r>
-        <w:t xml:space="preserve"> </w:t>
-      </w:r>
-      <w:r>
-        <w:rPr>
-          <w:b/>
-          <w:bCs/>
-        </w:rPr>
-        <w:t xml:space="preserve">Katabuchi, M.</w:t>
-      </w:r>
-      <w:r>
-        <w:t xml:space="preserve">, Onoda, Y., Zhou, C., Zhang, J.-L. &amp; Chen, Y.-J. Sources and consequences of mismatch between leaf disc and whole-leaf leaf mass per area (LMA).</w:t>
+        <w:t xml:space="preserve">Phoutthavong, K.,</w:t>
+      </w:r>
+      <w:r>
+        <w:t xml:space="preserve"> </w:t>
+      </w:r>
+      <w:r>
+        <w:rPr>
+          <w:b/>
+          <w:bCs/>
+        </w:rPr>
+        <w:t xml:space="preserve">Katabuchi, M.*</w:t>
+      </w:r>
+      <w:r>
+        <w:t xml:space="preserve">, Nakamura, A., Cheng, X. &amp; Cao, M. Inter- and intraspecific adaptations of pteridophyte leaf traits in limestone and non-limestone forests of monsoon tropical regions of southwest China.</w:t>
       </w:r>
       <w:r>
         <w:t xml:space="preserve"> </w:t>
@@ -949,13 +986,13 @@
           <w:i/>
           <w:iCs/>
         </w:rPr>
-        <w:t xml:space="preserve">American Journal of Botany</w:t>
-      </w:r>
-      <w:r>
-        <w:t xml:space="preserve"> </w:t>
-      </w:r>
-      <w:r>
-        <w:t xml:space="preserve">109, 1242–1250 (2022)</w:t>
+        <w:t xml:space="preserve">Journal of Plant Ecology</w:t>
+      </w:r>
+      <w:r>
+        <w:t xml:space="preserve"> </w:t>
+      </w:r>
+      <w:r>
+        <w:t xml:space="preserve">16, rtad026 (2023)</w:t>
       </w:r>
       <w:r>
         <w:t xml:space="preserve"> </w:t>
@@ -980,20 +1017,20 @@
         </w:numPr>
       </w:pPr>
       <w:r>
-        <w:t xml:space="preserve">Chen, Y.-J., Choat, B., Sterck, F., Maenpuen, P.,</w:t>
-      </w:r>
-      <w:r>
-        <w:t xml:space="preserve"> </w:t>
-      </w:r>
-      <w:r>
-        <w:rPr>
-          <w:b/>
-          <w:bCs/>
-        </w:rPr>
-        <w:t xml:space="preserve">Katabuchi, M.</w:t>
-      </w:r>
-      <w:r>
-        <w:t xml:space="preserve">, Zhang, S.-B., Tomlinson, K. W., Oliveira, R. S., Zhang, Y.-J., Shen, J.-X., Cao, K.-F. &amp; Jansen, S. Hydraulic prediction of drought-induced plant dieback and top-kill depends on leaf habit and growth form.</w:t>
+        <w:t xml:space="preserve">Maenpuen, P.†,</w:t>
+      </w:r>
+      <w:r>
+        <w:t xml:space="preserve"> </w:t>
+      </w:r>
+      <w:r>
+        <w:rPr>
+          <w:b/>
+          <w:bCs/>
+        </w:rPr>
+        <w:t xml:space="preserve">Katabuchi, M.†*</w:t>
+      </w:r>
+      <w:r>
+        <w:t xml:space="preserve">, Onoda, Y., Zhou, C., Zhang, J.-L.* &amp; Chen, Y.-J. Sources and consequences of mismatch between leaf disc and whole-leaf leaf mass per area (LMA).</w:t>
       </w:r>
       <w:r>
         <w:t xml:space="preserve"> </w:t>
@@ -1005,13 +1042,13 @@
           <w:i/>
           <w:iCs/>
         </w:rPr>
-        <w:t xml:space="preserve">Ecology Letters</w:t>
-      </w:r>
-      <w:r>
-        <w:t xml:space="preserve"> </w:t>
-      </w:r>
-      <w:r>
-        <w:t xml:space="preserve">24, 2350–2363 (2021)</w:t>
+        <w:t xml:space="preserve">American Journal of Botany</w:t>
+      </w:r>
+      <w:r>
+        <w:t xml:space="preserve"> </w:t>
+      </w:r>
+      <w:r>
+        <w:t xml:space="preserve">109, 1242–1250 (2022)</w:t>
       </w:r>
       <w:r>
         <w:t xml:space="preserve"> </w:t>
@@ -1036,7 +1073,7 @@
         </w:numPr>
       </w:pPr>
       <w:r>
-        <w:t xml:space="preserve">Chen, Y.-J., Maenpuen, P., Zhang, Y.-J., Barai, K.,</w:t>
+        <w:t xml:space="preserve">Chen, Y.-J., Choat, B., Sterck, F.*, Maenpuen, P.,</w:t>
       </w:r>
       <w:r>
         <w:t xml:space="preserve"> </w:t>
@@ -1049,7 +1086,7 @@
         <w:t xml:space="preserve">Katabuchi, M.</w:t>
       </w:r>
       <w:r>
-        <w:t xml:space="preserve">, Gao, H., Kaewkamol, S., Tao, L.-B. &amp; Zhang, J.-L. Quantifying vulnerability to embolism in tropical trees and lianas using five methods: Can discrepancies be explained by xylem structural traits?</w:t>
+        <w:t xml:space="preserve">, Zhang, S.-B., Tomlinson, K. W., Oliveira, R. S., Zhang, Y.-J., Shen, J.-X., Cao, K.-F.* &amp; Jansen, S.* Hydraulic prediction of drought-induced plant dieback and top-kill depends on leaf habit and growth form.</w:t>
       </w:r>
       <w:r>
         <w:t xml:space="preserve"> </w:t>
@@ -1061,13 +1098,13 @@
           <w:i/>
           <w:iCs/>
         </w:rPr>
-        <w:t xml:space="preserve">New Phytologist</w:t>
-      </w:r>
-      <w:r>
-        <w:t xml:space="preserve"> </w:t>
-      </w:r>
-      <w:r>
-        <w:t xml:space="preserve">229, 805–819 (2021)</w:t>
+        <w:t xml:space="preserve">Ecology Letters</w:t>
+      </w:r>
+      <w:r>
+        <w:t xml:space="preserve"> </w:t>
+      </w:r>
+      <w:r>
+        <w:t xml:space="preserve">24, 2350–2363 (2021)</w:t>
       </w:r>
       <w:r>
         <w:t xml:space="preserve"> </w:t>
@@ -1092,7 +1129,7 @@
         </w:numPr>
       </w:pPr>
       <w:r>
-        <w:t xml:space="preserve">Swenson, N. G., Hulshof, C. M.,</w:t>
+        <w:t xml:space="preserve">Chen, Y.-J.*, Maenpuen, P., Zhang, Y.-J.*, Barai, K.,</w:t>
       </w:r>
       <w:r>
         <w:t xml:space="preserve"> </w:t>
@@ -1105,10 +1142,7 @@
         <w:t xml:space="preserve">Katabuchi, M.</w:t>
       </w:r>
       <w:r>
-        <w:t xml:space="preserve"> </w:t>
-      </w:r>
-      <w:r>
-        <w:t xml:space="preserve">&amp; Enquist, B. J. Long-term shifts in the functional composition and diversity of a tropical dry forest: A 30-yr study.</w:t>
+        <w:t xml:space="preserve">, Gao, H., Kaewkamol, S., Tao, L.-B. &amp; Zhang, J.-L. Quantifying vulnerability to embolism in tropical trees and lianas using five methods: Can discrepancies be explained by xylem structural traits?</w:t>
       </w:r>
       <w:r>
         <w:t xml:space="preserve"> </w:t>
@@ -1120,13 +1154,13 @@
           <w:i/>
           <w:iCs/>
         </w:rPr>
-        <w:t xml:space="preserve">Ecological Monographs</w:t>
-      </w:r>
-      <w:r>
-        <w:t xml:space="preserve"> </w:t>
-      </w:r>
-      <w:r>
-        <w:t xml:space="preserve">e01408 (2020)</w:t>
+        <w:t xml:space="preserve">New Phytologist</w:t>
+      </w:r>
+      <w:r>
+        <w:t xml:space="preserve"> </w:t>
+      </w:r>
+      <w:r>
+        <w:t xml:space="preserve">229, 805–819 (2021)</w:t>
       </w:r>
       <w:r>
         <w:t xml:space="preserve"> </w:t>
@@ -1151,7 +1185,7 @@
         </w:numPr>
       </w:pPr>
       <w:r>
-        <w:t xml:space="preserve">Sreekar, R.,</w:t>
+        <w:t xml:space="preserve">Swenson, N. G.*, Hulshof, C. M.,</w:t>
       </w:r>
       <w:r>
         <w:t xml:space="preserve"> </w:t>
@@ -1164,7 +1198,10 @@
         <w:t xml:space="preserve">Katabuchi, M.</w:t>
       </w:r>
       <w:r>
-        <w:t xml:space="preserve">, Nakamura, A., Corlett, R. T., Slik, J. W. F., Fletcher, C., He, F., Weiblen, G. D., Shen, G., Xu, H., Sun, I.-F., Cao, K., Ma, K., Chang, L.-W., Cao, M., Jiang, M., Gunatilleke, I. A. U. N., Ong, P., Yap, S., Gunatilleke, C. V. S., Novotny, V., Brockelman, W. Y., Xiang, W., Mi, X., Li, X., Wang, X., Qiao, X., Li, Y., Tan, S., Condit, R., Harrison, R. D. &amp; Koh, L. P. Spatial scale changes the relationship between beta diversity, species richness and latitude.</w:t>
+        <w:t xml:space="preserve"> </w:t>
+      </w:r>
+      <w:r>
+        <w:t xml:space="preserve">&amp; Enquist, B. J. Long-term shifts in the functional composition and diversity of a tropical dry forest: A 30-yr study.</w:t>
       </w:r>
       <w:r>
         <w:t xml:space="preserve"> </w:t>
@@ -1176,13 +1213,13 @@
           <w:i/>
           <w:iCs/>
         </w:rPr>
-        <w:t xml:space="preserve">Open Science</w:t>
-      </w:r>
-      <w:r>
-        <w:t xml:space="preserve"> </w:t>
-      </w:r>
-      <w:r>
-        <w:t xml:space="preserve">5, 181168 (2018)</w:t>
+        <w:t xml:space="preserve">Ecological Monographs</w:t>
+      </w:r>
+      <w:r>
+        <w:t xml:space="preserve"> </w:t>
+      </w:r>
+      <w:r>
+        <w:t xml:space="preserve">e01408 (2020)</w:t>
       </w:r>
       <w:r>
         <w:t xml:space="preserve"> </w:t>
@@ -1207,7 +1244,7 @@
         </w:numPr>
       </w:pPr>
       <w:r>
-        <w:t xml:space="preserve">Johnson, D. J., Needham, J., Xu, C., Massoud, E. C., Davies, S. J., Anderson-Teixeira, K. J., Bunyavejchewin, S., Chambers, J. Q., Chang-Yang, C.-H., Chiang, J.-M., Chuyong, G. B., Condit, R., Cordell, S., Fletcher, C., Giardina, C. P., Giambelluca, T. W., Gunatilleke, N., Gunatilleke, S., Hsieh, C.-F., Hubbell, S., Inman-Narahari, F., Kassim, A. R.,</w:t>
+        <w:t xml:space="preserve">Sreekar, R.,</w:t>
       </w:r>
       <w:r>
         <w:t xml:space="preserve"> </w:t>
@@ -1220,7 +1257,7 @@
         <w:t xml:space="preserve">Katabuchi, M.</w:t>
       </w:r>
       <w:r>
-        <w:t xml:space="preserve">, Kenfack, D., Litton, C. M., Lum, S., Mohamad, M., Nasardin, M., Ong, P. S., Ostertag, R., Sack, L., Swenson, N. G., Sun, I. F., Tan, S., Thomas, D. W., Thompson, J., Umaña, M. N., Uriarte, M., Valencia, R., Yap, S., Zimmerman, J., McDowell, N. G. &amp; McMahon, S. M. Climate sensitive size-dependent survival in tropical trees.</w:t>
+        <w:t xml:space="preserve">, Nakamura, A., Corlett, R. T., Slik, J. W. F., Fletcher, C., He, F., Weiblen, G. D., Shen, G., Xu, H., Sun, I.-F., Cao, K., Ma, K., Chang, L.-W., Cao, M., Jiang, M., Gunatilleke, I. A. U. N., Ong, P., Yap, S., Gunatilleke, C. V. S., Novotny, V., Brockelman, W. Y., Xiang, W., Mi, X., Li, X., Wang, X., Qiao, X., Li, Y., Tan, S., Condit, R., Harrison, R. D. &amp; Koh, L. P. Spatial scale changes the relationship between beta diversity, species richness and latitude.</w:t>
       </w:r>
       <w:r>
         <w:t xml:space="preserve"> </w:t>
@@ -1232,13 +1269,13 @@
           <w:i/>
           <w:iCs/>
         </w:rPr>
-        <w:t xml:space="preserve">Nature Ecology &amp; Evolution</w:t>
-      </w:r>
-      <w:r>
-        <w:t xml:space="preserve"> </w:t>
-      </w:r>
-      <w:r>
-        <w:t xml:space="preserve">1 (2018)</w:t>
+        <w:t xml:space="preserve">Open Science</w:t>
+      </w:r>
+      <w:r>
+        <w:t xml:space="preserve"> </w:t>
+      </w:r>
+      <w:r>
+        <w:t xml:space="preserve">5, 181168 (2018)</w:t>
       </w:r>
       <w:r>
         <w:t xml:space="preserve"> </w:t>
@@ -1263,7 +1300,7 @@
         </w:numPr>
       </w:pPr>
       <w:r>
-        <w:t xml:space="preserve">Osnas, J. L. D.,</w:t>
+        <w:t xml:space="preserve">Johnson, D. J.*, Needham, J., Xu, C., Massoud, E. C., Davies, S. J., Anderson-Teixeira, K. J., Bunyavejchewin, S., Chambers, J. Q., Chang-Yang, C.-H., Chiang, J.-M., Chuyong, G. B., Condit, R., Cordell, S., Fletcher, C., Giardina, C. P., Giambelluca, T. W., Gunatilleke, N., Gunatilleke, S., Hsieh, C.-F., Hubbell, S., Inman-Narahari, F., Kassim, A. R.,</w:t>
       </w:r>
       <w:r>
         <w:t xml:space="preserve"> </w:t>
@@ -1276,7 +1313,7 @@
         <w:t xml:space="preserve">Katabuchi, M.</w:t>
       </w:r>
       <w:r>
-        <w:t xml:space="preserve">, Kitajima, K., Wright, S. J., Reich, P. B., Van Bael, S. A., Kraft, N. J. B., Samaniego, M. J., Pacala, S. W. &amp; Lichstein, J. W. Divergent drivers of leaf trait variation within species, among species, and among functional groups.</w:t>
+        <w:t xml:space="preserve">, Kenfack, D., Litton, C. M., Lum, S., Mohamad, M., Nasardin, M., Ong, P. S., Ostertag, R., Sack, L., Swenson, N. G., Sun, I. F., Tan, S., Thomas, D. W., Thompson, J., Umaña, M. N., Uriarte, M., Valencia, R., Yap, S., Zimmerman, J., McDowell, N. G. &amp; McMahon, S. M. Climate sensitive size-dependent survival in tropical trees.</w:t>
       </w:r>
       <w:r>
         <w:t xml:space="preserve"> </w:t>
@@ -1288,13 +1325,13 @@
           <w:i/>
           <w:iCs/>
         </w:rPr>
-        <w:t xml:space="preserve">Proceedings of the National Academy of Sciences of the United States of America</w:t>
-      </w:r>
-      <w:r>
-        <w:t xml:space="preserve"> </w:t>
-      </w:r>
-      <w:r>
-        <w:t xml:space="preserve">115, 5480–5485 (2018)</w:t>
+        <w:t xml:space="preserve">Nature Ecology &amp; Evolution</w:t>
+      </w:r>
+      <w:r>
+        <w:t xml:space="preserve"> </w:t>
+      </w:r>
+      <w:r>
+        <w:t xml:space="preserve">1 (2018)</w:t>
       </w:r>
       <w:r>
         <w:t xml:space="preserve"> </w:t>
@@ -1319,7 +1356,7 @@
         </w:numPr>
       </w:pPr>
       <w:r>
-        <w:t xml:space="preserve">Li, Y., Shipley, B., Price, J. N., Dantas, V. de L., Tamme, R., Westoby, M., Siefert, A., Schamp, B. S., Spasojevic, M. J., Jung, V., Laughlin, D. C., Richardson, S. J., Bagousse-Pinguet, Y. L., Schöb, C., Gazol, A., Prentice, H. C., Gross, N., Overton, J., Cianciaruso, M. V., Louault, F., Kamiyama, C., Nakashizuka, T., Hikosaka, K., Sasaki, T.,</w:t>
+        <w:t xml:space="preserve">Osnas, J. L. D.,</w:t>
       </w:r>
       <w:r>
         <w:t xml:space="preserve"> </w:t>
@@ -1332,7 +1369,7 @@
         <w:t xml:space="preserve">Katabuchi, M.</w:t>
       </w:r>
       <w:r>
-        <w:t xml:space="preserve">, Frenette Dussault, C., Gaucherand, S., Chen, N., Vandewalle, M. &amp; Batalha, M. A. Habitat filtering determines the functional niche occupancy of plant communities worldwide.</w:t>
+        <w:t xml:space="preserve">, Kitajima, K., Wright, S. J., Reich, P. B., Van Bael, S. A., Kraft, N. J. B., Samaniego, M. J., Pacala, S. W. &amp; Lichstein, J. W.* Divergent drivers of leaf trait variation within species, among species, and among functional groups.</w:t>
       </w:r>
       <w:r>
         <w:t xml:space="preserve"> </w:t>
@@ -1344,13 +1381,13 @@
           <w:i/>
           <w:iCs/>
         </w:rPr>
-        <w:t xml:space="preserve">Journal of Ecology</w:t>
-      </w:r>
-      <w:r>
-        <w:t xml:space="preserve"> </w:t>
-      </w:r>
-      <w:r>
-        <w:t xml:space="preserve">3, 808–809 (2017)</w:t>
+        <w:t xml:space="preserve">Proceedings of the National Academy of Sciences of the United States of America</w:t>
+      </w:r>
+      <w:r>
+        <w:t xml:space="preserve"> </w:t>
+      </w:r>
+      <w:r>
+        <w:t xml:space="preserve">115, 5480–5485 (2018)</w:t>
       </w:r>
       <w:r>
         <w:t xml:space="preserve"> </w:t>
@@ -1375,6 +1412,12 @@
         </w:numPr>
       </w:pPr>
       <w:r>
+        <w:t xml:space="preserve">Li, Y., Shipley, B.*, Price, J. N., Dantas, V. de L., Tamme, R., Westoby, M., Siefert, A., Schamp, B. S., Spasojevic, M. J., Jung, V., Laughlin, D. C., Richardson, S. J., Bagousse-Pinguet, Y. L., Schöb, C., Gazol, A., Prentice, H. C., Gross, N., Overton, J., Cianciaruso, M. V., Louault, F., Kamiyama, C., Nakashizuka, T., Hikosaka, K., Sasaki, T.,</w:t>
+      </w:r>
+      <w:r>
+        <w:t xml:space="preserve"> </w:t>
+      </w:r>
+      <w:r>
         <w:rPr>
           <w:b/>
           <w:bCs/>
@@ -1382,7 +1425,7 @@
         <w:t xml:space="preserve">Katabuchi, M.</w:t>
       </w:r>
       <w:r>
-        <w:t xml:space="preserve">, Wright, S. J., Swenson, N. G., Feeley, K. J., Condit, R., Hubbell, S. P. &amp; Davies, S. J. Contrasting outcomes of species- and community-level analyses of the temporal consistency of functional composition.</w:t>
+        <w:t xml:space="preserve">, Frenette Dussault, C., Gaucherand, S., Chen, N., Vandewalle, M. &amp; Batalha, M. A. Habitat filtering determines the functional niche occupancy of plant communities worldwide.</w:t>
       </w:r>
       <w:r>
         <w:t xml:space="preserve"> </w:t>
@@ -1394,13 +1437,13 @@
           <w:i/>
           <w:iCs/>
         </w:rPr>
-        <w:t xml:space="preserve">Ecology</w:t>
-      </w:r>
-      <w:r>
-        <w:t xml:space="preserve"> </w:t>
-      </w:r>
-      <w:r>
-        <w:t xml:space="preserve">98, 2273–2280 (2017)</w:t>
+        <w:t xml:space="preserve">Journal of Ecology</w:t>
+      </w:r>
+      <w:r>
+        <w:t xml:space="preserve"> </w:t>
+      </w:r>
+      <w:r>
+        <w:t xml:space="preserve">3, 808–809 (2017)</w:t>
       </w:r>
       <w:r>
         <w:t xml:space="preserve"> </w:t>
@@ -1425,20 +1468,14 @@
         </w:numPr>
       </w:pPr>
       <w:r>
-        <w:t xml:space="preserve">Siefert, A., Violle, C., Chalmandrier, L., Albert, C. H., Taudiere, A., Fajardo, A., Aarssen, L. W., Baraloto, C., Carlucci, M. B., Cianciaruso, M. V., de L. Dantas, V., de Bello, F., Duarte, L. D. S., Fonseca, C. R., Freschet, G. T., Gaucherand, S., Gross, N., Hikosaka, K., Jackson, B., Jung, V., Kamiyama, C.,</w:t>
-      </w:r>
-      <w:r>
-        <w:t xml:space="preserve"> </w:t>
-      </w:r>
-      <w:r>
-        <w:rPr>
-          <w:b/>
-          <w:bCs/>
-        </w:rPr>
-        <w:t xml:space="preserve">Katabuchi, M.</w:t>
-      </w:r>
-      <w:r>
-        <w:t xml:space="preserve">, Kembel, S. W., Kichenin, E., Kraft, N. J. B., Lagerström, A., Bagousse-Pinguet, Y. L., Li, Y., Mason, N., Messier, J., Nakashizuka, T., Overton, J. M., Peltzer, D. A., Pérez-Ramos, I. M., Pillar, V. D., Prentice, H. C., Richardson, S., Sasaki, T., Schamp, B. S., Schöb, C., Shipley, B., Sundqvist, M., Sykes, M. T., Vandewalle, M. &amp; Wardle, D. A. A global meta-analysis of the relative extent of intraspecific trait variation in plant communities.</w:t>
+        <w:rPr>
+          <w:b/>
+          <w:bCs/>
+        </w:rPr>
+        <w:t xml:space="preserve">Katabuchi, M.*</w:t>
+      </w:r>
+      <w:r>
+        <w:t xml:space="preserve">, Wright, S. J., Swenson, N. G., Feeley, K. J., Condit, R., Hubbell, S. P. &amp; Davies, S. J. Contrasting outcomes of species- and community-level analyses of the temporal consistency of functional composition.</w:t>
       </w:r>
       <w:r>
         <w:t xml:space="preserve"> </w:t>
@@ -1450,13 +1487,13 @@
           <w:i/>
           <w:iCs/>
         </w:rPr>
-        <w:t xml:space="preserve">Ecology Letters</w:t>
-      </w:r>
-      <w:r>
-        <w:t xml:space="preserve"> </w:t>
-      </w:r>
-      <w:r>
-        <w:t xml:space="preserve">18, 1406–1419 (2015)</w:t>
+        <w:t xml:space="preserve">Ecology</w:t>
+      </w:r>
+      <w:r>
+        <w:t xml:space="preserve"> </w:t>
+      </w:r>
+      <w:r>
+        <w:t xml:space="preserve">98, 2273–2280 (2017)</w:t>
       </w:r>
       <w:r>
         <w:t xml:space="preserve"> </w:t>
@@ -1481,6 +1518,12 @@
         </w:numPr>
       </w:pPr>
       <w:r>
+        <w:t xml:space="preserve">Siefert, A.*, Violle, C., Chalmandrier, L., Albert, C. H., Taudiere, A., Fajardo, A., Aarssen, L. W., Baraloto, C., Carlucci, M. B., Cianciaruso, M. V., de L. Dantas, V., de Bello, F., Duarte, L. D. S., Fonseca, C. R., Freschet, G. T., Gaucherand, S., Gross, N., Hikosaka, K., Jackson, B., Jung, V., Kamiyama, C.,</w:t>
+      </w:r>
+      <w:r>
+        <w:t xml:space="preserve"> </w:t>
+      </w:r>
+      <w:r>
         <w:rPr>
           <w:b/>
           <w:bCs/>
@@ -1488,10 +1531,7 @@
         <w:t xml:space="preserve">Katabuchi, M.</w:t>
       </w:r>
       <w:r>
-        <w:t xml:space="preserve"> </w:t>
-      </w:r>
-      <w:r>
-        <w:t xml:space="preserve">LeafArea: An R package for rapid digital image analysis of leaf area.</w:t>
+        <w:t xml:space="preserve">, Kembel, S. W., Kichenin, E., Kraft, N. J. B., Lagerström, A., Bagousse-Pinguet, Y. L., Li, Y., Mason, N., Messier, J., Nakashizuka, T., Overton, J. M., Peltzer, D. A., Pérez-Ramos, I. M., Pillar, V. D., Prentice, H. C., Richardson, S., Sasaki, T., Schamp, B. S., Schöb, C., Shipley, B., Sundqvist, M., Sykes, M. T., Vandewalle, M. &amp; Wardle, D. A. A global meta-analysis of the relative extent of intraspecific trait variation in plant communities.</w:t>
       </w:r>
       <w:r>
         <w:t xml:space="preserve"> </w:t>
@@ -1503,13 +1543,13 @@
           <w:i/>
           <w:iCs/>
         </w:rPr>
-        <w:t xml:space="preserve">Ecological Research</w:t>
-      </w:r>
-      <w:r>
-        <w:t xml:space="preserve"> </w:t>
-      </w:r>
-      <w:r>
-        <w:t xml:space="preserve">30, 1073–1077 (2015)</w:t>
+        <w:t xml:space="preserve">Ecology Letters</w:t>
+      </w:r>
+      <w:r>
+        <w:t xml:space="preserve"> </w:t>
+      </w:r>
+      <w:r>
+        <w:t xml:space="preserve">18, 1406–1419 (2015)</w:t>
       </w:r>
       <w:r>
         <w:t xml:space="preserve"> </w:t>
@@ -1534,20 +1574,17 @@
         </w:numPr>
       </w:pPr>
       <w:r>
-        <w:t xml:space="preserve">Ashton, L. A., Nakamura, A., Basset, Y., Burwell, C. J., Cao, M., Eastwood, R., Odell, E., de Oliveira, E. G., Hurley, K.,</w:t>
-      </w:r>
-      <w:r>
-        <w:t xml:space="preserve"> </w:t>
-      </w:r>
-      <w:r>
-        <w:rPr>
-          <w:b/>
-          <w:bCs/>
-        </w:rPr>
-        <w:t xml:space="preserve">Katabuchi, M.</w:t>
-      </w:r>
-      <w:r>
-        <w:t xml:space="preserve">, Maunsell, S., Mcbroom, J., Schmidl, J., Sun, Z., Tang, Y., Whitaker, T., Laidlaw, M. J., Mcdonald, W. J. F. &amp; Kitching, R. L. Vertical stratification of moths across elevation and latitude.</w:t>
+        <w:rPr>
+          <w:b/>
+          <w:bCs/>
+        </w:rPr>
+        <w:t xml:space="preserve">Katabuchi, M.*</w:t>
+      </w:r>
+      <w:r>
+        <w:t xml:space="preserve"> </w:t>
+      </w:r>
+      <w:r>
+        <w:t xml:space="preserve">LeafArea: An R package for rapid digital image analysis of leaf area.</w:t>
       </w:r>
       <w:r>
         <w:t xml:space="preserve"> </w:t>
@@ -1559,13 +1596,13 @@
           <w:i/>
           <w:iCs/>
         </w:rPr>
-        <w:t xml:space="preserve">Journal of Biogeography</w:t>
-      </w:r>
-      <w:r>
-        <w:t xml:space="preserve"> </w:t>
-      </w:r>
-      <w:r>
-        <w:t xml:space="preserve">43, 59–69 (2016)</w:t>
+        <w:t xml:space="preserve">Ecological Research</w:t>
+      </w:r>
+      <w:r>
+        <w:t xml:space="preserve"> </w:t>
+      </w:r>
+      <w:r>
+        <w:t xml:space="preserve">30, 1073–1077 (2015)</w:t>
       </w:r>
       <w:r>
         <w:t xml:space="preserve"> </w:t>
@@ -1590,7 +1627,7 @@
         </w:numPr>
       </w:pPr>
       <w:r>
-        <w:t xml:space="preserve">Nakamura, A., Burwell, C. J., Ashton, L. A., Laidlaw, M. J.,</w:t>
+        <w:t xml:space="preserve">Ashton, L. A., Nakamura, A.*, Basset, Y., Burwell, C. J., Cao, M., Eastwood, R., Odell, E., de Oliveira, E. G., Hurley, K.,</w:t>
       </w:r>
       <w:r>
         <w:t xml:space="preserve"> </w:t>
@@ -1603,10 +1640,7 @@
         <w:t xml:space="preserve">Katabuchi, M.</w:t>
       </w:r>
       <w:r>
-        <w:t xml:space="preserve"> </w:t>
-      </w:r>
-      <w:r>
-        <w:t xml:space="preserve">&amp; Kitching, R. L. Identifying indicator species of elevation: Comparing the utility of woody plants, ants and moths for long-term monitoring.</w:t>
+        <w:t xml:space="preserve">, Maunsell, S., Mcbroom, J., Schmidl, J., Sun, Z., Tang, Y., Whitaker, T., Laidlaw, M. J., Mcdonald, W. J. F. &amp; Kitching, R. L. Vertical stratification of moths across elevation and latitude.</w:t>
       </w:r>
       <w:r>
         <w:t xml:space="preserve"> </w:t>
@@ -1618,13 +1652,13 @@
           <w:i/>
           <w:iCs/>
         </w:rPr>
-        <w:t xml:space="preserve">Austral Ecology</w:t>
-      </w:r>
-      <w:r>
-        <w:t xml:space="preserve"> </w:t>
-      </w:r>
-      <w:r>
-        <w:t xml:space="preserve">41, 179–188 (2016)</w:t>
+        <w:t xml:space="preserve">Journal of Biogeography</w:t>
+      </w:r>
+      <w:r>
+        <w:t xml:space="preserve"> </w:t>
+      </w:r>
+      <w:r>
+        <w:t xml:space="preserve">43, 59–69 (2016)</w:t>
       </w:r>
       <w:r>
         <w:t xml:space="preserve"> </w:t>
@@ -1649,7 +1683,7 @@
         </w:numPr>
       </w:pPr>
       <w:r>
-        <w:t xml:space="preserve">Nakamura, A., Burwell, C. J., Lambkin, C. L.,</w:t>
+        <w:t xml:space="preserve">Nakamura, A.*, Burwell, C. J., Ashton, L. A., Laidlaw, M. J.,</w:t>
       </w:r>
       <w:r>
         <w:t xml:space="preserve"> </w:t>
@@ -1662,7 +1696,10 @@
         <w:t xml:space="preserve">Katabuchi, M.</w:t>
       </w:r>
       <w:r>
-        <w:t xml:space="preserve">, Mcdougall, A., Raven, R. J. &amp; Neldner, V. J. The role of human disturbance in island biogeography of arthropods and plants: An information theoretic approach.</w:t>
+        <w:t xml:space="preserve"> </w:t>
+      </w:r>
+      <w:r>
+        <w:t xml:space="preserve">&amp; Kitching, R. L. Identifying indicator species of elevation: Comparing the utility of woody plants, ants and moths for long-term monitoring.</w:t>
       </w:r>
       <w:r>
         <w:t xml:space="preserve"> </w:t>
@@ -1674,13 +1711,13 @@
           <w:i/>
           <w:iCs/>
         </w:rPr>
-        <w:t xml:space="preserve">Journal of Biogeography</w:t>
-      </w:r>
-      <w:r>
-        <w:t xml:space="preserve"> </w:t>
-      </w:r>
-      <w:r>
-        <w:t xml:space="preserve">42, 1406–1417 (2015)</w:t>
+        <w:t xml:space="preserve">Austral Ecology</w:t>
+      </w:r>
+      <w:r>
+        <w:t xml:space="preserve"> </w:t>
+      </w:r>
+      <w:r>
+        <w:t xml:space="preserve">41, 179–188 (2016)</w:t>
       </w:r>
       <w:r>
         <w:t xml:space="preserve"> </w:t>
@@ -1705,7 +1742,7 @@
         </w:numPr>
       </w:pPr>
       <w:r>
-        <w:t xml:space="preserve">Deng, X., Mohandass, D.,</w:t>
+        <w:t xml:space="preserve">Nakamura, A.*, Burwell, C. J., Lambkin, C. L.,</w:t>
       </w:r>
       <w:r>
         <w:t xml:space="preserve"> </w:t>
@@ -1718,51 +1755,25 @@
         <w:t xml:space="preserve">Katabuchi, M.</w:t>
       </w:r>
       <w:r>
-        <w:t xml:space="preserve">, Hughes, A. C. &amp; Roubik, D. W. Impact of Striped-Squirrel Nectar-Robbing Behaviour on Gender Fitness in</w:t>
-      </w:r>
-      <w:r>
-        <w:t xml:space="preserve"> </w:t>
-      </w:r>
-      <w:r>
-        <w:rPr>
+        <w:t xml:space="preserve">, Mcdougall, A., Raven, R. J. &amp; Neldner, V. J. The role of human disturbance in island biogeography of arthropods and plants: An information theoretic approach.</w:t>
+      </w:r>
+      <w:r>
+        <w:t xml:space="preserve"> </w:t>
+      </w:r>
+      <w:r>
+        <w:rPr>
+          <w:b/>
+          <w:bCs/>
           <w:i/>
           <w:iCs/>
         </w:rPr>
-        <w:t xml:space="preserve">Alpinia</w:t>
-      </w:r>
-      <w:r>
-        <w:t xml:space="preserve"> </w:t>
-      </w:r>
-      <w:r>
-        <w:rPr>
-          <w:i/>
-          <w:iCs/>
-        </w:rPr>
-        <w:t xml:space="preserve">Roxburghii</w:t>
-      </w:r>
-      <w:r>
-        <w:t xml:space="preserve"> </w:t>
-      </w:r>
-      <w:r>
-        <w:t xml:space="preserve">Sweet (Zingiberaceae).</w:t>
-      </w:r>
-      <w:r>
-        <w:t xml:space="preserve"> </w:t>
-      </w:r>
-      <w:r>
-        <w:rPr>
-          <w:b/>
-          <w:bCs/>
-          <w:i/>
-          <w:iCs/>
-        </w:rPr>
-        <w:t xml:space="preserve">PLoS ONE</w:t>
-      </w:r>
-      <w:r>
-        <w:t xml:space="preserve"> </w:t>
-      </w:r>
-      <w:r>
-        <w:t xml:space="preserve">10, (2015)</w:t>
+        <w:t xml:space="preserve">Journal of Biogeography</w:t>
+      </w:r>
+      <w:r>
+        <w:t xml:space="preserve"> </w:t>
+      </w:r>
+      <w:r>
+        <w:t xml:space="preserve">42, 1406–1417 (2015)</w:t>
       </w:r>
       <w:r>
         <w:t xml:space="preserve"> </w:t>
@@ -1787,7 +1798,7 @@
         </w:numPr>
       </w:pPr>
       <w:r>
-        <w:t xml:space="preserve">Hikosaka, K., Sasaki, T., Kamiyama, C.,</w:t>
+        <w:t xml:space="preserve">Deng, X., Mohandass, D.*,</w:t>
       </w:r>
       <w:r>
         <w:t xml:space="preserve"> </w:t>
@@ -1800,67 +1811,51 @@
         <w:t xml:space="preserve">Katabuchi, M.</w:t>
       </w:r>
       <w:r>
-        <w:t xml:space="preserve">, Oikawa, S., Shimazaki, M., Kimura, K. &amp; Nakshizuka, T. Understanding of species niche, coexistence and extinction based on functional traits : Approaches from community and physiological ecology for subalpine moorland plant communities [in Japanese].</w:t>
-      </w:r>
-      <w:r>
-        <w:t xml:space="preserve"> </w:t>
-      </w:r>
-      <w:r>
-        <w:rPr>
-          <w:b/>
-          <w:bCs/>
+        <w:t xml:space="preserve">, Hughes, A. C. &amp; Roubik, D. W. Impact of Striped-Squirrel Nectar-Robbing Behaviour on Gender Fitness in</w:t>
+      </w:r>
+      <w:r>
+        <w:t xml:space="preserve"> </w:t>
+      </w:r>
+      <w:r>
+        <w:rPr>
           <w:i/>
           <w:iCs/>
         </w:rPr>
-        <w:t xml:space="preserve">Chikyu-Kankyo</w:t>
-      </w:r>
-      <w:r>
-        <w:t xml:space="preserve"> </w:t>
-      </w:r>
-      <w:r>
-        <w:t xml:space="preserve">19, 33–46 (2014).</w:t>
-      </w:r>
-    </w:p>
-    <w:p>
-      <w:pPr>
-        <w:numPr>
-          <w:ilvl w:val="0"/>
-          <w:numId w:val="1001"/>
-        </w:numPr>
-      </w:pPr>
-      <w:r>
-        <w:t xml:space="preserve">Kamiyama, C.,</w:t>
-      </w:r>
-      <w:r>
-        <w:t xml:space="preserve"> </w:t>
-      </w:r>
-      <w:r>
-        <w:rPr>
-          <w:b/>
-          <w:bCs/>
-        </w:rPr>
-        <w:t xml:space="preserve">Katabuchi, M.</w:t>
-      </w:r>
-      <w:r>
-        <w:t xml:space="preserve">, Sasaki, T., Shimazaki, M., Nakashizuka, T. &amp; Hikosaka, K. Leaf-trait responses to environmental gradients in moorland communities: Contribution of intraspecific variation, species replacement and functional group replacement.</w:t>
-      </w:r>
-      <w:r>
-        <w:t xml:space="preserve"> </w:t>
-      </w:r>
-      <w:r>
-        <w:rPr>
-          <w:b/>
-          <w:bCs/>
+        <w:t xml:space="preserve">Alpinia</w:t>
+      </w:r>
+      <w:r>
+        <w:t xml:space="preserve"> </w:t>
+      </w:r>
+      <w:r>
+        <w:rPr>
           <w:i/>
           <w:iCs/>
         </w:rPr>
-        <w:t xml:space="preserve">Ecological Research</w:t>
-      </w:r>
-      <w:r>
-        <w:t xml:space="preserve"> </w:t>
-      </w:r>
-      <w:r>
-        <w:t xml:space="preserve">29, 607–617 (2014)</w:t>
+        <w:t xml:space="preserve">Roxburghii</w:t>
+      </w:r>
+      <w:r>
+        <w:t xml:space="preserve"> </w:t>
+      </w:r>
+      <w:r>
+        <w:t xml:space="preserve">Sweet (Zingiberaceae).</w:t>
+      </w:r>
+      <w:r>
+        <w:t xml:space="preserve"> </w:t>
+      </w:r>
+      <w:r>
+        <w:rPr>
+          <w:b/>
+          <w:bCs/>
+          <w:i/>
+          <w:iCs/>
+        </w:rPr>
+        <w:t xml:space="preserve">PLoS ONE</w:t>
+      </w:r>
+      <w:r>
+        <w:t xml:space="preserve"> </w:t>
+      </w:r>
+      <w:r>
+        <w:t xml:space="preserve">10, (2015)</w:t>
       </w:r>
       <w:r>
         <w:t xml:space="preserve"> </w:t>
@@ -1885,7 +1880,7 @@
         </w:numPr>
       </w:pPr>
       <w:r>
-        <w:t xml:space="preserve">Sasaki, T.,</w:t>
+        <w:t xml:space="preserve">Hikosaka, K.*, Sasaki, T., Kamiyama, C.,</w:t>
       </w:r>
       <w:r>
         <w:t xml:space="preserve"> </w:t>
@@ -1898,7 +1893,7 @@
         <w:t xml:space="preserve">Katabuchi, M.</w:t>
       </w:r>
       <w:r>
-        <w:t xml:space="preserve">, Kamiyama, C., Shimazaki, M., Nakashizuka, T. &amp; Hikosaka, K. Vulnerability of moorland plant communities to environmental change: Consequences of realistic species loss on functional diversity.</w:t>
+        <w:t xml:space="preserve">, Oikawa, S., Shimazaki, M., Kimura, K. &amp; Nakshizuka, T. Understanding of species niche, coexistence and extinction based on functional traits : Approaches from community and physiological ecology for subalpine moorland plant communities [in Japanese].</w:t>
       </w:r>
       <w:r>
         <w:t xml:space="preserve"> </w:t>
@@ -1910,13 +1905,55 @@
           <w:i/>
           <w:iCs/>
         </w:rPr>
-        <w:t xml:space="preserve">Journal of Applied Ecology</w:t>
-      </w:r>
-      <w:r>
-        <w:t xml:space="preserve"> </w:t>
-      </w:r>
-      <w:r>
-        <w:t xml:space="preserve">51, 299–308 (2014)</w:t>
+        <w:t xml:space="preserve">Chikyu-Kankyo</w:t>
+      </w:r>
+      <w:r>
+        <w:t xml:space="preserve"> </w:t>
+      </w:r>
+      <w:r>
+        <w:t xml:space="preserve">19, 33–46 (2014).</w:t>
+      </w:r>
+    </w:p>
+    <w:p>
+      <w:pPr>
+        <w:numPr>
+          <w:ilvl w:val="0"/>
+          <w:numId w:val="1001"/>
+        </w:numPr>
+      </w:pPr>
+      <w:r>
+        <w:t xml:space="preserve">Kamiyama, C.*,</w:t>
+      </w:r>
+      <w:r>
+        <w:t xml:space="preserve"> </w:t>
+      </w:r>
+      <w:r>
+        <w:rPr>
+          <w:b/>
+          <w:bCs/>
+        </w:rPr>
+        <w:t xml:space="preserve">Katabuchi, M.</w:t>
+      </w:r>
+      <w:r>
+        <w:t xml:space="preserve">, Sasaki, T., Shimazaki, M., Nakashizuka, T. &amp; Hikosaka, K. Leaf-trait responses to environmental gradients in moorland communities: Contribution of intraspecific variation, species replacement and functional group replacement.</w:t>
+      </w:r>
+      <w:r>
+        <w:t xml:space="preserve"> </w:t>
+      </w:r>
+      <w:r>
+        <w:rPr>
+          <w:b/>
+          <w:bCs/>
+          <w:i/>
+          <w:iCs/>
+        </w:rPr>
+        <w:t xml:space="preserve">Ecological Research</w:t>
+      </w:r>
+      <w:r>
+        <w:t xml:space="preserve"> </w:t>
+      </w:r>
+      <w:r>
+        <w:t xml:space="preserve">29, 607–617 (2014)</w:t>
       </w:r>
       <w:r>
         <w:t xml:space="preserve"> </w:t>
@@ -1941,7 +1978,7 @@
         </w:numPr>
       </w:pPr>
       <w:r>
-        <w:t xml:space="preserve">Cádiz, A., Nagata, N.,</w:t>
+        <w:t xml:space="preserve">Sasaki, T.*,</w:t>
       </w:r>
       <w:r>
         <w:t xml:space="preserve"> </w:t>
@@ -1954,7 +1991,7 @@
         <w:t xml:space="preserve">Katabuchi, M.</w:t>
       </w:r>
       <w:r>
-        <w:t xml:space="preserve">, DíAZ, L. M., ECHENIQUE-DíAZ, L. M., Akashi, H. D., Makino, T. &amp; Kawata, M. Relative importance of habitat use, range expansion, and speciation in local species diversity of anolis lizards in cuba.</w:t>
+        <w:t xml:space="preserve">, Kamiyama, C., Shimazaki, M., Nakashizuka, T. &amp; Hikosaka, K. Vulnerability of moorland plant communities to environmental change: Consequences of realistic species loss on functional diversity.</w:t>
       </w:r>
       <w:r>
         <w:t xml:space="preserve"> </w:t>
@@ -1966,13 +2003,13 @@
           <w:i/>
           <w:iCs/>
         </w:rPr>
-        <w:t xml:space="preserve">Ecosphere</w:t>
-      </w:r>
-      <w:r>
-        <w:t xml:space="preserve"> </w:t>
-      </w:r>
-      <w:r>
-        <w:t xml:space="preserve">4, (2013)</w:t>
+        <w:t xml:space="preserve">Journal of Applied Ecology</w:t>
+      </w:r>
+      <w:r>
+        <w:t xml:space="preserve"> </w:t>
+      </w:r>
+      <w:r>
+        <w:t xml:space="preserve">51, 299–308 (2014)</w:t>
       </w:r>
       <w:r>
         <w:t xml:space="preserve"> </w:t>
@@ -1997,7 +2034,7 @@
         </w:numPr>
       </w:pPr>
       <w:r>
-        <w:t xml:space="preserve">Asanok, L., Marod, D., Duengkae, P., Pranmongkol, U., Kurokawa, H., Aiba, M.,</w:t>
+        <w:t xml:space="preserve">Cádiz, A., Nagata, N.,</w:t>
       </w:r>
       <w:r>
         <w:t xml:space="preserve"> </w:t>
@@ -2010,10 +2047,7 @@
         <w:t xml:space="preserve">Katabuchi, M.</w:t>
       </w:r>
       <w:r>
-        <w:t xml:space="preserve"> </w:t>
-      </w:r>
-      <w:r>
-        <w:t xml:space="preserve">&amp; Nakashizuka, T. Relationships between functional traits and the ability of forest tree species to reestablish in secondary forest and enrichment plantations in the uplands of northern Thailand.</w:t>
+        <w:t xml:space="preserve">, DíAZ, L. M., ECHENIQUE-DíAZ, L. M., Akashi, H. D., Makino, T. &amp; Kawata, M.* Relative importance of habitat use, range expansion, and speciation in local species diversity of anolis lizards in cuba.</w:t>
       </w:r>
       <w:r>
         <w:t xml:space="preserve"> </w:t>
@@ -2025,13 +2059,13 @@
           <w:i/>
           <w:iCs/>
         </w:rPr>
-        <w:t xml:space="preserve">Forest Ecology and Management</w:t>
-      </w:r>
-      <w:r>
-        <w:t xml:space="preserve"> </w:t>
-      </w:r>
-      <w:r>
-        <w:t xml:space="preserve">296, 9–23 (2013)</w:t>
+        <w:t xml:space="preserve">Ecosphere</w:t>
+      </w:r>
+      <w:r>
+        <w:t xml:space="preserve"> </w:t>
+      </w:r>
+      <w:r>
+        <w:t xml:space="preserve">4, (2013)</w:t>
       </w:r>
       <w:r>
         <w:t xml:space="preserve"> </w:t>
@@ -2056,7 +2090,7 @@
         </w:numPr>
       </w:pPr>
       <w:r>
-        <w:t xml:space="preserve">Sasaki, T.,</w:t>
+        <w:t xml:space="preserve">Asanok, L.*, Marod, D., Duengkae, P., Pranmongkol, U., Kurokawa, H., Aiba, M.,</w:t>
       </w:r>
       <w:r>
         <w:t xml:space="preserve"> </w:t>
@@ -2069,7 +2103,10 @@
         <w:t xml:space="preserve">Katabuchi, M.</w:t>
       </w:r>
       <w:r>
-        <w:t xml:space="preserve">, Kamiyama, C., Shimazaki, M., Nakashizuka, T. &amp; Hikosaka, K. Variations in species composition of moorland plant communities along environmental gradients within a subalpine zone in northern japan.</w:t>
+        <w:t xml:space="preserve"> </w:t>
+      </w:r>
+      <w:r>
+        <w:t xml:space="preserve">&amp; Nakashizuka, T. Relationships between functional traits and the ability of forest tree species to reestablish in secondary forest and enrichment plantations in the uplands of northern Thailand.</w:t>
       </w:r>
       <w:r>
         <w:t xml:space="preserve"> </w:t>
@@ -2081,13 +2118,13 @@
           <w:i/>
           <w:iCs/>
         </w:rPr>
-        <w:t xml:space="preserve">Wetlands</w:t>
-      </w:r>
-      <w:r>
-        <w:t xml:space="preserve"> </w:t>
-      </w:r>
-      <w:r>
-        <w:t xml:space="preserve">33, 269–277 (2013)</w:t>
+        <w:t xml:space="preserve">Forest Ecology and Management</w:t>
+      </w:r>
+      <w:r>
+        <w:t xml:space="preserve"> </w:t>
+      </w:r>
+      <w:r>
+        <w:t xml:space="preserve">296, 9–23 (2013)</w:t>
       </w:r>
       <w:r>
         <w:t xml:space="preserve"> </w:t>
@@ -2112,7 +2149,7 @@
         </w:numPr>
       </w:pPr>
       <w:r>
-        <w:t xml:space="preserve">Aiba, M.,</w:t>
+        <w:t xml:space="preserve">Sasaki, T.*,</w:t>
       </w:r>
       <w:r>
         <w:t xml:space="preserve"> </w:t>
@@ -2125,7 +2162,7 @@
         <w:t xml:space="preserve">Katabuchi, M.</w:t>
       </w:r>
       <w:r>
-        <w:t xml:space="preserve">, Takafumi, H., Matsuzaki, S. I. S., Sasaki, T. &amp; Hiura, T. Robustness of trait distribution metrics for community assembly studies under the uncertainties of assembly processes.</w:t>
+        <w:t xml:space="preserve">, Kamiyama, C., Shimazaki, M., Nakashizuka, T. &amp; Hikosaka, K. Variations in species composition of moorland plant communities along environmental gradients within a subalpine zone in northern japan.</w:t>
       </w:r>
       <w:r>
         <w:t xml:space="preserve"> </w:t>
@@ -2137,13 +2174,13 @@
           <w:i/>
           <w:iCs/>
         </w:rPr>
-        <w:t xml:space="preserve">Ecology</w:t>
-      </w:r>
-      <w:r>
-        <w:t xml:space="preserve"> </w:t>
-      </w:r>
-      <w:r>
-        <w:t xml:space="preserve">94, 2873–2885 (2013)</w:t>
+        <w:t xml:space="preserve">Wetlands</w:t>
+      </w:r>
+      <w:r>
+        <w:t xml:space="preserve"> </w:t>
+      </w:r>
+      <w:r>
+        <w:t xml:space="preserve">33, 269–277 (2013)</w:t>
       </w:r>
       <w:r>
         <w:t xml:space="preserve"> </w:t>
@@ -2168,7 +2205,7 @@
         </w:numPr>
       </w:pPr>
       <w:r>
-        <w:t xml:space="preserve">Sasaki, T.,</w:t>
+        <w:t xml:space="preserve">Aiba, M.*,</w:t>
       </w:r>
       <w:r>
         <w:t xml:space="preserve"> </w:t>
@@ -2181,7 +2218,7 @@
         <w:t xml:space="preserve">Katabuchi, M.</w:t>
       </w:r>
       <w:r>
-        <w:t xml:space="preserve">, Kamiyama, C., Shimazaki, M., Nakashizuka, T. &amp; Hikosaka, K. Nestedness and niche-based species loss in moorland plant communities.</w:t>
+        <w:t xml:space="preserve">, Takafumi, H., Matsuzaki, S. I. S., Sasaki, T. &amp; Hiura, T. Robustness of trait distribution metrics for community assembly studies under the uncertainties of assembly processes.</w:t>
       </w:r>
       <w:r>
         <w:t xml:space="preserve"> </w:t>
@@ -2193,13 +2230,13 @@
           <w:i/>
           <w:iCs/>
         </w:rPr>
-        <w:t xml:space="preserve">Oikos</w:t>
-      </w:r>
-      <w:r>
-        <w:t xml:space="preserve"> </w:t>
-      </w:r>
-      <w:r>
-        <w:t xml:space="preserve">121, 1783–1790 (2012)</w:t>
+        <w:t xml:space="preserve">Ecology</w:t>
+      </w:r>
+      <w:r>
+        <w:t xml:space="preserve"> </w:t>
+      </w:r>
+      <w:r>
+        <w:t xml:space="preserve">94, 2873–2885 (2013)</w:t>
       </w:r>
       <w:r>
         <w:t xml:space="preserve"> </w:t>
@@ -2224,7 +2261,7 @@
         </w:numPr>
       </w:pPr>
       <w:r>
-        <w:t xml:space="preserve">Sasaki, T.,</w:t>
+        <w:t xml:space="preserve">Sasaki, T.*,</w:t>
       </w:r>
       <w:r>
         <w:t xml:space="preserve"> </w:t>
@@ -2237,7 +2274,7 @@
         <w:t xml:space="preserve">Katabuchi, M.</w:t>
       </w:r>
       <w:r>
-        <w:t xml:space="preserve">, Kamiyama, C., Shimazaki, M., Nakashizuka, T. &amp; Hikosaka, K. Diversity partitioning of moorland plant communities across hierarchical spatial scales.</w:t>
+        <w:t xml:space="preserve">, Kamiyama, C., Shimazaki, M., Nakashizuka, T. &amp; Hikosaka, K. Nestedness and niche-based species loss in moorland plant communities.</w:t>
       </w:r>
       <w:r>
         <w:t xml:space="preserve"> </w:t>
@@ -2249,13 +2286,13 @@
           <w:i/>
           <w:iCs/>
         </w:rPr>
-        <w:t xml:space="preserve">Biodiversity and Conservation</w:t>
-      </w:r>
-      <w:r>
-        <w:t xml:space="preserve"> </w:t>
-      </w:r>
-      <w:r>
-        <w:t xml:space="preserve">21, 1577–1588 (2012)</w:t>
+        <w:t xml:space="preserve">Oikos</w:t>
+      </w:r>
+      <w:r>
+        <w:t xml:space="preserve"> </w:t>
+      </w:r>
+      <w:r>
+        <w:t xml:space="preserve">121, 1783–1790 (2012)</w:t>
       </w:r>
       <w:r>
         <w:t xml:space="preserve"> </w:t>
@@ -2280,6 +2317,12 @@
         </w:numPr>
       </w:pPr>
       <w:r>
+        <w:t xml:space="preserve">Sasaki, T.*,</w:t>
+      </w:r>
+      <w:r>
+        <w:t xml:space="preserve"> </w:t>
+      </w:r>
+      <w:r>
         <w:rPr>
           <w:b/>
           <w:bCs/>
@@ -2287,7 +2330,7 @@
         <w:t xml:space="preserve">Katabuchi, M.</w:t>
       </w:r>
       <w:r>
-        <w:t xml:space="preserve">, Kurokawa, H., Davies, S. J., Tan, S. &amp; Nakashizuka, T. Soil resource availability shapes community trait structure in a species-rich dipterocarp forest.</w:t>
+        <w:t xml:space="preserve">, Kamiyama, C., Shimazaki, M., Nakashizuka, T. &amp; Hikosaka, K. Diversity partitioning of moorland plant communities across hierarchical spatial scales.</w:t>
       </w:r>
       <w:r>
         <w:t xml:space="preserve"> </w:t>
@@ -2299,13 +2342,13 @@
           <w:i/>
           <w:iCs/>
         </w:rPr>
-        <w:t xml:space="preserve">Journal of Ecology</w:t>
-      </w:r>
-      <w:r>
-        <w:t xml:space="preserve"> </w:t>
-      </w:r>
-      <w:r>
-        <w:t xml:space="preserve">100, 643–651 (2012)</w:t>
+        <w:t xml:space="preserve">Biodiversity and Conservation</w:t>
+      </w:r>
+      <w:r>
+        <w:t xml:space="preserve"> </w:t>
+      </w:r>
+      <w:r>
+        <w:t xml:space="preserve">21, 1577–1588 (2012)</w:t>
       </w:r>
       <w:r>
         <w:t xml:space="preserve"> </w:t>
@@ -2334,74 +2377,28 @@
           <w:b/>
           <w:bCs/>
         </w:rPr>
-        <w:t xml:space="preserve">Katabuchi, M.</w:t>
-      </w:r>
-      <w:r>
-        <w:t xml:space="preserve">, Isagi, Y. &amp; Nakashizuka, T. Development of 17 microsatellite markers for</w:t>
-      </w:r>
-      <w:r>
-        <w:t xml:space="preserve"> </w:t>
-      </w:r>
-      <w:r>
-        <w:rPr>
+        <w:t xml:space="preserve">Katabuchi, M.*</w:t>
+      </w:r>
+      <w:r>
+        <w:t xml:space="preserve">, Kurokawa, H., Davies, S. J., Tan, S. &amp; Nakashizuka, T. Soil resource availability shapes community trait structure in a species-rich dipterocarp forest.</w:t>
+      </w:r>
+      <w:r>
+        <w:t xml:space="preserve"> </w:t>
+      </w:r>
+      <w:r>
+        <w:rPr>
+          <w:b/>
+          <w:bCs/>
           <w:i/>
           <w:iCs/>
         </w:rPr>
-        <w:t xml:space="preserve">Ceratosolen</w:t>
-      </w:r>
-      <w:r>
-        <w:t xml:space="preserve"> </w:t>
-      </w:r>
-      <w:r>
-        <w:rPr>
-          <w:i/>
-          <w:iCs/>
-        </w:rPr>
-        <w:t xml:space="preserve">Constrictus</w:t>
-      </w:r>
-      <w:r>
-        <w:t xml:space="preserve">, the pollinating fig wasp of</w:t>
-      </w:r>
-      <w:r>
-        <w:t xml:space="preserve"> </w:t>
-      </w:r>
-      <w:r>
-        <w:rPr>
-          <w:i/>
-          <w:iCs/>
-        </w:rPr>
-        <w:t xml:space="preserve">Ficus</w:t>
-      </w:r>
-      <w:r>
-        <w:t xml:space="preserve"> </w:t>
-      </w:r>
-      <w:r>
-        <w:rPr>
-          <w:i/>
-          <w:iCs/>
-        </w:rPr>
-        <w:t xml:space="preserve">Fistulosa</w:t>
-      </w:r>
-      <w:r>
-        <w:t xml:space="preserve">.</w:t>
-      </w:r>
-      <w:r>
-        <w:t xml:space="preserve"> </w:t>
-      </w:r>
-      <w:r>
-        <w:rPr>
-          <w:b/>
-          <w:bCs/>
-          <w:i/>
-          <w:iCs/>
-        </w:rPr>
-        <w:t xml:space="preserve">Molecular Ecology Resources</w:t>
-      </w:r>
-      <w:r>
-        <w:t xml:space="preserve"> </w:t>
-      </w:r>
-      <w:r>
-        <w:t xml:space="preserve">8, 840–842 (2008)</w:t>
+        <w:t xml:space="preserve">Journal of Ecology</w:t>
+      </w:r>
+      <w:r>
+        <w:t xml:space="preserve"> </w:t>
+      </w:r>
+      <w:r>
+        <w:t xml:space="preserve">100, 643–651 (2012)</w:t>
       </w:r>
       <w:r>
         <w:t xml:space="preserve"> </w:t>
@@ -2430,10 +2427,10 @@
           <w:b/>
           <w:bCs/>
         </w:rPr>
-        <w:t xml:space="preserve">Katabuchi, M.</w:t>
-      </w:r>
-      <w:r>
-        <w:t xml:space="preserve">, Harrison, R. D. &amp; Nakashizuka, T. Documenting the effect of foundress number in a dioecious fig,</w:t>
+        <w:t xml:space="preserve">Katabuchi, M.*</w:t>
+      </w:r>
+      <w:r>
+        <w:t xml:space="preserve">, Isagi, Y. &amp; Nakashizuka, T. Development of 17 microsatellite markers for</w:t>
       </w:r>
       <w:r>
         <w:t xml:space="preserve"> </w:t>
@@ -2443,7 +2440,7 @@
           <w:i/>
           <w:iCs/>
         </w:rPr>
-        <w:t xml:space="preserve">Ficus</w:t>
+        <w:t xml:space="preserve">Ceratosolen</w:t>
       </w:r>
       <w:r>
         <w:t xml:space="preserve"> </w:t>
@@ -2453,28 +2450,51 @@
           <w:i/>
           <w:iCs/>
         </w:rPr>
-        <w:t xml:space="preserve">Fistulosa</w:t>
-      </w:r>
-      <w:r>
-        <w:t xml:space="preserve">, in Malaysia.</w:t>
-      </w:r>
-      <w:r>
-        <w:t xml:space="preserve"> </w:t>
-      </w:r>
-      <w:r>
-        <w:rPr>
-          <w:b/>
-          <w:bCs/>
+        <w:t xml:space="preserve">Constrictus</w:t>
+      </w:r>
+      <w:r>
+        <w:t xml:space="preserve">, the pollinating fig wasp of</w:t>
+      </w:r>
+      <w:r>
+        <w:t xml:space="preserve"> </w:t>
+      </w:r>
+      <w:r>
+        <w:rPr>
           <w:i/>
           <w:iCs/>
         </w:rPr>
-        <w:t xml:space="preserve">Biotropica</w:t>
-      </w:r>
-      <w:r>
-        <w:t xml:space="preserve"> </w:t>
-      </w:r>
-      <w:r>
-        <w:t xml:space="preserve">40, 457–461 (2008)</w:t>
+        <w:t xml:space="preserve">Ficus</w:t>
+      </w:r>
+      <w:r>
+        <w:t xml:space="preserve"> </w:t>
+      </w:r>
+      <w:r>
+        <w:rPr>
+          <w:i/>
+          <w:iCs/>
+        </w:rPr>
+        <w:t xml:space="preserve">Fistulosa</w:t>
+      </w:r>
+      <w:r>
+        <w:t xml:space="preserve">.</w:t>
+      </w:r>
+      <w:r>
+        <w:t xml:space="preserve"> </w:t>
+      </w:r>
+      <w:r>
+        <w:rPr>
+          <w:b/>
+          <w:bCs/>
+          <w:i/>
+          <w:iCs/>
+        </w:rPr>
+        <w:t xml:space="preserve">Molecular Ecology Resources</w:t>
+      </w:r>
+      <w:r>
+        <w:t xml:space="preserve"> </w:t>
+      </w:r>
+      <w:r>
+        <w:t xml:space="preserve">8, 840–842 (2008)</w:t>
       </w:r>
       <w:r>
         <w:t xml:space="preserve"> </w:t>
@@ -2491,8 +2511,81 @@
         <w:t xml:space="preserve">.</w:t>
       </w:r>
     </w:p>
-    <w:bookmarkEnd w:id="57"/>
-    <w:bookmarkStart w:id="58" w:name="book"/>
+    <w:p>
+      <w:pPr>
+        <w:numPr>
+          <w:ilvl w:val="0"/>
+          <w:numId w:val="1001"/>
+        </w:numPr>
+      </w:pPr>
+      <w:r>
+        <w:rPr>
+          <w:b/>
+          <w:bCs/>
+        </w:rPr>
+        <w:t xml:space="preserve">Katabuchi, M.*</w:t>
+      </w:r>
+      <w:r>
+        <w:t xml:space="preserve">, Harrison, R. D. &amp; Nakashizuka, T. Documenting the effect of foundress number in a dioecious fig,</w:t>
+      </w:r>
+      <w:r>
+        <w:t xml:space="preserve"> </w:t>
+      </w:r>
+      <w:r>
+        <w:rPr>
+          <w:i/>
+          <w:iCs/>
+        </w:rPr>
+        <w:t xml:space="preserve">Ficus</w:t>
+      </w:r>
+      <w:r>
+        <w:t xml:space="preserve"> </w:t>
+      </w:r>
+      <w:r>
+        <w:rPr>
+          <w:i/>
+          <w:iCs/>
+        </w:rPr>
+        <w:t xml:space="preserve">Fistulosa</w:t>
+      </w:r>
+      <w:r>
+        <w:t xml:space="preserve">, in Malaysia.</w:t>
+      </w:r>
+      <w:r>
+        <w:t xml:space="preserve"> </w:t>
+      </w:r>
+      <w:r>
+        <w:rPr>
+          <w:b/>
+          <w:bCs/>
+          <w:i/>
+          <w:iCs/>
+        </w:rPr>
+        <w:t xml:space="preserve">Biotropica</w:t>
+      </w:r>
+      <w:r>
+        <w:t xml:space="preserve"> </w:t>
+      </w:r>
+      <w:r>
+        <w:t xml:space="preserve">40, 457–461 (2008)</w:t>
+      </w:r>
+      <w:r>
+        <w:t xml:space="preserve"> </w:t>
+      </w:r>
+      <w:hyperlink r:id="rId57">
+        <w:r>
+          <w:rPr>
+            <w:rStyle w:val="InternetLink"/>
+          </w:rPr>
+          <w:t xml:space="preserve">[doi]</w:t>
+        </w:r>
+      </w:hyperlink>
+      <w:r>
+        <w:t xml:space="preserve">.</w:t>
+      </w:r>
+    </w:p>
+    <w:bookmarkEnd w:id="58"/>
+    <w:bookmarkStart w:id="59" w:name="book"/>
     <w:p>
       <w:pPr>
         <w:pStyle w:val="Heading2"/>
@@ -2503,13 +2596,49 @@
     </w:p>
     <w:p>
       <w:pPr>
-        <w:pStyle w:val="Compact"/>
         <w:numPr>
           <w:ilvl w:val="0"/>
           <w:numId w:val="1002"/>
         </w:numPr>
       </w:pPr>
       <w:r>
+        <w:t xml:space="preserve">Yang D., Tai X., He Y., Liu T., Li S. and</w:t>
+      </w:r>
+      <w:r>
+        <w:t xml:space="preserve"> </w:t>
+      </w:r>
+      <w:r>
+        <w:rPr>
+          <w:b/>
+          <w:bCs/>
+        </w:rPr>
+        <w:t xml:space="preserve">Katabuchi M.</w:t>
+      </w:r>
+      <w:r>
+        <w:t xml:space="preserve"> </w:t>
+      </w:r>
+      <w:r>
+        <w:t xml:space="preserve">(</w:t>
+      </w:r>
+      <w:r>
+        <w:rPr>
+          <w:i/>
+          <w:iCs/>
+        </w:rPr>
+        <w:t xml:space="preserve">in press</w:t>
+      </w:r>
+      <w:r>
+        <w:t xml:space="preserve">), Earth Observations for Deforestation. In: Huang X., Tsatsaris A., Kalogeropoulos K. and Wang S. (eds.), Data-Driven Earth Observation for Disaster Management: From Theory to Practical Applications. Elsevier, Amsterdam. (ISBN: 9780443338038)</w:t>
+      </w:r>
+    </w:p>
+    <w:p>
+      <w:pPr>
+        <w:numPr>
+          <w:ilvl w:val="0"/>
+          <w:numId w:val="1002"/>
+        </w:numPr>
+      </w:pPr>
+      <w:r>
         <w:t xml:space="preserve">Hikosaka K., Sasaki T., Kamiyama C.,</w:t>
       </w:r>
       <w:r>
@@ -2526,8 +2655,8 @@
         <w:t xml:space="preserve">, Oikawa S., Shimazaki M., Kimura H. and Nakashizuka T. (2016), Trait-Based Approaches for Understanding Species Niche, Coexistence, and Functional Diversity in Subalpine Moorlands. Structure and Function of Mountain Ecosystems in Japan.</w:t>
       </w:r>
     </w:p>
-    <w:bookmarkEnd w:id="58"/>
-    <w:bookmarkStart w:id="62" w:name="software"/>
+    <w:bookmarkEnd w:id="59"/>
+    <w:bookmarkStart w:id="63" w:name="software"/>
     <w:p>
       <w:pPr>
         <w:pStyle w:val="Heading2"/>
@@ -2557,40 +2686,6 @@
       </w:r>
       <w:r>
         <w:t xml:space="preserve">: Zero-Truncated Poisson Lognormal Distribution,</w:t>
-      </w:r>
-      <w:r>
-        <w:t xml:space="preserve"> </w:t>
-      </w:r>
-      <w:hyperlink r:id="rId59">
-        <w:r>
-          <w:rPr>
-            <w:rStyle w:val="InternetLink"/>
-          </w:rPr>
-          <w:t xml:space="preserve">R CRAN package</w:t>
-        </w:r>
-      </w:hyperlink>
-    </w:p>
-    <w:p>
-      <w:pPr>
-        <w:pStyle w:val="DefinitionTerm"/>
-      </w:pPr>
-      <w:r>
-        <w:t xml:space="preserve">2015</w:t>
-      </w:r>
-    </w:p>
-    <w:p>
-      <w:pPr>
-        <w:pStyle w:val="Definition"/>
-      </w:pPr>
-      <w:r>
-        <w:rPr>
-          <w:b/>
-          <w:bCs/>
-        </w:rPr>
-        <w:t xml:space="preserve">LeafArea</w:t>
-      </w:r>
-      <w:r>
-        <w:t xml:space="preserve">: Rapid Digital Image Analysis of Leaf Area,</w:t>
       </w:r>
       <w:r>
         <w:t xml:space="preserve"> </w:t>
@@ -2621,10 +2716,10 @@
           <w:b/>
           <w:bCs/>
         </w:rPr>
-        <w:t xml:space="preserve">mglmn</w:t>
-      </w:r>
-      <w:r>
-        <w:t xml:space="preserve">: Model Averaging fro Multivariate GLM with Null Models, R CRAN package</w:t>
+        <w:t xml:space="preserve">LeafArea</w:t>
+      </w:r>
+      <w:r>
+        <w:t xml:space="preserve">: Rapid Digital Image Analysis of Leaf Area,</w:t>
       </w:r>
       <w:r>
         <w:t xml:space="preserve"> </w:t>
@@ -2638,8 +2733,42 @@
         </w:r>
       </w:hyperlink>
     </w:p>
-    <w:bookmarkEnd w:id="62"/>
-    <w:bookmarkStart w:id="63" w:name="teaching-experience"/>
+    <w:p>
+      <w:pPr>
+        <w:pStyle w:val="DefinitionTerm"/>
+      </w:pPr>
+      <w:r>
+        <w:t xml:space="preserve">2015</w:t>
+      </w:r>
+    </w:p>
+    <w:p>
+      <w:pPr>
+        <w:pStyle w:val="Definition"/>
+      </w:pPr>
+      <w:r>
+        <w:rPr>
+          <w:b/>
+          <w:bCs/>
+        </w:rPr>
+        <w:t xml:space="preserve">mglmn</w:t>
+      </w:r>
+      <w:r>
+        <w:t xml:space="preserve">: Model Averaging fro Multivariate GLM with Null Models, R CRAN package</w:t>
+      </w:r>
+      <w:r>
+        <w:t xml:space="preserve"> </w:t>
+      </w:r>
+      <w:hyperlink r:id="rId62">
+        <w:r>
+          <w:rPr>
+            <w:rStyle w:val="InternetLink"/>
+          </w:rPr>
+          <w:t xml:space="preserve">R CRAN package</w:t>
+        </w:r>
+      </w:hyperlink>
+    </w:p>
+    <w:bookmarkEnd w:id="63"/>
+    <w:bookmarkStart w:id="64" w:name="teaching-experience"/>
     <w:p>
       <w:pPr>
         <w:pStyle w:val="Heading2"/>
@@ -2712,8 +2841,8 @@
         <w:t xml:space="preserve">R and generalized linear models, Xishuangbanna Tropical Botanical Garden, Chinese Academy of Sciences, China</w:t>
       </w:r>
     </w:p>
-    <w:bookmarkEnd w:id="63"/>
-    <w:bookmarkStart w:id="66" w:name="academic-service"/>
+    <w:bookmarkEnd w:id="64"/>
+    <w:bookmarkStart w:id="67" w:name="academic-service"/>
     <w:p>
       <w:pPr>
         <w:pStyle w:val="Heading2"/>
@@ -2734,7 +2863,7 @@
       <w:pPr>
         <w:pStyle w:val="Definition"/>
       </w:pPr>
-      <w:hyperlink r:id="rId64"/>
+      <w:hyperlink r:id="rId65"/>
     </w:p>
     <w:p>
       <w:pPr>
@@ -2756,7 +2885,7 @@
       <w:pPr>
         <w:pStyle w:val="Definition"/>
       </w:pPr>
-      <w:hyperlink r:id="rId64"/>
+      <w:hyperlink r:id="rId65"/>
     </w:p>
     <w:p>
       <w:pPr>
@@ -2778,7 +2907,7 @@
       <w:pPr>
         <w:pStyle w:val="Definition"/>
       </w:pPr>
-      <w:hyperlink r:id="rId64"/>
+      <w:hyperlink r:id="rId65"/>
     </w:p>
     <w:p>
       <w:pPr>
@@ -2800,7 +2929,7 @@
       <w:pPr>
         <w:pStyle w:val="Definition"/>
       </w:pPr>
-      <w:hyperlink r:id="rId64"/>
+      <w:hyperlink r:id="rId65"/>
     </w:p>
     <w:p>
       <w:pPr>
@@ -2810,7 +2939,7 @@
         <w:t xml:space="preserve">Statistical editor for Lepcey, The Journal of Tropical Asian Entomology</w:t>
       </w:r>
     </w:p>
-    <w:bookmarkStart w:id="65" w:name="reviewer-for-journals-12-per-year"/>
+    <w:bookmarkStart w:id="66" w:name="reviewer-for-journals-12-per-year"/>
     <w:p>
       <w:pPr>
         <w:pStyle w:val="Heading3"/>
@@ -2819,9 +2948,9 @@
         <w:t xml:space="preserve">Reviewer for journals (~ 12 per year):</w:t>
       </w:r>
     </w:p>
-    <w:bookmarkEnd w:id="65"/>
     <w:bookmarkEnd w:id="66"/>
-    <w:bookmarkStart w:id="67" w:name="awards-and-prizes"/>
+    <w:bookmarkEnd w:id="67"/>
+    <w:bookmarkStart w:id="68" w:name="awards-and-prizes"/>
     <w:p>
       <w:pPr>
         <w:pStyle w:val="Heading2"/>
@@ -2862,8 +2991,8 @@
         <w:t xml:space="preserve">Dean’s award for excellence, Graduate School of Life Sciences (Master’s Program), Tohoku University</w:t>
       </w:r>
     </w:p>
-    <w:bookmarkEnd w:id="67"/>
-    <w:bookmarkStart w:id="68" w:name="invited-seminars"/>
+    <w:bookmarkEnd w:id="68"/>
+    <w:bookmarkStart w:id="69" w:name="invited-seminars"/>
     <w:p>
       <w:pPr>
         <w:pStyle w:val="Heading2"/>
@@ -2968,8 +3097,8 @@
         <w:t xml:space="preserve">Additive partitioning of functional diversity in plant communities, Xishuangbanna Tropical Botanical Garden, China</w:t>
       </w:r>
     </w:p>
-    <w:bookmarkEnd w:id="68"/>
-    <w:bookmarkStart w:id="69" w:name="international-meetings"/>
+    <w:bookmarkEnd w:id="69"/>
+    <w:bookmarkStart w:id="70" w:name="international-meetings"/>
     <w:p>
       <w:pPr>
         <w:pStyle w:val="Heading2"/>
@@ -3384,8 +3513,8 @@
         <w:t xml:space="preserve">. ATBC, Marburg, Germany</w:t>
       </w:r>
     </w:p>
-    <w:bookmarkEnd w:id="69"/>
-    <w:bookmarkStart w:id="70" w:name="outreach"/>
+    <w:bookmarkEnd w:id="70"/>
+    <w:bookmarkStart w:id="71" w:name="outreach"/>
     <w:p>
       <w:pPr>
         <w:pStyle w:val="Heading2"/>
@@ -3419,8 +3548,8 @@
         <w:t xml:space="preserve">. Invited by the Japanese Association of Interdisciplinary Study Group in University Florida</w:t>
       </w:r>
     </w:p>
-    <w:bookmarkEnd w:id="70"/>
-    <w:bookmarkStart w:id="71" w:name="languages"/>
+    <w:bookmarkEnd w:id="71"/>
+    <w:bookmarkStart w:id="72" w:name="languages"/>
     <w:p>
       <w:pPr>
         <w:pStyle w:val="Heading2"/>
@@ -3437,8 +3566,8 @@
         <w:t xml:space="preserve">Japanese (native), English (fluent), Malay (basic), Chinese-Mandarin (basic)</w:t>
       </w:r>
     </w:p>
-    <w:bookmarkEnd w:id="71"/>
-    <w:bookmarkStart w:id="72" w:name="graduate-students"/>
+    <w:bookmarkEnd w:id="72"/>
+    <w:bookmarkStart w:id="73" w:name="graduate-students"/>
     <w:p>
       <w:pPr>
         <w:pStyle w:val="Heading2"/>
@@ -3463,7 +3592,7 @@
         <w:t xml:space="preserve">Zhou Cong, 2021 - 2023, M.Sc. Student, Recipient of UCAS Scholarship.</w:t>
       </w:r>
     </w:p>
-    <w:bookmarkEnd w:id="72"/>
+    <w:bookmarkEnd w:id="73"/>
     <w:sectPr>
       <w:headerReference r:id="rId9" w:type="default"/>
       <w:footnotePr>

</xml_diff>

<commit_message>
Deploying to gh-pages from @ mattocci27/my-cv@9a5e33d1f88bed1c15956cb289ddb84020c0b900 🚀
</commit_message>
<xml_diff>
--- a/Katabuchi_CV.docx
+++ b/Katabuchi_CV.docx
@@ -656,7 +656,7 @@
         <w:t xml:space="preserve"> </w:t>
       </w:r>
       <w:r>
-        <w:t xml:space="preserve">(2025)</w:t>
+        <w:t xml:space="preserve">41, e70021 (2026)</w:t>
       </w:r>
       <w:r>
         <w:t xml:space="preserve"> </w:t>
@@ -694,7 +694,7 @@
         <w:t xml:space="preserve">Katabuchi, M.†</w:t>
       </w:r>
       <w:r>
-        <w:t xml:space="preserve">, Tor-ngern, P., Palmroth, S., Zhang, S.-B., Xiao, Y.-X., Liu, M. &amp; Oren, R.†* Hydraulic conductivity-induced systematic parameter variation in a widely used thermal dissipation sap-flow technique.</w:t>
+        <w:t xml:space="preserve">, Tor-ngern, P., Palmroth, S., Zhang, S.-B., Xiao, Y.-X., Liu, M. &amp; Oren, R.†* Hっっjydraulic conductivity-induced systematic parameter variation in a widely used thermal dissipation sap-flow technique.</w:t>
       </w:r>
       <w:r>
         <w:t xml:space="preserve"> </w:t>

</xml_diff>

<commit_message>
Deploying to gh-pages from @ mattocci27/my-cv@33785c9282debac07ad8c2958ace112885c042fd 🚀
</commit_message>
<xml_diff>
--- a/Katabuchi_CV.docx
+++ b/Katabuchi_CV.docx
@@ -694,7 +694,7 @@
         <w:t xml:space="preserve">Katabuchi, M.†</w:t>
       </w:r>
       <w:r>
-        <w:t xml:space="preserve">, Tor-ngern, P., Palmroth, S., Zhang, S.-B., Xiao, Y.-X., Liu, M. &amp; Oren, R.†* Hっっjydraulic conductivity-induced systematic parameter variation in a widely used thermal dissipation sap-flow technique.</w:t>
+        <w:t xml:space="preserve">, Tor-ngern, P., Palmroth, S., Zhang, S.-B., Xiao, Y.-X., Liu, M. &amp; Oren, R.†* Hydraulic conductivity-induced systematic parameter variation in a widely used thermal dissipation sap-flow technique.</w:t>
       </w:r>
       <w:r>
         <w:t xml:space="preserve"> </w:t>
@@ -2957,6 +2957,22 @@
       </w:pPr>
       <w:r>
         <w:t xml:space="preserve">Awards and Prizes</w:t>
+      </w:r>
+    </w:p>
+    <w:p>
+      <w:pPr>
+        <w:pStyle w:val="DefinitionTerm"/>
+      </w:pPr>
+      <w:r>
+        <w:t xml:space="preserve">2026</w:t>
+      </w:r>
+    </w:p>
+    <w:p>
+      <w:pPr>
+        <w:pStyle w:val="Definition"/>
+      </w:pPr>
+      <w:r>
+        <w:t xml:space="preserve">Outstanding Staff Award for the year of 2025, Xishuangbanna Tropical Botanical Garden, Chinese Academy of Sciences</w:t>
       </w:r>
     </w:p>
     <w:p>

</xml_diff>

<commit_message>
Deploying to gh-pages from @ mattocci27/my-cv@3be78f418debb76214e86feaadb00c20a6614597 🚀
</commit_message>
<xml_diff>
--- a/Katabuchi_CV.docx
+++ b/Katabuchi_CV.docx
@@ -18,7 +18,7 @@
         <w:t xml:space="preserve">Masatoshi Katabuchi</w:t>
       </w:r>
     </w:p>
-    <w:bookmarkStart w:id="20" w:name="research-interest"/>
+    <w:bookmarkStart w:id="12" w:name="research-interest"/>
     <w:p>
       <w:pPr>
         <w:pStyle w:val="Heading2"/>
@@ -35,8 +35,8 @@
         <w:t xml:space="preserve">Community ecology, Tropical forest ecology, Functional traits, Global change biology, Bayesian and likelihood methods</w:t>
       </w:r>
     </w:p>
-    <w:bookmarkEnd w:id="20"/>
-    <w:bookmarkStart w:id="21" w:name="education"/>
+    <w:bookmarkEnd w:id="12"/>
+    <w:bookmarkStart w:id="13" w:name="education"/>
     <w:p>
       <w:pPr>
         <w:pStyle w:val="Heading2"/>
@@ -144,8 +144,8 @@
         <w:t xml:space="preserve">, Department of Biology</w:t>
       </w:r>
     </w:p>
-    <w:bookmarkEnd w:id="21"/>
-    <w:bookmarkStart w:id="22" w:name="academic-research-positions"/>
+    <w:bookmarkEnd w:id="13"/>
+    <w:bookmarkStart w:id="14" w:name="academic-research-positions"/>
     <w:p>
       <w:pPr>
         <w:pStyle w:val="Heading2"/>
@@ -361,8 +361,8 @@
         <w:t xml:space="preserve">, Tohoku University, Japan</w:t>
       </w:r>
     </w:p>
-    <w:bookmarkEnd w:id="22"/>
-    <w:bookmarkStart w:id="23" w:name="grants-fellowships"/>
+    <w:bookmarkEnd w:id="14"/>
+    <w:bookmarkStart w:id="15" w:name="grants-fellowships"/>
     <w:p>
       <w:pPr>
         <w:pStyle w:val="Heading2"/>
@@ -549,8 +549,8 @@
         <w:t xml:space="preserve">Grant-in-Aid for Scientific Research for JSPS Research Fellowship (no. 22-7035) 1,400,000 JPY</w:t>
       </w:r>
     </w:p>
-    <w:bookmarkEnd w:id="23"/>
-    <w:bookmarkStart w:id="24" w:name="collaborator-named-on-foreign-grants"/>
+    <w:bookmarkEnd w:id="15"/>
+    <w:bookmarkStart w:id="16" w:name="collaborator-named-on-foreign-grants"/>
     <w:p>
       <w:pPr>
         <w:pStyle w:val="Heading2"/>
@@ -593,8 +593,8 @@
         <w:t xml:space="preserve">External Scientific Collaborator: Masatoshi Katabuchi</w:t>
       </w:r>
     </w:p>
-    <w:bookmarkEnd w:id="24"/>
-    <w:bookmarkStart w:id="58" w:name="publications"/>
+    <w:bookmarkEnd w:id="16"/>
+    <w:bookmarkStart w:id="49" w:name="publications"/>
     <w:p>
       <w:pPr>
         <w:pStyle w:val="Heading2"/>
@@ -625,7 +625,7 @@
         </w:numPr>
       </w:pPr>
       <w:r>
-        <w:t xml:space="preserve">Kurokawa, H.*, Arai, T., Takayanagi, S., Kobayashi, M., Fukuzawa, K.,</w:t>
+        <w:t xml:space="preserve">Roeder, M.*, Yang, X., Dossa, G. G. O.,</w:t>
       </w:r>
       <w:r>
         <w:t xml:space="preserve"> </w:t>
@@ -638,7 +638,7 @@
         <w:t xml:space="preserve">Katabuchi, M.</w:t>
       </w:r>
       <w:r>
-        <w:t xml:space="preserve">, Oguro, M., Aiba, M., Nagano, S., Hikosaka, K., Shibata, H., Kaneko, N. &amp; Nakashizuka, T. Leaf litter decomposition along an elevation gradient across two contrasting forest types: Implications for future climate change.</w:t>
+        <w:t xml:space="preserve">, Yang, C. &amp; Nakamura, A. Mesofauna in mixed liana or tree litter bags: Growth form does not matter, but location does.</w:t>
       </w:r>
       <w:r>
         <w:t xml:space="preserve"> </w:t>
@@ -650,6 +650,62 @@
           <w:i/>
           <w:iCs/>
         </w:rPr>
+        <w:t xml:space="preserve">Ecological Frontiers</w:t>
+      </w:r>
+      <w:r>
+        <w:t xml:space="preserve"> </w:t>
+      </w:r>
+      <w:r>
+        <w:t xml:space="preserve">(2026)</w:t>
+      </w:r>
+      <w:r>
+        <w:t xml:space="preserve"> </w:t>
+      </w:r>
+      <w:hyperlink r:id="rId17">
+        <w:r>
+          <w:rPr>
+            <w:rStyle w:val="InternetLink"/>
+          </w:rPr>
+          <w:t xml:space="preserve">[doi]</w:t>
+        </w:r>
+      </w:hyperlink>
+      <w:r>
+        <w:t xml:space="preserve">.</w:t>
+      </w:r>
+    </w:p>
+    <w:p>
+      <w:pPr>
+        <w:numPr>
+          <w:ilvl w:val="0"/>
+          <w:numId w:val="1001"/>
+        </w:numPr>
+      </w:pPr>
+      <w:r>
+        <w:t xml:space="preserve">Kurokawa, H.*, Arai, T., Takayanagi, S., Kobayashi, M., Fukuzawa, K.,</w:t>
+      </w:r>
+      <w:r>
+        <w:t xml:space="preserve"> </w:t>
+      </w:r>
+      <w:r>
+        <w:rPr>
+          <w:b/>
+          <w:bCs/>
+        </w:rPr>
+        <w:t xml:space="preserve">Katabuchi, M.</w:t>
+      </w:r>
+      <w:r>
+        <w:t xml:space="preserve">, Oguro, M., Aiba, M., Nagano, S., Hikosaka, K., Shibata, H., Kaneko, N. &amp; Nakashizuka, T. Leaf litter decomposition along an elevation gradient across two contrasting forest types: Implications for future climate change.</w:t>
+      </w:r>
+      <w:r>
+        <w:t xml:space="preserve"> </w:t>
+      </w:r>
+      <w:r>
+        <w:rPr>
+          <w:b/>
+          <w:bCs/>
+          <w:i/>
+          <w:iCs/>
+        </w:rPr>
         <w:t xml:space="preserve">Ecological Research</w:t>
       </w:r>
       <w:r>
@@ -657,6 +713,398 @@
       </w:r>
       <w:r>
         <w:t xml:space="preserve">41, e70021 (2026)</w:t>
+      </w:r>
+      <w:r>
+        <w:t xml:space="preserve"> </w:t>
+      </w:r>
+      <w:hyperlink r:id="rId18">
+        <w:r>
+          <w:rPr>
+            <w:rStyle w:val="InternetLink"/>
+          </w:rPr>
+          <w:t xml:space="preserve">[doi]</w:t>
+        </w:r>
+      </w:hyperlink>
+      <w:r>
+        <w:t xml:space="preserve">.</w:t>
+      </w:r>
+    </w:p>
+    <w:p>
+      <w:pPr>
+        <w:numPr>
+          <w:ilvl w:val="0"/>
+          <w:numId w:val="1001"/>
+        </w:numPr>
+      </w:pPr>
+      <w:r>
+        <w:t xml:space="preserve">Chen, Y.-J.†*, Maenpuen, P.†,</w:t>
+      </w:r>
+      <w:r>
+        <w:t xml:space="preserve"> </w:t>
+      </w:r>
+      <w:r>
+        <w:rPr>
+          <w:b/>
+          <w:bCs/>
+        </w:rPr>
+        <w:t xml:space="preserve">Katabuchi, M.†</w:t>
+      </w:r>
+      <w:r>
+        <w:t xml:space="preserve">, Tor-ngern, P., Palmroth, S., Zhang, S.-B., Xiao, Y.-X., Liu, M. &amp; Oren, R.†* Hydraulic conductivity-induced systematic parameter variation in a widely used thermal dissipation sap-flow technique.</w:t>
+      </w:r>
+      <w:r>
+        <w:t xml:space="preserve"> </w:t>
+      </w:r>
+      <w:r>
+        <w:rPr>
+          <w:b/>
+          <w:bCs/>
+          <w:i/>
+          <w:iCs/>
+        </w:rPr>
+        <w:t xml:space="preserve">New Phytologist</w:t>
+      </w:r>
+      <w:r>
+        <w:t xml:space="preserve"> </w:t>
+      </w:r>
+      <w:r>
+        <w:t xml:space="preserve">(2025)</w:t>
+      </w:r>
+      <w:r>
+        <w:t xml:space="preserve"> </w:t>
+      </w:r>
+      <w:hyperlink r:id="rId19">
+        <w:r>
+          <w:rPr>
+            <w:rStyle w:val="InternetLink"/>
+          </w:rPr>
+          <w:t xml:space="preserve">[doi]</w:t>
+        </w:r>
+      </w:hyperlink>
+      <w:r>
+        <w:t xml:space="preserve">.</w:t>
+      </w:r>
+    </w:p>
+    <w:p>
+      <w:pPr>
+        <w:numPr>
+          <w:ilvl w:val="0"/>
+          <w:numId w:val="1001"/>
+        </w:numPr>
+      </w:pPr>
+      <w:r>
+        <w:t xml:space="preserve">Nguyen, T. D. &amp;</w:t>
+      </w:r>
+      <w:r>
+        <w:t xml:space="preserve"> </w:t>
+      </w:r>
+      <w:r>
+        <w:rPr>
+          <w:b/>
+          <w:bCs/>
+        </w:rPr>
+        <w:t xml:space="preserve">Katabuchi, M.*</w:t>
+      </w:r>
+      <w:r>
+        <w:t xml:space="preserve"> </w:t>
+      </w:r>
+      <w:r>
+        <w:t xml:space="preserve">Saturating allometric relationships reveal how wood density shapes global tree architecture.</w:t>
+      </w:r>
+      <w:r>
+        <w:t xml:space="preserve"> </w:t>
+      </w:r>
+      <w:r>
+        <w:rPr>
+          <w:b/>
+          <w:bCs/>
+          <w:i/>
+          <w:iCs/>
+        </w:rPr>
+        <w:t xml:space="preserve">Journal of Forestry Research</w:t>
+      </w:r>
+      <w:r>
+        <w:t xml:space="preserve"> </w:t>
+      </w:r>
+      <w:r>
+        <w:t xml:space="preserve">36, 107 (2025)</w:t>
+      </w:r>
+      <w:r>
+        <w:t xml:space="preserve"> </w:t>
+      </w:r>
+      <w:hyperlink r:id="rId20">
+        <w:r>
+          <w:rPr>
+            <w:rStyle w:val="InternetLink"/>
+          </w:rPr>
+          <w:t xml:space="preserve">[doi]</w:t>
+        </w:r>
+      </w:hyperlink>
+      <w:r>
+        <w:t xml:space="preserve">.</w:t>
+      </w:r>
+    </w:p>
+    <w:p>
+      <w:pPr>
+        <w:numPr>
+          <w:ilvl w:val="0"/>
+          <w:numId w:val="1001"/>
+        </w:numPr>
+      </w:pPr>
+      <w:r>
+        <w:rPr>
+          <w:b/>
+          <w:bCs/>
+        </w:rPr>
+        <w:t xml:space="preserve">Katabuchi, M.*</w:t>
+      </w:r>
+      <w:r>
+        <w:t xml:space="preserve">, Kitajima, K., Wright, S. J., Van Bael, S. A., Osnas, J. L. D. &amp; Lichstein, J. W. Decomposing leaf mass into metabolic and structural components explains divergent patterns of trait variation within and among plant species.</w:t>
+      </w:r>
+      <w:r>
+        <w:t xml:space="preserve"> </w:t>
+      </w:r>
+      <w:r>
+        <w:rPr>
+          <w:b/>
+          <w:bCs/>
+          <w:i/>
+          <w:iCs/>
+        </w:rPr>
+        <w:t xml:space="preserve">Oecologia</w:t>
+      </w:r>
+      <w:r>
+        <w:t xml:space="preserve"> </w:t>
+      </w:r>
+      <w:r>
+        <w:t xml:space="preserve">207, 71 (2025)</w:t>
+      </w:r>
+      <w:r>
+        <w:t xml:space="preserve"> </w:t>
+      </w:r>
+      <w:hyperlink r:id="rId21">
+        <w:r>
+          <w:rPr>
+            <w:rStyle w:val="InternetLink"/>
+          </w:rPr>
+          <w:t xml:space="preserve">[doi]</w:t>
+        </w:r>
+      </w:hyperlink>
+      <w:r>
+        <w:t xml:space="preserve">.</w:t>
+      </w:r>
+    </w:p>
+    <w:p>
+      <w:pPr>
+        <w:numPr>
+          <w:ilvl w:val="0"/>
+          <w:numId w:val="1001"/>
+        </w:numPr>
+      </w:pPr>
+      <w:r>
+        <w:t xml:space="preserve">Song, X.†,</w:t>
+      </w:r>
+      <w:r>
+        <w:t xml:space="preserve"> </w:t>
+      </w:r>
+      <w:r>
+        <w:rPr>
+          <w:b/>
+          <w:bCs/>
+        </w:rPr>
+        <w:t xml:space="preserve">Katabuchi, M.†</w:t>
+      </w:r>
+      <w:r>
+        <w:t xml:space="preserve">, Chase, J. M., Johnson, D. J., Zhang, W., Deng, X., Cao, M. &amp; Yang, J.* Drought tolerance and species abundance mediate dry season negative density dependence in a tropical forest.</w:t>
+      </w:r>
+      <w:r>
+        <w:t xml:space="preserve"> </w:t>
+      </w:r>
+      <w:r>
+        <w:rPr>
+          <w:b/>
+          <w:bCs/>
+          <w:i/>
+          <w:iCs/>
+        </w:rPr>
+        <w:t xml:space="preserve">Ecology</w:t>
+      </w:r>
+      <w:r>
+        <w:t xml:space="preserve"> </w:t>
+      </w:r>
+      <w:r>
+        <w:t xml:space="preserve">105, e4382 (2024)</w:t>
+      </w:r>
+      <w:r>
+        <w:t xml:space="preserve"> </w:t>
+      </w:r>
+      <w:hyperlink r:id="rId22">
+        <w:r>
+          <w:rPr>
+            <w:rStyle w:val="InternetLink"/>
+          </w:rPr>
+          <w:t xml:space="preserve">[doi]</w:t>
+        </w:r>
+      </w:hyperlink>
+      <w:r>
+        <w:t xml:space="preserve">.</w:t>
+      </w:r>
+    </w:p>
+    <w:p>
+      <w:pPr>
+        <w:numPr>
+          <w:ilvl w:val="0"/>
+          <w:numId w:val="1001"/>
+        </w:numPr>
+      </w:pPr>
+      <w:r>
+        <w:t xml:space="preserve">Zhou, C., Nakamura, A., Song, X. &amp;</w:t>
+      </w:r>
+      <w:r>
+        <w:t xml:space="preserve"> </w:t>
+      </w:r>
+      <w:r>
+        <w:rPr>
+          <w:b/>
+          <w:bCs/>
+        </w:rPr>
+        <w:t xml:space="preserve">Katabuchi, M.*</w:t>
+      </w:r>
+      <w:r>
+        <w:t xml:space="preserve"> </w:t>
+      </w:r>
+      <w:r>
+        <w:t xml:space="preserve">Artificial Light at Night (ALAN) Influences Understory Plant Traits through Ecological Processes: A Two-Year Experiment in a Rubber Plantation in China.</w:t>
+      </w:r>
+      <w:r>
+        <w:t xml:space="preserve"> </w:t>
+      </w:r>
+      <w:r>
+        <w:rPr>
+          <w:b/>
+          <w:bCs/>
+          <w:i/>
+          <w:iCs/>
+        </w:rPr>
+        <w:t xml:space="preserve">Ecologies</w:t>
+      </w:r>
+      <w:r>
+        <w:t xml:space="preserve"> </w:t>
+      </w:r>
+      <w:r>
+        <w:t xml:space="preserve">4, 704–713 (2023)</w:t>
+      </w:r>
+      <w:r>
+        <w:t xml:space="preserve"> </w:t>
+      </w:r>
+      <w:hyperlink r:id="rId23">
+        <w:r>
+          <w:rPr>
+            <w:rStyle w:val="InternetLink"/>
+          </w:rPr>
+          <w:t xml:space="preserve">[doi]</w:t>
+        </w:r>
+      </w:hyperlink>
+      <w:r>
+        <w:t xml:space="preserve">.</w:t>
+      </w:r>
+    </w:p>
+    <w:p>
+      <w:pPr>
+        <w:numPr>
+          <w:ilvl w:val="0"/>
+          <w:numId w:val="1001"/>
+        </w:numPr>
+      </w:pPr>
+      <w:r>
+        <w:t xml:space="preserve">Phoutthavong, K.,</w:t>
+      </w:r>
+      <w:r>
+        <w:t xml:space="preserve"> </w:t>
+      </w:r>
+      <w:r>
+        <w:rPr>
+          <w:b/>
+          <w:bCs/>
+        </w:rPr>
+        <w:t xml:space="preserve">Katabuchi, M.*</w:t>
+      </w:r>
+      <w:r>
+        <w:t xml:space="preserve">, Nakamura, A., Cheng, X. &amp; Cao, M. Inter- and intraspecific adaptations of pteridophyte leaf traits in limestone and non-limestone forests of monsoon tropical regions of southwest China.</w:t>
+      </w:r>
+      <w:r>
+        <w:t xml:space="preserve"> </w:t>
+      </w:r>
+      <w:r>
+        <w:rPr>
+          <w:b/>
+          <w:bCs/>
+          <w:i/>
+          <w:iCs/>
+        </w:rPr>
+        <w:t xml:space="preserve">Journal of Plant Ecology</w:t>
+      </w:r>
+      <w:r>
+        <w:t xml:space="preserve"> </w:t>
+      </w:r>
+      <w:r>
+        <w:t xml:space="preserve">16, rtad026 (2023)</w:t>
+      </w:r>
+      <w:r>
+        <w:t xml:space="preserve"> </w:t>
+      </w:r>
+      <w:hyperlink r:id="rId24">
+        <w:r>
+          <w:rPr>
+            <w:rStyle w:val="InternetLink"/>
+          </w:rPr>
+          <w:t xml:space="preserve">[doi]</w:t>
+        </w:r>
+      </w:hyperlink>
+      <w:r>
+        <w:t xml:space="preserve">.</w:t>
+      </w:r>
+    </w:p>
+    <w:p>
+      <w:pPr>
+        <w:numPr>
+          <w:ilvl w:val="0"/>
+          <w:numId w:val="1001"/>
+        </w:numPr>
+      </w:pPr>
+      <w:r>
+        <w:t xml:space="preserve">Maenpuen, P.†,</w:t>
+      </w:r>
+      <w:r>
+        <w:t xml:space="preserve"> </w:t>
+      </w:r>
+      <w:r>
+        <w:rPr>
+          <w:b/>
+          <w:bCs/>
+        </w:rPr>
+        <w:t xml:space="preserve">Katabuchi, M.†*</w:t>
+      </w:r>
+      <w:r>
+        <w:t xml:space="preserve">, Onoda, Y., Zhou, C., Zhang, J.-L.* &amp; Chen, Y.-J. Sources and consequences of mismatch between leaf disc and whole-leaf leaf mass per area (LMA).</w:t>
+      </w:r>
+      <w:r>
+        <w:t xml:space="preserve"> </w:t>
+      </w:r>
+      <w:r>
+        <w:rPr>
+          <w:b/>
+          <w:bCs/>
+          <w:i/>
+          <w:iCs/>
+        </w:rPr>
+        <w:t xml:space="preserve">American Journal of Botany</w:t>
+      </w:r>
+      <w:r>
+        <w:t xml:space="preserve"> </w:t>
+      </w:r>
+      <w:r>
+        <w:t xml:space="preserve">109, 1242–1250 (2022)</w:t>
       </w:r>
       <w:r>
         <w:t xml:space="preserve"> </w:t>
@@ -681,20 +1129,20 @@
         </w:numPr>
       </w:pPr>
       <w:r>
-        <w:t xml:space="preserve">Chen, Y.-J.†*, Maenpuen, P.†,</w:t>
-      </w:r>
-      <w:r>
-        <w:t xml:space="preserve"> </w:t>
-      </w:r>
-      <w:r>
-        <w:rPr>
-          <w:b/>
-          <w:bCs/>
-        </w:rPr>
-        <w:t xml:space="preserve">Katabuchi, M.†</w:t>
-      </w:r>
-      <w:r>
-        <w:t xml:space="preserve">, Tor-ngern, P., Palmroth, S., Zhang, S.-B., Xiao, Y.-X., Liu, M. &amp; Oren, R.†* Hydraulic conductivity-induced systematic parameter variation in a widely used thermal dissipation sap-flow technique.</w:t>
+        <w:t xml:space="preserve">Chen, Y.-J., Choat, B., Sterck, F.*, Maenpuen, P.,</w:t>
+      </w:r>
+      <w:r>
+        <w:t xml:space="preserve"> </w:t>
+      </w:r>
+      <w:r>
+        <w:rPr>
+          <w:b/>
+          <w:bCs/>
+        </w:rPr>
+        <w:t xml:space="preserve">Katabuchi, M.</w:t>
+      </w:r>
+      <w:r>
+        <w:t xml:space="preserve">, Zhang, S.-B., Tomlinson, K. W., Oliveira, R. S., Zhang, Y.-J., Shen, J.-X., Cao, K.-F.* &amp; Jansen, S.* Hydraulic prediction of drought-induced plant dieback and top-kill depends on leaf habit and growth form.</w:t>
       </w:r>
       <w:r>
         <w:t xml:space="preserve"> </w:t>
@@ -706,13 +1154,13 @@
           <w:i/>
           <w:iCs/>
         </w:rPr>
-        <w:t xml:space="preserve">New Phytologist</w:t>
-      </w:r>
-      <w:r>
-        <w:t xml:space="preserve"> </w:t>
-      </w:r>
-      <w:r>
-        <w:t xml:space="preserve">(2025)</w:t>
+        <w:t xml:space="preserve">Ecology Letters</w:t>
+      </w:r>
+      <w:r>
+        <w:t xml:space="preserve"> </w:t>
+      </w:r>
+      <w:r>
+        <w:t xml:space="preserve">24, 2350–2363 (2021)</w:t>
       </w:r>
       <w:r>
         <w:t xml:space="preserve"> </w:t>
@@ -737,23 +1185,20 @@
         </w:numPr>
       </w:pPr>
       <w:r>
-        <w:t xml:space="preserve">Nguyen, T. D. &amp;</w:t>
-      </w:r>
-      <w:r>
-        <w:t xml:space="preserve"> </w:t>
-      </w:r>
-      <w:r>
-        <w:rPr>
-          <w:b/>
-          <w:bCs/>
-        </w:rPr>
-        <w:t xml:space="preserve">Katabuchi, M.*</w:t>
-      </w:r>
-      <w:r>
-        <w:t xml:space="preserve"> </w:t>
-      </w:r>
-      <w:r>
-        <w:t xml:space="preserve">Saturating allometric relationships reveal how wood density shapes global tree architecture.</w:t>
+        <w:t xml:space="preserve">Chen, Y.-J.*, Maenpuen, P., Zhang, Y.-J.*, Barai, K.,</w:t>
+      </w:r>
+      <w:r>
+        <w:t xml:space="preserve"> </w:t>
+      </w:r>
+      <w:r>
+        <w:rPr>
+          <w:b/>
+          <w:bCs/>
+        </w:rPr>
+        <w:t xml:space="preserve">Katabuchi, M.</w:t>
+      </w:r>
+      <w:r>
+        <w:t xml:space="preserve">, Gao, H., Kaewkamol, S., Tao, L.-B. &amp; Zhang, J.-L. Quantifying vulnerability to embolism in tropical trees and lianas using five methods: Can discrepancies be explained by xylem structural traits?</w:t>
       </w:r>
       <w:r>
         <w:t xml:space="preserve"> </w:t>
@@ -765,13 +1210,13 @@
           <w:i/>
           <w:iCs/>
         </w:rPr>
-        <w:t xml:space="preserve">Journal of Forestry Research</w:t>
-      </w:r>
-      <w:r>
-        <w:t xml:space="preserve"> </w:t>
-      </w:r>
-      <w:r>
-        <w:t xml:space="preserve">36, 107 (2025)</w:t>
+        <w:t xml:space="preserve">New Phytologist</w:t>
+      </w:r>
+      <w:r>
+        <w:t xml:space="preserve"> </w:t>
+      </w:r>
+      <w:r>
+        <w:t xml:space="preserve">229, 805–819 (2021)</w:t>
       </w:r>
       <w:r>
         <w:t xml:space="preserve"> </w:t>
@@ -796,14 +1241,23 @@
         </w:numPr>
       </w:pPr>
       <w:r>
-        <w:rPr>
-          <w:b/>
-          <w:bCs/>
-        </w:rPr>
-        <w:t xml:space="preserve">Katabuchi, M.*</w:t>
-      </w:r>
-      <w:r>
-        <w:t xml:space="preserve">, Kitajima, K., Wright, S. J., Van Bael, S. A., Osnas, J. L. D. &amp; Lichstein, J. W. Decomposing leaf mass into metabolic and structural components explains divergent patterns of trait variation within and among plant species.</w:t>
+        <w:t xml:space="preserve">Swenson, N. G.*, Hulshof, C. M.,</w:t>
+      </w:r>
+      <w:r>
+        <w:t xml:space="preserve"> </w:t>
+      </w:r>
+      <w:r>
+        <w:rPr>
+          <w:b/>
+          <w:bCs/>
+        </w:rPr>
+        <w:t xml:space="preserve">Katabuchi, M.</w:t>
+      </w:r>
+      <w:r>
+        <w:t xml:space="preserve"> </w:t>
+      </w:r>
+      <w:r>
+        <w:t xml:space="preserve">&amp; Enquist, B. J. Long-term shifts in the functional composition and diversity of a tropical dry forest: A 30-yr study.</w:t>
       </w:r>
       <w:r>
         <w:t xml:space="preserve"> </w:t>
@@ -815,13 +1269,13 @@
           <w:i/>
           <w:iCs/>
         </w:rPr>
-        <w:t xml:space="preserve">Oecologia</w:t>
-      </w:r>
-      <w:r>
-        <w:t xml:space="preserve"> </w:t>
-      </w:r>
-      <w:r>
-        <w:t xml:space="preserve">207, 71 (2025)</w:t>
+        <w:t xml:space="preserve">Ecological Monographs</w:t>
+      </w:r>
+      <w:r>
+        <w:t xml:space="preserve"> </w:t>
+      </w:r>
+      <w:r>
+        <w:t xml:space="preserve">e01408 (2020)</w:t>
       </w:r>
       <w:r>
         <w:t xml:space="preserve"> </w:t>
@@ -846,20 +1300,20 @@
         </w:numPr>
       </w:pPr>
       <w:r>
-        <w:t xml:space="preserve">Song, X.†,</w:t>
-      </w:r>
-      <w:r>
-        <w:t xml:space="preserve"> </w:t>
-      </w:r>
-      <w:r>
-        <w:rPr>
-          <w:b/>
-          <w:bCs/>
-        </w:rPr>
-        <w:t xml:space="preserve">Katabuchi, M.†</w:t>
-      </w:r>
-      <w:r>
-        <w:t xml:space="preserve">, Chase, J. M., Johnson, D. J., Zhang, W., Deng, X., Cao, M. &amp; Yang, J.* Drought tolerance and species abundance mediate dry season negative density dependence in a tropical forest.</w:t>
+        <w:t xml:space="preserve">Sreekar, R.,</w:t>
+      </w:r>
+      <w:r>
+        <w:t xml:space="preserve"> </w:t>
+      </w:r>
+      <w:r>
+        <w:rPr>
+          <w:b/>
+          <w:bCs/>
+        </w:rPr>
+        <w:t xml:space="preserve">Katabuchi, M.</w:t>
+      </w:r>
+      <w:r>
+        <w:t xml:space="preserve">, Nakamura, A., Corlett, R. T., Slik, J. W. F., Fletcher, C., He, F., Weiblen, G. D., Shen, G., Xu, H., Sun, I.-F., Cao, K., Ma, K., Chang, L.-W., Cao, M., Jiang, M., Gunatilleke, I. A. U. N., Ong, P., Yap, S., Gunatilleke, C. V. S., Novotny, V., Brockelman, W. Y., Xiang, W., Mi, X., Li, X., Wang, X., Qiao, X., Li, Y., Tan, S., Condit, R., Harrison, R. D. &amp; Koh, L. P. Spatial scale changes the relationship between beta diversity, species richness and latitude.</w:t>
       </w:r>
       <w:r>
         <w:t xml:space="preserve"> </w:t>
@@ -871,13 +1325,13 @@
           <w:i/>
           <w:iCs/>
         </w:rPr>
-        <w:t xml:space="preserve">Ecology</w:t>
-      </w:r>
-      <w:r>
-        <w:t xml:space="preserve"> </w:t>
-      </w:r>
-      <w:r>
-        <w:t xml:space="preserve">105, e4382 (2024)</w:t>
+        <w:t xml:space="preserve">Open Science</w:t>
+      </w:r>
+      <w:r>
+        <w:t xml:space="preserve"> </w:t>
+      </w:r>
+      <w:r>
+        <w:t xml:space="preserve">5, 181168 (2018)</w:t>
       </w:r>
       <w:r>
         <w:t xml:space="preserve"> </w:t>
@@ -902,23 +1356,20 @@
         </w:numPr>
       </w:pPr>
       <w:r>
-        <w:t xml:space="preserve">Zhou, C., Nakamura, A., Song, X. &amp;</w:t>
-      </w:r>
-      <w:r>
-        <w:t xml:space="preserve"> </w:t>
-      </w:r>
-      <w:r>
-        <w:rPr>
-          <w:b/>
-          <w:bCs/>
-        </w:rPr>
-        <w:t xml:space="preserve">Katabuchi, M.*</w:t>
-      </w:r>
-      <w:r>
-        <w:t xml:space="preserve"> </w:t>
-      </w:r>
-      <w:r>
-        <w:t xml:space="preserve">Artificial Light at Night (ALAN) Influences Understory Plant Traits through Ecological Processes: A Two-Year Experiment in a Rubber Plantation in China.</w:t>
+        <w:t xml:space="preserve">Johnson, D. J.*, Needham, J., Xu, C., Massoud, E. C., Davies, S. J., Anderson-Teixeira, K. J., Bunyavejchewin, S., Chambers, J. Q., Chang-Yang, C.-H., Chiang, J.-M., Chuyong, G. B., Condit, R., Cordell, S., Fletcher, C., Giardina, C. P., Giambelluca, T. W., Gunatilleke, N., Gunatilleke, S., Hsieh, C.-F., Hubbell, S., Inman-Narahari, F., Kassim, A. R.,</w:t>
+      </w:r>
+      <w:r>
+        <w:t xml:space="preserve"> </w:t>
+      </w:r>
+      <w:r>
+        <w:rPr>
+          <w:b/>
+          <w:bCs/>
+        </w:rPr>
+        <w:t xml:space="preserve">Katabuchi, M.</w:t>
+      </w:r>
+      <w:r>
+        <w:t xml:space="preserve">, Kenfack, D., Litton, C. M., Lum, S., Mohamad, M., Nasardin, M., Ong, P. S., Ostertag, R., Sack, L., Swenson, N. G., Sun, I. F., Tan, S., Thomas, D. W., Thompson, J., Umaña, M. N., Uriarte, M., Valencia, R., Yap, S., Zimmerman, J., McDowell, N. G. &amp; McMahon, S. M. Climate sensitive size-dependent survival in tropical trees.</w:t>
       </w:r>
       <w:r>
         <w:t xml:space="preserve"> </w:t>
@@ -930,13 +1381,13 @@
           <w:i/>
           <w:iCs/>
         </w:rPr>
-        <w:t xml:space="preserve">Ecologies</w:t>
-      </w:r>
-      <w:r>
-        <w:t xml:space="preserve"> </w:t>
-      </w:r>
-      <w:r>
-        <w:t xml:space="preserve">4, 704–713 (2023)</w:t>
+        <w:t xml:space="preserve">Nature Ecology &amp; Evolution</w:t>
+      </w:r>
+      <w:r>
+        <w:t xml:space="preserve"> </w:t>
+      </w:r>
+      <w:r>
+        <w:t xml:space="preserve">1 (2018)</w:t>
       </w:r>
       <w:r>
         <w:t xml:space="preserve"> </w:t>
@@ -961,20 +1412,20 @@
         </w:numPr>
       </w:pPr>
       <w:r>
-        <w:t xml:space="preserve">Phoutthavong, K.,</w:t>
-      </w:r>
-      <w:r>
-        <w:t xml:space="preserve"> </w:t>
-      </w:r>
-      <w:r>
-        <w:rPr>
-          <w:b/>
-          <w:bCs/>
-        </w:rPr>
-        <w:t xml:space="preserve">Katabuchi, M.*</w:t>
-      </w:r>
-      <w:r>
-        <w:t xml:space="preserve">, Nakamura, A., Cheng, X. &amp; Cao, M. Inter- and intraspecific adaptations of pteridophyte leaf traits in limestone and non-limestone forests of monsoon tropical regions of southwest China.</w:t>
+        <w:t xml:space="preserve">Osnas, J. L. D.,</w:t>
+      </w:r>
+      <w:r>
+        <w:t xml:space="preserve"> </w:t>
+      </w:r>
+      <w:r>
+        <w:rPr>
+          <w:b/>
+          <w:bCs/>
+        </w:rPr>
+        <w:t xml:space="preserve">Katabuchi, M.</w:t>
+      </w:r>
+      <w:r>
+        <w:t xml:space="preserve">, Kitajima, K., Wright, S. J., Reich, P. B., Van Bael, S. A., Kraft, N. J. B., Samaniego, M. J., Pacala, S. W. &amp; Lichstein, J. W.* Divergent drivers of leaf trait variation within species, among species, and among functional groups.</w:t>
       </w:r>
       <w:r>
         <w:t xml:space="preserve"> </w:t>
@@ -986,13 +1437,13 @@
           <w:i/>
           <w:iCs/>
         </w:rPr>
-        <w:t xml:space="preserve">Journal of Plant Ecology</w:t>
-      </w:r>
-      <w:r>
-        <w:t xml:space="preserve"> </w:t>
-      </w:r>
-      <w:r>
-        <w:t xml:space="preserve">16, rtad026 (2023)</w:t>
+        <w:t xml:space="preserve">Proceedings of the National Academy of Sciences of the United States of America</w:t>
+      </w:r>
+      <w:r>
+        <w:t xml:space="preserve"> </w:t>
+      </w:r>
+      <w:r>
+        <w:t xml:space="preserve">115, 5480–5485 (2018)</w:t>
       </w:r>
       <w:r>
         <w:t xml:space="preserve"> </w:t>
@@ -1017,20 +1468,20 @@
         </w:numPr>
       </w:pPr>
       <w:r>
-        <w:t xml:space="preserve">Maenpuen, P.†,</w:t>
-      </w:r>
-      <w:r>
-        <w:t xml:space="preserve"> </w:t>
-      </w:r>
-      <w:r>
-        <w:rPr>
-          <w:b/>
-          <w:bCs/>
-        </w:rPr>
-        <w:t xml:space="preserve">Katabuchi, M.†*</w:t>
-      </w:r>
-      <w:r>
-        <w:t xml:space="preserve">, Onoda, Y., Zhou, C., Zhang, J.-L.* &amp; Chen, Y.-J. Sources and consequences of mismatch between leaf disc and whole-leaf leaf mass per area (LMA).</w:t>
+        <w:t xml:space="preserve">Li, Y., Shipley, B.*, Price, J. N., Dantas, V. de L., Tamme, R., Westoby, M., Siefert, A., Schamp, B. S., Spasojevic, M. J., Jung, V., Laughlin, D. C., Richardson, S. J., Bagousse-Pinguet, Y. L., Schöb, C., Gazol, A., Prentice, H. C., Gross, N., Overton, J., Cianciaruso, M. V., Louault, F., Kamiyama, C., Nakashizuka, T., Hikosaka, K., Sasaki, T.,</w:t>
+      </w:r>
+      <w:r>
+        <w:t xml:space="preserve"> </w:t>
+      </w:r>
+      <w:r>
+        <w:rPr>
+          <w:b/>
+          <w:bCs/>
+        </w:rPr>
+        <w:t xml:space="preserve">Katabuchi, M.</w:t>
+      </w:r>
+      <w:r>
+        <w:t xml:space="preserve">, Frenette Dussault, C., Gaucherand, S., Chen, N., Vandewalle, M. &amp; Batalha, M. A. Habitat filtering determines the functional niche occupancy of plant communities worldwide.</w:t>
       </w:r>
       <w:r>
         <w:t xml:space="preserve"> </w:t>
@@ -1042,13 +1493,13 @@
           <w:i/>
           <w:iCs/>
         </w:rPr>
-        <w:t xml:space="preserve">American Journal of Botany</w:t>
-      </w:r>
-      <w:r>
-        <w:t xml:space="preserve"> </w:t>
-      </w:r>
-      <w:r>
-        <w:t xml:space="preserve">109, 1242–1250 (2022)</w:t>
+        <w:t xml:space="preserve">Journal of Ecology</w:t>
+      </w:r>
+      <w:r>
+        <w:t xml:space="preserve"> </w:t>
+      </w:r>
+      <w:r>
+        <w:t xml:space="preserve">3, 808–809 (2017)</w:t>
       </w:r>
       <w:r>
         <w:t xml:space="preserve"> </w:t>
@@ -1073,20 +1524,14 @@
         </w:numPr>
       </w:pPr>
       <w:r>
-        <w:t xml:space="preserve">Chen, Y.-J., Choat, B., Sterck, F.*, Maenpuen, P.,</w:t>
-      </w:r>
-      <w:r>
-        <w:t xml:space="preserve"> </w:t>
-      </w:r>
-      <w:r>
-        <w:rPr>
-          <w:b/>
-          <w:bCs/>
-        </w:rPr>
-        <w:t xml:space="preserve">Katabuchi, M.</w:t>
-      </w:r>
-      <w:r>
-        <w:t xml:space="preserve">, Zhang, S.-B., Tomlinson, K. W., Oliveira, R. S., Zhang, Y.-J., Shen, J.-X., Cao, K.-F.* &amp; Jansen, S.* Hydraulic prediction of drought-induced plant dieback and top-kill depends on leaf habit and growth form.</w:t>
+        <w:rPr>
+          <w:b/>
+          <w:bCs/>
+        </w:rPr>
+        <w:t xml:space="preserve">Katabuchi, M.*</w:t>
+      </w:r>
+      <w:r>
+        <w:t xml:space="preserve">, Wright, S. J., Swenson, N. G., Feeley, K. J., Condit, R., Hubbell, S. P. &amp; Davies, S. J. Contrasting outcomes of species- and community-level analyses of the temporal consistency of functional composition.</w:t>
       </w:r>
       <w:r>
         <w:t xml:space="preserve"> </w:t>
@@ -1098,13 +1543,13 @@
           <w:i/>
           <w:iCs/>
         </w:rPr>
-        <w:t xml:space="preserve">Ecology Letters</w:t>
-      </w:r>
-      <w:r>
-        <w:t xml:space="preserve"> </w:t>
-      </w:r>
-      <w:r>
-        <w:t xml:space="preserve">24, 2350–2363 (2021)</w:t>
+        <w:t xml:space="preserve">Ecology</w:t>
+      </w:r>
+      <w:r>
+        <w:t xml:space="preserve"> </w:t>
+      </w:r>
+      <w:r>
+        <w:t xml:space="preserve">98, 2273–2280 (2017)</w:t>
       </w:r>
       <w:r>
         <w:t xml:space="preserve"> </w:t>
@@ -1129,7 +1574,7 @@
         </w:numPr>
       </w:pPr>
       <w:r>
-        <w:t xml:space="preserve">Chen, Y.-J.*, Maenpuen, P., Zhang, Y.-J.*, Barai, K.,</w:t>
+        <w:t xml:space="preserve">Siefert, A., Violle, C., Chalmandrier, L., Albert, C. H., Taudiere, A., Fajardo, A., Aarssen, L. W., Baraloto, C., Carlucci, M. B., Cianciaruso, M. V., de L. Dantas, V., de Bello, F., Duarte, L. D. S., Fonseca, C. R., Freschet, G. T., Gaucherand, S., Gross, N., Hikosaka, K., Jackson, B., Jung, V., Kamiyama, C.,</w:t>
       </w:r>
       <w:r>
         <w:t xml:space="preserve"> </w:t>
@@ -1142,7 +1587,28 @@
         <w:t xml:space="preserve">Katabuchi, M.</w:t>
       </w:r>
       <w:r>
-        <w:t xml:space="preserve">, Gao, H., Kaewkamol, S., Tao, L.-B. &amp; Zhang, J.-L. Quantifying vulnerability to embolism in tropical trees and lianas using five methods: Can discrepancies be explained by xylem structural traits?</w:t>
+        <w:t xml:space="preserve">, Kembel, S. W., Kichenin, E., Kraft, N. J. B., Lagerström, A., Bagousse-Pinguet, Y. L., Li, Y., Mason, N., Messier, J., Nakashizuka, T., Overton, J. M., Peltzer, D. A., Pérez-Ramos, I. M., Pillar, V. D., Prentice, H. C., Richardson, S., Sasaki, T., Schamp, B. S., Schöb, C., Shipley, B., Sundqvist, M., Sykes, M. T., Vandewalle, M. &amp; Wardle, D. A.</w:t>
+      </w:r>
+    </w:p>
+    <w:p>
+      <w:pPr>
+        <w:numPr>
+          <w:ilvl w:val="0"/>
+          <w:numId w:val="1001"/>
+        </w:numPr>
+      </w:pPr>
+      <w:r>
+        <w:rPr>
+          <w:b/>
+          <w:bCs/>
+        </w:rPr>
+        <w:t xml:space="preserve">Katabuchi, M.*</w:t>
+      </w:r>
+      <w:r>
+        <w:t xml:space="preserve"> </w:t>
+      </w:r>
+      <w:r>
+        <w:t xml:space="preserve">LeafArea: An R package for rapid digital image analysis of leaf area.</w:t>
       </w:r>
       <w:r>
         <w:t xml:space="preserve"> </w:t>
@@ -1154,13 +1620,13 @@
           <w:i/>
           <w:iCs/>
         </w:rPr>
-        <w:t xml:space="preserve">New Phytologist</w:t>
-      </w:r>
-      <w:r>
-        <w:t xml:space="preserve"> </w:t>
-      </w:r>
-      <w:r>
-        <w:t xml:space="preserve">229, 805–819 (2021)</w:t>
+        <w:t xml:space="preserve">Ecological Research</w:t>
+      </w:r>
+      <w:r>
+        <w:t xml:space="preserve"> </w:t>
+      </w:r>
+      <w:r>
+        <w:t xml:space="preserve">30, 1073–1077 (2015)</w:t>
       </w:r>
       <w:r>
         <w:t xml:space="preserve"> </w:t>
@@ -1185,7 +1651,7 @@
         </w:numPr>
       </w:pPr>
       <w:r>
-        <w:t xml:space="preserve">Swenson, N. G.*, Hulshof, C. M.,</w:t>
+        <w:t xml:space="preserve">Ashton, L. A., Nakamura, A., Basset, Y., Burwell, C. J., Cao, M., Eastwood, R., Odell, E., de Oliveira, E. G., Hurley, K.,</w:t>
       </w:r>
       <w:r>
         <w:t xml:space="preserve"> </w:t>
@@ -1198,10 +1664,34 @@
         <w:t xml:space="preserve">Katabuchi, M.</w:t>
       </w:r>
       <w:r>
-        <w:t xml:space="preserve"> </w:t>
-      </w:r>
-      <w:r>
-        <w:t xml:space="preserve">&amp; Enquist, B. J. Long-term shifts in the functional composition and diversity of a tropical dry forest: A 30-yr study.</w:t>
+        <w:t xml:space="preserve">, Maunsell, S., Mcbroom, J., Schmidl, J., Sun, Z., Tang, Y., Whitaker, T., Laidlaw, M. J., Mcdonald, W. J. F. &amp; Kitching, R. L.</w:t>
+      </w:r>
+    </w:p>
+    <w:p>
+      <w:pPr>
+        <w:numPr>
+          <w:ilvl w:val="0"/>
+          <w:numId w:val="1001"/>
+        </w:numPr>
+      </w:pPr>
+      <w:r>
+        <w:t xml:space="preserve">Nakamura, A.*, Burwell, C. J., Ashton, L. A., Laidlaw, M. J.,</w:t>
+      </w:r>
+      <w:r>
+        <w:t xml:space="preserve"> </w:t>
+      </w:r>
+      <w:r>
+        <w:rPr>
+          <w:b/>
+          <w:bCs/>
+        </w:rPr>
+        <w:t xml:space="preserve">Katabuchi, M.</w:t>
+      </w:r>
+      <w:r>
+        <w:t xml:space="preserve"> </w:t>
+      </w:r>
+      <w:r>
+        <w:t xml:space="preserve">&amp; Kitching, R. L. Identifying indicator species of elevation: Comparing the utility of woody plants, ants and moths for long-term monitoring.</w:t>
       </w:r>
       <w:r>
         <w:t xml:space="preserve"> </w:t>
@@ -1213,13 +1703,13 @@
           <w:i/>
           <w:iCs/>
         </w:rPr>
-        <w:t xml:space="preserve">Ecological Monographs</w:t>
-      </w:r>
-      <w:r>
-        <w:t xml:space="preserve"> </w:t>
-      </w:r>
-      <w:r>
-        <w:t xml:space="preserve">e01408 (2020)</w:t>
+        <w:t xml:space="preserve">Austral Ecology</w:t>
+      </w:r>
+      <w:r>
+        <w:t xml:space="preserve"> </w:t>
+      </w:r>
+      <w:r>
+        <w:t xml:space="preserve">41, 179–188 (2016)</w:t>
       </w:r>
       <w:r>
         <w:t xml:space="preserve"> </w:t>
@@ -1244,7 +1734,7 @@
         </w:numPr>
       </w:pPr>
       <w:r>
-        <w:t xml:space="preserve">Sreekar, R.,</w:t>
+        <w:t xml:space="preserve">Nakamura, A.*, Burwell, C. J., Lambkin, C. L.,</w:t>
       </w:r>
       <w:r>
         <w:t xml:space="preserve"> </w:t>
@@ -1257,7 +1747,7 @@
         <w:t xml:space="preserve">Katabuchi, M.</w:t>
       </w:r>
       <w:r>
-        <w:t xml:space="preserve">, Nakamura, A., Corlett, R. T., Slik, J. W. F., Fletcher, C., He, F., Weiblen, G. D., Shen, G., Xu, H., Sun, I.-F., Cao, K., Ma, K., Chang, L.-W., Cao, M., Jiang, M., Gunatilleke, I. A. U. N., Ong, P., Yap, S., Gunatilleke, C. V. S., Novotny, V., Brockelman, W. Y., Xiang, W., Mi, X., Li, X., Wang, X., Qiao, X., Li, Y., Tan, S., Condit, R., Harrison, R. D. &amp; Koh, L. P. Spatial scale changes the relationship between beta diversity, species richness and latitude.</w:t>
+        <w:t xml:space="preserve">, Mcdougall, A., Raven, R. J. &amp; Neldner, V. J. The role of human disturbance in island biogeography of arthropods and plants: An information theoretic approach.</w:t>
       </w:r>
       <w:r>
         <w:t xml:space="preserve"> </w:t>
@@ -1269,13 +1759,13 @@
           <w:i/>
           <w:iCs/>
         </w:rPr>
-        <w:t xml:space="preserve">Open Science</w:t>
-      </w:r>
-      <w:r>
-        <w:t xml:space="preserve"> </w:t>
-      </w:r>
-      <w:r>
-        <w:t xml:space="preserve">5, 181168 (2018)</w:t>
+        <w:t xml:space="preserve">Journal of Biogeography</w:t>
+      </w:r>
+      <w:r>
+        <w:t xml:space="preserve"> </w:t>
+      </w:r>
+      <w:r>
+        <w:t xml:space="preserve">42, 1406–1417 (2015)</w:t>
       </w:r>
       <w:r>
         <w:t xml:space="preserve"> </w:t>
@@ -1300,7 +1790,7 @@
         </w:numPr>
       </w:pPr>
       <w:r>
-        <w:t xml:space="preserve">Johnson, D. J.*, Needham, J., Xu, C., Massoud, E. C., Davies, S. J., Anderson-Teixeira, K. J., Bunyavejchewin, S., Chambers, J. Q., Chang-Yang, C.-H., Chiang, J.-M., Chuyong, G. B., Condit, R., Cordell, S., Fletcher, C., Giardina, C. P., Giambelluca, T. W., Gunatilleke, N., Gunatilleke, S., Hsieh, C.-F., Hubbell, S., Inman-Narahari, F., Kassim, A. R.,</w:t>
+        <w:t xml:space="preserve">Deng, X., Mohandass, D.*,</w:t>
       </w:r>
       <w:r>
         <w:t xml:space="preserve"> </w:t>
@@ -1313,25 +1803,51 @@
         <w:t xml:space="preserve">Katabuchi, M.</w:t>
       </w:r>
       <w:r>
-        <w:t xml:space="preserve">, Kenfack, D., Litton, C. M., Lum, S., Mohamad, M., Nasardin, M., Ong, P. S., Ostertag, R., Sack, L., Swenson, N. G., Sun, I. F., Tan, S., Thomas, D. W., Thompson, J., Umaña, M. N., Uriarte, M., Valencia, R., Yap, S., Zimmerman, J., McDowell, N. G. &amp; McMahon, S. M. Climate sensitive size-dependent survival in tropical trees.</w:t>
-      </w:r>
-      <w:r>
-        <w:t xml:space="preserve"> </w:t>
-      </w:r>
-      <w:r>
-        <w:rPr>
-          <w:b/>
-          <w:bCs/>
+        <w:t xml:space="preserve">, Hughes, A. C. &amp; Roubik, D. W. Impact of Striped-Squirrel Nectar-Robbing Behaviour on Gender Fitness in</w:t>
+      </w:r>
+      <w:r>
+        <w:t xml:space="preserve"> </w:t>
+      </w:r>
+      <w:r>
+        <w:rPr>
           <w:i/>
           <w:iCs/>
         </w:rPr>
-        <w:t xml:space="preserve">Nature Ecology &amp; Evolution</w:t>
-      </w:r>
-      <w:r>
-        <w:t xml:space="preserve"> </w:t>
-      </w:r>
-      <w:r>
-        <w:t xml:space="preserve">1 (2018)</w:t>
+        <w:t xml:space="preserve">Alpinia</w:t>
+      </w:r>
+      <w:r>
+        <w:t xml:space="preserve"> </w:t>
+      </w:r>
+      <w:r>
+        <w:rPr>
+          <w:i/>
+          <w:iCs/>
+        </w:rPr>
+        <w:t xml:space="preserve">Roxburghii</w:t>
+      </w:r>
+      <w:r>
+        <w:t xml:space="preserve"> </w:t>
+      </w:r>
+      <w:r>
+        <w:t xml:space="preserve">Sweet (Zingiberaceae).</w:t>
+      </w:r>
+      <w:r>
+        <w:t xml:space="preserve"> </w:t>
+      </w:r>
+      <w:r>
+        <w:rPr>
+          <w:b/>
+          <w:bCs/>
+          <w:i/>
+          <w:iCs/>
+        </w:rPr>
+        <w:t xml:space="preserve">PLoS ONE</w:t>
+      </w:r>
+      <w:r>
+        <w:t xml:space="preserve"> </w:t>
+      </w:r>
+      <w:r>
+        <w:t xml:space="preserve">10, (2015)</w:t>
       </w:r>
       <w:r>
         <w:t xml:space="preserve"> </w:t>
@@ -1356,7 +1872,7 @@
         </w:numPr>
       </w:pPr>
       <w:r>
-        <w:t xml:space="preserve">Osnas, J. L. D.,</w:t>
+        <w:t xml:space="preserve">Hikosaka, K.*, Sasaki, T., Kamiyama, C.,</w:t>
       </w:r>
       <w:r>
         <w:t xml:space="preserve"> </w:t>
@@ -1369,7 +1885,7 @@
         <w:t xml:space="preserve">Katabuchi, M.</w:t>
       </w:r>
       <w:r>
-        <w:t xml:space="preserve">, Kitajima, K., Wright, S. J., Reich, P. B., Van Bael, S. A., Kraft, N. J. B., Samaniego, M. J., Pacala, S. W. &amp; Lichstein, J. W.* Divergent drivers of leaf trait variation within species, among species, and among functional groups.</w:t>
+        <w:t xml:space="preserve">, Oikawa, S., Shimazaki, M., Kimura, K. &amp; Nakshizuka, T. Understanding of species niche, coexistence and extinction based on functional traits : Approaches from community and physiological ecology for subalpine moorland plant communities [in Japanese].</w:t>
       </w:r>
       <w:r>
         <w:t xml:space="preserve"> </w:t>
@@ -1381,13 +1897,55 @@
           <w:i/>
           <w:iCs/>
         </w:rPr>
-        <w:t xml:space="preserve">Proceedings of the National Academy of Sciences of the United States of America</w:t>
-      </w:r>
-      <w:r>
-        <w:t xml:space="preserve"> </w:t>
-      </w:r>
-      <w:r>
-        <w:t xml:space="preserve">115, 5480–5485 (2018)</w:t>
+        <w:t xml:space="preserve">Chikyu-Kankyo</w:t>
+      </w:r>
+      <w:r>
+        <w:t xml:space="preserve"> </w:t>
+      </w:r>
+      <w:r>
+        <w:t xml:space="preserve">19, 33–46 (2014).</w:t>
+      </w:r>
+    </w:p>
+    <w:p>
+      <w:pPr>
+        <w:numPr>
+          <w:ilvl w:val="0"/>
+          <w:numId w:val="1001"/>
+        </w:numPr>
+      </w:pPr>
+      <w:r>
+        <w:t xml:space="preserve">Kamiyama, C.*,</w:t>
+      </w:r>
+      <w:r>
+        <w:t xml:space="preserve"> </w:t>
+      </w:r>
+      <w:r>
+        <w:rPr>
+          <w:b/>
+          <w:bCs/>
+        </w:rPr>
+        <w:t xml:space="preserve">Katabuchi, M.</w:t>
+      </w:r>
+      <w:r>
+        <w:t xml:space="preserve">, Sasaki, T., Shimazaki, M., Nakashizuka, T. &amp; Hikosaka, K. Leaf-trait responses to environmental gradients in moorland communities: Contribution of intraspecific variation, species replacement and functional group replacement.</w:t>
+      </w:r>
+      <w:r>
+        <w:t xml:space="preserve"> </w:t>
+      </w:r>
+      <w:r>
+        <w:rPr>
+          <w:b/>
+          <w:bCs/>
+          <w:i/>
+          <w:iCs/>
+        </w:rPr>
+        <w:t xml:space="preserve">Ecological Research</w:t>
+      </w:r>
+      <w:r>
+        <w:t xml:space="preserve"> </w:t>
+      </w:r>
+      <w:r>
+        <w:t xml:space="preserve">29, 607–617 (2014)</w:t>
       </w:r>
       <w:r>
         <w:t xml:space="preserve"> </w:t>
@@ -1412,7 +1970,7 @@
         </w:numPr>
       </w:pPr>
       <w:r>
-        <w:t xml:space="preserve">Li, Y., Shipley, B.*, Price, J. N., Dantas, V. de L., Tamme, R., Westoby, M., Siefert, A., Schamp, B. S., Spasojevic, M. J., Jung, V., Laughlin, D. C., Richardson, S. J., Bagousse-Pinguet, Y. L., Schöb, C., Gazol, A., Prentice, H. C., Gross, N., Overton, J., Cianciaruso, M. V., Louault, F., Kamiyama, C., Nakashizuka, T., Hikosaka, K., Sasaki, T.,</w:t>
+        <w:t xml:space="preserve">Sasaki, T.*,</w:t>
       </w:r>
       <w:r>
         <w:t xml:space="preserve"> </w:t>
@@ -1425,7 +1983,7 @@
         <w:t xml:space="preserve">Katabuchi, M.</w:t>
       </w:r>
       <w:r>
-        <w:t xml:space="preserve">, Frenette Dussault, C., Gaucherand, S., Chen, N., Vandewalle, M. &amp; Batalha, M. A. Habitat filtering determines the functional niche occupancy of plant communities worldwide.</w:t>
+        <w:t xml:space="preserve">, Kamiyama, C., Shimazaki, M., Nakashizuka, T. &amp; Hikosaka, K. Vulnerability of moorland plant communities to environmental change: Consequences of realistic species loss on functional diversity.</w:t>
       </w:r>
       <w:r>
         <w:t xml:space="preserve"> </w:t>
@@ -1437,13 +1995,13 @@
           <w:i/>
           <w:iCs/>
         </w:rPr>
-        <w:t xml:space="preserve">Journal of Ecology</w:t>
-      </w:r>
-      <w:r>
-        <w:t xml:space="preserve"> </w:t>
-      </w:r>
-      <w:r>
-        <w:t xml:space="preserve">3, 808–809 (2017)</w:t>
+        <w:t xml:space="preserve">Journal of Applied Ecology</w:t>
+      </w:r>
+      <w:r>
+        <w:t xml:space="preserve"> </w:t>
+      </w:r>
+      <w:r>
+        <w:t xml:space="preserve">51, 299–308 (2014)</w:t>
       </w:r>
       <w:r>
         <w:t xml:space="preserve"> </w:t>
@@ -1468,14 +2026,20 @@
         </w:numPr>
       </w:pPr>
       <w:r>
-        <w:rPr>
-          <w:b/>
-          <w:bCs/>
-        </w:rPr>
-        <w:t xml:space="preserve">Katabuchi, M.*</w:t>
-      </w:r>
-      <w:r>
-        <w:t xml:space="preserve">, Wright, S. J., Swenson, N. G., Feeley, K. J., Condit, R., Hubbell, S. P. &amp; Davies, S. J. Contrasting outcomes of species- and community-level analyses of the temporal consistency of functional composition.</w:t>
+        <w:t xml:space="preserve">Cádiz, A., Nagata, N.,</w:t>
+      </w:r>
+      <w:r>
+        <w:t xml:space="preserve"> </w:t>
+      </w:r>
+      <w:r>
+        <w:rPr>
+          <w:b/>
+          <w:bCs/>
+        </w:rPr>
+        <w:t xml:space="preserve">Katabuchi, M.</w:t>
+      </w:r>
+      <w:r>
+        <w:t xml:space="preserve">, DíAZ, L. M., ECHENIQUE-DíAZ, L. M., Akashi, H. D., Makino, T. &amp; Kawata, M.* Relative importance of habitat use, range expansion, and speciation in local species diversity of anolis lizards in cuba.</w:t>
       </w:r>
       <w:r>
         <w:t xml:space="preserve"> </w:t>
@@ -1487,13 +2051,13 @@
           <w:i/>
           <w:iCs/>
         </w:rPr>
-        <w:t xml:space="preserve">Ecology</w:t>
-      </w:r>
-      <w:r>
-        <w:t xml:space="preserve"> </w:t>
-      </w:r>
-      <w:r>
-        <w:t xml:space="preserve">98, 2273–2280 (2017)</w:t>
+        <w:t xml:space="preserve">Ecosphere</w:t>
+      </w:r>
+      <w:r>
+        <w:t xml:space="preserve"> </w:t>
+      </w:r>
+      <w:r>
+        <w:t xml:space="preserve">4, (2013)</w:t>
       </w:r>
       <w:r>
         <w:t xml:space="preserve"> </w:t>
@@ -1518,7 +2082,7 @@
         </w:numPr>
       </w:pPr>
       <w:r>
-        <w:t xml:space="preserve">Siefert, A.*, Violle, C., Chalmandrier, L., Albert, C. H., Taudiere, A., Fajardo, A., Aarssen, L. W., Baraloto, C., Carlucci, M. B., Cianciaruso, M. V., de L. Dantas, V., de Bello, F., Duarte, L. D. S., Fonseca, C. R., Freschet, G. T., Gaucherand, S., Gross, N., Hikosaka, K., Jackson, B., Jung, V., Kamiyama, C.,</w:t>
+        <w:t xml:space="preserve">Asanok, L.*, Marod, D., Duengkae, P., Pranmongkol, U., Kurokawa, H., Aiba, M.,</w:t>
       </w:r>
       <w:r>
         <w:t xml:space="preserve"> </w:t>
@@ -1531,7 +2095,10 @@
         <w:t xml:space="preserve">Katabuchi, M.</w:t>
       </w:r>
       <w:r>
-        <w:t xml:space="preserve">, Kembel, S. W., Kichenin, E., Kraft, N. J. B., Lagerström, A., Bagousse-Pinguet, Y. L., Li, Y., Mason, N., Messier, J., Nakashizuka, T., Overton, J. M., Peltzer, D. A., Pérez-Ramos, I. M., Pillar, V. D., Prentice, H. C., Richardson, S., Sasaki, T., Schamp, B. S., Schöb, C., Shipley, B., Sundqvist, M., Sykes, M. T., Vandewalle, M. &amp; Wardle, D. A. A global meta-analysis of the relative extent of intraspecific trait variation in plant communities.</w:t>
+        <w:t xml:space="preserve"> </w:t>
+      </w:r>
+      <w:r>
+        <w:t xml:space="preserve">&amp; Nakashizuka, T. Relationships between functional traits and the ability of forest tree species to reestablish in secondary forest and enrichment plantations in the uplands of northern Thailand.</w:t>
       </w:r>
       <w:r>
         <w:t xml:space="preserve"> </w:t>
@@ -1543,13 +2110,13 @@
           <w:i/>
           <w:iCs/>
         </w:rPr>
-        <w:t xml:space="preserve">Ecology Letters</w:t>
-      </w:r>
-      <w:r>
-        <w:t xml:space="preserve"> </w:t>
-      </w:r>
-      <w:r>
-        <w:t xml:space="preserve">18, 1406–1419 (2015)</w:t>
+        <w:t xml:space="preserve">Forest Ecology and Management</w:t>
+      </w:r>
+      <w:r>
+        <w:t xml:space="preserve"> </w:t>
+      </w:r>
+      <w:r>
+        <w:t xml:space="preserve">296, 9–23 (2013)</w:t>
       </w:r>
       <w:r>
         <w:t xml:space="preserve"> </w:t>
@@ -1574,17 +2141,20 @@
         </w:numPr>
       </w:pPr>
       <w:r>
-        <w:rPr>
-          <w:b/>
-          <w:bCs/>
-        </w:rPr>
-        <w:t xml:space="preserve">Katabuchi, M.*</w:t>
-      </w:r>
-      <w:r>
-        <w:t xml:space="preserve"> </w:t>
-      </w:r>
-      <w:r>
-        <w:t xml:space="preserve">LeafArea: An R package for rapid digital image analysis of leaf area.</w:t>
+        <w:t xml:space="preserve">Sasaki, T.*,</w:t>
+      </w:r>
+      <w:r>
+        <w:t xml:space="preserve"> </w:t>
+      </w:r>
+      <w:r>
+        <w:rPr>
+          <w:b/>
+          <w:bCs/>
+        </w:rPr>
+        <w:t xml:space="preserve">Katabuchi, M.</w:t>
+      </w:r>
+      <w:r>
+        <w:t xml:space="preserve">, Kamiyama, C., Shimazaki, M., Nakashizuka, T. &amp; Hikosaka, K. Variations in species composition of moorland plant communities along environmental gradients within a subalpine zone in northern japan.</w:t>
       </w:r>
       <w:r>
         <w:t xml:space="preserve"> </w:t>
@@ -1596,13 +2166,13 @@
           <w:i/>
           <w:iCs/>
         </w:rPr>
-        <w:t xml:space="preserve">Ecological Research</w:t>
-      </w:r>
-      <w:r>
-        <w:t xml:space="preserve"> </w:t>
-      </w:r>
-      <w:r>
-        <w:t xml:space="preserve">30, 1073–1077 (2015)</w:t>
+        <w:t xml:space="preserve">Wetlands</w:t>
+      </w:r>
+      <w:r>
+        <w:t xml:space="preserve"> </w:t>
+      </w:r>
+      <w:r>
+        <w:t xml:space="preserve">33, 269–277 (2013)</w:t>
       </w:r>
       <w:r>
         <w:t xml:space="preserve"> </w:t>
@@ -1627,7 +2197,7 @@
         </w:numPr>
       </w:pPr>
       <w:r>
-        <w:t xml:space="preserve">Ashton, L. A., Nakamura, A.*, Basset, Y., Burwell, C. J., Cao, M., Eastwood, R., Odell, E., de Oliveira, E. G., Hurley, K.,</w:t>
+        <w:t xml:space="preserve">Aiba, M.*,</w:t>
       </w:r>
       <w:r>
         <w:t xml:space="preserve"> </w:t>
@@ -1640,7 +2210,7 @@
         <w:t xml:space="preserve">Katabuchi, M.</w:t>
       </w:r>
       <w:r>
-        <w:t xml:space="preserve">, Maunsell, S., Mcbroom, J., Schmidl, J., Sun, Z., Tang, Y., Whitaker, T., Laidlaw, M. J., Mcdonald, W. J. F. &amp; Kitching, R. L. Vertical stratification of moths across elevation and latitude.</w:t>
+        <w:t xml:space="preserve">, Takafumi, H., Matsuzaki, S. I. S., Sasaki, T. &amp; Hiura, T. Robustness of trait distribution metrics for community assembly studies under the uncertainties of assembly processes.</w:t>
       </w:r>
       <w:r>
         <w:t xml:space="preserve"> </w:t>
@@ -1652,13 +2222,13 @@
           <w:i/>
           <w:iCs/>
         </w:rPr>
-        <w:t xml:space="preserve">Journal of Biogeography</w:t>
-      </w:r>
-      <w:r>
-        <w:t xml:space="preserve"> </w:t>
-      </w:r>
-      <w:r>
-        <w:t xml:space="preserve">43, 59–69 (2016)</w:t>
+        <w:t xml:space="preserve">Ecology</w:t>
+      </w:r>
+      <w:r>
+        <w:t xml:space="preserve"> </w:t>
+      </w:r>
+      <w:r>
+        <w:t xml:space="preserve">94, 2873–2885 (2013)</w:t>
       </w:r>
       <w:r>
         <w:t xml:space="preserve"> </w:t>
@@ -1683,7 +2253,7 @@
         </w:numPr>
       </w:pPr>
       <w:r>
-        <w:t xml:space="preserve">Nakamura, A.*, Burwell, C. J., Ashton, L. A., Laidlaw, M. J.,</w:t>
+        <w:t xml:space="preserve">Sasaki, T.*,</w:t>
       </w:r>
       <w:r>
         <w:t xml:space="preserve"> </w:t>
@@ -1696,10 +2266,7 @@
         <w:t xml:space="preserve">Katabuchi, M.</w:t>
       </w:r>
       <w:r>
-        <w:t xml:space="preserve"> </w:t>
-      </w:r>
-      <w:r>
-        <w:t xml:space="preserve">&amp; Kitching, R. L. Identifying indicator species of elevation: Comparing the utility of woody plants, ants and moths for long-term monitoring.</w:t>
+        <w:t xml:space="preserve">, Kamiyama, C., Shimazaki, M., Nakashizuka, T. &amp; Hikosaka, K. Nestedness and niche-based species loss in moorland plant communities.</w:t>
       </w:r>
       <w:r>
         <w:t xml:space="preserve"> </w:t>
@@ -1711,13 +2278,13 @@
           <w:i/>
           <w:iCs/>
         </w:rPr>
-        <w:t xml:space="preserve">Austral Ecology</w:t>
-      </w:r>
-      <w:r>
-        <w:t xml:space="preserve"> </w:t>
-      </w:r>
-      <w:r>
-        <w:t xml:space="preserve">41, 179–188 (2016)</w:t>
+        <w:t xml:space="preserve">Oikos</w:t>
+      </w:r>
+      <w:r>
+        <w:t xml:space="preserve"> </w:t>
+      </w:r>
+      <w:r>
+        <w:t xml:space="preserve">121, 1783–1790 (2012)</w:t>
       </w:r>
       <w:r>
         <w:t xml:space="preserve"> </w:t>
@@ -1742,7 +2309,7 @@
         </w:numPr>
       </w:pPr>
       <w:r>
-        <w:t xml:space="preserve">Nakamura, A.*, Burwell, C. J., Lambkin, C. L.,</w:t>
+        <w:t xml:space="preserve">Sasaki, T.*,</w:t>
       </w:r>
       <w:r>
         <w:t xml:space="preserve"> </w:t>
@@ -1755,7 +2322,7 @@
         <w:t xml:space="preserve">Katabuchi, M.</w:t>
       </w:r>
       <w:r>
-        <w:t xml:space="preserve">, Mcdougall, A., Raven, R. J. &amp; Neldner, V. J. The role of human disturbance in island biogeography of arthropods and plants: An information theoretic approach.</w:t>
+        <w:t xml:space="preserve">, Kamiyama, C., Shimazaki, M., Nakashizuka, T. &amp; Hikosaka, K. Diversity partitioning of moorland plant communities across hierarchical spatial scales.</w:t>
       </w:r>
       <w:r>
         <w:t xml:space="preserve"> </w:t>
@@ -1767,13 +2334,13 @@
           <w:i/>
           <w:iCs/>
         </w:rPr>
-        <w:t xml:space="preserve">Journal of Biogeography</w:t>
-      </w:r>
-      <w:r>
-        <w:t xml:space="preserve"> </w:t>
-      </w:r>
-      <w:r>
-        <w:t xml:space="preserve">42, 1406–1417 (2015)</w:t>
+        <w:t xml:space="preserve">Biodiversity and Conservation</w:t>
+      </w:r>
+      <w:r>
+        <w:t xml:space="preserve"> </w:t>
+      </w:r>
+      <w:r>
+        <w:t xml:space="preserve">21, 1577–1588 (2012)</w:t>
       </w:r>
       <w:r>
         <w:t xml:space="preserve"> </w:t>
@@ -1798,64 +2365,32 @@
         </w:numPr>
       </w:pPr>
       <w:r>
-        <w:t xml:space="preserve">Deng, X., Mohandass, D.*,</w:t>
-      </w:r>
-      <w:r>
-        <w:t xml:space="preserve"> </w:t>
-      </w:r>
-      <w:r>
-        <w:rPr>
-          <w:b/>
-          <w:bCs/>
-        </w:rPr>
-        <w:t xml:space="preserve">Katabuchi, M.</w:t>
-      </w:r>
-      <w:r>
-        <w:t xml:space="preserve">, Hughes, A. C. &amp; Roubik, D. W. Impact of Striped-Squirrel Nectar-Robbing Behaviour on Gender Fitness in</w:t>
-      </w:r>
-      <w:r>
-        <w:t xml:space="preserve"> </w:t>
-      </w:r>
-      <w:r>
-        <w:rPr>
+        <w:rPr>
+          <w:b/>
+          <w:bCs/>
+        </w:rPr>
+        <w:t xml:space="preserve">Katabuchi, M.*</w:t>
+      </w:r>
+      <w:r>
+        <w:t xml:space="preserve">, Kurokawa, H., Davies, S. J., Tan, S. &amp; Nakashizuka, T. Soil resource availability shapes community trait structure in a species-rich dipterocarp forest.</w:t>
+      </w:r>
+      <w:r>
+        <w:t xml:space="preserve"> </w:t>
+      </w:r>
+      <w:r>
+        <w:rPr>
+          <w:b/>
+          <w:bCs/>
           <w:i/>
           <w:iCs/>
         </w:rPr>
-        <w:t xml:space="preserve">Alpinia</w:t>
-      </w:r>
-      <w:r>
-        <w:t xml:space="preserve"> </w:t>
-      </w:r>
-      <w:r>
-        <w:rPr>
-          <w:i/>
-          <w:iCs/>
-        </w:rPr>
-        <w:t xml:space="preserve">Roxburghii</w:t>
-      </w:r>
-      <w:r>
-        <w:t xml:space="preserve"> </w:t>
-      </w:r>
-      <w:r>
-        <w:t xml:space="preserve">Sweet (Zingiberaceae).</w:t>
-      </w:r>
-      <w:r>
-        <w:t xml:space="preserve"> </w:t>
-      </w:r>
-      <w:r>
-        <w:rPr>
-          <w:b/>
-          <w:bCs/>
-          <w:i/>
-          <w:iCs/>
-        </w:rPr>
-        <w:t xml:space="preserve">PLoS ONE</w:t>
-      </w:r>
-      <w:r>
-        <w:t xml:space="preserve"> </w:t>
-      </w:r>
-      <w:r>
-        <w:t xml:space="preserve">10, (2015)</w:t>
+        <w:t xml:space="preserve">Journal of Ecology</w:t>
+      </w:r>
+      <w:r>
+        <w:t xml:space="preserve"> </w:t>
+      </w:r>
+      <w:r>
+        <w:t xml:space="preserve">100, 643–651 (2012)</w:t>
       </w:r>
       <w:r>
         <w:t xml:space="preserve"> </w:t>
@@ -1880,80 +2415,78 @@
         </w:numPr>
       </w:pPr>
       <w:r>
-        <w:t xml:space="preserve">Hikosaka, K.*, Sasaki, T., Kamiyama, C.,</w:t>
-      </w:r>
-      <w:r>
-        <w:t xml:space="preserve"> </w:t>
-      </w:r>
-      <w:r>
-        <w:rPr>
-          <w:b/>
-          <w:bCs/>
-        </w:rPr>
-        <w:t xml:space="preserve">Katabuchi, M.</w:t>
-      </w:r>
-      <w:r>
-        <w:t xml:space="preserve">, Oikawa, S., Shimazaki, M., Kimura, K. &amp; Nakshizuka, T. Understanding of species niche, coexistence and extinction based on functional traits : Approaches from community and physiological ecology for subalpine moorland plant communities [in Japanese].</w:t>
-      </w:r>
-      <w:r>
-        <w:t xml:space="preserve"> </w:t>
-      </w:r>
-      <w:r>
-        <w:rPr>
-          <w:b/>
-          <w:bCs/>
+        <w:rPr>
+          <w:b/>
+          <w:bCs/>
+        </w:rPr>
+        <w:t xml:space="preserve">Katabuchi, M.*</w:t>
+      </w:r>
+      <w:r>
+        <w:t xml:space="preserve">, Isagi, Y. &amp; Nakashizuka, T. Development of 17 microsatellite markers for</w:t>
+      </w:r>
+      <w:r>
+        <w:t xml:space="preserve"> </w:t>
+      </w:r>
+      <w:r>
+        <w:rPr>
           <w:i/>
           <w:iCs/>
         </w:rPr>
-        <w:t xml:space="preserve">Chikyu-Kankyo</w:t>
-      </w:r>
-      <w:r>
-        <w:t xml:space="preserve"> </w:t>
-      </w:r>
-      <w:r>
-        <w:t xml:space="preserve">19, 33–46 (2014).</w:t>
-      </w:r>
-    </w:p>
-    <w:p>
-      <w:pPr>
-        <w:numPr>
-          <w:ilvl w:val="0"/>
-          <w:numId w:val="1001"/>
-        </w:numPr>
-      </w:pPr>
-      <w:r>
-        <w:t xml:space="preserve">Kamiyama, C.*,</w:t>
-      </w:r>
-      <w:r>
-        <w:t xml:space="preserve"> </w:t>
-      </w:r>
-      <w:r>
-        <w:rPr>
-          <w:b/>
-          <w:bCs/>
-        </w:rPr>
-        <w:t xml:space="preserve">Katabuchi, M.</w:t>
-      </w:r>
-      <w:r>
-        <w:t xml:space="preserve">, Sasaki, T., Shimazaki, M., Nakashizuka, T. &amp; Hikosaka, K. Leaf-trait responses to environmental gradients in moorland communities: Contribution of intraspecific variation, species replacement and functional group replacement.</w:t>
-      </w:r>
-      <w:r>
-        <w:t xml:space="preserve"> </w:t>
-      </w:r>
-      <w:r>
-        <w:rPr>
-          <w:b/>
-          <w:bCs/>
+        <w:t xml:space="preserve">Ceratosolen</w:t>
+      </w:r>
+      <w:r>
+        <w:t xml:space="preserve"> </w:t>
+      </w:r>
+      <w:r>
+        <w:rPr>
           <w:i/>
           <w:iCs/>
         </w:rPr>
-        <w:t xml:space="preserve">Ecological Research</w:t>
-      </w:r>
-      <w:r>
-        <w:t xml:space="preserve"> </w:t>
-      </w:r>
-      <w:r>
-        <w:t xml:space="preserve">29, 607–617 (2014)</w:t>
+        <w:t xml:space="preserve">Constrictus</w:t>
+      </w:r>
+      <w:r>
+        <w:t xml:space="preserve">, the pollinating fig wasp of</w:t>
+      </w:r>
+      <w:r>
+        <w:t xml:space="preserve"> </w:t>
+      </w:r>
+      <w:r>
+        <w:rPr>
+          <w:i/>
+          <w:iCs/>
+        </w:rPr>
+        <w:t xml:space="preserve">Ficus</w:t>
+      </w:r>
+      <w:r>
+        <w:t xml:space="preserve"> </w:t>
+      </w:r>
+      <w:r>
+        <w:rPr>
+          <w:i/>
+          <w:iCs/>
+        </w:rPr>
+        <w:t xml:space="preserve">Fistulosa</w:t>
+      </w:r>
+      <w:r>
+        <w:t xml:space="preserve">.</w:t>
+      </w:r>
+      <w:r>
+        <w:t xml:space="preserve"> </w:t>
+      </w:r>
+      <w:r>
+        <w:rPr>
+          <w:b/>
+          <w:bCs/>
+          <w:i/>
+          <w:iCs/>
+        </w:rPr>
+        <w:t xml:space="preserve">Molecular Ecology Resources</w:t>
+      </w:r>
+      <w:r>
+        <w:t xml:space="preserve"> </w:t>
+      </w:r>
+      <w:r>
+        <w:t xml:space="preserve">8, 840–842 (2008)</w:t>
       </w:r>
       <w:r>
         <w:t xml:space="preserve"> </w:t>
@@ -1978,38 +2511,55 @@
         </w:numPr>
       </w:pPr>
       <w:r>
-        <w:t xml:space="preserve">Sasaki, T.*,</w:t>
-      </w:r>
-      <w:r>
-        <w:t xml:space="preserve"> </w:t>
-      </w:r>
-      <w:r>
-        <w:rPr>
-          <w:b/>
-          <w:bCs/>
-        </w:rPr>
-        <w:t xml:space="preserve">Katabuchi, M.</w:t>
-      </w:r>
-      <w:r>
-        <w:t xml:space="preserve">, Kamiyama, C., Shimazaki, M., Nakashizuka, T. &amp; Hikosaka, K. Vulnerability of moorland plant communities to environmental change: Consequences of realistic species loss on functional diversity.</w:t>
-      </w:r>
-      <w:r>
-        <w:t xml:space="preserve"> </w:t>
-      </w:r>
-      <w:r>
-        <w:rPr>
-          <w:b/>
-          <w:bCs/>
+        <w:rPr>
+          <w:b/>
+          <w:bCs/>
+        </w:rPr>
+        <w:t xml:space="preserve">Katabuchi, M.*</w:t>
+      </w:r>
+      <w:r>
+        <w:t xml:space="preserve">, Harrison, R. D. &amp; Nakashizuka, T. Documenting the effect of foundress number in a dioecious fig,</w:t>
+      </w:r>
+      <w:r>
+        <w:t xml:space="preserve"> </w:t>
+      </w:r>
+      <w:r>
+        <w:rPr>
           <w:i/>
           <w:iCs/>
         </w:rPr>
-        <w:t xml:space="preserve">Journal of Applied Ecology</w:t>
-      </w:r>
-      <w:r>
-        <w:t xml:space="preserve"> </w:t>
-      </w:r>
-      <w:r>
-        <w:t xml:space="preserve">51, 299–308 (2014)</w:t>
+        <w:t xml:space="preserve">Ficus</w:t>
+      </w:r>
+      <w:r>
+        <w:t xml:space="preserve"> </w:t>
+      </w:r>
+      <w:r>
+        <w:rPr>
+          <w:i/>
+          <w:iCs/>
+        </w:rPr>
+        <w:t xml:space="preserve">Fistulosa</w:t>
+      </w:r>
+      <w:r>
+        <w:t xml:space="preserve">, in Malaysia.</w:t>
+      </w:r>
+      <w:r>
+        <w:t xml:space="preserve"> </w:t>
+      </w:r>
+      <w:r>
+        <w:rPr>
+          <w:b/>
+          <w:bCs/>
+          <w:i/>
+          <w:iCs/>
+        </w:rPr>
+        <w:t xml:space="preserve">Biotropica</w:t>
+      </w:r>
+      <w:r>
+        <w:t xml:space="preserve"> </w:t>
+      </w:r>
+      <w:r>
+        <w:t xml:space="preserve">40, 457–461 (2008)</w:t>
       </w:r>
       <w:r>
         <w:t xml:space="preserve"> </w:t>
@@ -2026,566 +2576,8 @@
         <w:t xml:space="preserve">.</w:t>
       </w:r>
     </w:p>
-    <w:p>
-      <w:pPr>
-        <w:numPr>
-          <w:ilvl w:val="0"/>
-          <w:numId w:val="1001"/>
-        </w:numPr>
-      </w:pPr>
-      <w:r>
-        <w:t xml:space="preserve">Cádiz, A., Nagata, N.,</w:t>
-      </w:r>
-      <w:r>
-        <w:t xml:space="preserve"> </w:t>
-      </w:r>
-      <w:r>
-        <w:rPr>
-          <w:b/>
-          <w:bCs/>
-        </w:rPr>
-        <w:t xml:space="preserve">Katabuchi, M.</w:t>
-      </w:r>
-      <w:r>
-        <w:t xml:space="preserve">, DíAZ, L. M., ECHENIQUE-DíAZ, L. M., Akashi, H. D., Makino, T. &amp; Kawata, M.* Relative importance of habitat use, range expansion, and speciation in local species diversity of anolis lizards in cuba.</w:t>
-      </w:r>
-      <w:r>
-        <w:t xml:space="preserve"> </w:t>
-      </w:r>
-      <w:r>
-        <w:rPr>
-          <w:b/>
-          <w:bCs/>
-          <w:i/>
-          <w:iCs/>
-        </w:rPr>
-        <w:t xml:space="preserve">Ecosphere</w:t>
-      </w:r>
-      <w:r>
-        <w:t xml:space="preserve"> </w:t>
-      </w:r>
-      <w:r>
-        <w:t xml:space="preserve">4, (2013)</w:t>
-      </w:r>
-      <w:r>
-        <w:t xml:space="preserve"> </w:t>
-      </w:r>
-      <w:hyperlink r:id="rId49">
-        <w:r>
-          <w:rPr>
-            <w:rStyle w:val="InternetLink"/>
-          </w:rPr>
-          <w:t xml:space="preserve">[doi]</w:t>
-        </w:r>
-      </w:hyperlink>
-      <w:r>
-        <w:t xml:space="preserve">.</w:t>
-      </w:r>
-    </w:p>
-    <w:p>
-      <w:pPr>
-        <w:numPr>
-          <w:ilvl w:val="0"/>
-          <w:numId w:val="1001"/>
-        </w:numPr>
-      </w:pPr>
-      <w:r>
-        <w:t xml:space="preserve">Asanok, L.*, Marod, D., Duengkae, P., Pranmongkol, U., Kurokawa, H., Aiba, M.,</w:t>
-      </w:r>
-      <w:r>
-        <w:t xml:space="preserve"> </w:t>
-      </w:r>
-      <w:r>
-        <w:rPr>
-          <w:b/>
-          <w:bCs/>
-        </w:rPr>
-        <w:t xml:space="preserve">Katabuchi, M.</w:t>
-      </w:r>
-      <w:r>
-        <w:t xml:space="preserve"> </w:t>
-      </w:r>
-      <w:r>
-        <w:t xml:space="preserve">&amp; Nakashizuka, T. Relationships between functional traits and the ability of forest tree species to reestablish in secondary forest and enrichment plantations in the uplands of northern Thailand.</w:t>
-      </w:r>
-      <w:r>
-        <w:t xml:space="preserve"> </w:t>
-      </w:r>
-      <w:r>
-        <w:rPr>
-          <w:b/>
-          <w:bCs/>
-          <w:i/>
-          <w:iCs/>
-        </w:rPr>
-        <w:t xml:space="preserve">Forest Ecology and Management</w:t>
-      </w:r>
-      <w:r>
-        <w:t xml:space="preserve"> </w:t>
-      </w:r>
-      <w:r>
-        <w:t xml:space="preserve">296, 9–23 (2013)</w:t>
-      </w:r>
-      <w:r>
-        <w:t xml:space="preserve"> </w:t>
-      </w:r>
-      <w:hyperlink r:id="rId50">
-        <w:r>
-          <w:rPr>
-            <w:rStyle w:val="InternetLink"/>
-          </w:rPr>
-          <w:t xml:space="preserve">[doi]</w:t>
-        </w:r>
-      </w:hyperlink>
-      <w:r>
-        <w:t xml:space="preserve">.</w:t>
-      </w:r>
-    </w:p>
-    <w:p>
-      <w:pPr>
-        <w:numPr>
-          <w:ilvl w:val="0"/>
-          <w:numId w:val="1001"/>
-        </w:numPr>
-      </w:pPr>
-      <w:r>
-        <w:t xml:space="preserve">Sasaki, T.*,</w:t>
-      </w:r>
-      <w:r>
-        <w:t xml:space="preserve"> </w:t>
-      </w:r>
-      <w:r>
-        <w:rPr>
-          <w:b/>
-          <w:bCs/>
-        </w:rPr>
-        <w:t xml:space="preserve">Katabuchi, M.</w:t>
-      </w:r>
-      <w:r>
-        <w:t xml:space="preserve">, Kamiyama, C., Shimazaki, M., Nakashizuka, T. &amp; Hikosaka, K. Variations in species composition of moorland plant communities along environmental gradients within a subalpine zone in northern japan.</w:t>
-      </w:r>
-      <w:r>
-        <w:t xml:space="preserve"> </w:t>
-      </w:r>
-      <w:r>
-        <w:rPr>
-          <w:b/>
-          <w:bCs/>
-          <w:i/>
-          <w:iCs/>
-        </w:rPr>
-        <w:t xml:space="preserve">Wetlands</w:t>
-      </w:r>
-      <w:r>
-        <w:t xml:space="preserve"> </w:t>
-      </w:r>
-      <w:r>
-        <w:t xml:space="preserve">33, 269–277 (2013)</w:t>
-      </w:r>
-      <w:r>
-        <w:t xml:space="preserve"> </w:t>
-      </w:r>
-      <w:hyperlink r:id="rId51">
-        <w:r>
-          <w:rPr>
-            <w:rStyle w:val="InternetLink"/>
-          </w:rPr>
-          <w:t xml:space="preserve">[doi]</w:t>
-        </w:r>
-      </w:hyperlink>
-      <w:r>
-        <w:t xml:space="preserve">.</w:t>
-      </w:r>
-    </w:p>
-    <w:p>
-      <w:pPr>
-        <w:numPr>
-          <w:ilvl w:val="0"/>
-          <w:numId w:val="1001"/>
-        </w:numPr>
-      </w:pPr>
-      <w:r>
-        <w:t xml:space="preserve">Aiba, M.*,</w:t>
-      </w:r>
-      <w:r>
-        <w:t xml:space="preserve"> </w:t>
-      </w:r>
-      <w:r>
-        <w:rPr>
-          <w:b/>
-          <w:bCs/>
-        </w:rPr>
-        <w:t xml:space="preserve">Katabuchi, M.</w:t>
-      </w:r>
-      <w:r>
-        <w:t xml:space="preserve">, Takafumi, H., Matsuzaki, S. I. S., Sasaki, T. &amp; Hiura, T. Robustness of trait distribution metrics for community assembly studies under the uncertainties of assembly processes.</w:t>
-      </w:r>
-      <w:r>
-        <w:t xml:space="preserve"> </w:t>
-      </w:r>
-      <w:r>
-        <w:rPr>
-          <w:b/>
-          <w:bCs/>
-          <w:i/>
-          <w:iCs/>
-        </w:rPr>
-        <w:t xml:space="preserve">Ecology</w:t>
-      </w:r>
-      <w:r>
-        <w:t xml:space="preserve"> </w:t>
-      </w:r>
-      <w:r>
-        <w:t xml:space="preserve">94, 2873–2885 (2013)</w:t>
-      </w:r>
-      <w:r>
-        <w:t xml:space="preserve"> </w:t>
-      </w:r>
-      <w:hyperlink r:id="rId52">
-        <w:r>
-          <w:rPr>
-            <w:rStyle w:val="InternetLink"/>
-          </w:rPr>
-          <w:t xml:space="preserve">[doi]</w:t>
-        </w:r>
-      </w:hyperlink>
-      <w:r>
-        <w:t xml:space="preserve">.</w:t>
-      </w:r>
-    </w:p>
-    <w:p>
-      <w:pPr>
-        <w:numPr>
-          <w:ilvl w:val="0"/>
-          <w:numId w:val="1001"/>
-        </w:numPr>
-      </w:pPr>
-      <w:r>
-        <w:t xml:space="preserve">Sasaki, T.*,</w:t>
-      </w:r>
-      <w:r>
-        <w:t xml:space="preserve"> </w:t>
-      </w:r>
-      <w:r>
-        <w:rPr>
-          <w:b/>
-          <w:bCs/>
-        </w:rPr>
-        <w:t xml:space="preserve">Katabuchi, M.</w:t>
-      </w:r>
-      <w:r>
-        <w:t xml:space="preserve">, Kamiyama, C., Shimazaki, M., Nakashizuka, T. &amp; Hikosaka, K. Nestedness and niche-based species loss in moorland plant communities.</w:t>
-      </w:r>
-      <w:r>
-        <w:t xml:space="preserve"> </w:t>
-      </w:r>
-      <w:r>
-        <w:rPr>
-          <w:b/>
-          <w:bCs/>
-          <w:i/>
-          <w:iCs/>
-        </w:rPr>
-        <w:t xml:space="preserve">Oikos</w:t>
-      </w:r>
-      <w:r>
-        <w:t xml:space="preserve"> </w:t>
-      </w:r>
-      <w:r>
-        <w:t xml:space="preserve">121, 1783–1790 (2012)</w:t>
-      </w:r>
-      <w:r>
-        <w:t xml:space="preserve"> </w:t>
-      </w:r>
-      <w:hyperlink r:id="rId53">
-        <w:r>
-          <w:rPr>
-            <w:rStyle w:val="InternetLink"/>
-          </w:rPr>
-          <w:t xml:space="preserve">[doi]</w:t>
-        </w:r>
-      </w:hyperlink>
-      <w:r>
-        <w:t xml:space="preserve">.</w:t>
-      </w:r>
-    </w:p>
-    <w:p>
-      <w:pPr>
-        <w:numPr>
-          <w:ilvl w:val="0"/>
-          <w:numId w:val="1001"/>
-        </w:numPr>
-      </w:pPr>
-      <w:r>
-        <w:t xml:space="preserve">Sasaki, T.*,</w:t>
-      </w:r>
-      <w:r>
-        <w:t xml:space="preserve"> </w:t>
-      </w:r>
-      <w:r>
-        <w:rPr>
-          <w:b/>
-          <w:bCs/>
-        </w:rPr>
-        <w:t xml:space="preserve">Katabuchi, M.</w:t>
-      </w:r>
-      <w:r>
-        <w:t xml:space="preserve">, Kamiyama, C., Shimazaki, M., Nakashizuka, T. &amp; Hikosaka, K. Diversity partitioning of moorland plant communities across hierarchical spatial scales.</w:t>
-      </w:r>
-      <w:r>
-        <w:t xml:space="preserve"> </w:t>
-      </w:r>
-      <w:r>
-        <w:rPr>
-          <w:b/>
-          <w:bCs/>
-          <w:i/>
-          <w:iCs/>
-        </w:rPr>
-        <w:t xml:space="preserve">Biodiversity and Conservation</w:t>
-      </w:r>
-      <w:r>
-        <w:t xml:space="preserve"> </w:t>
-      </w:r>
-      <w:r>
-        <w:t xml:space="preserve">21, 1577–1588 (2012)</w:t>
-      </w:r>
-      <w:r>
-        <w:t xml:space="preserve"> </w:t>
-      </w:r>
-      <w:hyperlink r:id="rId54">
-        <w:r>
-          <w:rPr>
-            <w:rStyle w:val="InternetLink"/>
-          </w:rPr>
-          <w:t xml:space="preserve">[doi]</w:t>
-        </w:r>
-      </w:hyperlink>
-      <w:r>
-        <w:t xml:space="preserve">.</w:t>
-      </w:r>
-    </w:p>
-    <w:p>
-      <w:pPr>
-        <w:numPr>
-          <w:ilvl w:val="0"/>
-          <w:numId w:val="1001"/>
-        </w:numPr>
-      </w:pPr>
-      <w:r>
-        <w:rPr>
-          <w:b/>
-          <w:bCs/>
-        </w:rPr>
-        <w:t xml:space="preserve">Katabuchi, M.*</w:t>
-      </w:r>
-      <w:r>
-        <w:t xml:space="preserve">, Kurokawa, H., Davies, S. J., Tan, S. &amp; Nakashizuka, T. Soil resource availability shapes community trait structure in a species-rich dipterocarp forest.</w:t>
-      </w:r>
-      <w:r>
-        <w:t xml:space="preserve"> </w:t>
-      </w:r>
-      <w:r>
-        <w:rPr>
-          <w:b/>
-          <w:bCs/>
-          <w:i/>
-          <w:iCs/>
-        </w:rPr>
-        <w:t xml:space="preserve">Journal of Ecology</w:t>
-      </w:r>
-      <w:r>
-        <w:t xml:space="preserve"> </w:t>
-      </w:r>
-      <w:r>
-        <w:t xml:space="preserve">100, 643–651 (2012)</w:t>
-      </w:r>
-      <w:r>
-        <w:t xml:space="preserve"> </w:t>
-      </w:r>
-      <w:hyperlink r:id="rId55">
-        <w:r>
-          <w:rPr>
-            <w:rStyle w:val="InternetLink"/>
-          </w:rPr>
-          <w:t xml:space="preserve">[doi]</w:t>
-        </w:r>
-      </w:hyperlink>
-      <w:r>
-        <w:t xml:space="preserve">.</w:t>
-      </w:r>
-    </w:p>
-    <w:p>
-      <w:pPr>
-        <w:numPr>
-          <w:ilvl w:val="0"/>
-          <w:numId w:val="1001"/>
-        </w:numPr>
-      </w:pPr>
-      <w:r>
-        <w:rPr>
-          <w:b/>
-          <w:bCs/>
-        </w:rPr>
-        <w:t xml:space="preserve">Katabuchi, M.*</w:t>
-      </w:r>
-      <w:r>
-        <w:t xml:space="preserve">, Isagi, Y. &amp; Nakashizuka, T. Development of 17 microsatellite markers for</w:t>
-      </w:r>
-      <w:r>
-        <w:t xml:space="preserve"> </w:t>
-      </w:r>
-      <w:r>
-        <w:rPr>
-          <w:i/>
-          <w:iCs/>
-        </w:rPr>
-        <w:t xml:space="preserve">Ceratosolen</w:t>
-      </w:r>
-      <w:r>
-        <w:t xml:space="preserve"> </w:t>
-      </w:r>
-      <w:r>
-        <w:rPr>
-          <w:i/>
-          <w:iCs/>
-        </w:rPr>
-        <w:t xml:space="preserve">Constrictus</w:t>
-      </w:r>
-      <w:r>
-        <w:t xml:space="preserve">, the pollinating fig wasp of</w:t>
-      </w:r>
-      <w:r>
-        <w:t xml:space="preserve"> </w:t>
-      </w:r>
-      <w:r>
-        <w:rPr>
-          <w:i/>
-          <w:iCs/>
-        </w:rPr>
-        <w:t xml:space="preserve">Ficus</w:t>
-      </w:r>
-      <w:r>
-        <w:t xml:space="preserve"> </w:t>
-      </w:r>
-      <w:r>
-        <w:rPr>
-          <w:i/>
-          <w:iCs/>
-        </w:rPr>
-        <w:t xml:space="preserve">Fistulosa</w:t>
-      </w:r>
-      <w:r>
-        <w:t xml:space="preserve">.</w:t>
-      </w:r>
-      <w:r>
-        <w:t xml:space="preserve"> </w:t>
-      </w:r>
-      <w:r>
-        <w:rPr>
-          <w:b/>
-          <w:bCs/>
-          <w:i/>
-          <w:iCs/>
-        </w:rPr>
-        <w:t xml:space="preserve">Molecular Ecology Resources</w:t>
-      </w:r>
-      <w:r>
-        <w:t xml:space="preserve"> </w:t>
-      </w:r>
-      <w:r>
-        <w:t xml:space="preserve">8, 840–842 (2008)</w:t>
-      </w:r>
-      <w:r>
-        <w:t xml:space="preserve"> </w:t>
-      </w:r>
-      <w:hyperlink r:id="rId56">
-        <w:r>
-          <w:rPr>
-            <w:rStyle w:val="InternetLink"/>
-          </w:rPr>
-          <w:t xml:space="preserve">[doi]</w:t>
-        </w:r>
-      </w:hyperlink>
-      <w:r>
-        <w:t xml:space="preserve">.</w:t>
-      </w:r>
-    </w:p>
-    <w:p>
-      <w:pPr>
-        <w:numPr>
-          <w:ilvl w:val="0"/>
-          <w:numId w:val="1001"/>
-        </w:numPr>
-      </w:pPr>
-      <w:r>
-        <w:rPr>
-          <w:b/>
-          <w:bCs/>
-        </w:rPr>
-        <w:t xml:space="preserve">Katabuchi, M.*</w:t>
-      </w:r>
-      <w:r>
-        <w:t xml:space="preserve">, Harrison, R. D. &amp; Nakashizuka, T. Documenting the effect of foundress number in a dioecious fig,</w:t>
-      </w:r>
-      <w:r>
-        <w:t xml:space="preserve"> </w:t>
-      </w:r>
-      <w:r>
-        <w:rPr>
-          <w:i/>
-          <w:iCs/>
-        </w:rPr>
-        <w:t xml:space="preserve">Ficus</w:t>
-      </w:r>
-      <w:r>
-        <w:t xml:space="preserve"> </w:t>
-      </w:r>
-      <w:r>
-        <w:rPr>
-          <w:i/>
-          <w:iCs/>
-        </w:rPr>
-        <w:t xml:space="preserve">Fistulosa</w:t>
-      </w:r>
-      <w:r>
-        <w:t xml:space="preserve">, in Malaysia.</w:t>
-      </w:r>
-      <w:r>
-        <w:t xml:space="preserve"> </w:t>
-      </w:r>
-      <w:r>
-        <w:rPr>
-          <w:b/>
-          <w:bCs/>
-          <w:i/>
-          <w:iCs/>
-        </w:rPr>
-        <w:t xml:space="preserve">Biotropica</w:t>
-      </w:r>
-      <w:r>
-        <w:t xml:space="preserve"> </w:t>
-      </w:r>
-      <w:r>
-        <w:t xml:space="preserve">40, 457–461 (2008)</w:t>
-      </w:r>
-      <w:r>
-        <w:t xml:space="preserve"> </w:t>
-      </w:r>
-      <w:hyperlink r:id="rId57">
-        <w:r>
-          <w:rPr>
-            <w:rStyle w:val="InternetLink"/>
-          </w:rPr>
-          <w:t xml:space="preserve">[doi]</w:t>
-        </w:r>
-      </w:hyperlink>
-      <w:r>
-        <w:t xml:space="preserve">.</w:t>
-      </w:r>
-    </w:p>
-    <w:bookmarkEnd w:id="58"/>
-    <w:bookmarkStart w:id="59" w:name="book"/>
+    <w:bookmarkEnd w:id="49"/>
+    <w:bookmarkStart w:id="50" w:name="book"/>
     <w:p>
       <w:pPr>
         <w:pStyle w:val="Heading2"/>
@@ -2655,8 +2647,8 @@
         <w:t xml:space="preserve">, Oikawa S., Shimazaki M., Kimura H. and Nakashizuka T. (2016), Trait-Based Approaches for Understanding Species Niche, Coexistence, and Functional Diversity in Subalpine Moorlands. Structure and Function of Mountain Ecosystems in Japan.</w:t>
       </w:r>
     </w:p>
-    <w:bookmarkEnd w:id="59"/>
-    <w:bookmarkStart w:id="63" w:name="software"/>
+    <w:bookmarkEnd w:id="50"/>
+    <w:bookmarkStart w:id="54" w:name="software"/>
     <w:p>
       <w:pPr>
         <w:pStyle w:val="Heading2"/>
@@ -2690,7 +2682,7 @@
       <w:r>
         <w:t xml:space="preserve"> </w:t>
       </w:r>
-      <w:hyperlink r:id="rId60">
+      <w:hyperlink r:id="rId51">
         <w:r>
           <w:rPr>
             <w:rStyle w:val="InternetLink"/>
@@ -2724,7 +2716,7 @@
       <w:r>
         <w:t xml:space="preserve"> </w:t>
       </w:r>
-      <w:hyperlink r:id="rId61">
+      <w:hyperlink r:id="rId52">
         <w:r>
           <w:rPr>
             <w:rStyle w:val="InternetLink"/>
@@ -2758,7 +2750,7 @@
       <w:r>
         <w:t xml:space="preserve"> </w:t>
       </w:r>
-      <w:hyperlink r:id="rId62">
+      <w:hyperlink r:id="rId53">
         <w:r>
           <w:rPr>
             <w:rStyle w:val="InternetLink"/>
@@ -2767,850 +2759,787 @@
         </w:r>
       </w:hyperlink>
     </w:p>
+    <w:bookmarkEnd w:id="54"/>
+    <w:bookmarkStart w:id="55" w:name="teaching-experience"/>
+    <w:p>
+      <w:pPr>
+        <w:pStyle w:val="Heading2"/>
+      </w:pPr>
+      <w:r>
+        <w:t xml:space="preserve">Teaching Experience</w:t>
+      </w:r>
+    </w:p>
+    <w:p>
+      <w:pPr>
+        <w:pStyle w:val="DefinitionTerm"/>
+      </w:pPr>
+      <w:r>
+        <w:t xml:space="preserve">2025</w:t>
+      </w:r>
+    </w:p>
+    <w:p>
+      <w:pPr>
+        <w:pStyle w:val="Definition"/>
+      </w:pPr>
+      <w:r>
+        <w:t xml:space="preserve">The 8th Advanced Statistics Workshop, Xishuangbanna Tropical Botanical Garden, Chinese Academy of Sciences, China</w:t>
+      </w:r>
+    </w:p>
+    <w:p>
+      <w:pPr>
+        <w:pStyle w:val="DefinitionTerm"/>
+      </w:pPr>
+      <w:r>
+        <w:t xml:space="preserve">2019-</w:t>
+      </w:r>
+    </w:p>
+    <w:p>
+      <w:pPr>
+        <w:pStyle w:val="Definition"/>
+      </w:pPr>
+      <w:r>
+        <w:t xml:space="preserve">Advanced Field course in Ecology and Conservation, Xishuangbanna Tropical Botanical Garden, Chinese Academy of Sciences, China</w:t>
+      </w:r>
+    </w:p>
+    <w:p>
+      <w:pPr>
+        <w:pStyle w:val="DefinitionTerm"/>
+      </w:pPr>
+      <w:r>
+        <w:t xml:space="preserve">2013</w:t>
+      </w:r>
+    </w:p>
+    <w:p>
+      <w:pPr>
+        <w:pStyle w:val="Definition"/>
+      </w:pPr>
+      <w:r>
+        <w:t xml:space="preserve">Experimental Design and Data Analysis, ATBC Asia-Pacific chapter, Banda Aceh, Indonesia</w:t>
+      </w:r>
+    </w:p>
+    <w:p>
+      <w:pPr>
+        <w:pStyle w:val="DefinitionTerm"/>
+      </w:pPr>
+      <w:r>
+        <w:t xml:space="preserve">2013</w:t>
+      </w:r>
+    </w:p>
+    <w:p>
+      <w:pPr>
+        <w:pStyle w:val="Definition"/>
+      </w:pPr>
+      <w:r>
+        <w:t xml:space="preserve">R and generalized linear models, Xishuangbanna Tropical Botanical Garden, Chinese Academy of Sciences, China</w:t>
+      </w:r>
+    </w:p>
+    <w:bookmarkEnd w:id="55"/>
+    <w:bookmarkStart w:id="58" w:name="academic-service"/>
+    <w:p>
+      <w:pPr>
+        <w:pStyle w:val="Heading2"/>
+      </w:pPr>
+      <w:r>
+        <w:t xml:space="preserve">Academic Service</w:t>
+      </w:r>
+    </w:p>
+    <w:p>
+      <w:pPr>
+        <w:pStyle w:val="DefinitionTerm"/>
+      </w:pPr>
+      <w:r>
+        <w:t xml:space="preserve">2023-</w:t>
+      </w:r>
+    </w:p>
+    <w:p>
+      <w:pPr>
+        <w:pStyle w:val="Definition"/>
+      </w:pPr>
+      <w:hyperlink r:id="rId56"/>
+    </w:p>
+    <w:p>
+      <w:pPr>
+        <w:pStyle w:val="Definition"/>
+      </w:pPr>
+      <w:r>
+        <w:t xml:space="preserve">Editorial Board Member of Thai Forest Ecological Research Journal</w:t>
+      </w:r>
+    </w:p>
+    <w:p>
+      <w:pPr>
+        <w:pStyle w:val="DefinitionTerm"/>
+      </w:pPr>
+      <w:r>
+        <w:t xml:space="preserve">2015-2017</w:t>
+      </w:r>
+    </w:p>
+    <w:p>
+      <w:pPr>
+        <w:pStyle w:val="Definition"/>
+      </w:pPr>
+      <w:hyperlink r:id="rId56"/>
+    </w:p>
+    <w:p>
+      <w:pPr>
+        <w:pStyle w:val="Definition"/>
+      </w:pPr>
+      <w:r>
+        <w:t xml:space="preserve">Working Group Member of INNGE, International Network of Next-Generation Ecologists</w:t>
+      </w:r>
+    </w:p>
+    <w:p>
+      <w:pPr>
+        <w:pStyle w:val="DefinitionTerm"/>
+      </w:pPr>
+      <w:r>
+        <w:t xml:space="preserve">2015-2017</w:t>
+      </w:r>
+    </w:p>
+    <w:p>
+      <w:pPr>
+        <w:pStyle w:val="Definition"/>
+      </w:pPr>
+      <w:hyperlink r:id="rId56"/>
+    </w:p>
+    <w:p>
+      <w:pPr>
+        <w:pStyle w:val="Definition"/>
+      </w:pPr>
+      <w:r>
+        <w:t xml:space="preserve">INNGE manager, The Japan Society of Tropical Ecology</w:t>
+      </w:r>
+    </w:p>
+    <w:p>
+      <w:pPr>
+        <w:pStyle w:val="DefinitionTerm"/>
+      </w:pPr>
+      <w:r>
+        <w:t xml:space="preserve">2013-</w:t>
+      </w:r>
+    </w:p>
+    <w:p>
+      <w:pPr>
+        <w:pStyle w:val="Definition"/>
+      </w:pPr>
+      <w:hyperlink r:id="rId56"/>
+    </w:p>
+    <w:p>
+      <w:pPr>
+        <w:pStyle w:val="Definition"/>
+      </w:pPr>
+      <w:r>
+        <w:t xml:space="preserve">Statistical editor for Lepcey, The Journal of Tropical Asian Entomology</w:t>
+      </w:r>
+    </w:p>
+    <w:bookmarkStart w:id="57" w:name="reviewer-for-journals-12-per-year"/>
+    <w:p>
+      <w:pPr>
+        <w:pStyle w:val="Heading3"/>
+      </w:pPr>
+      <w:r>
+        <w:t xml:space="preserve">Reviewer for journals (~ 12 per year):</w:t>
+      </w:r>
+    </w:p>
+    <w:bookmarkEnd w:id="57"/>
+    <w:bookmarkEnd w:id="58"/>
+    <w:bookmarkStart w:id="59" w:name="awards-and-prizes"/>
+    <w:p>
+      <w:pPr>
+        <w:pStyle w:val="Heading2"/>
+      </w:pPr>
+      <w:r>
+        <w:t xml:space="preserve">Awards and Prizes</w:t>
+      </w:r>
+    </w:p>
+    <w:p>
+      <w:pPr>
+        <w:pStyle w:val="DefinitionTerm"/>
+      </w:pPr>
+      <w:r>
+        <w:t xml:space="preserve">2026</w:t>
+      </w:r>
+    </w:p>
+    <w:p>
+      <w:pPr>
+        <w:pStyle w:val="Definition"/>
+      </w:pPr>
+      <w:r>
+        <w:t xml:space="preserve">Outstanding Staff Award for the year of 2025, Xishuangbanna Tropical Botanical Garden, Chinese Academy of Sciences</w:t>
+      </w:r>
+    </w:p>
+    <w:p>
+      <w:pPr>
+        <w:pStyle w:val="DefinitionTerm"/>
+      </w:pPr>
+      <w:r>
+        <w:t xml:space="preserve">2012</w:t>
+      </w:r>
+    </w:p>
+    <w:p>
+      <w:pPr>
+        <w:pStyle w:val="Definition"/>
+      </w:pPr>
+      <w:r>
+        <w:t xml:space="preserve">Dean’s award for excellence, Graduate School of Life Sciences (Doctoral Program), Tohoku University</w:t>
+      </w:r>
+    </w:p>
+    <w:p>
+      <w:pPr>
+        <w:pStyle w:val="DefinitionTerm"/>
+      </w:pPr>
+      <w:r>
+        <w:t xml:space="preserve">2009</w:t>
+      </w:r>
+    </w:p>
+    <w:p>
+      <w:pPr>
+        <w:pStyle w:val="Definition"/>
+      </w:pPr>
+      <w:r>
+        <w:t xml:space="preserve">Dean’s award for excellence, Graduate School of Life Sciences (Master’s Program), Tohoku University</w:t>
+      </w:r>
+    </w:p>
+    <w:bookmarkEnd w:id="59"/>
+    <w:bookmarkStart w:id="60" w:name="invited-seminars"/>
+    <w:p>
+      <w:pPr>
+        <w:pStyle w:val="Heading2"/>
+      </w:pPr>
+      <w:r>
+        <w:t xml:space="preserve">Invited Seminars</w:t>
+      </w:r>
+    </w:p>
+    <w:p>
+      <w:pPr>
+        <w:pStyle w:val="DefinitionTerm"/>
+      </w:pPr>
+      <w:r>
+        <w:t xml:space="preserve">2021</w:t>
+      </w:r>
+    </w:p>
+    <w:p>
+      <w:pPr>
+        <w:pStyle w:val="Definition"/>
+      </w:pPr>
+      <w:r>
+        <w:t xml:space="preserve">Introduction to visualization using ggplot2, International Institute of Tropical Agriculture, Kenya</w:t>
+      </w:r>
+    </w:p>
+    <w:p>
+      <w:pPr>
+        <w:pStyle w:val="DefinitionTerm"/>
+      </w:pPr>
+      <w:r>
+        <w:t xml:space="preserve">2018</w:t>
+      </w:r>
+    </w:p>
+    <w:p>
+      <w:pPr>
+        <w:pStyle w:val="Definition"/>
+      </w:pPr>
+      <w:r>
+        <w:t xml:space="preserve">A quantitative model for divergent drivers of leaf trait variation within and among plant species, Xishuangbanna Tropical Botanical Garden, China</w:t>
+      </w:r>
+    </w:p>
+    <w:p>
+      <w:pPr>
+        <w:pStyle w:val="DefinitionTerm"/>
+      </w:pPr>
+      <w:r>
+        <w:t xml:space="preserve">2018</w:t>
+      </w:r>
+    </w:p>
+    <w:p>
+      <w:pPr>
+        <w:pStyle w:val="Definition"/>
+      </w:pPr>
+      <w:r>
+        <w:t xml:space="preserve">Species coexistence and functional traits. Graduate School of Life Sciences, Tohoku University, Japan</w:t>
+      </w:r>
+    </w:p>
+    <w:p>
+      <w:pPr>
+        <w:pStyle w:val="DefinitionTerm"/>
+      </w:pPr>
+      <w:r>
+        <w:t xml:space="preserve">2018</w:t>
+      </w:r>
+    </w:p>
+    <w:p>
+      <w:pPr>
+        <w:pStyle w:val="Definition"/>
+      </w:pPr>
+      <w:r>
+        <w:t xml:space="preserve">Species coexistence and functional traits. Graduate School of Environment and Information Sciences, Yokoyama National University, Japan</w:t>
+      </w:r>
+    </w:p>
+    <w:p>
+      <w:pPr>
+        <w:pStyle w:val="DefinitionTerm"/>
+      </w:pPr>
+      <w:r>
+        <w:t xml:space="preserve">2016</w:t>
+      </w:r>
+    </w:p>
+    <w:p>
+      <w:pPr>
+        <w:pStyle w:val="Definition"/>
+      </w:pPr>
+      <w:r>
+        <w:t xml:space="preserve">Decomposing leaf mass into photosynthetic and structural components explains divergent patterns of trait variation within and among plant species. Department of Ecology and Evolutionary Biology, Princeton University, NJ</w:t>
+      </w:r>
+    </w:p>
+    <w:p>
+      <w:pPr>
+        <w:pStyle w:val="DefinitionTerm"/>
+      </w:pPr>
+      <w:r>
+        <w:t xml:space="preserve">2013</w:t>
+      </w:r>
+    </w:p>
+    <w:p>
+      <w:pPr>
+        <w:pStyle w:val="Definition"/>
+      </w:pPr>
+      <w:r>
+        <w:t xml:space="preserve">Additive partitioning of functional diversity in plant communities, Xishuangbanna Tropical Botanical Garden, China</w:t>
+      </w:r>
+    </w:p>
+    <w:bookmarkEnd w:id="60"/>
+    <w:bookmarkStart w:id="61" w:name="international-meetings"/>
+    <w:p>
+      <w:pPr>
+        <w:pStyle w:val="Heading2"/>
+      </w:pPr>
+      <w:r>
+        <w:t xml:space="preserve">International Meetings</w:t>
+      </w:r>
+    </w:p>
+    <w:p>
+      <w:pPr>
+        <w:pStyle w:val="FirstParagraph"/>
+      </w:pPr>
+      <w:r>
+        <w:rPr>
+          <w:b/>
+          <w:bCs/>
+        </w:rPr>
+        <w:t xml:space="preserve">Invited</w:t>
+      </w:r>
+    </w:p>
+    <w:p>
+      <w:pPr>
+        <w:pStyle w:val="DefinitionTerm"/>
+      </w:pPr>
+      <w:r>
+        <w:t xml:space="preserve">2015</w:t>
+      </w:r>
+    </w:p>
+    <w:p>
+      <w:pPr>
+        <w:pStyle w:val="Definition"/>
+      </w:pPr>
+      <w:r>
+        <w:rPr>
+          <w:b/>
+          <w:bCs/>
+        </w:rPr>
+        <w:t xml:space="preserve">Masatoshi Katabuchi</w:t>
+      </w:r>
+      <w:r>
+        <w:t xml:space="preserve">,</w:t>
+      </w:r>
+      <w:r>
+        <w:t xml:space="preserve"> </w:t>
+      </w:r>
+      <w:r>
+        <w:t xml:space="preserve">“Future perspective for functional trait research”</w:t>
+      </w:r>
+      <w:r>
+        <w:t xml:space="preserve">, Organized session on</w:t>
+      </w:r>
+      <w:r>
+        <w:t xml:space="preserve"> </w:t>
+      </w:r>
+      <w:r>
+        <w:t xml:space="preserve">“Achievements and outstanding questions for trait-based forest ecology”</w:t>
+      </w:r>
+      <w:r>
+        <w:t xml:space="preserve">, 62nd ESJ Annual meeting, Kagoshima, Japan</w:t>
+      </w:r>
+    </w:p>
+    <w:p>
+      <w:pPr>
+        <w:pStyle w:val="DefinitionTerm"/>
+      </w:pPr>
+      <w:r>
+        <w:t xml:space="preserve">2014</w:t>
+      </w:r>
+    </w:p>
+    <w:p>
+      <w:pPr>
+        <w:pStyle w:val="Definition"/>
+      </w:pPr>
+      <w:r>
+        <w:rPr>
+          <w:b/>
+          <w:bCs/>
+        </w:rPr>
+        <w:t xml:space="preserve">Masatoshi Katabuchi (Organizer)</w:t>
+      </w:r>
+      <w:r>
+        <w:t xml:space="preserve">, “Seedling dynamics and its consequence to community assembly processes in a tropical forest”, Symposium on</w:t>
+      </w:r>
+      <w:r>
+        <w:t xml:space="preserve"> </w:t>
+      </w:r>
+      <w:r>
+        <w:t xml:space="preserve">“Integrating the structure and dynamics of tree communities to uncover the mechanisms underlying species coexistence”</w:t>
+      </w:r>
+      <w:r>
+        <w:t xml:space="preserve">, 61st ESJ Annual meeting, Hiroshima, Japan</w:t>
+      </w:r>
+    </w:p>
+    <w:p>
+      <w:pPr>
+        <w:pStyle w:val="DefinitionTerm"/>
+      </w:pPr>
+      <w:r>
+        <w:t xml:space="preserve">2011</w:t>
+      </w:r>
+    </w:p>
+    <w:p>
+      <w:pPr>
+        <w:pStyle w:val="Definition"/>
+      </w:pPr>
+      <w:r>
+        <w:rPr>
+          <w:b/>
+          <w:bCs/>
+        </w:rPr>
+        <w:t xml:space="preserve">Masatoshi Katabuchi</w:t>
+      </w:r>
+      <w:r>
+        <w:t xml:space="preserve"> </w:t>
+      </w:r>
+      <w:r>
+        <w:t xml:space="preserve">and Hiroko Kurokawa</w:t>
+      </w:r>
+      <w:r>
+        <w:t xml:space="preserve"> </w:t>
+      </w:r>
+      <w:r>
+        <w:t xml:space="preserve">“Community assembly and demography of tropical tree species”</w:t>
+      </w:r>
+      <w:r>
+        <w:t xml:space="preserve">, Workshop on</w:t>
+      </w:r>
+      <w:r>
+        <w:t xml:space="preserve"> </w:t>
+      </w:r>
+      <w:r>
+        <w:t xml:space="preserve">“Life history regulation of forest trees: towards cross-biome analysis”</w:t>
+      </w:r>
+      <w:r>
+        <w:t xml:space="preserve">, Sapporo, Japan</w:t>
+      </w:r>
+    </w:p>
+    <w:p>
+      <w:pPr>
+        <w:pStyle w:val="FirstParagraph"/>
+      </w:pPr>
+      <w:r>
+        <w:rPr>
+          <w:b/>
+          <w:bCs/>
+        </w:rPr>
+        <w:t xml:space="preserve">Submitted</w:t>
+      </w:r>
+    </w:p>
+    <w:p>
+      <w:pPr>
+        <w:pStyle w:val="DefinitionTerm"/>
+      </w:pPr>
+      <w:r>
+        <w:t xml:space="preserve">2019</w:t>
+      </w:r>
+    </w:p>
+    <w:p>
+      <w:pPr>
+        <w:pStyle w:val="Definition"/>
+      </w:pPr>
+      <w:r>
+        <w:rPr>
+          <w:b/>
+          <w:bCs/>
+        </w:rPr>
+        <w:t xml:space="preserve">Masatoshi Katabuchi</w:t>
+      </w:r>
+      <w:r>
+        <w:t xml:space="preserve">, Kaito Umemura, Thomas Koffel, Litchman Elena, Klausmeier A Christopher,</w:t>
+      </w:r>
+      <w:r>
+        <w:t xml:space="preserve"> </w:t>
+      </w:r>
+      <w:r>
+        <w:t xml:space="preserve">“Combining metacommunity and trait-based approaches predicts species abundances distributions in biological communities”</w:t>
+      </w:r>
+      <w:r>
+        <w:t xml:space="preserve">, 66th ESJ Annual meeting, Kobe, Japan</w:t>
+      </w:r>
+    </w:p>
+    <w:p>
+      <w:pPr>
+        <w:pStyle w:val="DefinitionTerm"/>
+      </w:pPr>
+      <w:r>
+        <w:t xml:space="preserve">2015</w:t>
+      </w:r>
+    </w:p>
+    <w:p>
+      <w:pPr>
+        <w:pStyle w:val="Definition"/>
+      </w:pPr>
+      <w:r>
+        <w:rPr>
+          <w:b/>
+          <w:bCs/>
+        </w:rPr>
+        <w:t xml:space="preserve">Masatoshi Katabuchi</w:t>
+      </w:r>
+      <w:r>
+        <w:t xml:space="preserve">, Kaoru Kitajima, Joesph Wright, Jeanne Osnas and Jeremy Lichstein</w:t>
+      </w:r>
+      <w:r>
+        <w:t xml:space="preserve"> </w:t>
+      </w:r>
+      <w:r>
+        <w:t xml:space="preserve">“Decomposing leaf mass into photosynthetic and structural components explains diverge patterns of trait variation within vs. among plant communities”</w:t>
+      </w:r>
+      <w:r>
+        <w:t xml:space="preserve">, 100th ESA Annual meeting, Baltimore, USA</w:t>
+      </w:r>
+    </w:p>
+    <w:p>
+      <w:pPr>
+        <w:pStyle w:val="DefinitionTerm"/>
+      </w:pPr>
+      <w:r>
+        <w:t xml:space="preserve">2014</w:t>
+      </w:r>
+    </w:p>
+    <w:p>
+      <w:pPr>
+        <w:pStyle w:val="Definition"/>
+      </w:pPr>
+      <w:r>
+        <w:rPr>
+          <w:b/>
+          <w:bCs/>
+        </w:rPr>
+        <w:t xml:space="preserve">Masatoshi Katabuchi</w:t>
+      </w:r>
+      <w:r>
+        <w:t xml:space="preserve">, Takehiro Sasaki, Chiho Kamiyama, Masaya Shimazaki, Tohru Nakashizuka and Kouki Hikosaka “Intraspecific trait variations affect spatial patterns of functional diversity among moorland plant communities”, 99th ESA Annual meeting, Sacramento, USA.</w:t>
+      </w:r>
+    </w:p>
+    <w:p>
+      <w:pPr>
+        <w:pStyle w:val="DefinitionTerm"/>
+      </w:pPr>
+      <w:r>
+        <w:t xml:space="preserve">2013</w:t>
+      </w:r>
+    </w:p>
+    <w:p>
+      <w:pPr>
+        <w:pStyle w:val="Definition"/>
+      </w:pPr>
+      <w:r>
+        <w:rPr>
+          <w:b/>
+          <w:bCs/>
+        </w:rPr>
+        <w:t xml:space="preserve">Masatoshi Katabuchi</w:t>
+      </w:r>
+      <w:r>
+        <w:t xml:space="preserve">, Sylvester Tan and Tohru Nakashizuka “Negative density dependence reduces survival rates of common tree species in a species-rich tropical rain forest”, ATBC, San Jose, Costa Rica</w:t>
+      </w:r>
+    </w:p>
+    <w:p>
+      <w:pPr>
+        <w:pStyle w:val="DefinitionTerm"/>
+      </w:pPr>
+      <w:r>
+        <w:t xml:space="preserve">2012</w:t>
+      </w:r>
+    </w:p>
+    <w:p>
+      <w:pPr>
+        <w:pStyle w:val="Definition"/>
+      </w:pPr>
+      <w:r>
+        <w:rPr>
+          <w:b/>
+          <w:bCs/>
+        </w:rPr>
+        <w:t xml:space="preserve">Masatoshi Katabuchi</w:t>
+      </w:r>
+      <w:r>
+        <w:t xml:space="preserve">, Hiroko Kurokawa, Stuart Davies, Sylvester Tan and Tohru Nakashizuka</w:t>
+      </w:r>
+      <w:r>
+        <w:t xml:space="preserve"> </w:t>
+      </w:r>
+      <w:r>
+        <w:t xml:space="preserve">“Soil resource availability shapes community trait structure in a species-rich dipterocarp forest”</w:t>
+      </w:r>
+      <w:r>
+        <w:t xml:space="preserve">, ATBC Asia-Pacific chapter, XTBG, China</w:t>
+      </w:r>
+    </w:p>
+    <w:p>
+      <w:pPr>
+        <w:pStyle w:val="DefinitionTerm"/>
+      </w:pPr>
+      <w:r>
+        <w:t xml:space="preserve">2011</w:t>
+      </w:r>
+    </w:p>
+    <w:p>
+      <w:pPr>
+        <w:pStyle w:val="Definition"/>
+      </w:pPr>
+      <w:r>
+        <w:rPr>
+          <w:b/>
+          <w:bCs/>
+        </w:rPr>
+        <w:t xml:space="preserve">Masatoshi Katabuchi</w:t>
+      </w:r>
+      <w:r>
+        <w:t xml:space="preserve">, Hiroko Kurokawa, Sylvester Tan, Stuart J. Davies, and Tohru Nakashizuka, “Nonrandom abundance distributions of a tropical tree community: evidence from traits correlation at a local scale”. ATBC, Arusha, Tanzania</w:t>
+      </w:r>
+    </w:p>
+    <w:p>
+      <w:pPr>
+        <w:pStyle w:val="DefinitionTerm"/>
+      </w:pPr>
+      <w:r>
+        <w:t xml:space="preserve">2010</w:t>
+      </w:r>
+    </w:p>
+    <w:p>
+      <w:pPr>
+        <w:pStyle w:val="Definition"/>
+      </w:pPr>
+      <w:r>
+        <w:rPr>
+          <w:b/>
+          <w:bCs/>
+        </w:rPr>
+        <w:t xml:space="preserve">Masatoshi Katabuchi</w:t>
+      </w:r>
+      <w:r>
+        <w:t xml:space="preserve">, Hiroko Kurokawa, Sylvester Tan, and Tohru Nakashizuka, “Soil variation and functional trait assembly in a diverse dipterocarp forest”. 95th ESA Annual meeting, Pittsburgh, USA</w:t>
+      </w:r>
+    </w:p>
+    <w:p>
+      <w:pPr>
+        <w:pStyle w:val="DefinitionTerm"/>
+      </w:pPr>
+      <w:r>
+        <w:t xml:space="preserve">2009</w:t>
+      </w:r>
+    </w:p>
+    <w:p>
+      <w:pPr>
+        <w:pStyle w:val="Definition"/>
+      </w:pPr>
+      <w:r>
+        <w:rPr>
+          <w:b/>
+          <w:bCs/>
+        </w:rPr>
+        <w:t xml:space="preserve">Masatoshi Katabuchi</w:t>
+      </w:r>
+      <w:r>
+        <w:t xml:space="preserve">, Jun Yokoyama, and Tohru Nakashizuka, “Inbreeding and mating structure in a dioecious-fig pollinating wasp”. ATBC, Marburg, Germany</w:t>
+      </w:r>
+    </w:p>
+    <w:bookmarkEnd w:id="61"/>
+    <w:bookmarkStart w:id="62" w:name="outreach"/>
+    <w:p>
+      <w:pPr>
+        <w:pStyle w:val="Heading2"/>
+      </w:pPr>
+      <w:r>
+        <w:t xml:space="preserve">Outreach</w:t>
+      </w:r>
+    </w:p>
+    <w:p>
+      <w:pPr>
+        <w:pStyle w:val="DefinitionTerm"/>
+      </w:pPr>
+      <w:r>
+        <w:t xml:space="preserve">2015</w:t>
+      </w:r>
+    </w:p>
+    <w:p>
+      <w:pPr>
+        <w:pStyle w:val="Definition"/>
+      </w:pPr>
+      <w:r>
+        <w:t xml:space="preserve">Masatoshi Katabuchi “Leaves and tropical rainforests”. Invited by the Japanese Association of Interdisciplinary Study Group in University Florida</w:t>
+      </w:r>
+    </w:p>
+    <w:bookmarkEnd w:id="62"/>
+    <w:bookmarkStart w:id="63" w:name="languages"/>
+    <w:p>
+      <w:pPr>
+        <w:pStyle w:val="Heading2"/>
+      </w:pPr>
+      <w:r>
+        <w:t xml:space="preserve">Languages</w:t>
+      </w:r>
+    </w:p>
+    <w:p>
+      <w:pPr>
+        <w:pStyle w:val="FirstParagraph"/>
+      </w:pPr>
+      <w:r>
+        <w:t xml:space="preserve">Japanese (native), English (fluent), Malay (basic), Chinese-Mandarin (basic)</w:t>
+      </w:r>
+    </w:p>
     <w:bookmarkEnd w:id="63"/>
-    <w:bookmarkStart w:id="64" w:name="teaching-experience"/>
+    <w:bookmarkStart w:id="64" w:name="graduate-students"/>
     <w:p>
       <w:pPr>
         <w:pStyle w:val="Heading2"/>
       </w:pPr>
       <w:r>
-        <w:t xml:space="preserve">Teaching Experience</w:t>
-      </w:r>
-    </w:p>
-    <w:p>
-      <w:pPr>
-        <w:pStyle w:val="DefinitionTerm"/>
-      </w:pPr>
-      <w:r>
-        <w:t xml:space="preserve">2025</w:t>
-      </w:r>
-    </w:p>
-    <w:p>
-      <w:pPr>
-        <w:pStyle w:val="Definition"/>
-      </w:pPr>
-      <w:r>
-        <w:t xml:space="preserve">The 8th Advanced Statistics Workshop, Xishuangbanna Tropical Botanical Garden, Chinese Academy of Sciences, China</w:t>
-      </w:r>
-    </w:p>
-    <w:p>
-      <w:pPr>
-        <w:pStyle w:val="DefinitionTerm"/>
-      </w:pPr>
-      <w:r>
-        <w:t xml:space="preserve">2019-</w:t>
-      </w:r>
-    </w:p>
-    <w:p>
-      <w:pPr>
-        <w:pStyle w:val="Definition"/>
-      </w:pPr>
-      <w:r>
-        <w:t xml:space="preserve">Advanced Field course in Ecology and Conservation, Xishuangbanna Tropical Botanical Garden, Chinese Academy of Sciences, China</w:t>
-      </w:r>
-    </w:p>
-    <w:p>
-      <w:pPr>
-        <w:pStyle w:val="DefinitionTerm"/>
-      </w:pPr>
-      <w:r>
-        <w:t xml:space="preserve">2013</w:t>
-      </w:r>
-    </w:p>
-    <w:p>
-      <w:pPr>
-        <w:pStyle w:val="Definition"/>
-      </w:pPr>
-      <w:r>
-        <w:t xml:space="preserve">Experimental Design and Data Analysis, ATBC Asia-Pacific chapter, Banda Aceh, Indonesia</w:t>
-      </w:r>
-    </w:p>
-    <w:p>
-      <w:pPr>
-        <w:pStyle w:val="DefinitionTerm"/>
-      </w:pPr>
-      <w:r>
-        <w:t xml:space="preserve">2013</w:t>
-      </w:r>
-    </w:p>
-    <w:p>
-      <w:pPr>
-        <w:pStyle w:val="Definition"/>
-      </w:pPr>
-      <w:r>
-        <w:t xml:space="preserve">R and generalized linear models, Xishuangbanna Tropical Botanical Garden, Chinese Academy of Sciences, China</w:t>
+        <w:t xml:space="preserve">Graduate Students</w:t>
+      </w:r>
+    </w:p>
+    <w:p>
+      <w:pPr>
+        <w:pStyle w:val="FirstParagraph"/>
+      </w:pPr>
+      <w:r>
+        <w:t xml:space="preserve">Thi Duyen Nguyen, 2021 - 2025, M.Sc. Student, Recipient of ANSO Scholarship.</w:t>
+      </w:r>
+    </w:p>
+    <w:p>
+      <w:pPr>
+        <w:pStyle w:val="TextBody"/>
+      </w:pPr>
+      <w:r>
+        <w:t xml:space="preserve">Zhou Cong, 2021 - 2023, M.Sc. Student, Recipient of UCAS Scholarship.</w:t>
       </w:r>
     </w:p>
     <w:bookmarkEnd w:id="64"/>
-    <w:bookmarkStart w:id="67" w:name="academic-service"/>
-    <w:p>
-      <w:pPr>
-        <w:pStyle w:val="Heading2"/>
-      </w:pPr>
-      <w:r>
-        <w:t xml:space="preserve">Academic Service</w:t>
-      </w:r>
-    </w:p>
-    <w:p>
-      <w:pPr>
-        <w:pStyle w:val="DefinitionTerm"/>
-      </w:pPr>
-      <w:r>
-        <w:t xml:space="preserve">2023-</w:t>
-      </w:r>
-    </w:p>
-    <w:p>
-      <w:pPr>
-        <w:pStyle w:val="Definition"/>
-      </w:pPr>
-      <w:hyperlink r:id="rId65"/>
-    </w:p>
-    <w:p>
-      <w:pPr>
-        <w:pStyle w:val="Definition"/>
-      </w:pPr>
-      <w:r>
-        <w:t xml:space="preserve">Editorial Board Member of Thai Forest Ecological Research Journal</w:t>
-      </w:r>
-    </w:p>
-    <w:p>
-      <w:pPr>
-        <w:pStyle w:val="DefinitionTerm"/>
-      </w:pPr>
-      <w:r>
-        <w:t xml:space="preserve">2015-2017</w:t>
-      </w:r>
-    </w:p>
-    <w:p>
-      <w:pPr>
-        <w:pStyle w:val="Definition"/>
-      </w:pPr>
-      <w:hyperlink r:id="rId65"/>
-    </w:p>
-    <w:p>
-      <w:pPr>
-        <w:pStyle w:val="Definition"/>
-      </w:pPr>
-      <w:r>
-        <w:t xml:space="preserve">Working Group Member of INNGE, International Network of Next-Generation Ecologists</w:t>
-      </w:r>
-    </w:p>
-    <w:p>
-      <w:pPr>
-        <w:pStyle w:val="DefinitionTerm"/>
-      </w:pPr>
-      <w:r>
-        <w:t xml:space="preserve">2015-2017</w:t>
-      </w:r>
-    </w:p>
-    <w:p>
-      <w:pPr>
-        <w:pStyle w:val="Definition"/>
-      </w:pPr>
-      <w:hyperlink r:id="rId65"/>
-    </w:p>
-    <w:p>
-      <w:pPr>
-        <w:pStyle w:val="Definition"/>
-      </w:pPr>
-      <w:r>
-        <w:t xml:space="preserve">INNGE manager, The Japan Society of Tropical Ecology</w:t>
-      </w:r>
-    </w:p>
-    <w:p>
-      <w:pPr>
-        <w:pStyle w:val="DefinitionTerm"/>
-      </w:pPr>
-      <w:r>
-        <w:t xml:space="preserve">2013-</w:t>
-      </w:r>
-    </w:p>
-    <w:p>
-      <w:pPr>
-        <w:pStyle w:val="Definition"/>
-      </w:pPr>
-      <w:hyperlink r:id="rId65"/>
-    </w:p>
-    <w:p>
-      <w:pPr>
-        <w:pStyle w:val="Definition"/>
-      </w:pPr>
-      <w:r>
-        <w:t xml:space="preserve">Statistical editor for Lepcey, The Journal of Tropical Asian Entomology</w:t>
-      </w:r>
-    </w:p>
-    <w:bookmarkStart w:id="66" w:name="reviewer-for-journals-12-per-year"/>
-    <w:p>
-      <w:pPr>
-        <w:pStyle w:val="Heading3"/>
-      </w:pPr>
-      <w:r>
-        <w:t xml:space="preserve">Reviewer for journals (~ 12 per year):</w:t>
-      </w:r>
-    </w:p>
-    <w:bookmarkEnd w:id="66"/>
-    <w:bookmarkEnd w:id="67"/>
-    <w:bookmarkStart w:id="68" w:name="awards-and-prizes"/>
-    <w:p>
-      <w:pPr>
-        <w:pStyle w:val="Heading2"/>
-      </w:pPr>
-      <w:r>
-        <w:t xml:space="preserve">Awards and Prizes</w:t>
-      </w:r>
-    </w:p>
-    <w:p>
-      <w:pPr>
-        <w:pStyle w:val="DefinitionTerm"/>
-      </w:pPr>
-      <w:r>
-        <w:t xml:space="preserve">2026</w:t>
-      </w:r>
-    </w:p>
-    <w:p>
-      <w:pPr>
-        <w:pStyle w:val="Definition"/>
-      </w:pPr>
-      <w:r>
-        <w:t xml:space="preserve">Outstanding Staff Award for the year of 2025, Xishuangbanna Tropical Botanical Garden, Chinese Academy of Sciences</w:t>
-      </w:r>
-    </w:p>
-    <w:p>
-      <w:pPr>
-        <w:pStyle w:val="DefinitionTerm"/>
-      </w:pPr>
-      <w:r>
-        <w:t xml:space="preserve">2012</w:t>
-      </w:r>
-    </w:p>
-    <w:p>
-      <w:pPr>
-        <w:pStyle w:val="Definition"/>
-      </w:pPr>
-      <w:r>
-        <w:t xml:space="preserve">Dean’s award for excellence, Graduate School of Life Sciences (Doctoral Program), Tohoku University</w:t>
-      </w:r>
-    </w:p>
-    <w:p>
-      <w:pPr>
-        <w:pStyle w:val="DefinitionTerm"/>
-      </w:pPr>
-      <w:r>
-        <w:t xml:space="preserve">2009</w:t>
-      </w:r>
-    </w:p>
-    <w:p>
-      <w:pPr>
-        <w:pStyle w:val="Definition"/>
-      </w:pPr>
-      <w:r>
-        <w:t xml:space="preserve">Dean’s award for excellence, Graduate School of Life Sciences (Master’s Program), Tohoku University</w:t>
-      </w:r>
-    </w:p>
-    <w:bookmarkEnd w:id="68"/>
-    <w:bookmarkStart w:id="69" w:name="invited-seminars"/>
-    <w:p>
-      <w:pPr>
-        <w:pStyle w:val="Heading2"/>
-      </w:pPr>
-      <w:r>
-        <w:t xml:space="preserve">Invited Seminars</w:t>
-      </w:r>
-    </w:p>
-    <w:p>
-      <w:pPr>
-        <w:pStyle w:val="DefinitionTerm"/>
-      </w:pPr>
-      <w:r>
-        <w:t xml:space="preserve">2021</w:t>
-      </w:r>
-    </w:p>
-    <w:p>
-      <w:pPr>
-        <w:pStyle w:val="Definition"/>
-      </w:pPr>
-      <w:r>
-        <w:t xml:space="preserve">Introduction to visualization using ggplot2, International Institute of Tropical Agriculture, Kenya</w:t>
-      </w:r>
-    </w:p>
-    <w:p>
-      <w:pPr>
-        <w:pStyle w:val="DefinitionTerm"/>
-      </w:pPr>
-      <w:r>
-        <w:t xml:space="preserve">2018</w:t>
-      </w:r>
-    </w:p>
-    <w:p>
-      <w:pPr>
-        <w:pStyle w:val="Definition"/>
-      </w:pPr>
-      <w:r>
-        <w:t xml:space="preserve">A quantitative model for divergent drivers of leaf trait variation within and among plant species, Xishuangbanna Tropical Botanical Garden, China</w:t>
-      </w:r>
-    </w:p>
-    <w:p>
-      <w:pPr>
-        <w:pStyle w:val="DefinitionTerm"/>
-      </w:pPr>
-      <w:r>
-        <w:t xml:space="preserve">2018</w:t>
-      </w:r>
-    </w:p>
-    <w:p>
-      <w:pPr>
-        <w:pStyle w:val="Definition"/>
-      </w:pPr>
-      <w:r>
-        <w:t xml:space="preserve">Species coexistence and functional traits. Graduate School of Life Sciences, Tohoku University, Japan</w:t>
-      </w:r>
-    </w:p>
-    <w:p>
-      <w:pPr>
-        <w:pStyle w:val="DefinitionTerm"/>
-      </w:pPr>
-      <w:r>
-        <w:t xml:space="preserve">2018</w:t>
-      </w:r>
-    </w:p>
-    <w:p>
-      <w:pPr>
-        <w:pStyle w:val="Definition"/>
-      </w:pPr>
-      <w:r>
-        <w:t xml:space="preserve">Species coexistence and functional traits. Graduate School of Environment and Information Sciences, Yokoyama National University, Japan</w:t>
-      </w:r>
-    </w:p>
-    <w:p>
-      <w:pPr>
-        <w:pStyle w:val="DefinitionTerm"/>
-      </w:pPr>
-      <w:r>
-        <w:t xml:space="preserve">2016</w:t>
-      </w:r>
-    </w:p>
-    <w:p>
-      <w:pPr>
-        <w:pStyle w:val="Definition"/>
-      </w:pPr>
-      <w:r>
-        <w:t xml:space="preserve">Decomposing leaf mass into photosynthetic and structural components explains divergent patterns of trait variation within and among plant species. Department of Ecology and Evolutionary Biology, Princeton University, NJ</w:t>
-      </w:r>
-    </w:p>
-    <w:p>
-      <w:pPr>
-        <w:pStyle w:val="DefinitionTerm"/>
-      </w:pPr>
-      <w:r>
-        <w:t xml:space="preserve">2013</w:t>
-      </w:r>
-    </w:p>
-    <w:p>
-      <w:pPr>
-        <w:pStyle w:val="Definition"/>
-      </w:pPr>
-      <w:r>
-        <w:t xml:space="preserve">Additive partitioning of functional diversity in plant communities, Xishuangbanna Tropical Botanical Garden, China</w:t>
-      </w:r>
-    </w:p>
-    <w:bookmarkEnd w:id="69"/>
-    <w:bookmarkStart w:id="70" w:name="international-meetings"/>
-    <w:p>
-      <w:pPr>
-        <w:pStyle w:val="Heading2"/>
-      </w:pPr>
-      <w:r>
-        <w:t xml:space="preserve">International Meetings</w:t>
-      </w:r>
-    </w:p>
-    <w:p>
-      <w:pPr>
-        <w:pStyle w:val="FirstParagraph"/>
-      </w:pPr>
-      <w:r>
-        <w:rPr>
-          <w:b/>
-          <w:bCs/>
-        </w:rPr>
-        <w:t xml:space="preserve">Invited</w:t>
-      </w:r>
-    </w:p>
-    <w:p>
-      <w:pPr>
-        <w:pStyle w:val="DefinitionTerm"/>
-      </w:pPr>
-      <w:r>
-        <w:t xml:space="preserve">2015</w:t>
-      </w:r>
-    </w:p>
-    <w:p>
-      <w:pPr>
-        <w:pStyle w:val="Definition"/>
-      </w:pPr>
-      <w:r>
-        <w:rPr>
-          <w:b/>
-          <w:bCs/>
-        </w:rPr>
-        <w:t xml:space="preserve">Masatoshi Katabuchi</w:t>
-      </w:r>
-      <w:r>
-        <w:t xml:space="preserve">,</w:t>
-      </w:r>
-      <w:r>
-        <w:t xml:space="preserve"> </w:t>
-      </w:r>
-      <w:r>
-        <w:t xml:space="preserve">“Future perspective for functional trait research”</w:t>
-      </w:r>
-      <w:r>
-        <w:t xml:space="preserve">, Organized session on</w:t>
-      </w:r>
-      <w:r>
-        <w:t xml:space="preserve"> </w:t>
-      </w:r>
-      <w:r>
-        <w:t xml:space="preserve">“Achievements and outstanding questions for trait-based forest ecology”</w:t>
-      </w:r>
-      <w:r>
-        <w:t xml:space="preserve">, 62nd ESJ Annual meeting, Kagoshima, Japan</w:t>
-      </w:r>
-    </w:p>
-    <w:p>
-      <w:pPr>
-        <w:pStyle w:val="DefinitionTerm"/>
-      </w:pPr>
-      <w:r>
-        <w:t xml:space="preserve">2014</w:t>
-      </w:r>
-    </w:p>
-    <w:p>
-      <w:pPr>
-        <w:pStyle w:val="Definition"/>
-      </w:pPr>
-      <w:r>
-        <w:rPr>
-          <w:b/>
-          <w:bCs/>
-        </w:rPr>
-        <w:t xml:space="preserve">Masatoshi Katabuchi (Organizer)</w:t>
-      </w:r>
-      <w:r>
-        <w:t xml:space="preserve">,</w:t>
-      </w:r>
-      <w:r>
-        <w:t xml:space="preserve"> </w:t>
-      </w:r>
-      <w:r>
-        <w:t xml:space="preserve">“Seedling dynamics and its consequence to community assembly processes in a tropical forest”</w:t>
-      </w:r>
-      <w:r>
-        <w:t xml:space="preserve">, Symposium on</w:t>
-      </w:r>
-      <w:r>
-        <w:t xml:space="preserve"> </w:t>
-      </w:r>
-      <w:r>
-        <w:t xml:space="preserve">“Integrating the structure and dynamics of tree communities to uncover the mechanisms underlying species coexistence”</w:t>
-      </w:r>
-      <w:r>
-        <w:t xml:space="preserve">, 61st ESJ Annual meeting, Hiroshima, Japan</w:t>
-      </w:r>
-    </w:p>
-    <w:p>
-      <w:pPr>
-        <w:pStyle w:val="DefinitionTerm"/>
-      </w:pPr>
-      <w:r>
-        <w:t xml:space="preserve">2011</w:t>
-      </w:r>
-    </w:p>
-    <w:p>
-      <w:pPr>
-        <w:pStyle w:val="Definition"/>
-      </w:pPr>
-      <w:r>
-        <w:rPr>
-          <w:b/>
-          <w:bCs/>
-        </w:rPr>
-        <w:t xml:space="preserve">Masatoshi Katabuchi</w:t>
-      </w:r>
-      <w:r>
-        <w:t xml:space="preserve"> </w:t>
-      </w:r>
-      <w:r>
-        <w:t xml:space="preserve">and Hiroko Kurokawa</w:t>
-      </w:r>
-      <w:r>
-        <w:t xml:space="preserve"> </w:t>
-      </w:r>
-      <w:r>
-        <w:t xml:space="preserve">“Community assembly and demography of tropical tree species”</w:t>
-      </w:r>
-      <w:r>
-        <w:t xml:space="preserve">, Workshop on</w:t>
-      </w:r>
-      <w:r>
-        <w:t xml:space="preserve"> </w:t>
-      </w:r>
-      <w:r>
-        <w:t xml:space="preserve">“Life history regulation of forest trees: towards cross-biome analysis”</w:t>
-      </w:r>
-      <w:r>
-        <w:t xml:space="preserve">, Sapporo, Japan</w:t>
-      </w:r>
-    </w:p>
-    <w:p>
-      <w:pPr>
-        <w:pStyle w:val="FirstParagraph"/>
-      </w:pPr>
-      <w:r>
-        <w:rPr>
-          <w:b/>
-          <w:bCs/>
-        </w:rPr>
-        <w:t xml:space="preserve">Submitted</w:t>
-      </w:r>
-    </w:p>
-    <w:p>
-      <w:pPr>
-        <w:pStyle w:val="DefinitionTerm"/>
-      </w:pPr>
-      <w:r>
-        <w:t xml:space="preserve">2019</w:t>
-      </w:r>
-    </w:p>
-    <w:p>
-      <w:pPr>
-        <w:pStyle w:val="Definition"/>
-      </w:pPr>
-      <w:r>
-        <w:rPr>
-          <w:b/>
-          <w:bCs/>
-        </w:rPr>
-        <w:t xml:space="preserve">Masatoshi Katabuchi</w:t>
-      </w:r>
-      <w:r>
-        <w:t xml:space="preserve">, Kaito Umemura, Thomas Koffel, Litchman Elena, Klausmeier A Christopher,</w:t>
-      </w:r>
-      <w:r>
-        <w:t xml:space="preserve"> </w:t>
-      </w:r>
-      <w:r>
-        <w:t xml:space="preserve">“Combining metacommunity and trait-based approaches predicts species abundances distributions in biological communities”</w:t>
-      </w:r>
-      <w:r>
-        <w:t xml:space="preserve">, 66th ESJ Annual meeting, Kobe, Japan</w:t>
-      </w:r>
-    </w:p>
-    <w:p>
-      <w:pPr>
-        <w:pStyle w:val="DefinitionTerm"/>
-      </w:pPr>
-      <w:r>
-        <w:t xml:space="preserve">2015</w:t>
-      </w:r>
-    </w:p>
-    <w:p>
-      <w:pPr>
-        <w:pStyle w:val="Definition"/>
-      </w:pPr>
-      <w:r>
-        <w:rPr>
-          <w:b/>
-          <w:bCs/>
-        </w:rPr>
-        <w:t xml:space="preserve">Masatoshi Katabuchi</w:t>
-      </w:r>
-      <w:r>
-        <w:t xml:space="preserve">, Kaoru Kitajima, Joesph Wright, Jeanne Osnas and Jeremy Lichstein</w:t>
-      </w:r>
-      <w:r>
-        <w:t xml:space="preserve"> </w:t>
-      </w:r>
-      <w:r>
-        <w:t xml:space="preserve">“Decomposing leaf mass into photosynthetic and structural components explains diverge patterns of trait variation within vs. among plant communities”</w:t>
-      </w:r>
-      <w:r>
-        <w:t xml:space="preserve">, 100th ESA Annual meeting, Baltimore, USA</w:t>
-      </w:r>
-    </w:p>
-    <w:p>
-      <w:pPr>
-        <w:pStyle w:val="DefinitionTerm"/>
-      </w:pPr>
-      <w:r>
-        <w:t xml:space="preserve">2014</w:t>
-      </w:r>
-    </w:p>
-    <w:p>
-      <w:pPr>
-        <w:pStyle w:val="Definition"/>
-      </w:pPr>
-      <w:r>
-        <w:rPr>
-          <w:b/>
-          <w:bCs/>
-        </w:rPr>
-        <w:t xml:space="preserve">Masatoshi Katabuchi</w:t>
-      </w:r>
-      <w:r>
-        <w:t xml:space="preserve">, Takehiro Sasaki, Chiho Kamiyama, Masaya Shimazaki, Tohru Nakashizuka and Kouki Hikosaka</w:t>
-      </w:r>
-      <w:r>
-        <w:t xml:space="preserve"> </w:t>
-      </w:r>
-      <w:r>
-        <w:t xml:space="preserve">“Intraspecific trait variations affect spatial patterns of functional diversity among moorland plant communities”</w:t>
-      </w:r>
-      <w:r>
-        <w:t xml:space="preserve">, 99th ESA Annual meeting, Sacramento, USA.</w:t>
-      </w:r>
-    </w:p>
-    <w:p>
-      <w:pPr>
-        <w:pStyle w:val="DefinitionTerm"/>
-      </w:pPr>
-      <w:r>
-        <w:t xml:space="preserve">2013</w:t>
-      </w:r>
-    </w:p>
-    <w:p>
-      <w:pPr>
-        <w:pStyle w:val="Definition"/>
-      </w:pPr>
-      <w:r>
-        <w:rPr>
-          <w:b/>
-          <w:bCs/>
-        </w:rPr>
-        <w:t xml:space="preserve">Masatoshi Katabuchi</w:t>
-      </w:r>
-      <w:r>
-        <w:t xml:space="preserve">, Sylvester Tan and Tohru Nakashizuka</w:t>
-      </w:r>
-      <w:r>
-        <w:t xml:space="preserve"> </w:t>
-      </w:r>
-      <w:r>
-        <w:t xml:space="preserve">“Negative density dependence reduces survival rates of common tree species in a species-rich tropical rain forest”</w:t>
-      </w:r>
-      <w:r>
-        <w:t xml:space="preserve">, ATBC, San Jose, Costa Rica</w:t>
-      </w:r>
-    </w:p>
-    <w:p>
-      <w:pPr>
-        <w:pStyle w:val="DefinitionTerm"/>
-      </w:pPr>
-      <w:r>
-        <w:t xml:space="preserve">2012</w:t>
-      </w:r>
-    </w:p>
-    <w:p>
-      <w:pPr>
-        <w:pStyle w:val="Definition"/>
-      </w:pPr>
-      <w:r>
-        <w:rPr>
-          <w:b/>
-          <w:bCs/>
-        </w:rPr>
-        <w:t xml:space="preserve">Masatoshi Katabuchi</w:t>
-      </w:r>
-      <w:r>
-        <w:t xml:space="preserve">, Hiroko Kurokawa, Stuart Davies, Sylvester Tan and Tohru Nakashizuka</w:t>
-      </w:r>
-      <w:r>
-        <w:t xml:space="preserve"> </w:t>
-      </w:r>
-      <w:r>
-        <w:t xml:space="preserve">“Soil resource availability shapes community trait structure in a species-rich dipterocarp forest”</w:t>
-      </w:r>
-      <w:r>
-        <w:t xml:space="preserve">, ATBC Asia-Pacific chapter, XTBG, China</w:t>
-      </w:r>
-    </w:p>
-    <w:p>
-      <w:pPr>
-        <w:pStyle w:val="DefinitionTerm"/>
-      </w:pPr>
-      <w:r>
-        <w:t xml:space="preserve">2011</w:t>
-      </w:r>
-    </w:p>
-    <w:p>
-      <w:pPr>
-        <w:pStyle w:val="Definition"/>
-      </w:pPr>
-      <w:r>
-        <w:rPr>
-          <w:b/>
-          <w:bCs/>
-        </w:rPr>
-        <w:t xml:space="preserve">Masatoshi Katabuchi</w:t>
-      </w:r>
-      <w:r>
-        <w:t xml:space="preserve">, Hiroko Kurokawa, Sylvester Tan, Stuart J. Davies, and Tohru Nakashizuka,</w:t>
-      </w:r>
-      <w:r>
-        <w:t xml:space="preserve"> </w:t>
-      </w:r>
-      <w:r>
-        <w:t xml:space="preserve">“Nonrandom abundance distributions of a tropical tree community: evidence from traits correlation at a local scale”</w:t>
-      </w:r>
-      <w:r>
-        <w:t xml:space="preserve">. ATBC, Arusha, Tanzania</w:t>
-      </w:r>
-    </w:p>
-    <w:p>
-      <w:pPr>
-        <w:pStyle w:val="DefinitionTerm"/>
-      </w:pPr>
-      <w:r>
-        <w:t xml:space="preserve">2010</w:t>
-      </w:r>
-    </w:p>
-    <w:p>
-      <w:pPr>
-        <w:pStyle w:val="Definition"/>
-      </w:pPr>
-      <w:r>
-        <w:rPr>
-          <w:b/>
-          <w:bCs/>
-        </w:rPr>
-        <w:t xml:space="preserve">Masatoshi Katabuchi</w:t>
-      </w:r>
-      <w:r>
-        <w:t xml:space="preserve">, Hiroko Kurokawa, Sylvester Tan, and Tohru Nakashizuka,</w:t>
-      </w:r>
-      <w:r>
-        <w:t xml:space="preserve"> </w:t>
-      </w:r>
-      <w:r>
-        <w:t xml:space="preserve">“Soil variation and functional trait assembly in a diverse dipterocarp forest”</w:t>
-      </w:r>
-      <w:r>
-        <w:t xml:space="preserve">. 95th ESA Annual meeting, Pittsburgh, USA</w:t>
-      </w:r>
-    </w:p>
-    <w:p>
-      <w:pPr>
-        <w:pStyle w:val="DefinitionTerm"/>
-      </w:pPr>
-      <w:r>
-        <w:t xml:space="preserve">2009</w:t>
-      </w:r>
-    </w:p>
-    <w:p>
-      <w:pPr>
-        <w:pStyle w:val="Definition"/>
-      </w:pPr>
-      <w:r>
-        <w:rPr>
-          <w:b/>
-          <w:bCs/>
-        </w:rPr>
-        <w:t xml:space="preserve">Masatoshi Katabuchi</w:t>
-      </w:r>
-      <w:r>
-        <w:t xml:space="preserve">, Jun Yokoyama, and Tohru Nakashizuka,</w:t>
-      </w:r>
-      <w:r>
-        <w:t xml:space="preserve"> </w:t>
-      </w:r>
-      <w:r>
-        <w:t xml:space="preserve">“Inbreeding and mating structure in a dioecious-fig pollinating wasp”</w:t>
-      </w:r>
-      <w:r>
-        <w:t xml:space="preserve">. ATBC, Marburg, Germany</w:t>
-      </w:r>
-    </w:p>
-    <w:bookmarkEnd w:id="70"/>
-    <w:bookmarkStart w:id="71" w:name="outreach"/>
-    <w:p>
-      <w:pPr>
-        <w:pStyle w:val="Heading2"/>
-      </w:pPr>
-      <w:r>
-        <w:t xml:space="preserve">Outreach</w:t>
-      </w:r>
-    </w:p>
-    <w:p>
-      <w:pPr>
-        <w:pStyle w:val="DefinitionTerm"/>
-      </w:pPr>
-      <w:r>
-        <w:t xml:space="preserve">2015</w:t>
-      </w:r>
-    </w:p>
-    <w:p>
-      <w:pPr>
-        <w:pStyle w:val="Definition"/>
-      </w:pPr>
-      <w:r>
-        <w:t xml:space="preserve">Masatoshi Katabuchi</w:t>
-      </w:r>
-      <w:r>
-        <w:t xml:space="preserve"> </w:t>
-      </w:r>
-      <w:r>
-        <w:t xml:space="preserve">“Leaves and tropical rainforests”</w:t>
-      </w:r>
-      <w:r>
-        <w:t xml:space="preserve">. Invited by the Japanese Association of Interdisciplinary Study Group in University Florida</w:t>
-      </w:r>
-    </w:p>
-    <w:bookmarkEnd w:id="71"/>
-    <w:bookmarkStart w:id="72" w:name="languages"/>
-    <w:p>
-      <w:pPr>
-        <w:pStyle w:val="Heading2"/>
-      </w:pPr>
-      <w:r>
-        <w:t xml:space="preserve">Languages</w:t>
-      </w:r>
-    </w:p>
-    <w:p>
-      <w:pPr>
-        <w:pStyle w:val="FirstParagraph"/>
-      </w:pPr>
-      <w:r>
-        <w:t xml:space="preserve">Japanese (native), English (fluent), Malay (basic), Chinese-Mandarin (basic)</w:t>
-      </w:r>
-    </w:p>
-    <w:bookmarkEnd w:id="72"/>
-    <w:bookmarkStart w:id="73" w:name="graduate-students"/>
-    <w:p>
-      <w:pPr>
-        <w:pStyle w:val="Heading2"/>
-      </w:pPr>
-      <w:r>
-        <w:t xml:space="preserve">Graduate Students</w:t>
-      </w:r>
-    </w:p>
-    <w:p>
-      <w:pPr>
-        <w:pStyle w:val="FirstParagraph"/>
-      </w:pPr>
-      <w:r>
-        <w:t xml:space="preserve">Thi Duyen Nguyen, 2021 - 2025, M.Sc. Student, Recipient of ANSO Scholarship.</w:t>
-      </w:r>
-    </w:p>
-    <w:p>
-      <w:pPr>
-        <w:pStyle w:val="TextBody"/>
-      </w:pPr>
-      <w:r>
-        <w:t xml:space="preserve">Zhou Cong, 2021 - 2023, M.Sc. Student, Recipient of UCAS Scholarship.</w:t>
-      </w:r>
-    </w:p>
-    <w:bookmarkEnd w:id="73"/>
     <w:sectPr>
-      <w:headerReference r:id="rId9" w:type="default"/>
+      <w:headerReference r:id="rId3" w:type="default"/>
       <w:footnotePr>
         <w:numFmt w:val="decimal"/>
       </w:footnotePr>

</xml_diff>

<commit_message>
Deploying to gh-pages from @ mattocci27/my-cv@0f77991a734258e59f06f034902c753bfb3ac2b3 🚀
</commit_message>
<xml_diff>
--- a/Katabuchi_CV.docx
+++ b/Katabuchi_CV.docx
@@ -594,7 +594,7 @@
       </w:r>
     </w:p>
     <w:bookmarkEnd w:id="16"/>
-    <w:bookmarkStart w:id="49" w:name="publications"/>
+    <w:bookmarkStart w:id="51" w:name="publications"/>
     <w:p>
       <w:pPr>
         <w:pStyle w:val="Heading2"/>
@@ -1574,7 +1574,7 @@
         </w:numPr>
       </w:pPr>
       <w:r>
-        <w:t xml:space="preserve">Siefert, A., Violle, C., Chalmandrier, L., Albert, C. H., Taudiere, A., Fajardo, A., Aarssen, L. W., Baraloto, C., Carlucci, M. B., Cianciaruso, M. V., de L. Dantas, V., de Bello, F., Duarte, L. D. S., Fonseca, C. R., Freschet, G. T., Gaucherand, S., Gross, N., Hikosaka, K., Jackson, B., Jung, V., Kamiyama, C.,</w:t>
+        <w:t xml:space="preserve">Siefert, A.*, Violle, C., Chalmandrier, L., Albert, C. H., Taudiere, A., Fajardo, A., Aarssen, L. W., Baraloto, C., Carlucci, M. B., Cianciaruso, M. V., de L. Dantas, V., de Bello, F., Duarte, L. D. S., Fonseca, C. R., Freschet, G. T., Gaucherand, S., Gross, N., Hikosaka, K., Jackson, B., Jung, V., Kamiyama, C.,</w:t>
       </w:r>
       <w:r>
         <w:t xml:space="preserve"> </w:t>
@@ -1589,26 +1589,11 @@
       <w:r>
         <w:t xml:space="preserve">, Kembel, S. W., Kichenin, E., Kraft, N. J. B., Lagerström, A., Bagousse-Pinguet, Y. L., Li, Y., Mason, N., Messier, J., Nakashizuka, T., Overton, J. M., Peltzer, D. A., Pérez-Ramos, I. M., Pillar, V. D., Prentice, H. C., Richardson, S., Sasaki, T., Schamp, B. S., Schöb, C., Shipley, B., Sundqvist, M., Sykes, M. T., Vandewalle, M. &amp; Wardle, D. A.</w:t>
       </w:r>
-    </w:p>
-    <w:p>
-      <w:pPr>
-        <w:numPr>
-          <w:ilvl w:val="0"/>
-          <w:numId w:val="1001"/>
-        </w:numPr>
-      </w:pPr>
-      <w:r>
-        <w:rPr>
-          <w:b/>
-          <w:bCs/>
-        </w:rPr>
-        <w:t xml:space="preserve">Katabuchi, M.*</w:t>
-      </w:r>
-      <w:r>
-        <w:t xml:space="preserve"> </w:t>
-      </w:r>
-      <w:r>
-        <w:t xml:space="preserve">LeafArea: An R package for rapid digital image analysis of leaf area.</w:t>
+      <w:r>
+        <w:t xml:space="preserve"> </w:t>
+      </w:r>
+      <w:r>
+        <w:t xml:space="preserve">A global meta-analysis of the relative extent of intraspecific trait variation in plant communities.</w:t>
       </w:r>
       <w:r>
         <w:t xml:space="preserve"> </w:t>
@@ -1620,13 +1605,13 @@
           <w:i/>
           <w:iCs/>
         </w:rPr>
-        <w:t xml:space="preserve">Ecological Research</w:t>
-      </w:r>
-      <w:r>
-        <w:t xml:space="preserve"> </w:t>
-      </w:r>
-      <w:r>
-        <w:t xml:space="preserve">30, 1073–1077 (2015)</w:t>
+        <w:t xml:space="preserve">Ecology Letters</w:t>
+      </w:r>
+      <w:r>
+        <w:t xml:space="preserve"> </w:t>
+      </w:r>
+      <w:r>
+        <w:t xml:space="preserve">18, 1406–1419 (2015)</w:t>
       </w:r>
       <w:r>
         <w:t xml:space="preserve"> </w:t>
@@ -1651,47 +1636,17 @@
         </w:numPr>
       </w:pPr>
       <w:r>
-        <w:t xml:space="preserve">Ashton, L. A., Nakamura, A., Basset, Y., Burwell, C. J., Cao, M., Eastwood, R., Odell, E., de Oliveira, E. G., Hurley, K.,</w:t>
-      </w:r>
-      <w:r>
-        <w:t xml:space="preserve"> </w:t>
-      </w:r>
-      <w:r>
-        <w:rPr>
-          <w:b/>
-          <w:bCs/>
-        </w:rPr>
-        <w:t xml:space="preserve">Katabuchi, M.</w:t>
-      </w:r>
-      <w:r>
-        <w:t xml:space="preserve">, Maunsell, S., Mcbroom, J., Schmidl, J., Sun, Z., Tang, Y., Whitaker, T., Laidlaw, M. J., Mcdonald, W. J. F. &amp; Kitching, R. L.</w:t>
-      </w:r>
-    </w:p>
-    <w:p>
-      <w:pPr>
-        <w:numPr>
-          <w:ilvl w:val="0"/>
-          <w:numId w:val="1001"/>
-        </w:numPr>
-      </w:pPr>
-      <w:r>
-        <w:t xml:space="preserve">Nakamura, A.*, Burwell, C. J., Ashton, L. A., Laidlaw, M. J.,</w:t>
-      </w:r>
-      <w:r>
-        <w:t xml:space="preserve"> </w:t>
-      </w:r>
-      <w:r>
-        <w:rPr>
-          <w:b/>
-          <w:bCs/>
-        </w:rPr>
-        <w:t xml:space="preserve">Katabuchi, M.</w:t>
-      </w:r>
-      <w:r>
-        <w:t xml:space="preserve"> </w:t>
-      </w:r>
-      <w:r>
-        <w:t xml:space="preserve">&amp; Kitching, R. L. Identifying indicator species of elevation: Comparing the utility of woody plants, ants and moths for long-term monitoring.</w:t>
+        <w:rPr>
+          <w:b/>
+          <w:bCs/>
+        </w:rPr>
+        <w:t xml:space="preserve">Katabuchi, M.*</w:t>
+      </w:r>
+      <w:r>
+        <w:t xml:space="preserve"> </w:t>
+      </w:r>
+      <w:r>
+        <w:t xml:space="preserve">LeafArea: An R package for rapid digital image analysis of leaf area.</w:t>
       </w:r>
       <w:r>
         <w:t xml:space="preserve"> </w:t>
@@ -1703,13 +1658,13 @@
           <w:i/>
           <w:iCs/>
         </w:rPr>
-        <w:t xml:space="preserve">Austral Ecology</w:t>
-      </w:r>
-      <w:r>
-        <w:t xml:space="preserve"> </w:t>
-      </w:r>
-      <w:r>
-        <w:t xml:space="preserve">41, 179–188 (2016)</w:t>
+        <w:t xml:space="preserve">Ecological Research</w:t>
+      </w:r>
+      <w:r>
+        <w:t xml:space="preserve"> </w:t>
+      </w:r>
+      <w:r>
+        <w:t xml:space="preserve">30, 1073–1077 (2015)</w:t>
       </w:r>
       <w:r>
         <w:t xml:space="preserve"> </w:t>
@@ -1734,7 +1689,7 @@
         </w:numPr>
       </w:pPr>
       <w:r>
-        <w:t xml:space="preserve">Nakamura, A.*, Burwell, C. J., Lambkin, C. L.,</w:t>
+        <w:t xml:space="preserve">Ashton, L. A., Nakamura, A.*, Basset, Y., Burwell, C. J., Cao, M., Eastwood, R., Odell, E., de Oliveira, E. G., Hurley, K.,</w:t>
       </w:r>
       <w:r>
         <w:t xml:space="preserve"> </w:t>
@@ -1747,7 +1702,13 @@
         <w:t xml:space="preserve">Katabuchi, M.</w:t>
       </w:r>
       <w:r>
-        <w:t xml:space="preserve">, Mcdougall, A., Raven, R. J. &amp; Neldner, V. J. The role of human disturbance in island biogeography of arthropods and plants: An information theoretic approach.</w:t>
+        <w:t xml:space="preserve">, Maunsell, S., Mcbroom, J., Schmidl, J., Sun, Z., Tang, Y., Whitaker, T., Laidlaw, M. J., Mcdonald, W. J. F. &amp; Kitching, R. L.</w:t>
+      </w:r>
+      <w:r>
+        <w:t xml:space="preserve"> </w:t>
+      </w:r>
+      <w:r>
+        <w:t xml:space="preserve">Vertical stratification of moths across elevation and latitude.</w:t>
       </w:r>
       <w:r>
         <w:t xml:space="preserve"> </w:t>
@@ -1765,7 +1726,7 @@
         <w:t xml:space="preserve"> </w:t>
       </w:r>
       <w:r>
-        <w:t xml:space="preserve">42, 1406–1417 (2015)</w:t>
+        <w:t xml:space="preserve">43, 59–69 (2016)</w:t>
       </w:r>
       <w:r>
         <w:t xml:space="preserve"> </w:t>
@@ -1790,7 +1751,7 @@
         </w:numPr>
       </w:pPr>
       <w:r>
-        <w:t xml:space="preserve">Deng, X., Mohandass, D.*,</w:t>
+        <w:t xml:space="preserve">Nakamura, A.*, Burwell, C. J., Ashton, L. A., Laidlaw, M. J.,</w:t>
       </w:r>
       <w:r>
         <w:t xml:space="preserve"> </w:t>
@@ -1803,51 +1764,28 @@
         <w:t xml:space="preserve">Katabuchi, M.</w:t>
       </w:r>
       <w:r>
-        <w:t xml:space="preserve">, Hughes, A. C. &amp; Roubik, D. W. Impact of Striped-Squirrel Nectar-Robbing Behaviour on Gender Fitness in</w:t>
-      </w:r>
-      <w:r>
-        <w:t xml:space="preserve"> </w:t>
-      </w:r>
-      <w:r>
-        <w:rPr>
+        <w:t xml:space="preserve"> </w:t>
+      </w:r>
+      <w:r>
+        <w:t xml:space="preserve">&amp; Kitching, R. L. Identifying indicator species of elevation: Comparing the utility of woody plants, ants and moths for long-term monitoring.</w:t>
+      </w:r>
+      <w:r>
+        <w:t xml:space="preserve"> </w:t>
+      </w:r>
+      <w:r>
+        <w:rPr>
+          <w:b/>
+          <w:bCs/>
           <w:i/>
           <w:iCs/>
         </w:rPr>
-        <w:t xml:space="preserve">Alpinia</w:t>
-      </w:r>
-      <w:r>
-        <w:t xml:space="preserve"> </w:t>
-      </w:r>
-      <w:r>
-        <w:rPr>
-          <w:i/>
-          <w:iCs/>
-        </w:rPr>
-        <w:t xml:space="preserve">Roxburghii</w:t>
-      </w:r>
-      <w:r>
-        <w:t xml:space="preserve"> </w:t>
-      </w:r>
-      <w:r>
-        <w:t xml:space="preserve">Sweet (Zingiberaceae).</w:t>
-      </w:r>
-      <w:r>
-        <w:t xml:space="preserve"> </w:t>
-      </w:r>
-      <w:r>
-        <w:rPr>
-          <w:b/>
-          <w:bCs/>
-          <w:i/>
-          <w:iCs/>
-        </w:rPr>
-        <w:t xml:space="preserve">PLoS ONE</w:t>
-      </w:r>
-      <w:r>
-        <w:t xml:space="preserve"> </w:t>
-      </w:r>
-      <w:r>
-        <w:t xml:space="preserve">10, (2015)</w:t>
+        <w:t xml:space="preserve">Austral Ecology</w:t>
+      </w:r>
+      <w:r>
+        <w:t xml:space="preserve"> </w:t>
+      </w:r>
+      <w:r>
+        <w:t xml:space="preserve">41, 179–188 (2016)</w:t>
       </w:r>
       <w:r>
         <w:t xml:space="preserve"> </w:t>
@@ -1872,7 +1810,7 @@
         </w:numPr>
       </w:pPr>
       <w:r>
-        <w:t xml:space="preserve">Hikosaka, K.*, Sasaki, T., Kamiyama, C.,</w:t>
+        <w:t xml:space="preserve">Nakamura, A.*, Burwell, C. J., Lambkin, C. L.,</w:t>
       </w:r>
       <w:r>
         <w:t xml:space="preserve"> </w:t>
@@ -1885,7 +1823,7 @@
         <w:t xml:space="preserve">Katabuchi, M.</w:t>
       </w:r>
       <w:r>
-        <w:t xml:space="preserve">, Oikawa, S., Shimazaki, M., Kimura, K. &amp; Nakshizuka, T. Understanding of species niche, coexistence and extinction based on functional traits : Approaches from community and physiological ecology for subalpine moorland plant communities [in Japanese].</w:t>
+        <w:t xml:space="preserve">, Mcdougall, A., Raven, R. J. &amp; Neldner, V. J. The role of human disturbance in island biogeography of arthropods and plants: An information theoretic approach.</w:t>
       </w:r>
       <w:r>
         <w:t xml:space="preserve"> </w:t>
@@ -1897,55 +1835,13 @@
           <w:i/>
           <w:iCs/>
         </w:rPr>
-        <w:t xml:space="preserve">Chikyu-Kankyo</w:t>
-      </w:r>
-      <w:r>
-        <w:t xml:space="preserve"> </w:t>
-      </w:r>
-      <w:r>
-        <w:t xml:space="preserve">19, 33–46 (2014).</w:t>
-      </w:r>
-    </w:p>
-    <w:p>
-      <w:pPr>
-        <w:numPr>
-          <w:ilvl w:val="0"/>
-          <w:numId w:val="1001"/>
-        </w:numPr>
-      </w:pPr>
-      <w:r>
-        <w:t xml:space="preserve">Kamiyama, C.*,</w:t>
-      </w:r>
-      <w:r>
-        <w:t xml:space="preserve"> </w:t>
-      </w:r>
-      <w:r>
-        <w:rPr>
-          <w:b/>
-          <w:bCs/>
-        </w:rPr>
-        <w:t xml:space="preserve">Katabuchi, M.</w:t>
-      </w:r>
-      <w:r>
-        <w:t xml:space="preserve">, Sasaki, T., Shimazaki, M., Nakashizuka, T. &amp; Hikosaka, K. Leaf-trait responses to environmental gradients in moorland communities: Contribution of intraspecific variation, species replacement and functional group replacement.</w:t>
-      </w:r>
-      <w:r>
-        <w:t xml:space="preserve"> </w:t>
-      </w:r>
-      <w:r>
-        <w:rPr>
-          <w:b/>
-          <w:bCs/>
-          <w:i/>
-          <w:iCs/>
-        </w:rPr>
-        <w:t xml:space="preserve">Ecological Research</w:t>
-      </w:r>
-      <w:r>
-        <w:t xml:space="preserve"> </w:t>
-      </w:r>
-      <w:r>
-        <w:t xml:space="preserve">29, 607–617 (2014)</w:t>
+        <w:t xml:space="preserve">Journal of Biogeography</w:t>
+      </w:r>
+      <w:r>
+        <w:t xml:space="preserve"> </w:t>
+      </w:r>
+      <w:r>
+        <w:t xml:space="preserve">42, 1406–1417 (2015)</w:t>
       </w:r>
       <w:r>
         <w:t xml:space="preserve"> </w:t>
@@ -1970,7 +1866,7 @@
         </w:numPr>
       </w:pPr>
       <w:r>
-        <w:t xml:space="preserve">Sasaki, T.*,</w:t>
+        <w:t xml:space="preserve">Deng, X., Mohandass, D.*,</w:t>
       </w:r>
       <w:r>
         <w:t xml:space="preserve"> </w:t>
@@ -1983,25 +1879,51 @@
         <w:t xml:space="preserve">Katabuchi, M.</w:t>
       </w:r>
       <w:r>
-        <w:t xml:space="preserve">, Kamiyama, C., Shimazaki, M., Nakashizuka, T. &amp; Hikosaka, K. Vulnerability of moorland plant communities to environmental change: Consequences of realistic species loss on functional diversity.</w:t>
-      </w:r>
-      <w:r>
-        <w:t xml:space="preserve"> </w:t>
-      </w:r>
-      <w:r>
-        <w:rPr>
-          <w:b/>
-          <w:bCs/>
+        <w:t xml:space="preserve">, Hughes, A. C. &amp; Roubik, D. W. Impact of Striped-Squirrel Nectar-Robbing Behaviour on Gender Fitness in</w:t>
+      </w:r>
+      <w:r>
+        <w:t xml:space="preserve"> </w:t>
+      </w:r>
+      <w:r>
+        <w:rPr>
           <w:i/>
           <w:iCs/>
         </w:rPr>
-        <w:t xml:space="preserve">Journal of Applied Ecology</w:t>
-      </w:r>
-      <w:r>
-        <w:t xml:space="preserve"> </w:t>
-      </w:r>
-      <w:r>
-        <w:t xml:space="preserve">51, 299–308 (2014)</w:t>
+        <w:t xml:space="preserve">Alpinia</w:t>
+      </w:r>
+      <w:r>
+        <w:t xml:space="preserve"> </w:t>
+      </w:r>
+      <w:r>
+        <w:rPr>
+          <w:i/>
+          <w:iCs/>
+        </w:rPr>
+        <w:t xml:space="preserve">Roxburghii</w:t>
+      </w:r>
+      <w:r>
+        <w:t xml:space="preserve"> </w:t>
+      </w:r>
+      <w:r>
+        <w:t xml:space="preserve">Sweet (Zingiberaceae).</w:t>
+      </w:r>
+      <w:r>
+        <w:t xml:space="preserve"> </w:t>
+      </w:r>
+      <w:r>
+        <w:rPr>
+          <w:b/>
+          <w:bCs/>
+          <w:i/>
+          <w:iCs/>
+        </w:rPr>
+        <w:t xml:space="preserve">PLoS ONE</w:t>
+      </w:r>
+      <w:r>
+        <w:t xml:space="preserve"> </w:t>
+      </w:r>
+      <w:r>
+        <w:t xml:space="preserve">10, (2015)</w:t>
       </w:r>
       <w:r>
         <w:t xml:space="preserve"> </w:t>
@@ -2026,7 +1948,7 @@
         </w:numPr>
       </w:pPr>
       <w:r>
-        <w:t xml:space="preserve">Cádiz, A., Nagata, N.,</w:t>
+        <w:t xml:space="preserve">Hikosaka, K.*, Sasaki, T., Kamiyama, C.,</w:t>
       </w:r>
       <w:r>
         <w:t xml:space="preserve"> </w:t>
@@ -2039,7 +1961,7 @@
         <w:t xml:space="preserve">Katabuchi, M.</w:t>
       </w:r>
       <w:r>
-        <w:t xml:space="preserve">, DíAZ, L. M., ECHENIQUE-DíAZ, L. M., Akashi, H. D., Makino, T. &amp; Kawata, M.* Relative importance of habitat use, range expansion, and speciation in local species diversity of anolis lizards in cuba.</w:t>
+        <w:t xml:space="preserve">, Oikawa, S., Shimazaki, M., Kimura, K. &amp; Nakshizuka, T. Understanding of species niche, coexistence and extinction based on functional traits : Approaches from community and physiological ecology for subalpine moorland plant communities [in Japanese].</w:t>
       </w:r>
       <w:r>
         <w:t xml:space="preserve"> </w:t>
@@ -2051,13 +1973,55 @@
           <w:i/>
           <w:iCs/>
         </w:rPr>
-        <w:t xml:space="preserve">Ecosphere</w:t>
-      </w:r>
-      <w:r>
-        <w:t xml:space="preserve"> </w:t>
-      </w:r>
-      <w:r>
-        <w:t xml:space="preserve">4, (2013)</w:t>
+        <w:t xml:space="preserve">Chikyu-Kankyo</w:t>
+      </w:r>
+      <w:r>
+        <w:t xml:space="preserve"> </w:t>
+      </w:r>
+      <w:r>
+        <w:t xml:space="preserve">19, 33–46 (2014).</w:t>
+      </w:r>
+    </w:p>
+    <w:p>
+      <w:pPr>
+        <w:numPr>
+          <w:ilvl w:val="0"/>
+          <w:numId w:val="1001"/>
+        </w:numPr>
+      </w:pPr>
+      <w:r>
+        <w:t xml:space="preserve">Kamiyama, C.*,</w:t>
+      </w:r>
+      <w:r>
+        <w:t xml:space="preserve"> </w:t>
+      </w:r>
+      <w:r>
+        <w:rPr>
+          <w:b/>
+          <w:bCs/>
+        </w:rPr>
+        <w:t xml:space="preserve">Katabuchi, M.</w:t>
+      </w:r>
+      <w:r>
+        <w:t xml:space="preserve">, Sasaki, T., Shimazaki, M., Nakashizuka, T. &amp; Hikosaka, K. Leaf-trait responses to environmental gradients in moorland communities: Contribution of intraspecific variation, species replacement and functional group replacement.</w:t>
+      </w:r>
+      <w:r>
+        <w:t xml:space="preserve"> </w:t>
+      </w:r>
+      <w:r>
+        <w:rPr>
+          <w:b/>
+          <w:bCs/>
+          <w:i/>
+          <w:iCs/>
+        </w:rPr>
+        <w:t xml:space="preserve">Ecological Research</w:t>
+      </w:r>
+      <w:r>
+        <w:t xml:space="preserve"> </w:t>
+      </w:r>
+      <w:r>
+        <w:t xml:space="preserve">29, 607–617 (2014)</w:t>
       </w:r>
       <w:r>
         <w:t xml:space="preserve"> </w:t>
@@ -2082,7 +2046,7 @@
         </w:numPr>
       </w:pPr>
       <w:r>
-        <w:t xml:space="preserve">Asanok, L.*, Marod, D., Duengkae, P., Pranmongkol, U., Kurokawa, H., Aiba, M.,</w:t>
+        <w:t xml:space="preserve">Sasaki, T.*,</w:t>
       </w:r>
       <w:r>
         <w:t xml:space="preserve"> </w:t>
@@ -2095,10 +2059,7 @@
         <w:t xml:space="preserve">Katabuchi, M.</w:t>
       </w:r>
       <w:r>
-        <w:t xml:space="preserve"> </w:t>
-      </w:r>
-      <w:r>
-        <w:t xml:space="preserve">&amp; Nakashizuka, T. Relationships between functional traits and the ability of forest tree species to reestablish in secondary forest and enrichment plantations in the uplands of northern Thailand.</w:t>
+        <w:t xml:space="preserve">, Kamiyama, C., Shimazaki, M., Nakashizuka, T. &amp; Hikosaka, K. Vulnerability of moorland plant communities to environmental change: Consequences of realistic species loss on functional diversity.</w:t>
       </w:r>
       <w:r>
         <w:t xml:space="preserve"> </w:t>
@@ -2110,13 +2071,13 @@
           <w:i/>
           <w:iCs/>
         </w:rPr>
-        <w:t xml:space="preserve">Forest Ecology and Management</w:t>
-      </w:r>
-      <w:r>
-        <w:t xml:space="preserve"> </w:t>
-      </w:r>
-      <w:r>
-        <w:t xml:space="preserve">296, 9–23 (2013)</w:t>
+        <w:t xml:space="preserve">Journal of Applied Ecology</w:t>
+      </w:r>
+      <w:r>
+        <w:t xml:space="preserve"> </w:t>
+      </w:r>
+      <w:r>
+        <w:t xml:space="preserve">51, 299–308 (2014)</w:t>
       </w:r>
       <w:r>
         <w:t xml:space="preserve"> </w:t>
@@ -2141,7 +2102,7 @@
         </w:numPr>
       </w:pPr>
       <w:r>
-        <w:t xml:space="preserve">Sasaki, T.*,</w:t>
+        <w:t xml:space="preserve">Cádiz, A., Nagata, N.,</w:t>
       </w:r>
       <w:r>
         <w:t xml:space="preserve"> </w:t>
@@ -2154,7 +2115,7 @@
         <w:t xml:space="preserve">Katabuchi, M.</w:t>
       </w:r>
       <w:r>
-        <w:t xml:space="preserve">, Kamiyama, C., Shimazaki, M., Nakashizuka, T. &amp; Hikosaka, K. Variations in species composition of moorland plant communities along environmental gradients within a subalpine zone in northern japan.</w:t>
+        <w:t xml:space="preserve">, DíAZ, L. M., ECHENIQUE-DíAZ, L. M., Akashi, H. D., Makino, T. &amp; Kawata, M.* Relative importance of habitat use, range expansion, and speciation in local species diversity of anolis lizards in cuba.</w:t>
       </w:r>
       <w:r>
         <w:t xml:space="preserve"> </w:t>
@@ -2166,13 +2127,13 @@
           <w:i/>
           <w:iCs/>
         </w:rPr>
-        <w:t xml:space="preserve">Wetlands</w:t>
-      </w:r>
-      <w:r>
-        <w:t xml:space="preserve"> </w:t>
-      </w:r>
-      <w:r>
-        <w:t xml:space="preserve">33, 269–277 (2013)</w:t>
+        <w:t xml:space="preserve">Ecosphere</w:t>
+      </w:r>
+      <w:r>
+        <w:t xml:space="preserve"> </w:t>
+      </w:r>
+      <w:r>
+        <w:t xml:space="preserve">4, (2013)</w:t>
       </w:r>
       <w:r>
         <w:t xml:space="preserve"> </w:t>
@@ -2197,7 +2158,7 @@
         </w:numPr>
       </w:pPr>
       <w:r>
-        <w:t xml:space="preserve">Aiba, M.*,</w:t>
+        <w:t xml:space="preserve">Asanok, L.*, Marod, D., Duengkae, P., Pranmongkol, U., Kurokawa, H., Aiba, M.,</w:t>
       </w:r>
       <w:r>
         <w:t xml:space="preserve"> </w:t>
@@ -2210,7 +2171,10 @@
         <w:t xml:space="preserve">Katabuchi, M.</w:t>
       </w:r>
       <w:r>
-        <w:t xml:space="preserve">, Takafumi, H., Matsuzaki, S. I. S., Sasaki, T. &amp; Hiura, T. Robustness of trait distribution metrics for community assembly studies under the uncertainties of assembly processes.</w:t>
+        <w:t xml:space="preserve"> </w:t>
+      </w:r>
+      <w:r>
+        <w:t xml:space="preserve">&amp; Nakashizuka, T. Relationships between functional traits and the ability of forest tree species to reestablish in secondary forest and enrichment plantations in the uplands of northern Thailand.</w:t>
       </w:r>
       <w:r>
         <w:t xml:space="preserve"> </w:t>
@@ -2222,13 +2186,13 @@
           <w:i/>
           <w:iCs/>
         </w:rPr>
-        <w:t xml:space="preserve">Ecology</w:t>
-      </w:r>
-      <w:r>
-        <w:t xml:space="preserve"> </w:t>
-      </w:r>
-      <w:r>
-        <w:t xml:space="preserve">94, 2873–2885 (2013)</w:t>
+        <w:t xml:space="preserve">Forest Ecology and Management</w:t>
+      </w:r>
+      <w:r>
+        <w:t xml:space="preserve"> </w:t>
+      </w:r>
+      <w:r>
+        <w:t xml:space="preserve">296, 9–23 (2013)</w:t>
       </w:r>
       <w:r>
         <w:t xml:space="preserve"> </w:t>
@@ -2266,7 +2230,7 @@
         <w:t xml:space="preserve">Katabuchi, M.</w:t>
       </w:r>
       <w:r>
-        <w:t xml:space="preserve">, Kamiyama, C., Shimazaki, M., Nakashizuka, T. &amp; Hikosaka, K. Nestedness and niche-based species loss in moorland plant communities.</w:t>
+        <w:t xml:space="preserve">, Kamiyama, C., Shimazaki, M., Nakashizuka, T. &amp; Hikosaka, K. Variations in species composition of moorland plant communities along environmental gradients within a subalpine zone in northern japan.</w:t>
       </w:r>
       <w:r>
         <w:t xml:space="preserve"> </w:t>
@@ -2278,13 +2242,13 @@
           <w:i/>
           <w:iCs/>
         </w:rPr>
-        <w:t xml:space="preserve">Oikos</w:t>
-      </w:r>
-      <w:r>
-        <w:t xml:space="preserve"> </w:t>
-      </w:r>
-      <w:r>
-        <w:t xml:space="preserve">121, 1783–1790 (2012)</w:t>
+        <w:t xml:space="preserve">Wetlands</w:t>
+      </w:r>
+      <w:r>
+        <w:t xml:space="preserve"> </w:t>
+      </w:r>
+      <w:r>
+        <w:t xml:space="preserve">33, 269–277 (2013)</w:t>
       </w:r>
       <w:r>
         <w:t xml:space="preserve"> </w:t>
@@ -2309,7 +2273,7 @@
         </w:numPr>
       </w:pPr>
       <w:r>
-        <w:t xml:space="preserve">Sasaki, T.*,</w:t>
+        <w:t xml:space="preserve">Aiba, M.*,</w:t>
       </w:r>
       <w:r>
         <w:t xml:space="preserve"> </w:t>
@@ -2322,7 +2286,7 @@
         <w:t xml:space="preserve">Katabuchi, M.</w:t>
       </w:r>
       <w:r>
-        <w:t xml:space="preserve">, Kamiyama, C., Shimazaki, M., Nakashizuka, T. &amp; Hikosaka, K. Diversity partitioning of moorland plant communities across hierarchical spatial scales.</w:t>
+        <w:t xml:space="preserve">, Takafumi, H., Matsuzaki, S. I. S., Sasaki, T. &amp; Hiura, T. Robustness of trait distribution metrics for community assembly studies under the uncertainties of assembly processes.</w:t>
       </w:r>
       <w:r>
         <w:t xml:space="preserve"> </w:t>
@@ -2334,13 +2298,13 @@
           <w:i/>
           <w:iCs/>
         </w:rPr>
-        <w:t xml:space="preserve">Biodiversity and Conservation</w:t>
-      </w:r>
-      <w:r>
-        <w:t xml:space="preserve"> </w:t>
-      </w:r>
-      <w:r>
-        <w:t xml:space="preserve">21, 1577–1588 (2012)</w:t>
+        <w:t xml:space="preserve">Ecology</w:t>
+      </w:r>
+      <w:r>
+        <w:t xml:space="preserve"> </w:t>
+      </w:r>
+      <w:r>
+        <w:t xml:space="preserve">94, 2873–2885 (2013)</w:t>
       </w:r>
       <w:r>
         <w:t xml:space="preserve"> </w:t>
@@ -2365,14 +2329,20 @@
         </w:numPr>
       </w:pPr>
       <w:r>
-        <w:rPr>
-          <w:b/>
-          <w:bCs/>
-        </w:rPr>
-        <w:t xml:space="preserve">Katabuchi, M.*</w:t>
-      </w:r>
-      <w:r>
-        <w:t xml:space="preserve">, Kurokawa, H., Davies, S. J., Tan, S. &amp; Nakashizuka, T. Soil resource availability shapes community trait structure in a species-rich dipterocarp forest.</w:t>
+        <w:t xml:space="preserve">Sasaki, T.*,</w:t>
+      </w:r>
+      <w:r>
+        <w:t xml:space="preserve"> </w:t>
+      </w:r>
+      <w:r>
+        <w:rPr>
+          <w:b/>
+          <w:bCs/>
+        </w:rPr>
+        <w:t xml:space="preserve">Katabuchi, M.</w:t>
+      </w:r>
+      <w:r>
+        <w:t xml:space="preserve">, Kamiyama, C., Shimazaki, M., Nakashizuka, T. &amp; Hikosaka, K. Nestedness and niche-based species loss in moorland plant communities.</w:t>
       </w:r>
       <w:r>
         <w:t xml:space="preserve"> </w:t>
@@ -2384,13 +2354,13 @@
           <w:i/>
           <w:iCs/>
         </w:rPr>
-        <w:t xml:space="preserve">Journal of Ecology</w:t>
-      </w:r>
-      <w:r>
-        <w:t xml:space="preserve"> </w:t>
-      </w:r>
-      <w:r>
-        <w:t xml:space="preserve">100, 643–651 (2012)</w:t>
+        <w:t xml:space="preserve">Oikos</w:t>
+      </w:r>
+      <w:r>
+        <w:t xml:space="preserve"> </w:t>
+      </w:r>
+      <w:r>
+        <w:t xml:space="preserve">121, 1783–1790 (2012)</w:t>
       </w:r>
       <w:r>
         <w:t xml:space="preserve"> </w:t>
@@ -2415,78 +2385,38 @@
         </w:numPr>
       </w:pPr>
       <w:r>
-        <w:rPr>
-          <w:b/>
-          <w:bCs/>
-        </w:rPr>
-        <w:t xml:space="preserve">Katabuchi, M.*</w:t>
-      </w:r>
-      <w:r>
-        <w:t xml:space="preserve">, Isagi, Y. &amp; Nakashizuka, T. Development of 17 microsatellite markers for</w:t>
-      </w:r>
-      <w:r>
-        <w:t xml:space="preserve"> </w:t>
-      </w:r>
-      <w:r>
-        <w:rPr>
+        <w:t xml:space="preserve">Sasaki, T.*,</w:t>
+      </w:r>
+      <w:r>
+        <w:t xml:space="preserve"> </w:t>
+      </w:r>
+      <w:r>
+        <w:rPr>
+          <w:b/>
+          <w:bCs/>
+        </w:rPr>
+        <w:t xml:space="preserve">Katabuchi, M.</w:t>
+      </w:r>
+      <w:r>
+        <w:t xml:space="preserve">, Kamiyama, C., Shimazaki, M., Nakashizuka, T. &amp; Hikosaka, K. Diversity partitioning of moorland plant communities across hierarchical spatial scales.</w:t>
+      </w:r>
+      <w:r>
+        <w:t xml:space="preserve"> </w:t>
+      </w:r>
+      <w:r>
+        <w:rPr>
+          <w:b/>
+          <w:bCs/>
           <w:i/>
           <w:iCs/>
         </w:rPr>
-        <w:t xml:space="preserve">Ceratosolen</w:t>
-      </w:r>
-      <w:r>
-        <w:t xml:space="preserve"> </w:t>
-      </w:r>
-      <w:r>
-        <w:rPr>
-          <w:i/>
-          <w:iCs/>
-        </w:rPr>
-        <w:t xml:space="preserve">Constrictus</w:t>
-      </w:r>
-      <w:r>
-        <w:t xml:space="preserve">, the pollinating fig wasp of</w:t>
-      </w:r>
-      <w:r>
-        <w:t xml:space="preserve"> </w:t>
-      </w:r>
-      <w:r>
-        <w:rPr>
-          <w:i/>
-          <w:iCs/>
-        </w:rPr>
-        <w:t xml:space="preserve">Ficus</w:t>
-      </w:r>
-      <w:r>
-        <w:t xml:space="preserve"> </w:t>
-      </w:r>
-      <w:r>
-        <w:rPr>
-          <w:i/>
-          <w:iCs/>
-        </w:rPr>
-        <w:t xml:space="preserve">Fistulosa</w:t>
-      </w:r>
-      <w:r>
-        <w:t xml:space="preserve">.</w:t>
-      </w:r>
-      <w:r>
-        <w:t xml:space="preserve"> </w:t>
-      </w:r>
-      <w:r>
-        <w:rPr>
-          <w:b/>
-          <w:bCs/>
-          <w:i/>
-          <w:iCs/>
-        </w:rPr>
-        <w:t xml:space="preserve">Molecular Ecology Resources</w:t>
-      </w:r>
-      <w:r>
-        <w:t xml:space="preserve"> </w:t>
-      </w:r>
-      <w:r>
-        <w:t xml:space="preserve">8, 840–842 (2008)</w:t>
+        <w:t xml:space="preserve">Biodiversity and Conservation</w:t>
+      </w:r>
+      <w:r>
+        <w:t xml:space="preserve"> </w:t>
+      </w:r>
+      <w:r>
+        <w:t xml:space="preserve">21, 1577–1588 (2012)</w:t>
       </w:r>
       <w:r>
         <w:t xml:space="preserve"> </w:t>
@@ -2518,48 +2448,25 @@
         <w:t xml:space="preserve">Katabuchi, M.*</w:t>
       </w:r>
       <w:r>
-        <w:t xml:space="preserve">, Harrison, R. D. &amp; Nakashizuka, T. Documenting the effect of foundress number in a dioecious fig,</w:t>
-      </w:r>
-      <w:r>
-        <w:t xml:space="preserve"> </w:t>
-      </w:r>
-      <w:r>
-        <w:rPr>
+        <w:t xml:space="preserve">, Kurokawa, H., Davies, S. J., Tan, S. &amp; Nakashizuka, T. Soil resource availability shapes community trait structure in a species-rich dipterocarp forest.</w:t>
+      </w:r>
+      <w:r>
+        <w:t xml:space="preserve"> </w:t>
+      </w:r>
+      <w:r>
+        <w:rPr>
+          <w:b/>
+          <w:bCs/>
           <w:i/>
           <w:iCs/>
         </w:rPr>
-        <w:t xml:space="preserve">Ficus</w:t>
-      </w:r>
-      <w:r>
-        <w:t xml:space="preserve"> </w:t>
-      </w:r>
-      <w:r>
-        <w:rPr>
-          <w:i/>
-          <w:iCs/>
-        </w:rPr>
-        <w:t xml:space="preserve">Fistulosa</w:t>
-      </w:r>
-      <w:r>
-        <w:t xml:space="preserve">, in Malaysia.</w:t>
-      </w:r>
-      <w:r>
-        <w:t xml:space="preserve"> </w:t>
-      </w:r>
-      <w:r>
-        <w:rPr>
-          <w:b/>
-          <w:bCs/>
-          <w:i/>
-          <w:iCs/>
-        </w:rPr>
-        <w:t xml:space="preserve">Biotropica</w:t>
-      </w:r>
-      <w:r>
-        <w:t xml:space="preserve"> </w:t>
-      </w:r>
-      <w:r>
-        <w:t xml:space="preserve">40, 457–461 (2008)</w:t>
+        <w:t xml:space="preserve">Journal of Ecology</w:t>
+      </w:r>
+      <w:r>
+        <w:t xml:space="preserve"> </w:t>
+      </w:r>
+      <w:r>
+        <w:t xml:space="preserve">100, 643–651 (2012)</w:t>
       </w:r>
       <w:r>
         <w:t xml:space="preserve"> </w:t>
@@ -2576,8 +2483,177 @@
         <w:t xml:space="preserve">.</w:t>
       </w:r>
     </w:p>
-    <w:bookmarkEnd w:id="49"/>
-    <w:bookmarkStart w:id="50" w:name="book"/>
+    <w:p>
+      <w:pPr>
+        <w:numPr>
+          <w:ilvl w:val="0"/>
+          <w:numId w:val="1001"/>
+        </w:numPr>
+      </w:pPr>
+      <w:r>
+        <w:rPr>
+          <w:b/>
+          <w:bCs/>
+        </w:rPr>
+        <w:t xml:space="preserve">Katabuchi, M.*</w:t>
+      </w:r>
+      <w:r>
+        <w:t xml:space="preserve">, Isagi, Y. &amp; Nakashizuka, T. Development of 17 microsatellite markers for</w:t>
+      </w:r>
+      <w:r>
+        <w:t xml:space="preserve"> </w:t>
+      </w:r>
+      <w:r>
+        <w:rPr>
+          <w:i/>
+          <w:iCs/>
+        </w:rPr>
+        <w:t xml:space="preserve">Ceratosolen</w:t>
+      </w:r>
+      <w:r>
+        <w:t xml:space="preserve"> </w:t>
+      </w:r>
+      <w:r>
+        <w:rPr>
+          <w:i/>
+          <w:iCs/>
+        </w:rPr>
+        <w:t xml:space="preserve">Constrictus</w:t>
+      </w:r>
+      <w:r>
+        <w:t xml:space="preserve">, the pollinating fig wasp of</w:t>
+      </w:r>
+      <w:r>
+        <w:t xml:space="preserve"> </w:t>
+      </w:r>
+      <w:r>
+        <w:rPr>
+          <w:i/>
+          <w:iCs/>
+        </w:rPr>
+        <w:t xml:space="preserve">Ficus</w:t>
+      </w:r>
+      <w:r>
+        <w:t xml:space="preserve"> </w:t>
+      </w:r>
+      <w:r>
+        <w:rPr>
+          <w:i/>
+          <w:iCs/>
+        </w:rPr>
+        <w:t xml:space="preserve">Fistulosa</w:t>
+      </w:r>
+      <w:r>
+        <w:t xml:space="preserve">.</w:t>
+      </w:r>
+      <w:r>
+        <w:t xml:space="preserve"> </w:t>
+      </w:r>
+      <w:r>
+        <w:rPr>
+          <w:b/>
+          <w:bCs/>
+          <w:i/>
+          <w:iCs/>
+        </w:rPr>
+        <w:t xml:space="preserve">Molecular Ecology Resources</w:t>
+      </w:r>
+      <w:r>
+        <w:t xml:space="preserve"> </w:t>
+      </w:r>
+      <w:r>
+        <w:t xml:space="preserve">8, 840–842 (2008)</w:t>
+      </w:r>
+      <w:r>
+        <w:t xml:space="preserve"> </w:t>
+      </w:r>
+      <w:hyperlink r:id="rId49">
+        <w:r>
+          <w:rPr>
+            <w:rStyle w:val="InternetLink"/>
+          </w:rPr>
+          <w:t xml:space="preserve">[doi]</w:t>
+        </w:r>
+      </w:hyperlink>
+      <w:r>
+        <w:t xml:space="preserve">.</w:t>
+      </w:r>
+    </w:p>
+    <w:p>
+      <w:pPr>
+        <w:numPr>
+          <w:ilvl w:val="0"/>
+          <w:numId w:val="1001"/>
+        </w:numPr>
+      </w:pPr>
+      <w:r>
+        <w:rPr>
+          <w:b/>
+          <w:bCs/>
+        </w:rPr>
+        <w:t xml:space="preserve">Katabuchi, M.*</w:t>
+      </w:r>
+      <w:r>
+        <w:t xml:space="preserve">, Harrison, R. D. &amp; Nakashizuka, T. Documenting the effect of foundress number in a dioecious fig,</w:t>
+      </w:r>
+      <w:r>
+        <w:t xml:space="preserve"> </w:t>
+      </w:r>
+      <w:r>
+        <w:rPr>
+          <w:i/>
+          <w:iCs/>
+        </w:rPr>
+        <w:t xml:space="preserve">Ficus</w:t>
+      </w:r>
+      <w:r>
+        <w:t xml:space="preserve"> </w:t>
+      </w:r>
+      <w:r>
+        <w:rPr>
+          <w:i/>
+          <w:iCs/>
+        </w:rPr>
+        <w:t xml:space="preserve">Fistulosa</w:t>
+      </w:r>
+      <w:r>
+        <w:t xml:space="preserve">, in Malaysia.</w:t>
+      </w:r>
+      <w:r>
+        <w:t xml:space="preserve"> </w:t>
+      </w:r>
+      <w:r>
+        <w:rPr>
+          <w:b/>
+          <w:bCs/>
+          <w:i/>
+          <w:iCs/>
+        </w:rPr>
+        <w:t xml:space="preserve">Biotropica</w:t>
+      </w:r>
+      <w:r>
+        <w:t xml:space="preserve"> </w:t>
+      </w:r>
+      <w:r>
+        <w:t xml:space="preserve">40, 457–461 (2008)</w:t>
+      </w:r>
+      <w:r>
+        <w:t xml:space="preserve"> </w:t>
+      </w:r>
+      <w:hyperlink r:id="rId50">
+        <w:r>
+          <w:rPr>
+            <w:rStyle w:val="InternetLink"/>
+          </w:rPr>
+          <w:t xml:space="preserve">[doi]</w:t>
+        </w:r>
+      </w:hyperlink>
+      <w:r>
+        <w:t xml:space="preserve">.</w:t>
+      </w:r>
+    </w:p>
+    <w:bookmarkEnd w:id="51"/>
+    <w:bookmarkStart w:id="52" w:name="book"/>
     <w:p>
       <w:pPr>
         <w:pStyle w:val="Heading2"/>
@@ -2647,8 +2723,8 @@
         <w:t xml:space="preserve">, Oikawa S., Shimazaki M., Kimura H. and Nakashizuka T. (2016), Trait-Based Approaches for Understanding Species Niche, Coexistence, and Functional Diversity in Subalpine Moorlands. Structure and Function of Mountain Ecosystems in Japan.</w:t>
       </w:r>
     </w:p>
-    <w:bookmarkEnd w:id="50"/>
-    <w:bookmarkStart w:id="54" w:name="software"/>
+    <w:bookmarkEnd w:id="52"/>
+    <w:bookmarkStart w:id="56" w:name="software"/>
     <w:p>
       <w:pPr>
         <w:pStyle w:val="Heading2"/>
@@ -2678,74 +2754,6 @@
       </w:r>
       <w:r>
         <w:t xml:space="preserve">: Zero-Truncated Poisson Lognormal Distribution,</w:t>
-      </w:r>
-      <w:r>
-        <w:t xml:space="preserve"> </w:t>
-      </w:r>
-      <w:hyperlink r:id="rId51">
-        <w:r>
-          <w:rPr>
-            <w:rStyle w:val="InternetLink"/>
-          </w:rPr>
-          <w:t xml:space="preserve">R CRAN package</w:t>
-        </w:r>
-      </w:hyperlink>
-    </w:p>
-    <w:p>
-      <w:pPr>
-        <w:pStyle w:val="DefinitionTerm"/>
-      </w:pPr>
-      <w:r>
-        <w:t xml:space="preserve">2015</w:t>
-      </w:r>
-    </w:p>
-    <w:p>
-      <w:pPr>
-        <w:pStyle w:val="Definition"/>
-      </w:pPr>
-      <w:r>
-        <w:rPr>
-          <w:b/>
-          <w:bCs/>
-        </w:rPr>
-        <w:t xml:space="preserve">LeafArea</w:t>
-      </w:r>
-      <w:r>
-        <w:t xml:space="preserve">: Rapid Digital Image Analysis of Leaf Area,</w:t>
-      </w:r>
-      <w:r>
-        <w:t xml:space="preserve"> </w:t>
-      </w:r>
-      <w:hyperlink r:id="rId52">
-        <w:r>
-          <w:rPr>
-            <w:rStyle w:val="InternetLink"/>
-          </w:rPr>
-          <w:t xml:space="preserve">R CRAN package</w:t>
-        </w:r>
-      </w:hyperlink>
-    </w:p>
-    <w:p>
-      <w:pPr>
-        <w:pStyle w:val="DefinitionTerm"/>
-      </w:pPr>
-      <w:r>
-        <w:t xml:space="preserve">2015</w:t>
-      </w:r>
-    </w:p>
-    <w:p>
-      <w:pPr>
-        <w:pStyle w:val="Definition"/>
-      </w:pPr>
-      <w:r>
-        <w:rPr>
-          <w:b/>
-          <w:bCs/>
-        </w:rPr>
-        <w:t xml:space="preserve">mglmn</w:t>
-      </w:r>
-      <w:r>
-        <w:t xml:space="preserve">: Model Averaging fro Multivariate GLM with Null Models, R CRAN package</w:t>
       </w:r>
       <w:r>
         <w:t xml:space="preserve"> </w:t>
@@ -2759,8 +2767,76 @@
         </w:r>
       </w:hyperlink>
     </w:p>
-    <w:bookmarkEnd w:id="54"/>
-    <w:bookmarkStart w:id="55" w:name="teaching-experience"/>
+    <w:p>
+      <w:pPr>
+        <w:pStyle w:val="DefinitionTerm"/>
+      </w:pPr>
+      <w:r>
+        <w:t xml:space="preserve">2015</w:t>
+      </w:r>
+    </w:p>
+    <w:p>
+      <w:pPr>
+        <w:pStyle w:val="Definition"/>
+      </w:pPr>
+      <w:r>
+        <w:rPr>
+          <w:b/>
+          <w:bCs/>
+        </w:rPr>
+        <w:t xml:space="preserve">LeafArea</w:t>
+      </w:r>
+      <w:r>
+        <w:t xml:space="preserve">: Rapid Digital Image Analysis of Leaf Area,</w:t>
+      </w:r>
+      <w:r>
+        <w:t xml:space="preserve"> </w:t>
+      </w:r>
+      <w:hyperlink r:id="rId54">
+        <w:r>
+          <w:rPr>
+            <w:rStyle w:val="InternetLink"/>
+          </w:rPr>
+          <w:t xml:space="preserve">R CRAN package</w:t>
+        </w:r>
+      </w:hyperlink>
+    </w:p>
+    <w:p>
+      <w:pPr>
+        <w:pStyle w:val="DefinitionTerm"/>
+      </w:pPr>
+      <w:r>
+        <w:t xml:space="preserve">2015</w:t>
+      </w:r>
+    </w:p>
+    <w:p>
+      <w:pPr>
+        <w:pStyle w:val="Definition"/>
+      </w:pPr>
+      <w:r>
+        <w:rPr>
+          <w:b/>
+          <w:bCs/>
+        </w:rPr>
+        <w:t xml:space="preserve">mglmn</w:t>
+      </w:r>
+      <w:r>
+        <w:t xml:space="preserve">: Model Averaging fro Multivariate GLM with Null Models, R CRAN package</w:t>
+      </w:r>
+      <w:r>
+        <w:t xml:space="preserve"> </w:t>
+      </w:r>
+      <w:hyperlink r:id="rId55">
+        <w:r>
+          <w:rPr>
+            <w:rStyle w:val="InternetLink"/>
+          </w:rPr>
+          <w:t xml:space="preserve">R CRAN package</w:t>
+        </w:r>
+      </w:hyperlink>
+    </w:p>
+    <w:bookmarkEnd w:id="56"/>
+    <w:bookmarkStart w:id="57" w:name="teaching-experience"/>
     <w:p>
       <w:pPr>
         <w:pStyle w:val="Heading2"/>
@@ -2833,8 +2909,8 @@
         <w:t xml:space="preserve">R and generalized linear models, Xishuangbanna Tropical Botanical Garden, Chinese Academy of Sciences, China</w:t>
       </w:r>
     </w:p>
-    <w:bookmarkEnd w:id="55"/>
-    <w:bookmarkStart w:id="58" w:name="academic-service"/>
+    <w:bookmarkEnd w:id="57"/>
+    <w:bookmarkStart w:id="60" w:name="academic-service"/>
     <w:p>
       <w:pPr>
         <w:pStyle w:val="Heading2"/>
@@ -2855,7 +2931,7 @@
       <w:pPr>
         <w:pStyle w:val="Definition"/>
       </w:pPr>
-      <w:hyperlink r:id="rId56"/>
+      <w:hyperlink r:id="rId58"/>
     </w:p>
     <w:p>
       <w:pPr>
@@ -2877,7 +2953,7 @@
       <w:pPr>
         <w:pStyle w:val="Definition"/>
       </w:pPr>
-      <w:hyperlink r:id="rId56"/>
+      <w:hyperlink r:id="rId58"/>
     </w:p>
     <w:p>
       <w:pPr>
@@ -2899,7 +2975,7 @@
       <w:pPr>
         <w:pStyle w:val="Definition"/>
       </w:pPr>
-      <w:hyperlink r:id="rId56"/>
+      <w:hyperlink r:id="rId58"/>
     </w:p>
     <w:p>
       <w:pPr>
@@ -2921,7 +2997,7 @@
       <w:pPr>
         <w:pStyle w:val="Definition"/>
       </w:pPr>
-      <w:hyperlink r:id="rId56"/>
+      <w:hyperlink r:id="rId58"/>
     </w:p>
     <w:p>
       <w:pPr>
@@ -2931,7 +3007,7 @@
         <w:t xml:space="preserve">Statistical editor for Lepcey, The Journal of Tropical Asian Entomology</w:t>
       </w:r>
     </w:p>
-    <w:bookmarkStart w:id="57" w:name="reviewer-for-journals-12-per-year"/>
+    <w:bookmarkStart w:id="59" w:name="reviewer-for-journals-12-per-year"/>
     <w:p>
       <w:pPr>
         <w:pStyle w:val="Heading3"/>
@@ -2940,9 +3016,9 @@
         <w:t xml:space="preserve">Reviewer for journals (~ 12 per year):</w:t>
       </w:r>
     </w:p>
-    <w:bookmarkEnd w:id="57"/>
-    <w:bookmarkEnd w:id="58"/>
-    <w:bookmarkStart w:id="59" w:name="awards-and-prizes"/>
+    <w:bookmarkEnd w:id="59"/>
+    <w:bookmarkEnd w:id="60"/>
+    <w:bookmarkStart w:id="61" w:name="awards-and-prizes"/>
     <w:p>
       <w:pPr>
         <w:pStyle w:val="Heading2"/>
@@ -2999,8 +3075,8 @@
         <w:t xml:space="preserve">Dean’s award for excellence, Graduate School of Life Sciences (Master’s Program), Tohoku University</w:t>
       </w:r>
     </w:p>
-    <w:bookmarkEnd w:id="59"/>
-    <w:bookmarkStart w:id="60" w:name="invited-seminars"/>
+    <w:bookmarkEnd w:id="61"/>
+    <w:bookmarkStart w:id="62" w:name="invited-seminars"/>
     <w:p>
       <w:pPr>
         <w:pStyle w:val="Heading2"/>
@@ -3105,8 +3181,8 @@
         <w:t xml:space="preserve">Additive partitioning of functional diversity in plant communities, Xishuangbanna Tropical Botanical Garden, China</w:t>
       </w:r>
     </w:p>
-    <w:bookmarkEnd w:id="60"/>
-    <w:bookmarkStart w:id="61" w:name="international-meetings"/>
+    <w:bookmarkEnd w:id="62"/>
+    <w:bookmarkStart w:id="63" w:name="international-meetings"/>
     <w:p>
       <w:pPr>
         <w:pStyle w:val="Heading2"/>
@@ -3467,8 +3543,8 @@
         <w:t xml:space="preserve">, Jun Yokoyama, and Tohru Nakashizuka, “Inbreeding and mating structure in a dioecious-fig pollinating wasp”. ATBC, Marburg, Germany</w:t>
       </w:r>
     </w:p>
-    <w:bookmarkEnd w:id="61"/>
-    <w:bookmarkStart w:id="62" w:name="outreach"/>
+    <w:bookmarkEnd w:id="63"/>
+    <w:bookmarkStart w:id="64" w:name="outreach"/>
     <w:p>
       <w:pPr>
         <w:pStyle w:val="Heading2"/>
@@ -3493,8 +3569,8 @@
         <w:t xml:space="preserve">Masatoshi Katabuchi “Leaves and tropical rainforests”. Invited by the Japanese Association of Interdisciplinary Study Group in University Florida</w:t>
       </w:r>
     </w:p>
-    <w:bookmarkEnd w:id="62"/>
-    <w:bookmarkStart w:id="63" w:name="languages"/>
+    <w:bookmarkEnd w:id="64"/>
+    <w:bookmarkStart w:id="65" w:name="languages"/>
     <w:p>
       <w:pPr>
         <w:pStyle w:val="Heading2"/>
@@ -3511,8 +3587,8 @@
         <w:t xml:space="preserve">Japanese (native), English (fluent), Malay (basic), Chinese-Mandarin (basic)</w:t>
       </w:r>
     </w:p>
-    <w:bookmarkEnd w:id="63"/>
-    <w:bookmarkStart w:id="64" w:name="graduate-students"/>
+    <w:bookmarkEnd w:id="65"/>
+    <w:bookmarkStart w:id="66" w:name="graduate-students"/>
     <w:p>
       <w:pPr>
         <w:pStyle w:val="Heading2"/>
@@ -3537,7 +3613,7 @@
         <w:t xml:space="preserve">Zhou Cong, 2021 - 2023, M.Sc. Student, Recipient of UCAS Scholarship.</w:t>
       </w:r>
     </w:p>
-    <w:bookmarkEnd w:id="64"/>
+    <w:bookmarkEnd w:id="66"/>
     <w:sectPr>
       <w:headerReference r:id="rId3" w:type="default"/>
       <w:footnotePr>

</xml_diff>